<commit_message>
Fix state withholding. Add tax preparation deduction and investment expenses. Add deduction for state income tax due on last year's taxes, but paid this year.
</commit_message>
<xml_diff>
--- a/Documentation/AboutTAXTools.docx
+++ b/Documentation/AboutTAXTools.docx
@@ -47,7 +47,7 @@
         <w:rPr>
           <w:noProof/>
         </w:rPr>
-        <w:t>September 3, 2026</w:t>
+        <w:t>September 30, 2026</w:t>
       </w:r>
       <w:r>
         <w:rPr>
@@ -113,9 +113,11 @@
             <w:rPr>
               <w:rFonts w:asciiTheme="minorHAnsi" w:eastAsiaTheme="minorEastAsia" w:hAnsiTheme="minorHAnsi" w:cstheme="minorBidi"/>
               <w:b w:val="0"/>
-              <w:sz w:val="22"/>
-              <w:szCs w:val="22"/>
+              <w:kern w:val="2"/>
+              <w:sz w:val="24"/>
+              <w:szCs w:val="24"/>
               <w:lang w:eastAsia="en-US"/>
+              <w14:ligatures w14:val="standardContextual"/>
             </w:rPr>
           </w:pPr>
           <w:r>
@@ -127,7 +129,7 @@
           <w:r>
             <w:fldChar w:fldCharType="separate"/>
           </w:r>
-          <w:hyperlink w:anchor="_Toc239272551" w:history="1">
+          <w:hyperlink w:anchor="_Toc241654053" w:history="1">
             <w:r>
               <w:rPr>
                 <w:rStyle w:val="Hyperlink"/>
@@ -150,7 +152,7 @@
               <w:rPr>
                 <w:webHidden/>
               </w:rPr>
-              <w:instrText xml:space="preserve"> PAGEREF _Toc239272551 \h </w:instrText>
+              <w:instrText xml:space="preserve"> PAGEREF _Toc241654053 \h </w:instrText>
             </w:r>
             <w:r>
               <w:rPr>
@@ -183,12 +185,14 @@
             <w:rPr>
               <w:rFonts w:asciiTheme="minorHAnsi" w:eastAsiaTheme="minorEastAsia" w:hAnsiTheme="minorHAnsi" w:cstheme="minorBidi"/>
               <w:b w:val="0"/>
-              <w:sz w:val="22"/>
-              <w:szCs w:val="22"/>
+              <w:kern w:val="2"/>
+              <w:sz w:val="24"/>
+              <w:szCs w:val="24"/>
               <w:lang w:eastAsia="en-US"/>
+              <w14:ligatures w14:val="standardContextual"/>
             </w:rPr>
           </w:pPr>
-          <w:hyperlink w:anchor="_Toc239272552" w:history="1">
+          <w:hyperlink w:anchor="_Toc241654054" w:history="1">
             <w:r>
               <w:rPr>
                 <w:rStyle w:val="Hyperlink"/>
@@ -211,7 +215,7 @@
               <w:rPr>
                 <w:webHidden/>
               </w:rPr>
-              <w:instrText xml:space="preserve"> PAGEREF _Toc239272552 \h </w:instrText>
+              <w:instrText xml:space="preserve"> PAGEREF _Toc241654054 \h </w:instrText>
             </w:r>
             <w:r>
               <w:rPr>
@@ -244,12 +248,14 @@
             <w:rPr>
               <w:rFonts w:asciiTheme="minorHAnsi" w:eastAsiaTheme="minorEastAsia" w:hAnsiTheme="minorHAnsi" w:cstheme="minorBidi"/>
               <w:noProof/>
-              <w:sz w:val="22"/>
-              <w:szCs w:val="22"/>
+              <w:kern w:val="2"/>
+              <w:sz w:val="24"/>
+              <w:szCs w:val="24"/>
               <w:lang w:eastAsia="en-US"/>
+              <w14:ligatures w14:val="standardContextual"/>
             </w:rPr>
           </w:pPr>
-          <w:hyperlink w:anchor="_Toc239272553" w:history="1">
+          <w:hyperlink w:anchor="_Toc241654055" w:history="1">
             <w:r>
               <w:rPr>
                 <w:rStyle w:val="Hyperlink"/>
@@ -276,7 +282,7 @@
                 <w:noProof/>
                 <w:webHidden/>
               </w:rPr>
-              <w:instrText xml:space="preserve"> PAGEREF _Toc239272553 \h </w:instrText>
+              <w:instrText xml:space="preserve"> PAGEREF _Toc241654055 \h </w:instrText>
             </w:r>
             <w:r>
               <w:rPr>
@@ -313,12 +319,14 @@
             <w:rPr>
               <w:rFonts w:asciiTheme="minorHAnsi" w:eastAsiaTheme="minorEastAsia" w:hAnsiTheme="minorHAnsi" w:cstheme="minorBidi"/>
               <w:noProof/>
-              <w:sz w:val="22"/>
-              <w:szCs w:val="22"/>
+              <w:kern w:val="2"/>
+              <w:sz w:val="24"/>
+              <w:szCs w:val="24"/>
               <w:lang w:eastAsia="en-US"/>
+              <w14:ligatures w14:val="standardContextual"/>
             </w:rPr>
           </w:pPr>
-          <w:hyperlink w:anchor="_Toc239272554" w:history="1">
+          <w:hyperlink w:anchor="_Toc241654056" w:history="1">
             <w:r>
               <w:rPr>
                 <w:rStyle w:val="Hyperlink"/>
@@ -345,7 +353,7 @@
                 <w:noProof/>
                 <w:webHidden/>
               </w:rPr>
-              <w:instrText xml:space="preserve"> PAGEREF _Toc239272554 \h </w:instrText>
+              <w:instrText xml:space="preserve"> PAGEREF _Toc241654056 \h </w:instrText>
             </w:r>
             <w:r>
               <w:rPr>
@@ -382,12 +390,14 @@
             <w:rPr>
               <w:rFonts w:asciiTheme="minorHAnsi" w:eastAsiaTheme="minorEastAsia" w:hAnsiTheme="minorHAnsi" w:cstheme="minorBidi"/>
               <w:noProof/>
-              <w:sz w:val="22"/>
-              <w:szCs w:val="22"/>
+              <w:kern w:val="2"/>
+              <w:sz w:val="24"/>
+              <w:szCs w:val="24"/>
               <w:lang w:eastAsia="en-US"/>
+              <w14:ligatures w14:val="standardContextual"/>
             </w:rPr>
           </w:pPr>
-          <w:hyperlink w:anchor="_Toc239272555" w:history="1">
+          <w:hyperlink w:anchor="_Toc241654057" w:history="1">
             <w:r>
               <w:rPr>
                 <w:rStyle w:val="Hyperlink"/>
@@ -414,7 +424,7 @@
                 <w:noProof/>
                 <w:webHidden/>
               </w:rPr>
-              <w:instrText xml:space="preserve"> PAGEREF _Toc239272555 \h </w:instrText>
+              <w:instrText xml:space="preserve"> PAGEREF _Toc241654057 \h </w:instrText>
             </w:r>
             <w:r>
               <w:rPr>
@@ -451,12 +461,14 @@
             <w:rPr>
               <w:rFonts w:asciiTheme="minorHAnsi" w:eastAsiaTheme="minorEastAsia" w:hAnsiTheme="minorHAnsi" w:cstheme="minorBidi"/>
               <w:noProof/>
-              <w:sz w:val="22"/>
-              <w:szCs w:val="22"/>
+              <w:kern w:val="2"/>
+              <w:sz w:val="24"/>
+              <w:szCs w:val="24"/>
               <w:lang w:eastAsia="en-US"/>
+              <w14:ligatures w14:val="standardContextual"/>
             </w:rPr>
           </w:pPr>
-          <w:hyperlink w:anchor="_Toc239272556" w:history="1">
+          <w:hyperlink w:anchor="_Toc241654058" w:history="1">
             <w:r>
               <w:rPr>
                 <w:rStyle w:val="Hyperlink"/>
@@ -483,7 +495,7 @@
                 <w:noProof/>
                 <w:webHidden/>
               </w:rPr>
-              <w:instrText xml:space="preserve"> PAGEREF _Toc239272556 \h </w:instrText>
+              <w:instrText xml:space="preserve"> PAGEREF _Toc241654058 \h </w:instrText>
             </w:r>
             <w:r>
               <w:rPr>
@@ -503,7 +515,7 @@
                 <w:noProof/>
                 <w:webHidden/>
               </w:rPr>
-              <w:t>2</w:t>
+              <w:t>3</w:t>
             </w:r>
             <w:r>
               <w:rPr>
@@ -520,12 +532,14 @@
             <w:rPr>
               <w:rFonts w:asciiTheme="minorHAnsi" w:eastAsiaTheme="minorEastAsia" w:hAnsiTheme="minorHAnsi" w:cstheme="minorBidi"/>
               <w:b w:val="0"/>
-              <w:sz w:val="22"/>
-              <w:szCs w:val="22"/>
+              <w:kern w:val="2"/>
+              <w:sz w:val="24"/>
+              <w:szCs w:val="24"/>
               <w:lang w:eastAsia="en-US"/>
+              <w14:ligatures w14:val="standardContextual"/>
             </w:rPr>
           </w:pPr>
-          <w:hyperlink w:anchor="_Toc239272557" w:history="1">
+          <w:hyperlink w:anchor="_Toc241654059" w:history="1">
             <w:r>
               <w:rPr>
                 <w:rStyle w:val="Hyperlink"/>
@@ -548,7 +562,7 @@
               <w:rPr>
                 <w:webHidden/>
               </w:rPr>
-              <w:instrText xml:space="preserve"> PAGEREF _Toc239272557 \h </w:instrText>
+              <w:instrText xml:space="preserve"> PAGEREF _Toc241654059 \h </w:instrText>
             </w:r>
             <w:r>
               <w:rPr>
@@ -581,12 +595,14 @@
             <w:rPr>
               <w:rFonts w:asciiTheme="minorHAnsi" w:eastAsiaTheme="minorEastAsia" w:hAnsiTheme="minorHAnsi" w:cstheme="minorBidi"/>
               <w:b w:val="0"/>
-              <w:sz w:val="22"/>
-              <w:szCs w:val="22"/>
+              <w:kern w:val="2"/>
+              <w:sz w:val="24"/>
+              <w:szCs w:val="24"/>
               <w:lang w:eastAsia="en-US"/>
+              <w14:ligatures w14:val="standardContextual"/>
             </w:rPr>
           </w:pPr>
-          <w:hyperlink w:anchor="_Toc239272558" w:history="1">
+          <w:hyperlink w:anchor="_Toc241654060" w:history="1">
             <w:r>
               <w:rPr>
                 <w:rStyle w:val="Hyperlink"/>
@@ -609,7 +625,7 @@
               <w:rPr>
                 <w:webHidden/>
               </w:rPr>
-              <w:instrText xml:space="preserve"> PAGEREF _Toc239272558 \h </w:instrText>
+              <w:instrText xml:space="preserve"> PAGEREF _Toc241654060 \h </w:instrText>
             </w:r>
             <w:r>
               <w:rPr>
@@ -626,7 +642,7 @@
               <w:rPr>
                 <w:webHidden/>
               </w:rPr>
-              <w:t>3</w:t>
+              <w:t>4</w:t>
             </w:r>
             <w:r>
               <w:rPr>
@@ -642,18 +658,20 @@
             <w:rPr>
               <w:rFonts w:asciiTheme="minorHAnsi" w:eastAsiaTheme="minorEastAsia" w:hAnsiTheme="minorHAnsi" w:cstheme="minorBidi"/>
               <w:noProof/>
-              <w:sz w:val="22"/>
-              <w:szCs w:val="22"/>
+              <w:kern w:val="2"/>
+              <w:sz w:val="24"/>
+              <w:szCs w:val="24"/>
               <w:lang w:eastAsia="en-US"/>
+              <w14:ligatures w14:val="standardContextual"/>
             </w:rPr>
           </w:pPr>
-          <w:hyperlink w:anchor="_Toc239272559" w:history="1">
+          <w:hyperlink w:anchor="_Toc241654061" w:history="1">
             <w:r>
               <w:rPr>
                 <w:rStyle w:val="Hyperlink"/>
                 <w:noProof/>
               </w:rPr>
-              <w:t>California Sales Tax Calculator and California Sales Tax Deduction Calculator</w:t>
+              <w:t>General Issues</w:t>
             </w:r>
             <w:r>
               <w:rPr>
@@ -674,7 +692,7 @@
                 <w:noProof/>
                 <w:webHidden/>
               </w:rPr>
-              <w:instrText xml:space="preserve"> PAGEREF _Toc239272559 \h </w:instrText>
+              <w:instrText xml:space="preserve"> PAGEREF _Toc241654061 \h </w:instrText>
             </w:r>
             <w:r>
               <w:rPr>
@@ -694,7 +712,7 @@
                 <w:noProof/>
                 <w:webHidden/>
               </w:rPr>
-              <w:t>3</w:t>
+              <w:t>4</w:t>
             </w:r>
             <w:r>
               <w:rPr>
@@ -711,18 +729,20 @@
             <w:rPr>
               <w:rFonts w:asciiTheme="minorHAnsi" w:eastAsiaTheme="minorEastAsia" w:hAnsiTheme="minorHAnsi" w:cstheme="minorBidi"/>
               <w:noProof/>
-              <w:sz w:val="22"/>
-              <w:szCs w:val="22"/>
+              <w:kern w:val="2"/>
+              <w:sz w:val="24"/>
+              <w:szCs w:val="24"/>
               <w:lang w:eastAsia="en-US"/>
+              <w14:ligatures w14:val="standardContextual"/>
             </w:rPr>
           </w:pPr>
-          <w:hyperlink w:anchor="_Toc239272560" w:history="1">
+          <w:hyperlink w:anchor="_Toc241654062" w:history="1">
             <w:r>
               <w:rPr>
                 <w:rStyle w:val="Hyperlink"/>
                 <w:noProof/>
               </w:rPr>
-              <w:t>Estimated Tax Calculator (Federal)</w:t>
+              <w:t>California Sales Tax Calculator and California Sales Tax Deduction Calculator</w:t>
             </w:r>
             <w:r>
               <w:rPr>
@@ -743,7 +763,7 @@
                 <w:noProof/>
                 <w:webHidden/>
               </w:rPr>
-              <w:instrText xml:space="preserve"> PAGEREF _Toc239272560 \h </w:instrText>
+              <w:instrText xml:space="preserve"> PAGEREF _Toc241654062 \h </w:instrText>
             </w:r>
             <w:r>
               <w:rPr>
@@ -780,18 +800,20 @@
             <w:rPr>
               <w:rFonts w:asciiTheme="minorHAnsi" w:eastAsiaTheme="minorEastAsia" w:hAnsiTheme="minorHAnsi" w:cstheme="minorBidi"/>
               <w:noProof/>
-              <w:sz w:val="22"/>
-              <w:szCs w:val="22"/>
+              <w:kern w:val="2"/>
+              <w:sz w:val="24"/>
+              <w:szCs w:val="24"/>
               <w:lang w:eastAsia="en-US"/>
+              <w14:ligatures w14:val="standardContextual"/>
             </w:rPr>
           </w:pPr>
-          <w:hyperlink w:anchor="_Toc239272561" w:history="1">
+          <w:hyperlink w:anchor="_Toc241654063" w:history="1">
             <w:r>
               <w:rPr>
                 <w:rStyle w:val="Hyperlink"/>
                 <w:noProof/>
               </w:rPr>
-              <w:t>Small Business Tax Calculator</w:t>
+              <w:t>Estimated Tax Calculator (Federal)</w:t>
             </w:r>
             <w:r>
               <w:rPr>
@@ -812,7 +834,7 @@
                 <w:noProof/>
                 <w:webHidden/>
               </w:rPr>
-              <w:instrText xml:space="preserve"> PAGEREF _Toc239272561 \h </w:instrText>
+              <w:instrText xml:space="preserve"> PAGEREF _Toc241654063 \h </w:instrText>
             </w:r>
             <w:r>
               <w:rPr>
@@ -849,18 +871,20 @@
             <w:rPr>
               <w:rFonts w:asciiTheme="minorHAnsi" w:eastAsiaTheme="minorEastAsia" w:hAnsiTheme="minorHAnsi" w:cstheme="minorBidi"/>
               <w:noProof/>
-              <w:sz w:val="22"/>
-              <w:szCs w:val="22"/>
+              <w:kern w:val="2"/>
+              <w:sz w:val="24"/>
+              <w:szCs w:val="24"/>
               <w:lang w:eastAsia="en-US"/>
+              <w14:ligatures w14:val="standardContextual"/>
             </w:rPr>
           </w:pPr>
-          <w:hyperlink w:anchor="_Toc239272562" w:history="1">
+          <w:hyperlink w:anchor="_Toc241654064" w:history="1">
             <w:r>
               <w:rPr>
                 <w:rStyle w:val="Hyperlink"/>
                 <w:noProof/>
               </w:rPr>
-              <w:t>Social Security - Taxable Benefits Calculator</w:t>
+              <w:t>Simple Math Calculator</w:t>
             </w:r>
             <w:r>
               <w:rPr>
@@ -881,7 +905,7 @@
                 <w:noProof/>
                 <w:webHidden/>
               </w:rPr>
-              <w:instrText xml:space="preserve"> PAGEREF _Toc239272562 \h </w:instrText>
+              <w:instrText xml:space="preserve"> PAGEREF _Toc241654064 \h </w:instrText>
             </w:r>
             <w:r>
               <w:rPr>
@@ -918,18 +942,20 @@
             <w:rPr>
               <w:rFonts w:asciiTheme="minorHAnsi" w:eastAsiaTheme="minorEastAsia" w:hAnsiTheme="minorHAnsi" w:cstheme="minorBidi"/>
               <w:noProof/>
-              <w:sz w:val="22"/>
-              <w:szCs w:val="22"/>
+              <w:kern w:val="2"/>
+              <w:sz w:val="24"/>
+              <w:szCs w:val="24"/>
               <w:lang w:eastAsia="en-US"/>
+              <w14:ligatures w14:val="standardContextual"/>
             </w:rPr>
           </w:pPr>
-          <w:hyperlink w:anchor="_Toc239272563" w:history="1">
+          <w:hyperlink w:anchor="_Toc241654065" w:history="1">
             <w:r>
               <w:rPr>
                 <w:rStyle w:val="Hyperlink"/>
                 <w:noProof/>
               </w:rPr>
-              <w:t>Social Security Lump Sum Calculator</w:t>
+              <w:t>Small Business Tax Calculator</w:t>
             </w:r>
             <w:r>
               <w:rPr>
@@ -950,7 +976,7 @@
                 <w:noProof/>
                 <w:webHidden/>
               </w:rPr>
-              <w:instrText xml:space="preserve"> PAGEREF _Toc239272563 \h </w:instrText>
+              <w:instrText xml:space="preserve"> PAGEREF _Toc241654065 \h </w:instrText>
             </w:r>
             <w:r>
               <w:rPr>
@@ -987,17 +1013,161 @@
             <w:rPr>
               <w:rFonts w:asciiTheme="minorHAnsi" w:eastAsiaTheme="minorEastAsia" w:hAnsiTheme="minorHAnsi" w:cstheme="minorBidi"/>
               <w:noProof/>
-              <w:sz w:val="22"/>
-              <w:szCs w:val="22"/>
+              <w:kern w:val="2"/>
+              <w:sz w:val="24"/>
+              <w:szCs w:val="24"/>
               <w:lang w:eastAsia="en-US"/>
+              <w14:ligatures w14:val="standardContextual"/>
             </w:rPr>
           </w:pPr>
-          <w:hyperlink w:anchor="_Toc239272564" w:history="1">
+          <w:hyperlink w:anchor="_Toc241654066" w:history="1">
             <w:r>
               <w:rPr>
                 <w:rStyle w:val="Hyperlink"/>
                 <w:noProof/>
               </w:rPr>
+              <w:t>Social Security - Taxable Benefits Calculator</w:t>
+            </w:r>
+            <w:r>
+              <w:rPr>
+                <w:noProof/>
+                <w:webHidden/>
+              </w:rPr>
+              <w:tab/>
+            </w:r>
+            <w:r>
+              <w:rPr>
+                <w:noProof/>
+                <w:webHidden/>
+              </w:rPr>
+              <w:fldChar w:fldCharType="begin"/>
+            </w:r>
+            <w:r>
+              <w:rPr>
+                <w:noProof/>
+                <w:webHidden/>
+              </w:rPr>
+              <w:instrText xml:space="preserve"> PAGEREF _Toc241654066 \h </w:instrText>
+            </w:r>
+            <w:r>
+              <w:rPr>
+                <w:noProof/>
+                <w:webHidden/>
+              </w:rPr>
+            </w:r>
+            <w:r>
+              <w:rPr>
+                <w:noProof/>
+                <w:webHidden/>
+              </w:rPr>
+              <w:fldChar w:fldCharType="separate"/>
+            </w:r>
+            <w:r>
+              <w:rPr>
+                <w:noProof/>
+                <w:webHidden/>
+              </w:rPr>
+              <w:t>4</w:t>
+            </w:r>
+            <w:r>
+              <w:rPr>
+                <w:noProof/>
+                <w:webHidden/>
+              </w:rPr>
+              <w:fldChar w:fldCharType="end"/>
+            </w:r>
+          </w:hyperlink>
+        </w:p>
+        <w:p>
+          <w:pPr>
+            <w:pStyle w:val="TOC3"/>
+            <w:rPr>
+              <w:rFonts w:asciiTheme="minorHAnsi" w:eastAsiaTheme="minorEastAsia" w:hAnsiTheme="minorHAnsi" w:cstheme="minorBidi"/>
+              <w:noProof/>
+              <w:kern w:val="2"/>
+              <w:sz w:val="24"/>
+              <w:szCs w:val="24"/>
+              <w:lang w:eastAsia="en-US"/>
+              <w14:ligatures w14:val="standardContextual"/>
+            </w:rPr>
+          </w:pPr>
+          <w:hyperlink w:anchor="_Toc241654067" w:history="1">
+            <w:r>
+              <w:rPr>
+                <w:rStyle w:val="Hyperlink"/>
+                <w:noProof/>
+              </w:rPr>
+              <w:t>Social Security Lump Sum Calculator</w:t>
+            </w:r>
+            <w:r>
+              <w:rPr>
+                <w:noProof/>
+                <w:webHidden/>
+              </w:rPr>
+              <w:tab/>
+            </w:r>
+            <w:r>
+              <w:rPr>
+                <w:noProof/>
+                <w:webHidden/>
+              </w:rPr>
+              <w:fldChar w:fldCharType="begin"/>
+            </w:r>
+            <w:r>
+              <w:rPr>
+                <w:noProof/>
+                <w:webHidden/>
+              </w:rPr>
+              <w:instrText xml:space="preserve"> PAGEREF _Toc241654067 \h </w:instrText>
+            </w:r>
+            <w:r>
+              <w:rPr>
+                <w:noProof/>
+                <w:webHidden/>
+              </w:rPr>
+            </w:r>
+            <w:r>
+              <w:rPr>
+                <w:noProof/>
+                <w:webHidden/>
+              </w:rPr>
+              <w:fldChar w:fldCharType="separate"/>
+            </w:r>
+            <w:r>
+              <w:rPr>
+                <w:noProof/>
+                <w:webHidden/>
+              </w:rPr>
+              <w:t>4</w:t>
+            </w:r>
+            <w:r>
+              <w:rPr>
+                <w:noProof/>
+                <w:webHidden/>
+              </w:rPr>
+              <w:fldChar w:fldCharType="end"/>
+            </w:r>
+          </w:hyperlink>
+        </w:p>
+        <w:p>
+          <w:pPr>
+            <w:pStyle w:val="TOC3"/>
+            <w:rPr>
+              <w:rFonts w:asciiTheme="minorHAnsi" w:eastAsiaTheme="minorEastAsia" w:hAnsiTheme="minorHAnsi" w:cstheme="minorBidi"/>
+              <w:noProof/>
+              <w:kern w:val="2"/>
+              <w:sz w:val="24"/>
+              <w:szCs w:val="24"/>
+              <w:lang w:eastAsia="en-US"/>
+              <w14:ligatures w14:val="standardContextual"/>
+            </w:rPr>
+          </w:pPr>
+          <w:hyperlink w:anchor="_Toc241654068" w:history="1">
+            <w:r>
+              <w:rPr>
+                <w:rStyle w:val="Hyperlink"/>
+                <w:noProof/>
+              </w:rPr>
               <w:t>State Tax Refund Calculator</w:t>
             </w:r>
             <w:r>
@@ -1019,7 +1189,7 @@
                 <w:noProof/>
                 <w:webHidden/>
               </w:rPr>
-              <w:instrText xml:space="preserve"> PAGEREF _Toc239272564 \h </w:instrText>
+              <w:instrText xml:space="preserve"> PAGEREF _Toc241654068 \h </w:instrText>
             </w:r>
             <w:r>
               <w:rPr>
@@ -1040,6 +1210,148 @@
                 <w:webHidden/>
               </w:rPr>
               <w:t>4</w:t>
+            </w:r>
+            <w:r>
+              <w:rPr>
+                <w:noProof/>
+                <w:webHidden/>
+              </w:rPr>
+              <w:fldChar w:fldCharType="end"/>
+            </w:r>
+          </w:hyperlink>
+        </w:p>
+        <w:p>
+          <w:pPr>
+            <w:pStyle w:val="TOC3"/>
+            <w:rPr>
+              <w:rFonts w:asciiTheme="minorHAnsi" w:eastAsiaTheme="minorEastAsia" w:hAnsiTheme="minorHAnsi" w:cstheme="minorBidi"/>
+              <w:noProof/>
+              <w:kern w:val="2"/>
+              <w:sz w:val="24"/>
+              <w:szCs w:val="24"/>
+              <w:lang w:eastAsia="en-US"/>
+              <w14:ligatures w14:val="standardContextual"/>
+            </w:rPr>
+          </w:pPr>
+          <w:hyperlink w:anchor="_Toc241654069" w:history="1">
+            <w:r>
+              <w:rPr>
+                <w:rStyle w:val="Hyperlink"/>
+                <w:noProof/>
+              </w:rPr>
+              <w:t>Tax Return Calculator</w:t>
+            </w:r>
+            <w:r>
+              <w:rPr>
+                <w:noProof/>
+                <w:webHidden/>
+              </w:rPr>
+              <w:tab/>
+            </w:r>
+            <w:r>
+              <w:rPr>
+                <w:noProof/>
+                <w:webHidden/>
+              </w:rPr>
+              <w:fldChar w:fldCharType="begin"/>
+            </w:r>
+            <w:r>
+              <w:rPr>
+                <w:noProof/>
+                <w:webHidden/>
+              </w:rPr>
+              <w:instrText xml:space="preserve"> PAGEREF _Toc241654069 \h </w:instrText>
+            </w:r>
+            <w:r>
+              <w:rPr>
+                <w:noProof/>
+                <w:webHidden/>
+              </w:rPr>
+            </w:r>
+            <w:r>
+              <w:rPr>
+                <w:noProof/>
+                <w:webHidden/>
+              </w:rPr>
+              <w:fldChar w:fldCharType="separate"/>
+            </w:r>
+            <w:r>
+              <w:rPr>
+                <w:noProof/>
+                <w:webHidden/>
+              </w:rPr>
+              <w:t>4</w:t>
+            </w:r>
+            <w:r>
+              <w:rPr>
+                <w:noProof/>
+                <w:webHidden/>
+              </w:rPr>
+              <w:fldChar w:fldCharType="end"/>
+            </w:r>
+          </w:hyperlink>
+        </w:p>
+        <w:p>
+          <w:pPr>
+            <w:pStyle w:val="TOC2"/>
+            <w:rPr>
+              <w:rFonts w:asciiTheme="minorHAnsi" w:eastAsiaTheme="minorEastAsia" w:hAnsiTheme="minorHAnsi" w:cstheme="minorBidi"/>
+              <w:noProof/>
+              <w:kern w:val="2"/>
+              <w:sz w:val="24"/>
+              <w:szCs w:val="24"/>
+              <w:lang w:eastAsia="en-US"/>
+              <w14:ligatures w14:val="standardContextual"/>
+            </w:rPr>
+          </w:pPr>
+          <w:hyperlink w:anchor="_Toc241654070" w:history="1">
+            <w:r>
+              <w:rPr>
+                <w:rStyle w:val="Hyperlink"/>
+                <w:noProof/>
+              </w:rPr>
+              <w:t>Other Tools I'm Thinking About</w:t>
+            </w:r>
+            <w:r>
+              <w:rPr>
+                <w:noProof/>
+                <w:webHidden/>
+              </w:rPr>
+              <w:tab/>
+            </w:r>
+            <w:r>
+              <w:rPr>
+                <w:noProof/>
+                <w:webHidden/>
+              </w:rPr>
+              <w:fldChar w:fldCharType="begin"/>
+            </w:r>
+            <w:r>
+              <w:rPr>
+                <w:noProof/>
+                <w:webHidden/>
+              </w:rPr>
+              <w:instrText xml:space="preserve"> PAGEREF _Toc241654070 \h </w:instrText>
+            </w:r>
+            <w:r>
+              <w:rPr>
+                <w:noProof/>
+                <w:webHidden/>
+              </w:rPr>
+            </w:r>
+            <w:r>
+              <w:rPr>
+                <w:noProof/>
+                <w:webHidden/>
+              </w:rPr>
+              <w:fldChar w:fldCharType="separate"/>
+            </w:r>
+            <w:r>
+              <w:rPr>
+                <w:noProof/>
+                <w:webHidden/>
+              </w:rPr>
+              <w:t>5</w:t>
             </w:r>
             <w:r>
               <w:rPr>
@@ -1056,17 +1368,19 @@
             <w:rPr>
               <w:rFonts w:asciiTheme="minorHAnsi" w:eastAsiaTheme="minorEastAsia" w:hAnsiTheme="minorHAnsi" w:cstheme="minorBidi"/>
               <w:b w:val="0"/>
-              <w:sz w:val="22"/>
-              <w:szCs w:val="22"/>
+              <w:kern w:val="2"/>
+              <w:sz w:val="24"/>
+              <w:szCs w:val="24"/>
               <w:lang w:eastAsia="en-US"/>
+              <w14:ligatures w14:val="standardContextual"/>
             </w:rPr>
           </w:pPr>
-          <w:hyperlink w:anchor="_Toc239272565" w:history="1">
+          <w:hyperlink w:anchor="_Toc241654071" w:history="1">
             <w:r>
               <w:rPr>
                 <w:rStyle w:val="Hyperlink"/>
               </w:rPr>
-              <w:t>Changes I'm Thinking About</w:t>
+              <w:t>Feedback</w:t>
             </w:r>
             <w:r>
               <w:rPr>
@@ -1084,68 +1398,7 @@
               <w:rPr>
                 <w:webHidden/>
               </w:rPr>
-              <w:instrText xml:space="preserve"> PAGEREF _Toc239272565 \h </w:instrText>
-            </w:r>
-            <w:r>
-              <w:rPr>
-                <w:webHidden/>
-              </w:rPr>
-            </w:r>
-            <w:r>
-              <w:rPr>
-                <w:webHidden/>
-              </w:rPr>
-              <w:fldChar w:fldCharType="separate"/>
-            </w:r>
-            <w:r>
-              <w:rPr>
-                <w:webHidden/>
-              </w:rPr>
-              <w:t>4</w:t>
-            </w:r>
-            <w:r>
-              <w:rPr>
-                <w:webHidden/>
-              </w:rPr>
-              <w:fldChar w:fldCharType="end"/>
-            </w:r>
-          </w:hyperlink>
-        </w:p>
-        <w:p>
-          <w:pPr>
-            <w:pStyle w:val="TOC1"/>
-            <w:rPr>
-              <w:rFonts w:asciiTheme="minorHAnsi" w:eastAsiaTheme="minorEastAsia" w:hAnsiTheme="minorHAnsi" w:cstheme="minorBidi"/>
-              <w:b w:val="0"/>
-              <w:sz w:val="22"/>
-              <w:szCs w:val="22"/>
-              <w:lang w:eastAsia="en-US"/>
-            </w:rPr>
-          </w:pPr>
-          <w:hyperlink w:anchor="_Toc239272566" w:history="1">
-            <w:r>
-              <w:rPr>
-                <w:rStyle w:val="Hyperlink"/>
-              </w:rPr>
-              <w:t>Feedback</w:t>
-            </w:r>
-            <w:r>
-              <w:rPr>
-                <w:webHidden/>
-              </w:rPr>
-              <w:tab/>
-            </w:r>
-            <w:r>
-              <w:rPr>
-                <w:webHidden/>
-              </w:rPr>
-              <w:fldChar w:fldCharType="begin"/>
-            </w:r>
-            <w:r>
-              <w:rPr>
-                <w:webHidden/>
-              </w:rPr>
-              <w:instrText xml:space="preserve"> PAGEREF _Toc239272566 \h </w:instrText>
+              <w:instrText xml:space="preserve"> PAGEREF _Toc241654071 \h </w:instrText>
             </w:r>
             <w:r>
               <w:rPr>
@@ -1189,7 +1442,7 @@
         <w:pStyle w:val="Heading1"/>
         <w:ind w:left="0" w:firstLine="0"/>
       </w:pPr>
-      <w:bookmarkStart w:id="0" w:name="_Toc239272551"/>
+      <w:bookmarkStart w:id="0" w:name="_Toc241654053"/>
       <w:r>
         <w:t>Introduction</w:t>
       </w:r>
@@ -1401,6 +1654,7 @@
       </w:pPr>
       <w:bookmarkStart w:id="1" w:name="_Toc228630160"/>
       <w:r>
+        <w:lastRenderedPageBreak/>
         <w:t xml:space="preserve">These tools are intended to help you estimate various tax values. Since each tool estimates a </w:t>
       </w:r>
       <w:r>
@@ -1451,11 +1705,7 @@
         <w:t xml:space="preserve"> is, the more accurate </w:t>
       </w:r>
       <w:r>
-        <w:t xml:space="preserve">the calculation will be. A typical way to use these </w:t>
-      </w:r>
-      <w:r>
-        <w:lastRenderedPageBreak/>
-        <w:t xml:space="preserve">tools </w:t>
+        <w:t xml:space="preserve">the calculation will be. A typical way to use these tools </w:t>
       </w:r>
       <w:proofErr w:type="gramStart"/>
       <w:r>
@@ -1527,7 +1777,7 @@
         <w:pStyle w:val="Heading1"/>
       </w:pPr>
       <w:bookmarkStart w:id="2" w:name="_Toc231285045"/>
-      <w:bookmarkStart w:id="3" w:name="_Toc239272552"/>
+      <w:bookmarkStart w:id="3" w:name="_Toc241654054"/>
       <w:r>
         <w:t>Interface</w:t>
       </w:r>
@@ -1585,7 +1835,7 @@
         <w:pStyle w:val="Heading2"/>
       </w:pPr>
       <w:bookmarkStart w:id="4" w:name="_Toc231285046"/>
-      <w:bookmarkStart w:id="5" w:name="_Toc239272553"/>
+      <w:bookmarkStart w:id="5" w:name="_Toc241654055"/>
       <w:r>
         <w:t>Tooltips</w:t>
       </w:r>
@@ -1614,7 +1864,7 @@
         <w:pStyle w:val="Heading2"/>
       </w:pPr>
       <w:bookmarkStart w:id="6" w:name="_Toc231285047"/>
-      <w:bookmarkStart w:id="7" w:name="_Toc239272554"/>
+      <w:bookmarkStart w:id="7" w:name="_Toc241654056"/>
       <w:r>
         <w:t xml:space="preserve">Numeric </w:t>
       </w:r>
@@ -1694,60 +1944,61 @@
       <w:pPr>
         <w:pStyle w:val="Heading2"/>
       </w:pPr>
-      <w:bookmarkStart w:id="8" w:name="_Toc239272555"/>
-      <w:bookmarkStart w:id="9" w:name="_Toc231285048"/>
+      <w:bookmarkStart w:id="8" w:name="_Toc231285048"/>
+      <w:bookmarkStart w:id="9" w:name="_Toc241654057"/>
       <w:r>
         <w:t>Default Values</w:t>
       </w:r>
+      <w:bookmarkEnd w:id="9"/>
+    </w:p>
+    <w:p>
+      <w:pPr>
+        <w:pStyle w:val="Body-Text"/>
+      </w:pPr>
+      <w:r>
+        <w:t>When a field expecting a numeric value is left blank, its value defaults to zero (0). When you enter a value in a field, that value will be used in any calculation even if the tool calculates a different value for that field. Most of the time, this behavior is what you expect to happen</w:t>
+      </w:r>
+      <w:r>
+        <w:t>; after all, if you enter a value, you expect it to be used.</w:t>
+      </w:r>
+    </w:p>
+    <w:p>
+      <w:pPr>
+        <w:pStyle w:val="Body-Text"/>
+      </w:pPr>
+      <w:r>
+        <w:t xml:space="preserve">The Tax </w:t>
+      </w:r>
+      <w:r>
+        <w:t>Return Calculator</w:t>
+      </w:r>
+      <w:r>
+        <w:t xml:space="preserve"> tool created a new problem. In that tool, you can enter just about any value in any field of any form. Any fields that do not have an entry will be calculated according to the rules for that form.</w:t>
+      </w:r>
+      <w:r>
+        <w:t xml:space="preserve"> Now, a field where you enter zero (0) means that you want it to stay zero (0) and not be calculated. Thus, an explicitly entered zero (0) and a default value of zero (0) are treated differently. Therefore, when removing a value from a field, delete the entry rather than replacing the old value with zero (0). A field that does not have an entry will display the default value in gray characters. A field where you have entered a value will display the value in dark characters.</w:t>
+      </w:r>
+    </w:p>
+    <w:p>
+      <w:pPr>
+        <w:pStyle w:val="Heading2"/>
+      </w:pPr>
+      <w:bookmarkStart w:id="10" w:name="_Toc241654058"/>
+      <w:r>
+        <w:lastRenderedPageBreak/>
+        <w:t xml:space="preserve">Debugging </w:t>
+      </w:r>
+      <w:r>
+        <w:t>Information</w:t>
+      </w:r>
       <w:bookmarkEnd w:id="8"/>
+      <w:bookmarkEnd w:id="10"/>
     </w:p>
     <w:p>
       <w:pPr>
         <w:pStyle w:val="Body-Text"/>
       </w:pPr>
       <w:r>
-        <w:t>When a field expecting a numeric value is left blank, its value defaults to zero (0). When you enter a value in a field, that value will be used in any calculation even if the tool calculates a different value for that field. Most of the time, this behavior is what you expect to happen</w:t>
-      </w:r>
-      <w:r>
-        <w:t>; after all, if you enter a value, you expect it to be used.</w:t>
-      </w:r>
-    </w:p>
-    <w:p>
-      <w:pPr>
-        <w:pStyle w:val="Body-Text"/>
-      </w:pPr>
-      <w:r>
-        <w:t xml:space="preserve">The Tax </w:t>
-      </w:r>
-      <w:r>
-        <w:t>Return Calculator</w:t>
-      </w:r>
-      <w:r>
-        <w:t xml:space="preserve"> tool created a new problem. In that tool, you can enter just about any value in any field of any form. Any fields that do not have an entry will be calculated according to the rules for that form.</w:t>
-      </w:r>
-      <w:r>
-        <w:t xml:space="preserve"> Now, a field where you enter zero (0) means that you want it to stay zero (0) and not be calculated. Thus, an explicitly entered zero (0) and a default value of zero (0) are treated differently. Therefore, when removing a value from a field, delete the entry rather than replacing the old value with zero (0). A field that does not have an entry will display the default value in gray characters. A field where you have entered a value will display the value in dark characters.</w:t>
-      </w:r>
-    </w:p>
-    <w:p>
-      <w:pPr>
-        <w:pStyle w:val="Heading2"/>
-      </w:pPr>
-      <w:bookmarkStart w:id="10" w:name="_Toc239272556"/>
-      <w:r>
-        <w:t xml:space="preserve">Debugging </w:t>
-      </w:r>
-      <w:r>
-        <w:t>Information</w:t>
-      </w:r>
-      <w:bookmarkEnd w:id="9"/>
-      <w:bookmarkEnd w:id="10"/>
-    </w:p>
-    <w:p>
-      <w:pPr>
-        <w:pStyle w:val="Body-Text"/>
-      </w:pPr>
-      <w:r>
         <w:t>Some of the tools can display additional information that shows internal calculations</w:t>
       </w:r>
       <w:r>
@@ -1762,11 +2013,7 @@
         <w:t xml:space="preserve"> you can enter one of several keywords </w:t>
       </w:r>
       <w:r>
-        <w:t xml:space="preserve">in any input field. The keywords are not case-sensitive </w:t>
-      </w:r>
-      <w:r>
-        <w:lastRenderedPageBreak/>
-        <w:t>and can be entered in any order. Separate the input value and one or more keywords using commas or whitespace.</w:t>
+        <w:t>in any input field. The keywords are not case-sensitive and can be entered in any order. Separate the input value and one or more keywords using commas or whitespace.</w:t>
       </w:r>
     </w:p>
     <w:p>
@@ -1987,14 +2234,14 @@
       </w:pPr>
       <w:bookmarkStart w:id="11" w:name="_Toc228630163"/>
       <w:bookmarkStart w:id="12" w:name="_Toc231285049"/>
-      <w:bookmarkStart w:id="13" w:name="_Toc239272557"/>
-      <w:bookmarkStart w:id="14" w:name="_Toc228630161"/>
+      <w:bookmarkStart w:id="13" w:name="_Toc228630161"/>
+      <w:bookmarkStart w:id="14" w:name="_Toc241654059"/>
       <w:r>
         <w:t>Version Numbers</w:t>
       </w:r>
       <w:bookmarkEnd w:id="11"/>
       <w:bookmarkEnd w:id="12"/>
-      <w:bookmarkEnd w:id="13"/>
+      <w:bookmarkEnd w:id="14"/>
     </w:p>
     <w:p>
       <w:pPr>
@@ -2210,21 +2457,23 @@
       <w:pPr>
         <w:pStyle w:val="Heading1"/>
       </w:pPr>
-      <w:bookmarkStart w:id="15" w:name="_Toc239272558"/>
-      <w:bookmarkStart w:id="16" w:name="_Toc231285050"/>
-      <w:r>
+      <w:bookmarkStart w:id="15" w:name="_Toc231285050"/>
+      <w:bookmarkStart w:id="16" w:name="_Toc241654060"/>
+      <w:r>
+        <w:lastRenderedPageBreak/>
         <w:t>Issues, Limitations, and Known Problems</w:t>
       </w:r>
-      <w:bookmarkEnd w:id="15"/>
+      <w:bookmarkEnd w:id="16"/>
     </w:p>
     <w:p>
       <w:pPr>
         <w:pStyle w:val="Heading3"/>
       </w:pPr>
-      <w:bookmarkStart w:id="17" w:name="_Toc239272559"/>
+      <w:bookmarkStart w:id="17" w:name="_Toc241654061"/>
       <w:r>
         <w:t>General Issues</w:t>
       </w:r>
+      <w:bookmarkEnd w:id="17"/>
     </w:p>
     <w:p>
       <w:pPr>
@@ -2245,7 +2494,6 @@
         <w:pStyle w:val="List-Bullet025"/>
       </w:pPr>
       <w:r>
-        <w:lastRenderedPageBreak/>
         <w:t>If an input field is modified internally, should the input field be updated so the user can see the corrected value?</w:t>
       </w:r>
     </w:p>
@@ -2269,10 +2517,11 @@
       <w:pPr>
         <w:pStyle w:val="Heading3"/>
       </w:pPr>
+      <w:bookmarkStart w:id="18" w:name="_Toc241654062"/>
       <w:r>
         <w:t>California Sales Tax Calculator and California Sales Tax Deduction Calculator</w:t>
       </w:r>
-      <w:bookmarkEnd w:id="17"/>
+      <w:bookmarkEnd w:id="18"/>
     </w:p>
     <w:p>
       <w:pPr>
@@ -2286,11 +2535,11 @@
       <w:pPr>
         <w:pStyle w:val="Heading3"/>
       </w:pPr>
-      <w:bookmarkStart w:id="18" w:name="_Toc239272560"/>
+      <w:bookmarkStart w:id="19" w:name="_Toc241654063"/>
       <w:r>
         <w:t>Estimated Tax Calculator (Federal)</w:t>
       </w:r>
-      <w:bookmarkEnd w:id="18"/>
+      <w:bookmarkEnd w:id="19"/>
     </w:p>
     <w:p>
       <w:pPr>
@@ -2328,10 +2577,11 @@
       <w:pPr>
         <w:pStyle w:val="Heading3"/>
       </w:pPr>
-      <w:bookmarkStart w:id="19" w:name="_Toc239272561"/>
+      <w:bookmarkStart w:id="20" w:name="_Toc241654064"/>
       <w:r>
         <w:t>Simple Math Calculator</w:t>
       </w:r>
+      <w:bookmarkEnd w:id="20"/>
     </w:p>
     <w:p>
       <w:pPr>
@@ -2348,10 +2598,11 @@
       <w:pPr>
         <w:pStyle w:val="Heading3"/>
       </w:pPr>
+      <w:bookmarkStart w:id="21" w:name="_Toc241654065"/>
       <w:r>
         <w:t>Small Business Tax Calculator</w:t>
       </w:r>
-      <w:bookmarkEnd w:id="19"/>
+      <w:bookmarkEnd w:id="21"/>
     </w:p>
     <w:p>
       <w:pPr>
@@ -2397,11 +2648,11 @@
       <w:pPr>
         <w:pStyle w:val="Heading3"/>
       </w:pPr>
-      <w:bookmarkStart w:id="20" w:name="_Toc239272562"/>
+      <w:bookmarkStart w:id="22" w:name="_Toc241654066"/>
       <w:r>
         <w:t>Social Security - Taxable Benefits Calculator</w:t>
       </w:r>
-      <w:bookmarkEnd w:id="20"/>
+      <w:bookmarkEnd w:id="22"/>
     </w:p>
     <w:p>
       <w:pPr>
@@ -2423,11 +2674,11 @@
       <w:pPr>
         <w:pStyle w:val="Heading3"/>
       </w:pPr>
-      <w:bookmarkStart w:id="21" w:name="_Toc239272563"/>
+      <w:bookmarkStart w:id="23" w:name="_Toc241654067"/>
       <w:r>
         <w:t>Social Security Lump Sum Calculator</w:t>
       </w:r>
-      <w:bookmarkEnd w:id="21"/>
+      <w:bookmarkEnd w:id="23"/>
     </w:p>
     <w:p>
       <w:pPr>
@@ -2465,11 +2716,11 @@
       <w:pPr>
         <w:pStyle w:val="Heading3"/>
       </w:pPr>
-      <w:bookmarkStart w:id="22" w:name="_Toc239272564"/>
+      <w:bookmarkStart w:id="24" w:name="_Toc241654068"/>
       <w:r>
         <w:t>State Tax Refund Calculator</w:t>
       </w:r>
-      <w:bookmarkEnd w:id="22"/>
+      <w:bookmarkEnd w:id="24"/>
     </w:p>
     <w:p>
       <w:pPr>
@@ -2483,9 +2734,11 @@
       <w:pPr>
         <w:pStyle w:val="Heading3"/>
       </w:pPr>
+      <w:bookmarkStart w:id="25" w:name="_Toc241654069"/>
       <w:r>
         <w:t>Tax Return Calculator</w:t>
       </w:r>
+      <w:bookmarkEnd w:id="25"/>
     </w:p>
     <w:p>
       <w:pPr>
@@ -2498,19 +2751,7 @@
         <w:rPr>
           <w:lang w:eastAsia="ar-SA"/>
         </w:rPr>
-        <w:t xml:space="preserve">This is a list of issues with </w:t>
-      </w:r>
-      <w:r>
-        <w:rPr>
-          <w:lang w:eastAsia="ar-SA"/>
-        </w:rPr>
-        <w:t>the Tax Return Calculator</w:t>
-      </w:r>
-      <w:r>
-        <w:rPr>
-          <w:lang w:eastAsia="ar-SA"/>
-        </w:rPr>
-        <w:t xml:space="preserve"> that are closer to defects than missing features.</w:t>
+        <w:t>This is a list of issues with the Tax Return Calculator that are closer to defects than missing features.</w:t>
       </w:r>
     </w:p>
     <w:p>
@@ -2532,56 +2773,23 @@
         <w:pStyle w:val="List-Bullet-tight025"/>
       </w:pPr>
       <w:r>
-        <w:t xml:space="preserve">Write </w:t>
+        <w:lastRenderedPageBreak/>
+        <w:t>For each tax form, initially move the cursor to an appropriate field.</w:t>
+      </w:r>
+    </w:p>
+    <w:p>
+      <w:pPr>
+        <w:pStyle w:val="List-Bullet-tight025"/>
+      </w:pPr>
+      <w:r>
+        <w:t xml:space="preserve">In </w:t>
       </w:r>
       <w:proofErr w:type="spellStart"/>
-      <w:proofErr w:type="gramStart"/>
-      <w:r>
-        <w:t>saveFields</w:t>
+      <w:r>
+        <w:t>TaxProgram</w:t>
       </w:r>
       <w:proofErr w:type="spellEnd"/>
       <w:r>
-        <w:t>(</w:t>
-      </w:r>
-      <w:proofErr w:type="gramEnd"/>
-      <w:r>
-        <w:t xml:space="preserve">) and </w:t>
-      </w:r>
-      <w:proofErr w:type="spellStart"/>
-      <w:proofErr w:type="gramStart"/>
-      <w:r>
-        <w:t>restoreFields</w:t>
-      </w:r>
-      <w:proofErr w:type="spellEnd"/>
-      <w:r>
-        <w:t>(</w:t>
-      </w:r>
-      <w:proofErr w:type="gramEnd"/>
-      <w:r>
-        <w:t>) that copy fields from web pages without modification.</w:t>
-      </w:r>
-    </w:p>
-    <w:p>
-      <w:pPr>
-        <w:pStyle w:val="List-Bullet-tight025"/>
-      </w:pPr>
-      <w:r>
-        <w:t>For each tax form, initially move the cursor to an appropriate field.</w:t>
-      </w:r>
-    </w:p>
-    <w:p>
-      <w:pPr>
-        <w:pStyle w:val="List-Bullet-tight025"/>
-      </w:pPr>
-      <w:r>
-        <w:t xml:space="preserve">In </w:t>
-      </w:r>
-      <w:proofErr w:type="spellStart"/>
-      <w:r>
-        <w:t>TaxProgram</w:t>
-      </w:r>
-      <w:proofErr w:type="spellEnd"/>
-      <w:r>
         <w:t>, why does the cursor turn into a finger over the Restore button, but not the others?</w:t>
       </w:r>
     </w:p>
@@ -2596,11 +2804,18 @@
     <w:p>
       <w:pPr>
         <w:pStyle w:val="List-Bullet-tight025"/>
-        <w:numPr>
-          <w:ilvl w:val="0"/>
-          <w:numId w:val="0"/>
-        </w:numPr>
-      </w:pPr>
+      </w:pPr>
+      <w:r>
+        <w:t>If multiple Schedule Cs there needs to be a separate Schedule SSE for each; how are they connected?</w:t>
+      </w:r>
+    </w:p>
+    <w:p>
+      <w:pPr>
+        <w:pStyle w:val="List-Bullet-tight025"/>
+      </w:pPr>
+      <w:r>
+        <w:t>Charitable donation without itemizing (new in 2026)</w:t>
+      </w:r>
     </w:p>
     <w:p>
       <w:pPr>
@@ -2723,14 +2938,6 @@
         <w:pStyle w:val="List-Bullet-tight025"/>
       </w:pPr>
       <w:r>
-        <w:t>If multiple Schedule Cs there needs to be a separate Schedule SSE for each; how are they connected?</w:t>
-      </w:r>
-    </w:p>
-    <w:p>
-      <w:pPr>
-        <w:pStyle w:val="List-Bullet-tight025"/>
-      </w:pPr>
-      <w:r>
         <w:t>Find forms with fields that need to be negative and fix</w:t>
       </w:r>
       <w:r>
@@ -2750,7 +2957,10 @@
         <w:pStyle w:val="List-Bullet-tight025"/>
       </w:pPr>
       <w:r>
-        <w:t>Make sure there's a difference between not entering a value (let program calculate value), and setting it to 0. Make Save/restore conform.</w:t>
+        <w:t xml:space="preserve">Make sure there's a difference between not entering a value (let program calculate value), and setting it to 0. </w:t>
+      </w:r>
+      <w:r>
+        <w:t>Update documentation to use 0.0 instead of 0.</w:t>
       </w:r>
     </w:p>
     <w:p>
@@ -2873,22 +3083,6 @@
         <w:pStyle w:val="List-Bullet-tight025"/>
       </w:pPr>
       <w:r>
-        <w:t>Allow entry of itemized deduction for state tax due on last year's return, but paid this tax year.</w:t>
-      </w:r>
-    </w:p>
-    <w:p>
-      <w:pPr>
-        <w:pStyle w:val="List-Bullet-tight025"/>
-      </w:pPr>
-      <w:r>
-        <w:t>Charitable donation without itemizing (new in 2026)</w:t>
-      </w:r>
-    </w:p>
-    <w:p>
-      <w:pPr>
-        <w:pStyle w:val="List-Bullet-tight025"/>
-      </w:pPr>
-      <w:r>
         <w:t>Stock transactions</w:t>
       </w:r>
     </w:p>
@@ -3025,7 +3219,7 @@
       <w:pPr>
         <w:pStyle w:val="Heading2"/>
       </w:pPr>
-      <w:bookmarkStart w:id="23" w:name="_Toc239272565"/>
+      <w:bookmarkStart w:id="26" w:name="_Toc241654070"/>
       <w:r>
         <w:t>Other Tools</w:t>
       </w:r>
@@ -3035,9 +3229,9 @@
       <w:r>
         <w:t>About</w:t>
       </w:r>
-      <w:bookmarkEnd w:id="14"/>
-      <w:bookmarkEnd w:id="16"/>
-      <w:bookmarkEnd w:id="23"/>
+      <w:bookmarkEnd w:id="13"/>
+      <w:bookmarkEnd w:id="15"/>
+      <w:bookmarkEnd w:id="26"/>
     </w:p>
     <w:p>
       <w:pPr>
@@ -3093,15 +3287,15 @@
       <w:pPr>
         <w:pStyle w:val="Heading1"/>
       </w:pPr>
-      <w:bookmarkStart w:id="24" w:name="_Toc228630162"/>
-      <w:bookmarkStart w:id="25" w:name="_Toc231285051"/>
-      <w:bookmarkStart w:id="26" w:name="_Toc239272566"/>
+      <w:bookmarkStart w:id="27" w:name="_Toc228630162"/>
+      <w:bookmarkStart w:id="28" w:name="_Toc231285051"/>
+      <w:bookmarkStart w:id="29" w:name="_Toc241654071"/>
       <w:r>
         <w:t>Feedback</w:t>
       </w:r>
-      <w:bookmarkEnd w:id="24"/>
-      <w:bookmarkEnd w:id="25"/>
-      <w:bookmarkEnd w:id="26"/>
+      <w:bookmarkEnd w:id="27"/>
+      <w:bookmarkEnd w:id="28"/>
+      <w:bookmarkEnd w:id="29"/>
     </w:p>
     <w:p>
       <w:pPr>
@@ -4262,6 +4456,7 @@
   <w:style w:type="character" w:default="1" w:styleId="DefaultParagraphFont">
     <w:name w:val="Default Paragraph Font"/>
     <w:uiPriority w:val="1"/>
+    <w:semiHidden/>
     <w:unhideWhenUsed/>
   </w:style>
   <w:style w:type="table" w:default="1" w:styleId="TableNormal">

</xml_diff>

<commit_message>
Update issues and problems section.
</commit_message>
<xml_diff>
--- a/Documentation/AboutTAXTools.docx
+++ b/Documentation/AboutTAXTools.docx
@@ -1,6 +1,6 @@
 
 <file path=word/document.xml><?xml version="1.0" encoding="utf-8"?>
-<w:document xmlns:wpc="http://schemas.microsoft.com/office/word/2010/wordprocessingCanvas" xmlns:cx="http://schemas.microsoft.com/office/drawing/2014/chartex" xmlns:cx1="http://schemas.microsoft.com/office/drawing/2015/9/8/chartex" xmlns:cx2="http://schemas.microsoft.com/office/drawing/2015/10/21/chartex" xmlns:cx3="http://schemas.microsoft.com/office/drawing/2016/5/9/chartex" xmlns:cx4="http://schemas.microsoft.com/office/drawing/2016/5/10/chartex" xmlns:cx5="http://schemas.microsoft.com/office/drawing/2016/5/11/chartex" xmlns:cx6="http://schemas.microsoft.com/office/drawing/2016/5/12/chartex" xmlns:cx7="http://schemas.microsoft.com/office/drawing/2016/5/13/chartex" xmlns:cx8="http://schemas.microsoft.com/office/drawing/2016/5/14/chartex" xmlns:mc="http://schemas.openxmlformats.org/markup-compatibility/2006" xmlns:aink="http://schemas.microsoft.com/office/drawing/2016/ink" xmlns:am3d="http://schemas.microsoft.com/office/drawing/2017/model3d" xmlns:o="urn:schemas-microsoft-com:office:office" xmlns:oel="http://schemas.microsoft.com/office/2019/extlst" xmlns:r="http://schemas.openxmlformats.org/officeDocument/2006/relationships" xmlns:m="http://schemas.openxmlformats.org/officeDocument/2006/math" xmlns:v="urn:schemas-microsoft-com:vml" xmlns:wp14="http://schemas.microsoft.com/office/word/2010/wordprocessingDrawing" xmlns:wp="http://schemas.openxmlformats.org/drawingml/2006/wordprocessingDrawing" xmlns:w10="urn:schemas-microsoft-com:office:word" xmlns:w="http://schemas.openxmlformats.org/wordprocessingml/2006/main" xmlns:w14="http://schemas.microsoft.com/office/word/2010/wordml" xmlns:w15="http://schemas.microsoft.com/office/word/2012/wordml" xmlns:w16cex="http://schemas.microsoft.com/office/word/2018/wordml/cex" xmlns:w16cid="http://schemas.microsoft.com/office/word/2016/wordml/cid" xmlns:w16="http://schemas.microsoft.com/office/word/2018/wordml" xmlns:w16du="http://schemas.microsoft.com/office/word/2023/wordml/word16du" xmlns:w16sdtdh="http://schemas.microsoft.com/office/word/2020/wordml/sdtdatahash" xmlns:w16sdtfl="http://schemas.microsoft.com/office/word/2024/wordml/sdtformatlock" xmlns:w16se="http://schemas.microsoft.com/office/word/2015/wordml/symex" xmlns:wpg="http://schemas.microsoft.com/office/word/2010/wordprocessingGroup" xmlns:wpi="http://schemas.microsoft.com/office/word/2010/wordprocessingInk" xmlns:wne="http://schemas.microsoft.com/office/word/2006/wordml" xmlns:wps="http://schemas.microsoft.com/office/word/2010/wordprocessingShape" mc:Ignorable="w14 w15 w16se w16cid w16 w16cex w16sdtdh w16sdtfl w16du wp14">
+<w:document xmlns:ve="http://schemas.openxmlformats.org/markup-compatibility/2006" xmlns:o="urn:schemas-microsoft-com:office:office" xmlns:r="http://schemas.openxmlformats.org/officeDocument/2006/relationships" xmlns:m="http://schemas.openxmlformats.org/officeDocument/2006/math" xmlns:v="urn:schemas-microsoft-com:vml" xmlns:wp="http://schemas.openxmlformats.org/drawingml/2006/wordprocessingDrawing" xmlns:w10="urn:schemas-microsoft-com:office:word" xmlns:w="http://schemas.openxmlformats.org/wordprocessingml/2006/main" xmlns:wne="http://schemas.microsoft.com/office/word/2006/wordml">
   <w:body>
     <w:p>
       <w:pPr>
@@ -47,7 +47,7 @@
         <w:rPr>
           <w:noProof/>
         </w:rPr>
-        <w:t>September 30, 2026</w:t>
+        <w:t>October 1, 2026</w:t>
       </w:r>
       <w:r>
         <w:rPr>
@@ -113,11 +113,9 @@
             <w:rPr>
               <w:rFonts w:asciiTheme="minorHAnsi" w:eastAsiaTheme="minorEastAsia" w:hAnsiTheme="minorHAnsi" w:cstheme="minorBidi"/>
               <w:b w:val="0"/>
-              <w:kern w:val="2"/>
-              <w:sz w:val="24"/>
-              <w:szCs w:val="24"/>
+              <w:sz w:val="22"/>
+              <w:szCs w:val="22"/>
               <w:lang w:eastAsia="en-US"/>
-              <w14:ligatures w14:val="standardContextual"/>
             </w:rPr>
           </w:pPr>
           <w:r>
@@ -129,7 +127,7 @@
           <w:r>
             <w:fldChar w:fldCharType="separate"/>
           </w:r>
-          <w:hyperlink w:anchor="_Toc241654053" w:history="1">
+          <w:hyperlink w:anchor="_Toc241737368" w:history="1">
             <w:r>
               <w:rPr>
                 <w:rStyle w:val="Hyperlink"/>
@@ -152,7 +150,7 @@
               <w:rPr>
                 <w:webHidden/>
               </w:rPr>
-              <w:instrText xml:space="preserve"> PAGEREF _Toc241654053 \h </w:instrText>
+              <w:instrText xml:space="preserve"> PAGEREF _Toc241737368 \h </w:instrText>
             </w:r>
             <w:r>
               <w:rPr>
@@ -185,14 +183,12 @@
             <w:rPr>
               <w:rFonts w:asciiTheme="minorHAnsi" w:eastAsiaTheme="minorEastAsia" w:hAnsiTheme="minorHAnsi" w:cstheme="minorBidi"/>
               <w:b w:val="0"/>
-              <w:kern w:val="2"/>
-              <w:sz w:val="24"/>
-              <w:szCs w:val="24"/>
+              <w:sz w:val="22"/>
+              <w:szCs w:val="22"/>
               <w:lang w:eastAsia="en-US"/>
-              <w14:ligatures w14:val="standardContextual"/>
             </w:rPr>
           </w:pPr>
-          <w:hyperlink w:anchor="_Toc241654054" w:history="1">
+          <w:hyperlink w:anchor="_Toc241737369" w:history="1">
             <w:r>
               <w:rPr>
                 <w:rStyle w:val="Hyperlink"/>
@@ -215,7 +211,7 @@
               <w:rPr>
                 <w:webHidden/>
               </w:rPr>
-              <w:instrText xml:space="preserve"> PAGEREF _Toc241654054 \h </w:instrText>
+              <w:instrText xml:space="preserve"> PAGEREF _Toc241737369 \h </w:instrText>
             </w:r>
             <w:r>
               <w:rPr>
@@ -248,14 +244,12 @@
             <w:rPr>
               <w:rFonts w:asciiTheme="minorHAnsi" w:eastAsiaTheme="minorEastAsia" w:hAnsiTheme="minorHAnsi" w:cstheme="minorBidi"/>
               <w:noProof/>
-              <w:kern w:val="2"/>
-              <w:sz w:val="24"/>
-              <w:szCs w:val="24"/>
+              <w:sz w:val="22"/>
+              <w:szCs w:val="22"/>
               <w:lang w:eastAsia="en-US"/>
-              <w14:ligatures w14:val="standardContextual"/>
             </w:rPr>
           </w:pPr>
-          <w:hyperlink w:anchor="_Toc241654055" w:history="1">
+          <w:hyperlink w:anchor="_Toc241737370" w:history="1">
             <w:r>
               <w:rPr>
                 <w:rStyle w:val="Hyperlink"/>
@@ -282,7 +276,7 @@
                 <w:noProof/>
                 <w:webHidden/>
               </w:rPr>
-              <w:instrText xml:space="preserve"> PAGEREF _Toc241654055 \h </w:instrText>
+              <w:instrText xml:space="preserve"> PAGEREF _Toc241737370 \h </w:instrText>
             </w:r>
             <w:r>
               <w:rPr>
@@ -319,14 +313,12 @@
             <w:rPr>
               <w:rFonts w:asciiTheme="minorHAnsi" w:eastAsiaTheme="minorEastAsia" w:hAnsiTheme="minorHAnsi" w:cstheme="minorBidi"/>
               <w:noProof/>
-              <w:kern w:val="2"/>
-              <w:sz w:val="24"/>
-              <w:szCs w:val="24"/>
+              <w:sz w:val="22"/>
+              <w:szCs w:val="22"/>
               <w:lang w:eastAsia="en-US"/>
-              <w14:ligatures w14:val="standardContextual"/>
             </w:rPr>
           </w:pPr>
-          <w:hyperlink w:anchor="_Toc241654056" w:history="1">
+          <w:hyperlink w:anchor="_Toc241737371" w:history="1">
             <w:r>
               <w:rPr>
                 <w:rStyle w:val="Hyperlink"/>
@@ -353,7 +345,7 @@
                 <w:noProof/>
                 <w:webHidden/>
               </w:rPr>
-              <w:instrText xml:space="preserve"> PAGEREF _Toc241654056 \h </w:instrText>
+              <w:instrText xml:space="preserve"> PAGEREF _Toc241737371 \h </w:instrText>
             </w:r>
             <w:r>
               <w:rPr>
@@ -390,14 +382,12 @@
             <w:rPr>
               <w:rFonts w:asciiTheme="minorHAnsi" w:eastAsiaTheme="minorEastAsia" w:hAnsiTheme="minorHAnsi" w:cstheme="minorBidi"/>
               <w:noProof/>
-              <w:kern w:val="2"/>
-              <w:sz w:val="24"/>
-              <w:szCs w:val="24"/>
+              <w:sz w:val="22"/>
+              <w:szCs w:val="22"/>
               <w:lang w:eastAsia="en-US"/>
-              <w14:ligatures w14:val="standardContextual"/>
             </w:rPr>
           </w:pPr>
-          <w:hyperlink w:anchor="_Toc241654057" w:history="1">
+          <w:hyperlink w:anchor="_Toc241737372" w:history="1">
             <w:r>
               <w:rPr>
                 <w:rStyle w:val="Hyperlink"/>
@@ -424,7 +414,7 @@
                 <w:noProof/>
                 <w:webHidden/>
               </w:rPr>
-              <w:instrText xml:space="preserve"> PAGEREF _Toc241654057 \h </w:instrText>
+              <w:instrText xml:space="preserve"> PAGEREF _Toc241737372 \h </w:instrText>
             </w:r>
             <w:r>
               <w:rPr>
@@ -461,14 +451,12 @@
             <w:rPr>
               <w:rFonts w:asciiTheme="minorHAnsi" w:eastAsiaTheme="minorEastAsia" w:hAnsiTheme="minorHAnsi" w:cstheme="minorBidi"/>
               <w:noProof/>
-              <w:kern w:val="2"/>
-              <w:sz w:val="24"/>
-              <w:szCs w:val="24"/>
+              <w:sz w:val="22"/>
+              <w:szCs w:val="22"/>
               <w:lang w:eastAsia="en-US"/>
-              <w14:ligatures w14:val="standardContextual"/>
             </w:rPr>
           </w:pPr>
-          <w:hyperlink w:anchor="_Toc241654058" w:history="1">
+          <w:hyperlink w:anchor="_Toc241737373" w:history="1">
             <w:r>
               <w:rPr>
                 <w:rStyle w:val="Hyperlink"/>
@@ -495,7 +483,7 @@
                 <w:noProof/>
                 <w:webHidden/>
               </w:rPr>
-              <w:instrText xml:space="preserve"> PAGEREF _Toc241654058 \h </w:instrText>
+              <w:instrText xml:space="preserve"> PAGEREF _Toc241737373 \h </w:instrText>
             </w:r>
             <w:r>
               <w:rPr>
@@ -532,14 +520,12 @@
             <w:rPr>
               <w:rFonts w:asciiTheme="minorHAnsi" w:eastAsiaTheme="minorEastAsia" w:hAnsiTheme="minorHAnsi" w:cstheme="minorBidi"/>
               <w:b w:val="0"/>
-              <w:kern w:val="2"/>
-              <w:sz w:val="24"/>
-              <w:szCs w:val="24"/>
+              <w:sz w:val="22"/>
+              <w:szCs w:val="22"/>
               <w:lang w:eastAsia="en-US"/>
-              <w14:ligatures w14:val="standardContextual"/>
             </w:rPr>
           </w:pPr>
-          <w:hyperlink w:anchor="_Toc241654059" w:history="1">
+          <w:hyperlink w:anchor="_Toc241737374" w:history="1">
             <w:r>
               <w:rPr>
                 <w:rStyle w:val="Hyperlink"/>
@@ -562,7 +548,7 @@
               <w:rPr>
                 <w:webHidden/>
               </w:rPr>
-              <w:instrText xml:space="preserve"> PAGEREF _Toc241654059 \h </w:instrText>
+              <w:instrText xml:space="preserve"> PAGEREF _Toc241737374 \h </w:instrText>
             </w:r>
             <w:r>
               <w:rPr>
@@ -595,14 +581,12 @@
             <w:rPr>
               <w:rFonts w:asciiTheme="minorHAnsi" w:eastAsiaTheme="minorEastAsia" w:hAnsiTheme="minorHAnsi" w:cstheme="minorBidi"/>
               <w:b w:val="0"/>
-              <w:kern w:val="2"/>
-              <w:sz w:val="24"/>
-              <w:szCs w:val="24"/>
+              <w:sz w:val="22"/>
+              <w:szCs w:val="22"/>
               <w:lang w:eastAsia="en-US"/>
-              <w14:ligatures w14:val="standardContextual"/>
             </w:rPr>
           </w:pPr>
-          <w:hyperlink w:anchor="_Toc241654060" w:history="1">
+          <w:hyperlink w:anchor="_Toc241737375" w:history="1">
             <w:r>
               <w:rPr>
                 <w:rStyle w:val="Hyperlink"/>
@@ -625,7 +609,7 @@
               <w:rPr>
                 <w:webHidden/>
               </w:rPr>
-              <w:instrText xml:space="preserve"> PAGEREF _Toc241654060 \h </w:instrText>
+              <w:instrText xml:space="preserve"> PAGEREF _Toc241737375 \h </w:instrText>
             </w:r>
             <w:r>
               <w:rPr>
@@ -658,14 +642,12 @@
             <w:rPr>
               <w:rFonts w:asciiTheme="minorHAnsi" w:eastAsiaTheme="minorEastAsia" w:hAnsiTheme="minorHAnsi" w:cstheme="minorBidi"/>
               <w:noProof/>
-              <w:kern w:val="2"/>
-              <w:sz w:val="24"/>
-              <w:szCs w:val="24"/>
+              <w:sz w:val="22"/>
+              <w:szCs w:val="22"/>
               <w:lang w:eastAsia="en-US"/>
-              <w14:ligatures w14:val="standardContextual"/>
             </w:rPr>
           </w:pPr>
-          <w:hyperlink w:anchor="_Toc241654061" w:history="1">
+          <w:hyperlink w:anchor="_Toc241737376" w:history="1">
             <w:r>
               <w:rPr>
                 <w:rStyle w:val="Hyperlink"/>
@@ -692,7 +674,7 @@
                 <w:noProof/>
                 <w:webHidden/>
               </w:rPr>
-              <w:instrText xml:space="preserve"> PAGEREF _Toc241654061 \h </w:instrText>
+              <w:instrText xml:space="preserve"> PAGEREF _Toc241737376 \h </w:instrText>
             </w:r>
             <w:r>
               <w:rPr>
@@ -729,14 +711,12 @@
             <w:rPr>
               <w:rFonts w:asciiTheme="minorHAnsi" w:eastAsiaTheme="minorEastAsia" w:hAnsiTheme="minorHAnsi" w:cstheme="minorBidi"/>
               <w:noProof/>
-              <w:kern w:val="2"/>
-              <w:sz w:val="24"/>
-              <w:szCs w:val="24"/>
+              <w:sz w:val="22"/>
+              <w:szCs w:val="22"/>
               <w:lang w:eastAsia="en-US"/>
-              <w14:ligatures w14:val="standardContextual"/>
             </w:rPr>
           </w:pPr>
-          <w:hyperlink w:anchor="_Toc241654062" w:history="1">
+          <w:hyperlink w:anchor="_Toc241737377" w:history="1">
             <w:r>
               <w:rPr>
                 <w:rStyle w:val="Hyperlink"/>
@@ -763,7 +743,7 @@
                 <w:noProof/>
                 <w:webHidden/>
               </w:rPr>
-              <w:instrText xml:space="preserve"> PAGEREF _Toc241654062 \h </w:instrText>
+              <w:instrText xml:space="preserve"> PAGEREF _Toc241737377 \h </w:instrText>
             </w:r>
             <w:r>
               <w:rPr>
@@ -800,14 +780,12 @@
             <w:rPr>
               <w:rFonts w:asciiTheme="minorHAnsi" w:eastAsiaTheme="minorEastAsia" w:hAnsiTheme="minorHAnsi" w:cstheme="minorBidi"/>
               <w:noProof/>
-              <w:kern w:val="2"/>
-              <w:sz w:val="24"/>
-              <w:szCs w:val="24"/>
+              <w:sz w:val="22"/>
+              <w:szCs w:val="22"/>
               <w:lang w:eastAsia="en-US"/>
-              <w14:ligatures w14:val="standardContextual"/>
             </w:rPr>
           </w:pPr>
-          <w:hyperlink w:anchor="_Toc241654063" w:history="1">
+          <w:hyperlink w:anchor="_Toc241737378" w:history="1">
             <w:r>
               <w:rPr>
                 <w:rStyle w:val="Hyperlink"/>
@@ -834,7 +812,7 @@
                 <w:noProof/>
                 <w:webHidden/>
               </w:rPr>
-              <w:instrText xml:space="preserve"> PAGEREF _Toc241654063 \h </w:instrText>
+              <w:instrText xml:space="preserve"> PAGEREF _Toc241737378 \h </w:instrText>
             </w:r>
             <w:r>
               <w:rPr>
@@ -871,14 +849,12 @@
             <w:rPr>
               <w:rFonts w:asciiTheme="minorHAnsi" w:eastAsiaTheme="minorEastAsia" w:hAnsiTheme="minorHAnsi" w:cstheme="minorBidi"/>
               <w:noProof/>
-              <w:kern w:val="2"/>
-              <w:sz w:val="24"/>
-              <w:szCs w:val="24"/>
+              <w:sz w:val="22"/>
+              <w:szCs w:val="22"/>
               <w:lang w:eastAsia="en-US"/>
-              <w14:ligatures w14:val="standardContextual"/>
             </w:rPr>
           </w:pPr>
-          <w:hyperlink w:anchor="_Toc241654064" w:history="1">
+          <w:hyperlink w:anchor="_Toc241737379" w:history="1">
             <w:r>
               <w:rPr>
                 <w:rStyle w:val="Hyperlink"/>
@@ -905,7 +881,7 @@
                 <w:noProof/>
                 <w:webHidden/>
               </w:rPr>
-              <w:instrText xml:space="preserve"> PAGEREF _Toc241654064 \h </w:instrText>
+              <w:instrText xml:space="preserve"> PAGEREF _Toc241737379 \h </w:instrText>
             </w:r>
             <w:r>
               <w:rPr>
@@ -942,14 +918,12 @@
             <w:rPr>
               <w:rFonts w:asciiTheme="minorHAnsi" w:eastAsiaTheme="minorEastAsia" w:hAnsiTheme="minorHAnsi" w:cstheme="minorBidi"/>
               <w:noProof/>
-              <w:kern w:val="2"/>
-              <w:sz w:val="24"/>
-              <w:szCs w:val="24"/>
+              <w:sz w:val="22"/>
+              <w:szCs w:val="22"/>
               <w:lang w:eastAsia="en-US"/>
-              <w14:ligatures w14:val="standardContextual"/>
             </w:rPr>
           </w:pPr>
-          <w:hyperlink w:anchor="_Toc241654065" w:history="1">
+          <w:hyperlink w:anchor="_Toc241737380" w:history="1">
             <w:r>
               <w:rPr>
                 <w:rStyle w:val="Hyperlink"/>
@@ -976,7 +950,7 @@
                 <w:noProof/>
                 <w:webHidden/>
               </w:rPr>
-              <w:instrText xml:space="preserve"> PAGEREF _Toc241654065 \h </w:instrText>
+              <w:instrText xml:space="preserve"> PAGEREF _Toc241737380 \h </w:instrText>
             </w:r>
             <w:r>
               <w:rPr>
@@ -1013,14 +987,12 @@
             <w:rPr>
               <w:rFonts w:asciiTheme="minorHAnsi" w:eastAsiaTheme="minorEastAsia" w:hAnsiTheme="minorHAnsi" w:cstheme="minorBidi"/>
               <w:noProof/>
-              <w:kern w:val="2"/>
-              <w:sz w:val="24"/>
-              <w:szCs w:val="24"/>
+              <w:sz w:val="22"/>
+              <w:szCs w:val="22"/>
               <w:lang w:eastAsia="en-US"/>
-              <w14:ligatures w14:val="standardContextual"/>
             </w:rPr>
           </w:pPr>
-          <w:hyperlink w:anchor="_Toc241654066" w:history="1">
+          <w:hyperlink w:anchor="_Toc241737381" w:history="1">
             <w:r>
               <w:rPr>
                 <w:rStyle w:val="Hyperlink"/>
@@ -1047,7 +1019,7 @@
                 <w:noProof/>
                 <w:webHidden/>
               </w:rPr>
-              <w:instrText xml:space="preserve"> PAGEREF _Toc241654066 \h </w:instrText>
+              <w:instrText xml:space="preserve"> PAGEREF _Toc241737381 \h </w:instrText>
             </w:r>
             <w:r>
               <w:rPr>
@@ -1084,14 +1056,12 @@
             <w:rPr>
               <w:rFonts w:asciiTheme="minorHAnsi" w:eastAsiaTheme="minorEastAsia" w:hAnsiTheme="minorHAnsi" w:cstheme="minorBidi"/>
               <w:noProof/>
-              <w:kern w:val="2"/>
-              <w:sz w:val="24"/>
-              <w:szCs w:val="24"/>
+              <w:sz w:val="22"/>
+              <w:szCs w:val="22"/>
               <w:lang w:eastAsia="en-US"/>
-              <w14:ligatures w14:val="standardContextual"/>
             </w:rPr>
           </w:pPr>
-          <w:hyperlink w:anchor="_Toc241654067" w:history="1">
+          <w:hyperlink w:anchor="_Toc241737382" w:history="1">
             <w:r>
               <w:rPr>
                 <w:rStyle w:val="Hyperlink"/>
@@ -1118,7 +1088,7 @@
                 <w:noProof/>
                 <w:webHidden/>
               </w:rPr>
-              <w:instrText xml:space="preserve"> PAGEREF _Toc241654067 \h </w:instrText>
+              <w:instrText xml:space="preserve"> PAGEREF _Toc241737382 \h </w:instrText>
             </w:r>
             <w:r>
               <w:rPr>
@@ -1155,14 +1125,12 @@
             <w:rPr>
               <w:rFonts w:asciiTheme="minorHAnsi" w:eastAsiaTheme="minorEastAsia" w:hAnsiTheme="minorHAnsi" w:cstheme="minorBidi"/>
               <w:noProof/>
-              <w:kern w:val="2"/>
-              <w:sz w:val="24"/>
-              <w:szCs w:val="24"/>
+              <w:sz w:val="22"/>
+              <w:szCs w:val="22"/>
               <w:lang w:eastAsia="en-US"/>
-              <w14:ligatures w14:val="standardContextual"/>
             </w:rPr>
           </w:pPr>
-          <w:hyperlink w:anchor="_Toc241654068" w:history="1">
+          <w:hyperlink w:anchor="_Toc241737383" w:history="1">
             <w:r>
               <w:rPr>
                 <w:rStyle w:val="Hyperlink"/>
@@ -1189,7 +1157,7 @@
                 <w:noProof/>
                 <w:webHidden/>
               </w:rPr>
-              <w:instrText xml:space="preserve"> PAGEREF _Toc241654068 \h </w:instrText>
+              <w:instrText xml:space="preserve"> PAGEREF _Toc241737383 \h </w:instrText>
             </w:r>
             <w:r>
               <w:rPr>
@@ -1226,14 +1194,12 @@
             <w:rPr>
               <w:rFonts w:asciiTheme="minorHAnsi" w:eastAsiaTheme="minorEastAsia" w:hAnsiTheme="minorHAnsi" w:cstheme="minorBidi"/>
               <w:noProof/>
-              <w:kern w:val="2"/>
-              <w:sz w:val="24"/>
-              <w:szCs w:val="24"/>
+              <w:sz w:val="22"/>
+              <w:szCs w:val="22"/>
               <w:lang w:eastAsia="en-US"/>
-              <w14:ligatures w14:val="standardContextual"/>
             </w:rPr>
           </w:pPr>
-          <w:hyperlink w:anchor="_Toc241654069" w:history="1">
+          <w:hyperlink w:anchor="_Toc241737384" w:history="1">
             <w:r>
               <w:rPr>
                 <w:rStyle w:val="Hyperlink"/>
@@ -1260,7 +1226,7 @@
                 <w:noProof/>
                 <w:webHidden/>
               </w:rPr>
-              <w:instrText xml:space="preserve"> PAGEREF _Toc241654069 \h </w:instrText>
+              <w:instrText xml:space="preserve"> PAGEREF _Toc241737384 \h </w:instrText>
             </w:r>
             <w:r>
               <w:rPr>
@@ -1297,14 +1263,12 @@
             <w:rPr>
               <w:rFonts w:asciiTheme="minorHAnsi" w:eastAsiaTheme="minorEastAsia" w:hAnsiTheme="minorHAnsi" w:cstheme="minorBidi"/>
               <w:noProof/>
-              <w:kern w:val="2"/>
-              <w:sz w:val="24"/>
-              <w:szCs w:val="24"/>
+              <w:sz w:val="22"/>
+              <w:szCs w:val="22"/>
               <w:lang w:eastAsia="en-US"/>
-              <w14:ligatures w14:val="standardContextual"/>
             </w:rPr>
           </w:pPr>
-          <w:hyperlink w:anchor="_Toc241654070" w:history="1">
+          <w:hyperlink w:anchor="_Toc241737385" w:history="1">
             <w:r>
               <w:rPr>
                 <w:rStyle w:val="Hyperlink"/>
@@ -1331,7 +1295,7 @@
                 <w:noProof/>
                 <w:webHidden/>
               </w:rPr>
-              <w:instrText xml:space="preserve"> PAGEREF _Toc241654070 \h </w:instrText>
+              <w:instrText xml:space="preserve"> PAGEREF _Toc241737385 \h </w:instrText>
             </w:r>
             <w:r>
               <w:rPr>
@@ -1368,14 +1332,12 @@
             <w:rPr>
               <w:rFonts w:asciiTheme="minorHAnsi" w:eastAsiaTheme="minorEastAsia" w:hAnsiTheme="minorHAnsi" w:cstheme="minorBidi"/>
               <w:b w:val="0"/>
-              <w:kern w:val="2"/>
-              <w:sz w:val="24"/>
-              <w:szCs w:val="24"/>
+              <w:sz w:val="22"/>
+              <w:szCs w:val="22"/>
               <w:lang w:eastAsia="en-US"/>
-              <w14:ligatures w14:val="standardContextual"/>
             </w:rPr>
           </w:pPr>
-          <w:hyperlink w:anchor="_Toc241654071" w:history="1">
+          <w:hyperlink w:anchor="_Toc241737386" w:history="1">
             <w:r>
               <w:rPr>
                 <w:rStyle w:val="Hyperlink"/>
@@ -1398,7 +1360,7 @@
               <w:rPr>
                 <w:webHidden/>
               </w:rPr>
-              <w:instrText xml:space="preserve"> PAGEREF _Toc241654071 \h </w:instrText>
+              <w:instrText xml:space="preserve"> PAGEREF _Toc241737386 \h </w:instrText>
             </w:r>
             <w:r>
               <w:rPr>
@@ -1442,7 +1404,7 @@
         <w:pStyle w:val="Heading1"/>
         <w:ind w:left="0" w:firstLine="0"/>
       </w:pPr>
-      <w:bookmarkStart w:id="0" w:name="_Toc241654053"/>
+      <w:bookmarkStart w:id="0" w:name="_Toc241737368"/>
       <w:r>
         <w:t>Introduction</w:t>
       </w:r>
@@ -1705,15 +1667,7 @@
         <w:t xml:space="preserve"> is, the more accurate </w:t>
       </w:r>
       <w:r>
-        <w:t xml:space="preserve">the calculation will be. A typical way to use these tools </w:t>
-      </w:r>
-      <w:proofErr w:type="gramStart"/>
-      <w:r>
-        <w:t>is</w:t>
-      </w:r>
-      <w:proofErr w:type="gramEnd"/>
-      <w:r>
-        <w:t xml:space="preserve"> to enter the information as accurately as possible</w:t>
+        <w:t>the calculation will be. A typical way to use these tools is to enter the information as accurately as possible</w:t>
       </w:r>
       <w:r>
         <w:t xml:space="preserve"> (for example, from last year’s </w:t>
@@ -1777,7 +1731,7 @@
         <w:pStyle w:val="Heading1"/>
       </w:pPr>
       <w:bookmarkStart w:id="2" w:name="_Toc231285045"/>
-      <w:bookmarkStart w:id="3" w:name="_Toc241654054"/>
+      <w:bookmarkStart w:id="3" w:name="_Toc241737369"/>
       <w:r>
         <w:t>Interface</w:t>
       </w:r>
@@ -1835,7 +1789,7 @@
         <w:pStyle w:val="Heading2"/>
       </w:pPr>
       <w:bookmarkStart w:id="4" w:name="_Toc231285046"/>
-      <w:bookmarkStart w:id="5" w:name="_Toc241654055"/>
+      <w:bookmarkStart w:id="5" w:name="_Toc241737370"/>
       <w:r>
         <w:t>Tooltips</w:t>
       </w:r>
@@ -1864,7 +1818,7 @@
         <w:pStyle w:val="Heading2"/>
       </w:pPr>
       <w:bookmarkStart w:id="6" w:name="_Toc231285047"/>
-      <w:bookmarkStart w:id="7" w:name="_Toc241654056"/>
+      <w:bookmarkStart w:id="7" w:name="_Toc241737371"/>
       <w:r>
         <w:t xml:space="preserve">Numeric </w:t>
       </w:r>
@@ -1945,7 +1899,7 @@
         <w:pStyle w:val="Heading2"/>
       </w:pPr>
       <w:bookmarkStart w:id="8" w:name="_Toc231285048"/>
-      <w:bookmarkStart w:id="9" w:name="_Toc241654057"/>
+      <w:bookmarkStart w:id="9" w:name="_Toc241737372"/>
       <w:r>
         <w:t>Default Values</w:t>
       </w:r>
@@ -1955,8 +1909,13 @@
       <w:pPr>
         <w:pStyle w:val="Body-Text"/>
       </w:pPr>
-      <w:r>
-        <w:t>When a field expecting a numeric value is left blank, its value defaults to zero (0). When you enter a value in a field, that value will be used in any calculation even if the tool calculates a different value for that field. Most of the time, this behavior is what you expect to happen</w:t>
+      <w:proofErr w:type="gramStart"/>
+      <w:r>
+        <w:t>When a field expecting a numeric value is left blank, its value defaults to zero (0).</w:t>
+      </w:r>
+      <w:proofErr w:type="gramEnd"/>
+      <w:r>
+        <w:t xml:space="preserve"> When you enter a value in a field, that value will be used in any calculation even if the tool calculates a different value for that field. Most of the time, this behavior is what you expect to happen</w:t>
       </w:r>
       <w:r>
         <w:t>; after all, if you enter a value, you expect it to be used.</w:t>
@@ -1983,7 +1942,7 @@
       <w:pPr>
         <w:pStyle w:val="Heading2"/>
       </w:pPr>
-      <w:bookmarkStart w:id="10" w:name="_Toc241654058"/>
+      <w:bookmarkStart w:id="10" w:name="_Toc241737373"/>
       <w:r>
         <w:lastRenderedPageBreak/>
         <w:t xml:space="preserve">Debugging </w:t>
@@ -2002,15 +1961,7 @@
         <w:t>Some of the tools can display additional information that shows internal calculations</w:t>
       </w:r>
       <w:r>
-        <w:t xml:space="preserve">. To see the additional </w:t>
-      </w:r>
-      <w:proofErr w:type="gramStart"/>
-      <w:r>
-        <w:t>information</w:t>
-      </w:r>
-      <w:proofErr w:type="gramEnd"/>
-      <w:r>
-        <w:t xml:space="preserve"> you can enter one of several keywords </w:t>
+        <w:t xml:space="preserve">. To see the additional information you can enter one of several keywords </w:t>
       </w:r>
       <w:r>
         <w:t>in any input field. The keywords are not case-sensitive and can be entered in any order. Separate the input value and one or more keywords using commas or whitespace.</w:t>
@@ -2235,7 +2186,7 @@
       <w:bookmarkStart w:id="11" w:name="_Toc228630163"/>
       <w:bookmarkStart w:id="12" w:name="_Toc231285049"/>
       <w:bookmarkStart w:id="13" w:name="_Toc228630161"/>
-      <w:bookmarkStart w:id="14" w:name="_Toc241654059"/>
+      <w:bookmarkStart w:id="14" w:name="_Toc241737374"/>
       <w:r>
         <w:t>Version Numbers</w:t>
       </w:r>
@@ -2320,30 +2271,126 @@
         <w:t xml:space="preserve">the </w:t>
       </w:r>
       <w:r>
-        <w:t xml:space="preserve">tools </w:t>
+        <w:t>tools are</w:t>
+      </w:r>
+      <w:r>
+        <w:t xml:space="preserve"> released. There are always two versions of </w:t>
+      </w:r>
+      <w:r>
+        <w:t xml:space="preserve">the </w:t>
+      </w:r>
+      <w:r>
+        <w:t>t</w:t>
+      </w:r>
+      <w:r>
+        <w:t xml:space="preserve">ools: the released version and a </w:t>
+      </w:r>
+      <w:r>
+        <w:t>development</w:t>
+      </w:r>
+      <w:r>
+        <w:t xml:space="preserve"> version. The second part of the version number starts at 00 for the released version and 01 for the development version. Whenever the development version is merged into the released version, the second part of the version number is incremented by two in both versions. Thus, the second part of the version number in a released version is always and even number, and in the development version, it is an odd number that is one greater than the released version.</w:t>
+      </w:r>
+    </w:p>
+    <w:p>
+      <w:pPr>
+        <w:pStyle w:val="Body-Text"/>
+      </w:pPr>
+      <w:r>
+        <w:t xml:space="preserve">The third part of the version number starts at 000 and is incremented for each change. This part of the version number is </w:t>
+      </w:r>
+      <w:r>
+        <w:t>rarely</w:t>
+      </w:r>
+      <w:r>
+        <w:t xml:space="preserve"> used in the released version of </w:t>
+      </w:r>
+      <w:r>
+        <w:t xml:space="preserve">the </w:t>
+      </w:r>
+      <w:r>
+        <w:t>t</w:t>
+      </w:r>
+      <w:r>
+        <w:t>ools</w:t>
+      </w:r>
+      <w:r>
+        <w:t>.</w:t>
+      </w:r>
+    </w:p>
+    <w:p>
+      <w:pPr>
+        <w:pStyle w:val="Body-Text"/>
+      </w:pPr>
+      <w:r>
+        <w:t>In summary:</w:t>
+      </w:r>
+    </w:p>
+    <w:p>
+      <w:pPr>
+        <w:pStyle w:val="List-Bullet025"/>
+      </w:pPr>
+      <w:r>
+        <w:t>The first part of the version number is incremented each tax year.</w:t>
+      </w:r>
+    </w:p>
+    <w:p>
+      <w:pPr>
+        <w:pStyle w:val="List-Bullet025"/>
+      </w:pPr>
+      <w:r>
+        <w:t>The second part of the version number is incremented whenever the development version is merged into the released version.</w:t>
+      </w:r>
+    </w:p>
+    <w:p>
+      <w:pPr>
+        <w:pStyle w:val="List-Bullet025"/>
+      </w:pPr>
+      <w:r>
+        <w:t>And, the third part is incremented whenever the source code is changed.</w:t>
+      </w:r>
+    </w:p>
+    <w:p>
+      <w:pPr>
+        <w:pStyle w:val="Body-Text"/>
+      </w:pPr>
+      <w:r>
+        <w:t>T</w:t>
+      </w:r>
+      <w:r>
+        <w:t xml:space="preserve">he version number </w:t>
+      </w:r>
+      <w:r>
+        <w:t xml:space="preserve">of the development version is always appended with </w:t>
       </w:r>
       <w:proofErr w:type="gramStart"/>
       <w:r>
-        <w:t>are</w:t>
+        <w:t xml:space="preserve">an </w:t>
+      </w:r>
+      <w:r>
+        <w:t>at</w:t>
       </w:r>
       <w:proofErr w:type="gramEnd"/>
       <w:r>
-        <w:t xml:space="preserve"> released. There are always two versions of </w:t>
-      </w:r>
-      <w:r>
-        <w:t xml:space="preserve">the </w:t>
-      </w:r>
-      <w:r>
-        <w:t>t</w:t>
-      </w:r>
-      <w:r>
-        <w:t xml:space="preserve">ools: the released version and a </w:t>
-      </w:r>
-      <w:r>
-        <w:t>development</w:t>
-      </w:r>
-      <w:r>
-        <w:t xml:space="preserve"> version. The second part of the version number starts at 00 for the released version and 01 for the development version. Whenever the development version is merged into the released version, the second part of the version number is incremented by two in both versions. Thus, the second part of the version number in a released version is always and even number, and in the development version, it is an odd number that is one greater than the released version.</w:t>
+        <w:t xml:space="preserve"> sign (@) </w:t>
+      </w:r>
+      <w:r>
+        <w:t xml:space="preserve">to call attention to the </w:t>
+      </w:r>
+      <w:r>
+        <w:t>fact that that version</w:t>
+      </w:r>
+      <w:r>
+        <w:t xml:space="preserve"> </w:t>
+      </w:r>
+      <w:r>
+        <w:t>is under development</w:t>
+      </w:r>
+      <w:r>
+        <w:t xml:space="preserve"> and </w:t>
+      </w:r>
+      <w:r>
+        <w:t>not ready to be used.</w:t>
       </w:r>
     </w:p>
     <w:p>
@@ -2351,99 +2398,6 @@
         <w:pStyle w:val="Body-Text"/>
       </w:pPr>
       <w:r>
-        <w:t xml:space="preserve">The third part of the version number starts at 000 and is incremented for each change. This part of the version number is </w:t>
-      </w:r>
-      <w:r>
-        <w:t>rarely</w:t>
-      </w:r>
-      <w:r>
-        <w:t xml:space="preserve"> used in the released version of </w:t>
-      </w:r>
-      <w:r>
-        <w:t xml:space="preserve">the </w:t>
-      </w:r>
-      <w:r>
-        <w:t>t</w:t>
-      </w:r>
-      <w:r>
-        <w:t>ools</w:t>
-      </w:r>
-      <w:r>
-        <w:t>.</w:t>
-      </w:r>
-    </w:p>
-    <w:p>
-      <w:pPr>
-        <w:pStyle w:val="Body-Text"/>
-      </w:pPr>
-      <w:r>
-        <w:t>In summary:</w:t>
-      </w:r>
-    </w:p>
-    <w:p>
-      <w:pPr>
-        <w:pStyle w:val="List-Bullet025"/>
-      </w:pPr>
-      <w:r>
-        <w:t>The first part of the version number is incremented each tax year.</w:t>
-      </w:r>
-    </w:p>
-    <w:p>
-      <w:pPr>
-        <w:pStyle w:val="List-Bullet025"/>
-      </w:pPr>
-      <w:r>
-        <w:t>The second part of the version number is incremented whenever the development version is merged into the released version.</w:t>
-      </w:r>
-    </w:p>
-    <w:p>
-      <w:pPr>
-        <w:pStyle w:val="List-Bullet025"/>
-      </w:pPr>
-      <w:r>
-        <w:t>And, the third part is incremented whenever the source code is changed.</w:t>
-      </w:r>
-    </w:p>
-    <w:p>
-      <w:pPr>
-        <w:pStyle w:val="Body-Text"/>
-      </w:pPr>
-      <w:r>
-        <w:t>T</w:t>
-      </w:r>
-      <w:r>
-        <w:t xml:space="preserve">he version number </w:t>
-      </w:r>
-      <w:r>
-        <w:t xml:space="preserve">of the development version is always appended with an </w:t>
-      </w:r>
-      <w:r>
-        <w:t xml:space="preserve">at sign (@) </w:t>
-      </w:r>
-      <w:r>
-        <w:t xml:space="preserve">to call attention to the </w:t>
-      </w:r>
-      <w:r>
-        <w:t>fact that that version</w:t>
-      </w:r>
-      <w:r>
-        <w:t xml:space="preserve"> </w:t>
-      </w:r>
-      <w:r>
-        <w:t>is under development</w:t>
-      </w:r>
-      <w:r>
-        <w:t xml:space="preserve"> and </w:t>
-      </w:r>
-      <w:r>
-        <w:t>not ready to be used.</w:t>
-      </w:r>
-    </w:p>
-    <w:p>
-      <w:pPr>
-        <w:pStyle w:val="Body-Text"/>
-      </w:pPr>
-      <w:r>
         <w:t>Whenever the version number is shown in one of the tools, it is a link that you can click</w:t>
       </w:r>
       <w:r>
@@ -2458,7 +2412,7 @@
         <w:pStyle w:val="Heading1"/>
       </w:pPr>
       <w:bookmarkStart w:id="15" w:name="_Toc231285050"/>
-      <w:bookmarkStart w:id="16" w:name="_Toc241654060"/>
+      <w:bookmarkStart w:id="16" w:name="_Toc241737375"/>
       <w:r>
         <w:lastRenderedPageBreak/>
         <w:t>Issues, Limitations, and Known Problems</w:t>
@@ -2469,7 +2423,7 @@
       <w:pPr>
         <w:pStyle w:val="Heading3"/>
       </w:pPr>
-      <w:bookmarkStart w:id="17" w:name="_Toc241654061"/>
+      <w:bookmarkStart w:id="17" w:name="_Toc241737376"/>
       <w:r>
         <w:t>General Issues</w:t>
       </w:r>
@@ -2510,14 +2464,22 @@
         <w:pStyle w:val="List-Bullet025"/>
       </w:pPr>
       <w:r>
-        <w:t>Convert CamelCase IDs in HTML to kebab-case.</w:t>
+        <w:t xml:space="preserve">Convert </w:t>
+      </w:r>
+      <w:proofErr w:type="spellStart"/>
+      <w:r>
+        <w:t>CamelCase</w:t>
+      </w:r>
+      <w:proofErr w:type="spellEnd"/>
+      <w:r>
+        <w:t xml:space="preserve"> IDs in HTML to kebab-case.</w:t>
       </w:r>
     </w:p>
     <w:p>
       <w:pPr>
         <w:pStyle w:val="Heading3"/>
       </w:pPr>
-      <w:bookmarkStart w:id="18" w:name="_Toc241654062"/>
+      <w:bookmarkStart w:id="18" w:name="_Toc241737377"/>
       <w:r>
         <w:t>California Sales Tax Calculator and California Sales Tax Deduction Calculator</w:t>
       </w:r>
@@ -2535,7 +2497,7 @@
       <w:pPr>
         <w:pStyle w:val="Heading3"/>
       </w:pPr>
-      <w:bookmarkStart w:id="19" w:name="_Toc241654063"/>
+      <w:bookmarkStart w:id="19" w:name="_Toc241737378"/>
       <w:r>
         <w:t>Estimated Tax Calculator (Federal)</w:t>
       </w:r>
@@ -2577,7 +2539,7 @@
       <w:pPr>
         <w:pStyle w:val="Heading3"/>
       </w:pPr>
-      <w:bookmarkStart w:id="20" w:name="_Toc241654064"/>
+      <w:bookmarkStart w:id="20" w:name="_Toc241737379"/>
       <w:r>
         <w:t>Simple Math Calculator</w:t>
       </w:r>
@@ -2598,7 +2560,7 @@
       <w:pPr>
         <w:pStyle w:val="Heading3"/>
       </w:pPr>
-      <w:bookmarkStart w:id="21" w:name="_Toc241654065"/>
+      <w:bookmarkStart w:id="21" w:name="_Toc241737380"/>
       <w:r>
         <w:t>Small Business Tax Calculator</w:t>
       </w:r>
@@ -2648,7 +2610,7 @@
       <w:pPr>
         <w:pStyle w:val="Heading3"/>
       </w:pPr>
-      <w:bookmarkStart w:id="22" w:name="_Toc241654066"/>
+      <w:bookmarkStart w:id="22" w:name="_Toc241737381"/>
       <w:r>
         <w:t>Social Security - Taxable Benefits Calculator</w:t>
       </w:r>
@@ -2674,7 +2636,7 @@
       <w:pPr>
         <w:pStyle w:val="Heading3"/>
       </w:pPr>
-      <w:bookmarkStart w:id="23" w:name="_Toc241654067"/>
+      <w:bookmarkStart w:id="23" w:name="_Toc241737382"/>
       <w:r>
         <w:t>Social Security Lump Sum Calculator</w:t>
       </w:r>
@@ -2701,22 +2663,14 @@
         <w:pStyle w:val="List-Bullet-tight025"/>
       </w:pPr>
       <w:r>
-        <w:t xml:space="preserve">If you are filing Married Filing Separately and you lived with your spouse at </w:t>
-      </w:r>
-      <w:proofErr w:type="spellStart"/>
-      <w:r>
-        <w:t>anytime</w:t>
-      </w:r>
-      <w:proofErr w:type="spellEnd"/>
-      <w:r>
-        <w:t xml:space="preserve"> during the tax year, do not use this tool; the taxable percentage of your Social Security is 85%.</w:t>
+        <w:t>If you are filing Married Filing Separately and you lived with your spouse at anytime during the tax year, do not use this tool; the taxable percentage of your Social Security is 85%.</w:t>
       </w:r>
     </w:p>
     <w:p>
       <w:pPr>
         <w:pStyle w:val="Heading3"/>
       </w:pPr>
-      <w:bookmarkStart w:id="24" w:name="_Toc241654068"/>
+      <w:bookmarkStart w:id="24" w:name="_Toc241737383"/>
       <w:r>
         <w:t>State Tax Refund Calculator</w:t>
       </w:r>
@@ -2734,7 +2688,7 @@
       <w:pPr>
         <w:pStyle w:val="Heading3"/>
       </w:pPr>
-      <w:bookmarkStart w:id="25" w:name="_Toc241654069"/>
+      <w:bookmarkStart w:id="25" w:name="_Toc241737384"/>
       <w:r>
         <w:t>Tax Return Calculator</w:t>
       </w:r>
@@ -2756,25 +2710,20 @@
     </w:p>
     <w:p>
       <w:pPr>
-        <w:pStyle w:val="Body-Text"/>
-        <w:rPr>
-          <w:lang w:eastAsia="ar-SA"/>
-        </w:rPr>
-      </w:pPr>
-      <w:r>
-        <w:rPr>
-          <w:lang w:eastAsia="ar-SA"/>
-        </w:rPr>
-        <w:t>Top of the List</w:t>
-      </w:r>
-    </w:p>
-    <w:p>
-      <w:pPr>
         <w:pStyle w:val="List-Bullet-tight025"/>
       </w:pPr>
       <w:r>
         <w:lastRenderedPageBreak/>
-        <w:t>For each tax form, initially move the cursor to an appropriate field.</w:t>
+        <w:t>Get rid of minimum and maximum values for each line</w:t>
+      </w:r>
+      <w:r>
+        <w:t>, or e</w:t>
+      </w:r>
+      <w:r>
+        <w:t>nter min/max values for all the lines in forms</w:t>
+      </w:r>
+      <w:r>
+        <w:t>.</w:t>
       </w:r>
     </w:p>
     <w:p>
@@ -2782,15 +2731,31 @@
         <w:pStyle w:val="List-Bullet-tight025"/>
       </w:pPr>
       <w:r>
-        <w:t xml:space="preserve">In </w:t>
+        <w:t>When a field is incorrect in a saved file, restore should handle it gracefully.</w:t>
+      </w:r>
+    </w:p>
+    <w:p>
+      <w:pPr>
+        <w:pStyle w:val="List-Bullet-tight025"/>
+      </w:pPr>
+      <w:r>
+        <w:t xml:space="preserve">Should the </w:t>
       </w:r>
       <w:proofErr w:type="spellStart"/>
       <w:r>
-        <w:t>TaxProgram</w:t>
+        <w:t>TaxTable</w:t>
       </w:r>
       <w:proofErr w:type="spellEnd"/>
       <w:r>
-        <w:t>, why does the cursor turn into a finger over the Restore button, but not the others?</w:t>
+        <w:t xml:space="preserve"> functions get the taxpayer object so they do not need the </w:t>
+      </w:r>
+      <w:proofErr w:type="spellStart"/>
+      <w:r>
+        <w:t>filing_status</w:t>
+      </w:r>
+      <w:proofErr w:type="spellEnd"/>
+      <w:r>
+        <w:t xml:space="preserve"> parameter?</w:t>
       </w:r>
     </w:p>
     <w:p>
@@ -2798,7 +2763,7 @@
         <w:pStyle w:val="List-Bullet-tight025"/>
       </w:pPr>
       <w:r>
-        <w:t>Review which fields should be green on input forms.</w:t>
+        <w:t>Figure out how to recover from errors so input data is not lost.</w:t>
       </w:r>
     </w:p>
     <w:p>
@@ -2806,7 +2771,7 @@
         <w:pStyle w:val="List-Bullet-tight025"/>
       </w:pPr>
       <w:r>
-        <w:t>If multiple Schedule Cs there needs to be a separate Schedule SSE for each; how are they connected?</w:t>
+        <w:t>Find all the throw statements and improve the messages.</w:t>
       </w:r>
     </w:p>
     <w:p>
@@ -2814,29 +2779,10 @@
         <w:pStyle w:val="List-Bullet-tight025"/>
       </w:pPr>
       <w:r>
-        <w:t>Charitable donation without itemizing (new in 2026)</w:t>
-      </w:r>
-    </w:p>
-    <w:p>
-      <w:pPr>
-        <w:pStyle w:val="Body-Text"/>
-        <w:rPr>
-          <w:lang w:eastAsia="ar-SA"/>
-        </w:rPr>
-      </w:pPr>
-    </w:p>
-    <w:p>
-      <w:pPr>
-        <w:pStyle w:val="Body-Text"/>
-        <w:rPr>
-          <w:lang w:eastAsia="ar-SA"/>
-        </w:rPr>
-      </w:pPr>
-      <w:r>
-        <w:rPr>
-          <w:lang w:eastAsia="ar-SA"/>
-        </w:rPr>
-        <w:t>Rest of the list</w:t>
+        <w:t>Find forms with fields that need to be negative and fix</w:t>
+      </w:r>
+      <w:r>
+        <w:t>.</w:t>
       </w:r>
     </w:p>
     <w:p>
@@ -2844,16 +2790,7 @@
         <w:pStyle w:val="List-Bullet-tight025"/>
       </w:pPr>
       <w:r>
-        <w:t>Get rid of minimum and maximum values for each line</w:t>
-      </w:r>
-      <w:r>
-        <w:t>, or e</w:t>
-      </w:r>
-      <w:r>
-        <w:t>nter min/max values for all the lines in forms</w:t>
-      </w:r>
-      <w:r>
-        <w:t>.</w:t>
+        <w:t>Add all forms in Python tool.</w:t>
       </w:r>
     </w:p>
     <w:p>
@@ -2861,7 +2798,15 @@
         <w:pStyle w:val="List-Bullet-tight025"/>
       </w:pPr>
       <w:r>
-        <w:t>When a field is incorrect in a saved file, restore should handle it gracefully.</w:t>
+        <w:t xml:space="preserve">Get rid of </w:t>
+      </w:r>
+      <w:proofErr w:type="spellStart"/>
+      <w:r>
+        <w:t>formname</w:t>
+      </w:r>
+      <w:proofErr w:type="spellEnd"/>
+      <w:r>
+        <w:t xml:space="preserve"> inside the form.</w:t>
       </w:r>
     </w:p>
     <w:p>
@@ -2869,140 +2814,30 @@
         <w:pStyle w:val="List-Bullet-tight025"/>
       </w:pPr>
       <w:r>
-        <w:t xml:space="preserve">Should the </w:t>
+        <w:t xml:space="preserve">Merge </w:t>
       </w:r>
       <w:proofErr w:type="spellStart"/>
       <w:r>
-        <w:t>TaxTable</w:t>
+        <w:t>TaxTableTmpl</w:t>
       </w:r>
       <w:proofErr w:type="spellEnd"/>
       <w:r>
-        <w:t xml:space="preserve"> functions get the taxpayer object so they do not need the </w:t>
+        <w:t xml:space="preserve"> with TaxTable.js</w:t>
+      </w:r>
+    </w:p>
+    <w:p>
+      <w:pPr>
+        <w:pStyle w:val="List-Bullet-tight025"/>
+      </w:pPr>
+      <w:r>
+        <w:t xml:space="preserve">Write setter/getter methods for </w:t>
+      </w:r>
+      <w:proofErr w:type="gramStart"/>
+      <w:r>
+        <w:t>lines[</w:t>
       </w:r>
       <w:proofErr w:type="spellStart"/>
-      <w:r>
-        <w:t>filing_status</w:t>
-      </w:r>
-      <w:proofErr w:type="spellEnd"/>
-      <w:r>
-        <w:t xml:space="preserve"> parameter?</w:t>
-      </w:r>
-    </w:p>
-    <w:p>
-      <w:pPr>
-        <w:pStyle w:val="List-Bullet-tight025"/>
-      </w:pPr>
-      <w:r>
-        <w:t>Figure out how to recover from errors so input data is not lost.</w:t>
-      </w:r>
-    </w:p>
-    <w:p>
-      <w:pPr>
-        <w:pStyle w:val="List-Bullet-tight025"/>
-      </w:pPr>
-      <w:r>
-        <w:t xml:space="preserve">Use </w:t>
-      </w:r>
-      <w:proofErr w:type="spellStart"/>
-      <w:r>
-        <w:t>Debug.verify</w:t>
-      </w:r>
-      <w:proofErr w:type="spellEnd"/>
-      <w:r>
-        <w:t xml:space="preserve">() instead of throw. Rename to </w:t>
-      </w:r>
-      <w:proofErr w:type="spellStart"/>
-      <w:r>
-        <w:t>Ensure.isString</w:t>
-      </w:r>
-      <w:proofErr w:type="spellEnd"/>
-      <w:r>
-        <w:t xml:space="preserve">, </w:t>
-      </w:r>
-      <w:proofErr w:type="spellStart"/>
-      <w:r>
-        <w:t>Ensure.isNumber</w:t>
-      </w:r>
-      <w:proofErr w:type="spellEnd"/>
-    </w:p>
-    <w:p>
-      <w:pPr>
-        <w:pStyle w:val="List-Bullet-tight025"/>
-      </w:pPr>
-      <w:r>
-        <w:t>Find all the throw statements and improve the messages.</w:t>
-      </w:r>
-    </w:p>
-    <w:p>
-      <w:pPr>
-        <w:pStyle w:val="List-Bullet-tight025"/>
-      </w:pPr>
-      <w:r>
-        <w:t>Find forms with fields that need to be negative and fix</w:t>
-      </w:r>
-      <w:r>
-        <w:t>.</w:t>
-      </w:r>
-    </w:p>
-    <w:p>
-      <w:pPr>
-        <w:pStyle w:val="List-Bullet-tight025"/>
-      </w:pPr>
-      <w:r>
-        <w:t>Add all forms in Python tool.</w:t>
-      </w:r>
-    </w:p>
-    <w:p>
-      <w:pPr>
-        <w:pStyle w:val="List-Bullet-tight025"/>
-      </w:pPr>
-      <w:r>
-        <w:t xml:space="preserve">Make sure there's a difference between not entering a value (let program calculate value), and setting it to 0. </w:t>
-      </w:r>
-      <w:r>
-        <w:t>Update documentation to use 0.0 instead of 0.</w:t>
-      </w:r>
-    </w:p>
-    <w:p>
-      <w:pPr>
-        <w:pStyle w:val="List-Bullet-tight025"/>
-      </w:pPr>
-      <w:r>
-        <w:t xml:space="preserve">Get rid of </w:t>
-      </w:r>
-      <w:proofErr w:type="spellStart"/>
-      <w:r>
-        <w:t>formname</w:t>
-      </w:r>
-      <w:proofErr w:type="spellEnd"/>
-      <w:r>
-        <w:t xml:space="preserve"> inside the form.</w:t>
-      </w:r>
-    </w:p>
-    <w:p>
-      <w:pPr>
-        <w:pStyle w:val="List-Bullet-tight025"/>
-      </w:pPr>
-      <w:r>
-        <w:t xml:space="preserve">Merge </w:t>
-      </w:r>
-      <w:proofErr w:type="spellStart"/>
-      <w:r>
-        <w:t>TaxTableTmpl</w:t>
-      </w:r>
-      <w:proofErr w:type="spellEnd"/>
-      <w:r>
-        <w:t xml:space="preserve"> with TaxTable.js</w:t>
-      </w:r>
-    </w:p>
-    <w:p>
-      <w:pPr>
-        <w:pStyle w:val="List-Bullet-tight025"/>
-      </w:pPr>
-      <w:r>
-        <w:t>Write setter/getter methods for lines[</w:t>
-      </w:r>
-      <w:proofErr w:type="spellStart"/>
+      <w:proofErr w:type="gramEnd"/>
       <w:r>
         <w:t>lineno</w:t>
       </w:r>
@@ -3017,9 +2852,14 @@
         <w:ind w:left="1800"/>
       </w:pPr>
       <w:r>
-        <w:t>Make sure lines[</w:t>
+        <w:t xml:space="preserve">Make sure </w:t>
+      </w:r>
+      <w:proofErr w:type="gramStart"/>
+      <w:r>
+        <w:t>lines[</w:t>
       </w:r>
       <w:proofErr w:type="spellStart"/>
+      <w:proofErr w:type="gramEnd"/>
       <w:r>
         <w:t>lineno</w:t>
       </w:r>
@@ -3050,9 +2890,12 @@
         <w:t>super.setter</w:t>
       </w:r>
       <w:proofErr w:type="spellEnd"/>
+      <w:r>
+        <w:t>(</w:t>
+      </w:r>
       <w:proofErr w:type="gramEnd"/>
       <w:r>
-        <w:t>().</w:t>
+        <w:t>).</w:t>
       </w:r>
     </w:p>
     <w:p>
@@ -3083,14 +2926,6 @@
         <w:pStyle w:val="List-Bullet-tight025"/>
       </w:pPr>
       <w:r>
-        <w:t>Stock transactions</w:t>
-      </w:r>
-    </w:p>
-    <w:p>
-      <w:pPr>
-        <w:pStyle w:val="List-Bullet-tight025"/>
-      </w:pPr>
-      <w:r>
         <w:t>Credits</w:t>
       </w:r>
     </w:p>
@@ -3219,7 +3054,7 @@
       <w:pPr>
         <w:pStyle w:val="Heading2"/>
       </w:pPr>
-      <w:bookmarkStart w:id="26" w:name="_Toc241654070"/>
+      <w:bookmarkStart w:id="26" w:name="_Toc241737385"/>
       <w:r>
         <w:t>Other Tools</w:t>
       </w:r>
@@ -3289,7 +3124,7 @@
       </w:pPr>
       <w:bookmarkStart w:id="27" w:name="_Toc228630162"/>
       <w:bookmarkStart w:id="28" w:name="_Toc231285051"/>
-      <w:bookmarkStart w:id="29" w:name="_Toc241654071"/>
+      <w:bookmarkStart w:id="29" w:name="_Toc241737386"/>
       <w:r>
         <w:t>Feedback</w:t>
       </w:r>
@@ -3329,7 +3164,7 @@
 </file>
 
 <file path=word/endnotes.xml><?xml version="1.0" encoding="utf-8"?>
-<w:endnotes xmlns:wpc="http://schemas.microsoft.com/office/word/2010/wordprocessingCanvas" xmlns:cx="http://schemas.microsoft.com/office/drawing/2014/chartex" xmlns:cx1="http://schemas.microsoft.com/office/drawing/2015/9/8/chartex" xmlns:cx2="http://schemas.microsoft.com/office/drawing/2015/10/21/chartex" xmlns:cx3="http://schemas.microsoft.com/office/drawing/2016/5/9/chartex" xmlns:cx4="http://schemas.microsoft.com/office/drawing/2016/5/10/chartex" xmlns:cx5="http://schemas.microsoft.com/office/drawing/2016/5/11/chartex" xmlns:cx6="http://schemas.microsoft.com/office/drawing/2016/5/12/chartex" xmlns:cx7="http://schemas.microsoft.com/office/drawing/2016/5/13/chartex" xmlns:cx8="http://schemas.microsoft.com/office/drawing/2016/5/14/chartex" xmlns:mc="http://schemas.openxmlformats.org/markup-compatibility/2006" xmlns:aink="http://schemas.microsoft.com/office/drawing/2016/ink" xmlns:am3d="http://schemas.microsoft.com/office/drawing/2017/model3d" xmlns:o="urn:schemas-microsoft-com:office:office" xmlns:oel="http://schemas.microsoft.com/office/2019/extlst" xmlns:r="http://schemas.openxmlformats.org/officeDocument/2006/relationships" xmlns:m="http://schemas.openxmlformats.org/officeDocument/2006/math" xmlns:v="urn:schemas-microsoft-com:vml" xmlns:wp14="http://schemas.microsoft.com/office/word/2010/wordprocessingDrawing" xmlns:wp="http://schemas.openxmlformats.org/drawingml/2006/wordprocessingDrawing" xmlns:w10="urn:schemas-microsoft-com:office:word" xmlns:w="http://schemas.openxmlformats.org/wordprocessingml/2006/main" xmlns:w14="http://schemas.microsoft.com/office/word/2010/wordml" xmlns:w15="http://schemas.microsoft.com/office/word/2012/wordml" xmlns:w16cex="http://schemas.microsoft.com/office/word/2018/wordml/cex" xmlns:w16cid="http://schemas.microsoft.com/office/word/2016/wordml/cid" xmlns:w16="http://schemas.microsoft.com/office/word/2018/wordml" xmlns:w16du="http://schemas.microsoft.com/office/word/2023/wordml/word16du" xmlns:w16sdtdh="http://schemas.microsoft.com/office/word/2020/wordml/sdtdatahash" xmlns:w16sdtfl="http://schemas.microsoft.com/office/word/2024/wordml/sdtformatlock" xmlns:w16se="http://schemas.microsoft.com/office/word/2015/wordml/symex" xmlns:wpg="http://schemas.microsoft.com/office/word/2010/wordprocessingGroup" xmlns:wpi="http://schemas.microsoft.com/office/word/2010/wordprocessingInk" xmlns:wne="http://schemas.microsoft.com/office/word/2006/wordml" xmlns:wps="http://schemas.microsoft.com/office/word/2010/wordprocessingShape" mc:Ignorable="w14 w15 w16se w16cid w16 w16cex w16sdtdh w16sdtfl w16du wp14">
+<w:endnotes xmlns:ve="http://schemas.openxmlformats.org/markup-compatibility/2006" xmlns:o="urn:schemas-microsoft-com:office:office" xmlns:r="http://schemas.openxmlformats.org/officeDocument/2006/relationships" xmlns:m="http://schemas.openxmlformats.org/officeDocument/2006/math" xmlns:v="urn:schemas-microsoft-com:vml" xmlns:wp="http://schemas.openxmlformats.org/drawingml/2006/wordprocessingDrawing" xmlns:w10="urn:schemas-microsoft-com:office:word" xmlns:w="http://schemas.openxmlformats.org/wordprocessingml/2006/main" xmlns:wne="http://schemas.microsoft.com/office/word/2006/wordml">
   <w:endnote w:type="separator" w:id="-1">
     <w:p>
       <w:r>
@@ -3348,7 +3183,7 @@
 </file>
 
 <file path=word/footer1.xml><?xml version="1.0" encoding="utf-8"?>
-<w:ftr xmlns:wpc="http://schemas.microsoft.com/office/word/2010/wordprocessingCanvas" xmlns:cx="http://schemas.microsoft.com/office/drawing/2014/chartex" xmlns:cx1="http://schemas.microsoft.com/office/drawing/2015/9/8/chartex" xmlns:cx2="http://schemas.microsoft.com/office/drawing/2015/10/21/chartex" xmlns:cx3="http://schemas.microsoft.com/office/drawing/2016/5/9/chartex" xmlns:cx4="http://schemas.microsoft.com/office/drawing/2016/5/10/chartex" xmlns:cx5="http://schemas.microsoft.com/office/drawing/2016/5/11/chartex" xmlns:cx6="http://schemas.microsoft.com/office/drawing/2016/5/12/chartex" xmlns:cx7="http://schemas.microsoft.com/office/drawing/2016/5/13/chartex" xmlns:cx8="http://schemas.microsoft.com/office/drawing/2016/5/14/chartex" xmlns:mc="http://schemas.openxmlformats.org/markup-compatibility/2006" xmlns:aink="http://schemas.microsoft.com/office/drawing/2016/ink" xmlns:am3d="http://schemas.microsoft.com/office/drawing/2017/model3d" xmlns:o="urn:schemas-microsoft-com:office:office" xmlns:oel="http://schemas.microsoft.com/office/2019/extlst" xmlns:r="http://schemas.openxmlformats.org/officeDocument/2006/relationships" xmlns:m="http://schemas.openxmlformats.org/officeDocument/2006/math" xmlns:v="urn:schemas-microsoft-com:vml" xmlns:wp14="http://schemas.microsoft.com/office/word/2010/wordprocessingDrawing" xmlns:wp="http://schemas.openxmlformats.org/drawingml/2006/wordprocessingDrawing" xmlns:w10="urn:schemas-microsoft-com:office:word" xmlns:w="http://schemas.openxmlformats.org/wordprocessingml/2006/main" xmlns:w14="http://schemas.microsoft.com/office/word/2010/wordml" xmlns:w15="http://schemas.microsoft.com/office/word/2012/wordml" xmlns:w16cex="http://schemas.microsoft.com/office/word/2018/wordml/cex" xmlns:w16cid="http://schemas.microsoft.com/office/word/2016/wordml/cid" xmlns:w16="http://schemas.microsoft.com/office/word/2018/wordml" xmlns:w16du="http://schemas.microsoft.com/office/word/2023/wordml/word16du" xmlns:w16sdtdh="http://schemas.microsoft.com/office/word/2020/wordml/sdtdatahash" xmlns:w16sdtfl="http://schemas.microsoft.com/office/word/2024/wordml/sdtformatlock" xmlns:w16se="http://schemas.microsoft.com/office/word/2015/wordml/symex" xmlns:wpg="http://schemas.microsoft.com/office/word/2010/wordprocessingGroup" xmlns:wpi="http://schemas.microsoft.com/office/word/2010/wordprocessingInk" xmlns:wne="http://schemas.microsoft.com/office/word/2006/wordml" xmlns:wps="http://schemas.microsoft.com/office/word/2010/wordprocessingShape" mc:Ignorable="w14 w15 w16se w16cid w16 w16cex w16sdtdh w16sdtfl w16du wp14">
+<w:ftr xmlns:ve="http://schemas.openxmlformats.org/markup-compatibility/2006" xmlns:o="urn:schemas-microsoft-com:office:office" xmlns:r="http://schemas.openxmlformats.org/officeDocument/2006/relationships" xmlns:m="http://schemas.openxmlformats.org/officeDocument/2006/math" xmlns:v="urn:schemas-microsoft-com:vml" xmlns:wp="http://schemas.openxmlformats.org/drawingml/2006/wordprocessingDrawing" xmlns:w10="urn:schemas-microsoft-com:office:word" xmlns:w="http://schemas.openxmlformats.org/wordprocessingml/2006/main" xmlns:wne="http://schemas.microsoft.com/office/word/2006/wordml">
   <w:p>
     <w:pPr>
       <w:pStyle w:val="Footer"/>
@@ -3439,7 +3274,7 @@
         <w:szCs w:val="24"/>
         <w:lang w:eastAsia="en-US"/>
       </w:rPr>
-      <w:t>5</w:t>
+      <w:t>1</w:t>
     </w:r>
     <w:r>
       <w:rPr>
@@ -3460,7 +3295,7 @@
 </file>
 
 <file path=word/footnotes.xml><?xml version="1.0" encoding="utf-8"?>
-<w:footnotes xmlns:wpc="http://schemas.microsoft.com/office/word/2010/wordprocessingCanvas" xmlns:cx="http://schemas.microsoft.com/office/drawing/2014/chartex" xmlns:cx1="http://schemas.microsoft.com/office/drawing/2015/9/8/chartex" xmlns:cx2="http://schemas.microsoft.com/office/drawing/2015/10/21/chartex" xmlns:cx3="http://schemas.microsoft.com/office/drawing/2016/5/9/chartex" xmlns:cx4="http://schemas.microsoft.com/office/drawing/2016/5/10/chartex" xmlns:cx5="http://schemas.microsoft.com/office/drawing/2016/5/11/chartex" xmlns:cx6="http://schemas.microsoft.com/office/drawing/2016/5/12/chartex" xmlns:cx7="http://schemas.microsoft.com/office/drawing/2016/5/13/chartex" xmlns:cx8="http://schemas.microsoft.com/office/drawing/2016/5/14/chartex" xmlns:mc="http://schemas.openxmlformats.org/markup-compatibility/2006" xmlns:aink="http://schemas.microsoft.com/office/drawing/2016/ink" xmlns:am3d="http://schemas.microsoft.com/office/drawing/2017/model3d" xmlns:o="urn:schemas-microsoft-com:office:office" xmlns:oel="http://schemas.microsoft.com/office/2019/extlst" xmlns:r="http://schemas.openxmlformats.org/officeDocument/2006/relationships" xmlns:m="http://schemas.openxmlformats.org/officeDocument/2006/math" xmlns:v="urn:schemas-microsoft-com:vml" xmlns:wp14="http://schemas.microsoft.com/office/word/2010/wordprocessingDrawing" xmlns:wp="http://schemas.openxmlformats.org/drawingml/2006/wordprocessingDrawing" xmlns:w10="urn:schemas-microsoft-com:office:word" xmlns:w="http://schemas.openxmlformats.org/wordprocessingml/2006/main" xmlns:w14="http://schemas.microsoft.com/office/word/2010/wordml" xmlns:w15="http://schemas.microsoft.com/office/word/2012/wordml" xmlns:w16cex="http://schemas.microsoft.com/office/word/2018/wordml/cex" xmlns:w16cid="http://schemas.microsoft.com/office/word/2016/wordml/cid" xmlns:w16="http://schemas.microsoft.com/office/word/2018/wordml" xmlns:w16du="http://schemas.microsoft.com/office/word/2023/wordml/word16du" xmlns:w16sdtdh="http://schemas.microsoft.com/office/word/2020/wordml/sdtdatahash" xmlns:w16sdtfl="http://schemas.microsoft.com/office/word/2024/wordml/sdtformatlock" xmlns:w16se="http://schemas.microsoft.com/office/word/2015/wordml/symex" xmlns:wpg="http://schemas.microsoft.com/office/word/2010/wordprocessingGroup" xmlns:wpi="http://schemas.microsoft.com/office/word/2010/wordprocessingInk" xmlns:wne="http://schemas.microsoft.com/office/word/2006/wordml" xmlns:wps="http://schemas.microsoft.com/office/word/2010/wordprocessingShape" mc:Ignorable="w14 w15 w16se w16cid w16 w16cex w16sdtdh w16sdtfl w16du wp14">
+<w:footnotes xmlns:ve="http://schemas.openxmlformats.org/markup-compatibility/2006" xmlns:o="urn:schemas-microsoft-com:office:office" xmlns:r="http://schemas.openxmlformats.org/officeDocument/2006/relationships" xmlns:m="http://schemas.openxmlformats.org/officeDocument/2006/math" xmlns:v="urn:schemas-microsoft-com:vml" xmlns:wp="http://schemas.openxmlformats.org/drawingml/2006/wordprocessingDrawing" xmlns:w10="urn:schemas-microsoft-com:office:word" xmlns:w="http://schemas.openxmlformats.org/wordprocessingml/2006/main" xmlns:wne="http://schemas.microsoft.com/office/word/2006/wordml">
   <w:footnote w:type="separator" w:id="-1">
     <w:p>
       <w:r>
@@ -3479,8 +3314,8 @@
 </file>
 
 <file path=word/numbering.xml><?xml version="1.0" encoding="utf-8"?>
-<w:numbering xmlns:wpc="http://schemas.microsoft.com/office/word/2010/wordprocessingCanvas" xmlns:cx="http://schemas.microsoft.com/office/drawing/2014/chartex" xmlns:cx1="http://schemas.microsoft.com/office/drawing/2015/9/8/chartex" xmlns:cx2="http://schemas.microsoft.com/office/drawing/2015/10/21/chartex" xmlns:cx3="http://schemas.microsoft.com/office/drawing/2016/5/9/chartex" xmlns:cx4="http://schemas.microsoft.com/office/drawing/2016/5/10/chartex" xmlns:cx5="http://schemas.microsoft.com/office/drawing/2016/5/11/chartex" xmlns:cx6="http://schemas.microsoft.com/office/drawing/2016/5/12/chartex" xmlns:cx7="http://schemas.microsoft.com/office/drawing/2016/5/13/chartex" xmlns:cx8="http://schemas.microsoft.com/office/drawing/2016/5/14/chartex" xmlns:mc="http://schemas.openxmlformats.org/markup-compatibility/2006" xmlns:aink="http://schemas.microsoft.com/office/drawing/2016/ink" xmlns:am3d="http://schemas.microsoft.com/office/drawing/2017/model3d" xmlns:o="urn:schemas-microsoft-com:office:office" xmlns:oel="http://schemas.microsoft.com/office/2019/extlst" xmlns:r="http://schemas.openxmlformats.org/officeDocument/2006/relationships" xmlns:m="http://schemas.openxmlformats.org/officeDocument/2006/math" xmlns:v="urn:schemas-microsoft-com:vml" xmlns:wp14="http://schemas.microsoft.com/office/word/2010/wordprocessingDrawing" xmlns:wp="http://schemas.openxmlformats.org/drawingml/2006/wordprocessingDrawing" xmlns:w10="urn:schemas-microsoft-com:office:word" xmlns:w="http://schemas.openxmlformats.org/wordprocessingml/2006/main" xmlns:w14="http://schemas.microsoft.com/office/word/2010/wordml" xmlns:w15="http://schemas.microsoft.com/office/word/2012/wordml" xmlns:w16cex="http://schemas.microsoft.com/office/word/2018/wordml/cex" xmlns:w16cid="http://schemas.microsoft.com/office/word/2016/wordml/cid" xmlns:w16="http://schemas.microsoft.com/office/word/2018/wordml" xmlns:w16du="http://schemas.microsoft.com/office/word/2023/wordml/word16du" xmlns:w16sdtdh="http://schemas.microsoft.com/office/word/2020/wordml/sdtdatahash" xmlns:w16sdtfl="http://schemas.microsoft.com/office/word/2024/wordml/sdtformatlock" xmlns:w16se="http://schemas.microsoft.com/office/word/2015/wordml/symex" xmlns:wpg="http://schemas.microsoft.com/office/word/2010/wordprocessingGroup" xmlns:wpi="http://schemas.microsoft.com/office/word/2010/wordprocessingInk" xmlns:wne="http://schemas.microsoft.com/office/word/2006/wordml" xmlns:wps="http://schemas.microsoft.com/office/word/2010/wordprocessingShape" mc:Ignorable="w14 w15 w16se w16cid w16 w16cex w16sdtdh w16sdtfl w16du wp14">
-  <w:abstractNum w:abstractNumId="0" w15:restartNumberingAfterBreak="0">
+<w:numbering xmlns:ve="http://schemas.openxmlformats.org/markup-compatibility/2006" xmlns:o="urn:schemas-microsoft-com:office:office" xmlns:r="http://schemas.openxmlformats.org/officeDocument/2006/relationships" xmlns:m="http://schemas.openxmlformats.org/officeDocument/2006/math" xmlns:v="urn:schemas-microsoft-com:vml" xmlns:wp="http://schemas.openxmlformats.org/drawingml/2006/wordprocessingDrawing" xmlns:w10="urn:schemas-microsoft-com:office:word" xmlns:w="http://schemas.openxmlformats.org/wordprocessingml/2006/main" xmlns:wne="http://schemas.microsoft.com/office/word/2006/wordml">
+  <w:abstractNum w:abstractNumId="0">
     <w:nsid w:val="163115D9"/>
     <w:multiLevelType w:val="hybridMultilevel"/>
     <w:tmpl w:val="97DAFCAE"/>
@@ -3594,7 +3429,7 @@
       </w:rPr>
     </w:lvl>
   </w:abstractNum>
-  <w:abstractNum w:abstractNumId="1" w15:restartNumberingAfterBreak="0">
+  <w:abstractNum w:abstractNumId="1">
     <w:nsid w:val="3D3B424D"/>
     <w:multiLevelType w:val="hybridMultilevel"/>
     <w:tmpl w:val="11DA1700"/>
@@ -3708,7 +3543,7 @@
       </w:rPr>
     </w:lvl>
   </w:abstractNum>
-  <w:abstractNum w:abstractNumId="2" w15:restartNumberingAfterBreak="0">
+  <w:abstractNum w:abstractNumId="2">
     <w:nsid w:val="41936094"/>
     <w:multiLevelType w:val="hybridMultilevel"/>
     <w:tmpl w:val="D0107CD2"/>
@@ -3822,7 +3657,7 @@
       </w:rPr>
     </w:lvl>
   </w:abstractNum>
-  <w:abstractNum w:abstractNumId="3" w15:restartNumberingAfterBreak="0">
+  <w:abstractNum w:abstractNumId="3">
     <w:nsid w:val="45145E4D"/>
     <w:multiLevelType w:val="hybridMultilevel"/>
     <w:tmpl w:val="7696BC50"/>
@@ -3936,16 +3771,16 @@
       </w:rPr>
     </w:lvl>
   </w:abstractNum>
-  <w:num w:numId="1" w16cid:durableId="1401557070">
+  <w:num w:numId="1">
     <w:abstractNumId w:val="1"/>
   </w:num>
-  <w:num w:numId="2" w16cid:durableId="216626179">
+  <w:num w:numId="2">
     <w:abstractNumId w:val="2"/>
   </w:num>
-  <w:num w:numId="3" w16cid:durableId="27687066">
+  <w:num w:numId="3">
     <w:abstractNumId w:val="0"/>
   </w:num>
-  <w:num w:numId="4" w16cid:durableId="222915658">
+  <w:num w:numId="4">
     <w:abstractNumId w:val="3"/>
   </w:num>
   <w:numIdMacAtCleanup w:val="4"/>
@@ -3953,7 +3788,7 @@
 </file>
 
 <file path=word/styles.xml><?xml version="1.0" encoding="utf-8"?>
-<w:styles xmlns:mc="http://schemas.openxmlformats.org/markup-compatibility/2006" xmlns:r="http://schemas.openxmlformats.org/officeDocument/2006/relationships" xmlns:w="http://schemas.openxmlformats.org/wordprocessingml/2006/main" xmlns:w14="http://schemas.microsoft.com/office/word/2010/wordml" xmlns:w15="http://schemas.microsoft.com/office/word/2012/wordml" xmlns:w16cex="http://schemas.microsoft.com/office/word/2018/wordml/cex" xmlns:w16cid="http://schemas.microsoft.com/office/word/2016/wordml/cid" xmlns:w16="http://schemas.microsoft.com/office/word/2018/wordml" xmlns:w16du="http://schemas.microsoft.com/office/word/2023/wordml/word16du" xmlns:w16sdtdh="http://schemas.microsoft.com/office/word/2020/wordml/sdtdatahash" xmlns:w16sdtfl="http://schemas.microsoft.com/office/word/2024/wordml/sdtformatlock" xmlns:w16se="http://schemas.microsoft.com/office/word/2015/wordml/symex" mc:Ignorable="w14 w15 w16se w16cid w16 w16cex w16sdtdh w16sdtfl w16du">
+<w:styles xmlns:r="http://schemas.openxmlformats.org/officeDocument/2006/relationships" xmlns:w="http://schemas.openxmlformats.org/wordprocessingml/2006/main">
   <w:docDefaults>
     <w:rPrDefault>
       <w:rPr>
@@ -3967,383 +3802,145 @@
       </w:pPr>
     </w:pPrDefault>
   </w:docDefaults>
-  <w:latentStyles w:defLockedState="0" w:defUIPriority="99" w:defSemiHidden="0" w:defUnhideWhenUsed="0" w:defQFormat="0" w:count="376">
-    <w:lsdException w:name="Normal" w:uiPriority="0" w:qFormat="1"/>
-    <w:lsdException w:name="heading 1" w:uiPriority="0" w:qFormat="1"/>
-    <w:lsdException w:name="heading 2" w:semiHidden="1" w:uiPriority="0" w:unhideWhenUsed="1" w:qFormat="1"/>
-    <w:lsdException w:name="heading 3" w:semiHidden="1" w:uiPriority="0" w:unhideWhenUsed="1" w:qFormat="1"/>
-    <w:lsdException w:name="heading 4" w:semiHidden="1" w:uiPriority="9" w:unhideWhenUsed="1" w:qFormat="1"/>
-    <w:lsdException w:name="heading 5" w:semiHidden="1" w:uiPriority="9" w:unhideWhenUsed="1" w:qFormat="1"/>
-    <w:lsdException w:name="heading 6" w:semiHidden="1" w:uiPriority="9" w:unhideWhenUsed="1" w:qFormat="1"/>
-    <w:lsdException w:name="heading 7" w:semiHidden="1" w:uiPriority="9" w:unhideWhenUsed="1" w:qFormat="1"/>
-    <w:lsdException w:name="heading 8" w:semiHidden="1" w:uiPriority="9" w:unhideWhenUsed="1" w:qFormat="1"/>
-    <w:lsdException w:name="heading 9" w:semiHidden="1" w:uiPriority="9" w:unhideWhenUsed="1" w:qFormat="1"/>
-    <w:lsdException w:name="index 1" w:semiHidden="1" w:unhideWhenUsed="1"/>
-    <w:lsdException w:name="index 2" w:semiHidden="1" w:unhideWhenUsed="1"/>
-    <w:lsdException w:name="index 3" w:semiHidden="1" w:unhideWhenUsed="1"/>
-    <w:lsdException w:name="index 4" w:semiHidden="1" w:unhideWhenUsed="1"/>
-    <w:lsdException w:name="index 5" w:semiHidden="1" w:unhideWhenUsed="1"/>
-    <w:lsdException w:name="index 6" w:semiHidden="1" w:unhideWhenUsed="1"/>
-    <w:lsdException w:name="index 7" w:semiHidden="1" w:unhideWhenUsed="1"/>
-    <w:lsdException w:name="index 8" w:semiHidden="1" w:unhideWhenUsed="1"/>
-    <w:lsdException w:name="index 9" w:semiHidden="1" w:unhideWhenUsed="1"/>
-    <w:lsdException w:name="toc 1" w:semiHidden="1" w:uiPriority="39" w:unhideWhenUsed="1" w:qFormat="1"/>
-    <w:lsdException w:name="toc 2" w:semiHidden="1" w:uiPriority="39" w:unhideWhenUsed="1" w:qFormat="1"/>
-    <w:lsdException w:name="toc 3" w:semiHidden="1" w:uiPriority="39" w:unhideWhenUsed="1" w:qFormat="1"/>
-    <w:lsdException w:name="toc 4" w:semiHidden="1" w:uiPriority="39" w:unhideWhenUsed="1"/>
-    <w:lsdException w:name="toc 5" w:semiHidden="1" w:uiPriority="39" w:unhideWhenUsed="1"/>
-    <w:lsdException w:name="toc 6" w:semiHidden="1" w:uiPriority="39" w:unhideWhenUsed="1"/>
-    <w:lsdException w:name="toc 7" w:semiHidden="1" w:uiPriority="39" w:unhideWhenUsed="1"/>
-    <w:lsdException w:name="toc 8" w:semiHidden="1" w:uiPriority="39" w:unhideWhenUsed="1"/>
-    <w:lsdException w:name="toc 9" w:semiHidden="1" w:uiPriority="39" w:unhideWhenUsed="1"/>
-    <w:lsdException w:name="Normal Indent" w:semiHidden="1" w:unhideWhenUsed="1"/>
-    <w:lsdException w:name="footnote text" w:semiHidden="1" w:unhideWhenUsed="1"/>
-    <w:lsdException w:name="annotation text" w:semiHidden="1" w:unhideWhenUsed="1"/>
-    <w:lsdException w:name="header" w:semiHidden="1" w:unhideWhenUsed="1"/>
-    <w:lsdException w:name="footer" w:semiHidden="1" w:uiPriority="0" w:unhideWhenUsed="1"/>
-    <w:lsdException w:name="index heading" w:semiHidden="1" w:unhideWhenUsed="1"/>
-    <w:lsdException w:name="caption" w:semiHidden="1" w:uiPriority="0" w:unhideWhenUsed="1" w:qFormat="1"/>
-    <w:lsdException w:name="table of figures" w:semiHidden="1" w:unhideWhenUsed="1"/>
-    <w:lsdException w:name="envelope address" w:semiHidden="1" w:unhideWhenUsed="1"/>
-    <w:lsdException w:name="envelope return" w:semiHidden="1" w:unhideWhenUsed="1"/>
-    <w:lsdException w:name="footnote reference" w:semiHidden="1" w:unhideWhenUsed="1"/>
-    <w:lsdException w:name="annotation reference" w:semiHidden="1" w:unhideWhenUsed="1"/>
-    <w:lsdException w:name="line number" w:semiHidden="1" w:unhideWhenUsed="1"/>
-    <w:lsdException w:name="page number" w:semiHidden="1" w:unhideWhenUsed="1"/>
-    <w:lsdException w:name="endnote reference" w:semiHidden="1" w:unhideWhenUsed="1"/>
-    <w:lsdException w:name="endnote text" w:semiHidden="1" w:unhideWhenUsed="1"/>
-    <w:lsdException w:name="table of authorities" w:semiHidden="1" w:unhideWhenUsed="1"/>
-    <w:lsdException w:name="macro" w:semiHidden="1" w:unhideWhenUsed="1"/>
-    <w:lsdException w:name="toa heading" w:semiHidden="1" w:unhideWhenUsed="1"/>
-    <w:lsdException w:name="List" w:semiHidden="1" w:unhideWhenUsed="1"/>
-    <w:lsdException w:name="List Bullet" w:semiHidden="1" w:unhideWhenUsed="1"/>
-    <w:lsdException w:name="List Number" w:semiHidden="1" w:unhideWhenUsed="1"/>
-    <w:lsdException w:name="List 2" w:semiHidden="1" w:unhideWhenUsed="1"/>
-    <w:lsdException w:name="List 3" w:semiHidden="1" w:unhideWhenUsed="1"/>
-    <w:lsdException w:name="List 4" w:semiHidden="1" w:unhideWhenUsed="1"/>
-    <w:lsdException w:name="List 5" w:semiHidden="1" w:unhideWhenUsed="1"/>
-    <w:lsdException w:name="List Bullet 2" w:semiHidden="1" w:unhideWhenUsed="1"/>
-    <w:lsdException w:name="List Bullet 3" w:semiHidden="1" w:unhideWhenUsed="1"/>
-    <w:lsdException w:name="List Bullet 4" w:semiHidden="1" w:unhideWhenUsed="1"/>
-    <w:lsdException w:name="List Bullet 5" w:semiHidden="1" w:unhideWhenUsed="1"/>
-    <w:lsdException w:name="List Number 2" w:semiHidden="1" w:unhideWhenUsed="1"/>
-    <w:lsdException w:name="List Number 3" w:semiHidden="1" w:unhideWhenUsed="1"/>
-    <w:lsdException w:name="List Number 4" w:semiHidden="1" w:unhideWhenUsed="1"/>
-    <w:lsdException w:name="List Number 5" w:semiHidden="1" w:unhideWhenUsed="1"/>
-    <w:lsdException w:name="Title" w:uiPriority="10" w:qFormat="1"/>
-    <w:lsdException w:name="Closing" w:semiHidden="1" w:unhideWhenUsed="1"/>
-    <w:lsdException w:name="Signature" w:semiHidden="1" w:unhideWhenUsed="1"/>
-    <w:lsdException w:name="Default Paragraph Font" w:semiHidden="1" w:uiPriority="1" w:unhideWhenUsed="1"/>
-    <w:lsdException w:name="Body Text" w:semiHidden="1" w:unhideWhenUsed="1"/>
-    <w:lsdException w:name="Body Text Indent" w:semiHidden="1" w:unhideWhenUsed="1"/>
-    <w:lsdException w:name="List Continue" w:semiHidden="1" w:unhideWhenUsed="1"/>
-    <w:lsdException w:name="List Continue 2" w:semiHidden="1" w:unhideWhenUsed="1"/>
-    <w:lsdException w:name="List Continue 3" w:semiHidden="1" w:unhideWhenUsed="1"/>
-    <w:lsdException w:name="List Continue 4" w:semiHidden="1" w:unhideWhenUsed="1"/>
-    <w:lsdException w:name="List Continue 5" w:semiHidden="1" w:unhideWhenUsed="1"/>
-    <w:lsdException w:name="Message Header" w:semiHidden="1" w:unhideWhenUsed="1"/>
-    <w:lsdException w:name="Subtitle" w:uiPriority="11" w:qFormat="1"/>
-    <w:lsdException w:name="Salutation" w:semiHidden="1" w:unhideWhenUsed="1"/>
-    <w:lsdException w:name="Date" w:semiHidden="1" w:unhideWhenUsed="1"/>
-    <w:lsdException w:name="Body Text First Indent" w:semiHidden="1" w:unhideWhenUsed="1"/>
-    <w:lsdException w:name="Body Text First Indent 2" w:semiHidden="1" w:unhideWhenUsed="1"/>
-    <w:lsdException w:name="Note Heading" w:semiHidden="1" w:unhideWhenUsed="1"/>
-    <w:lsdException w:name="Body Text 2" w:semiHidden="1" w:unhideWhenUsed="1"/>
-    <w:lsdException w:name="Body Text 3" w:semiHidden="1" w:unhideWhenUsed="1"/>
-    <w:lsdException w:name="Body Text Indent 2" w:semiHidden="1" w:unhideWhenUsed="1"/>
-    <w:lsdException w:name="Body Text Indent 3" w:semiHidden="1" w:unhideWhenUsed="1"/>
-    <w:lsdException w:name="Block Text" w:semiHidden="1" w:unhideWhenUsed="1"/>
-    <w:lsdException w:name="Hyperlink" w:semiHidden="1" w:unhideWhenUsed="1"/>
-    <w:lsdException w:name="FollowedHyperlink" w:semiHidden="1" w:unhideWhenUsed="1"/>
-    <w:lsdException w:name="Strong" w:uiPriority="22" w:qFormat="1"/>
-    <w:lsdException w:name="Emphasis" w:uiPriority="20" w:qFormat="1"/>
-    <w:lsdException w:name="Document Map" w:semiHidden="1" w:unhideWhenUsed="1"/>
-    <w:lsdException w:name="Plain Text" w:semiHidden="1" w:unhideWhenUsed="1"/>
-    <w:lsdException w:name="E-mail Signature" w:semiHidden="1" w:unhideWhenUsed="1"/>
-    <w:lsdException w:name="HTML Top of Form" w:semiHidden="1" w:unhideWhenUsed="1"/>
-    <w:lsdException w:name="HTML Bottom of Form" w:semiHidden="1" w:unhideWhenUsed="1"/>
-    <w:lsdException w:name="Normal (Web)" w:semiHidden="1" w:unhideWhenUsed="1"/>
-    <w:lsdException w:name="HTML Acronym" w:semiHidden="1" w:unhideWhenUsed="1"/>
-    <w:lsdException w:name="HTML Address" w:semiHidden="1" w:unhideWhenUsed="1"/>
-    <w:lsdException w:name="HTML Cite" w:semiHidden="1" w:unhideWhenUsed="1"/>
-    <w:lsdException w:name="HTML Code" w:semiHidden="1" w:unhideWhenUsed="1"/>
-    <w:lsdException w:name="HTML Definition" w:semiHidden="1" w:unhideWhenUsed="1"/>
-    <w:lsdException w:name="HTML Keyboard" w:semiHidden="1" w:unhideWhenUsed="1"/>
-    <w:lsdException w:name="HTML Preformatted" w:semiHidden="1" w:unhideWhenUsed="1"/>
-    <w:lsdException w:name="HTML Sample" w:semiHidden="1" w:unhideWhenUsed="1"/>
-    <w:lsdException w:name="HTML Typewriter" w:semiHidden="1" w:unhideWhenUsed="1"/>
-    <w:lsdException w:name="HTML Variable" w:semiHidden="1" w:unhideWhenUsed="1"/>
-    <w:lsdException w:name="Normal Table" w:semiHidden="1" w:unhideWhenUsed="1"/>
-    <w:lsdException w:name="annotation subject" w:semiHidden="1" w:unhideWhenUsed="1"/>
-    <w:lsdException w:name="No List" w:semiHidden="1" w:unhideWhenUsed="1"/>
-    <w:lsdException w:name="Outline List 1" w:semiHidden="1" w:unhideWhenUsed="1"/>
-    <w:lsdException w:name="Outline List 2" w:semiHidden="1" w:unhideWhenUsed="1"/>
-    <w:lsdException w:name="Outline List 3" w:semiHidden="1" w:unhideWhenUsed="1"/>
-    <w:lsdException w:name="Table Simple 1" w:semiHidden="1" w:unhideWhenUsed="1"/>
-    <w:lsdException w:name="Table Simple 2" w:semiHidden="1" w:unhideWhenUsed="1"/>
-    <w:lsdException w:name="Table Simple 3" w:semiHidden="1" w:unhideWhenUsed="1"/>
-    <w:lsdException w:name="Table Classic 1" w:semiHidden="1" w:unhideWhenUsed="1"/>
-    <w:lsdException w:name="Table Classic 2" w:semiHidden="1" w:unhideWhenUsed="1"/>
-    <w:lsdException w:name="Table Classic 3" w:semiHidden="1" w:unhideWhenUsed="1"/>
-    <w:lsdException w:name="Table Classic 4" w:semiHidden="1" w:unhideWhenUsed="1"/>
-    <w:lsdException w:name="Table Colorful 1" w:semiHidden="1" w:unhideWhenUsed="1"/>
-    <w:lsdException w:name="Table Colorful 2" w:semiHidden="1" w:unhideWhenUsed="1"/>
-    <w:lsdException w:name="Table Colorful 3" w:semiHidden="1" w:unhideWhenUsed="1"/>
-    <w:lsdException w:name="Table Columns 1" w:semiHidden="1" w:unhideWhenUsed="1"/>
-    <w:lsdException w:name="Table Columns 2" w:semiHidden="1" w:unhideWhenUsed="1"/>
-    <w:lsdException w:name="Table Columns 3" w:semiHidden="1" w:unhideWhenUsed="1"/>
-    <w:lsdException w:name="Table Columns 4" w:semiHidden="1" w:unhideWhenUsed="1"/>
-    <w:lsdException w:name="Table Columns 5" w:semiHidden="1" w:unhideWhenUsed="1"/>
-    <w:lsdException w:name="Table Grid 1" w:semiHidden="1" w:unhideWhenUsed="1"/>
-    <w:lsdException w:name="Table Grid 2" w:semiHidden="1" w:unhideWhenUsed="1"/>
-    <w:lsdException w:name="Table Grid 3" w:semiHidden="1" w:unhideWhenUsed="1"/>
-    <w:lsdException w:name="Table Grid 4" w:semiHidden="1" w:unhideWhenUsed="1"/>
-    <w:lsdException w:name="Table Grid 5" w:semiHidden="1" w:unhideWhenUsed="1"/>
-    <w:lsdException w:name="Table Grid 6" w:semiHidden="1" w:unhideWhenUsed="1"/>
-    <w:lsdException w:name="Table Grid 7" w:semiHidden="1" w:unhideWhenUsed="1"/>
-    <w:lsdException w:name="Table Grid 8" w:semiHidden="1" w:unhideWhenUsed="1"/>
-    <w:lsdException w:name="Table List 1" w:semiHidden="1" w:unhideWhenUsed="1"/>
-    <w:lsdException w:name="Table List 2" w:semiHidden="1" w:unhideWhenUsed="1"/>
-    <w:lsdException w:name="Table List 3" w:semiHidden="1" w:unhideWhenUsed="1"/>
-    <w:lsdException w:name="Table List 4" w:semiHidden="1" w:unhideWhenUsed="1"/>
-    <w:lsdException w:name="Table List 5" w:semiHidden="1" w:unhideWhenUsed="1"/>
-    <w:lsdException w:name="Table List 6" w:semiHidden="1" w:unhideWhenUsed="1"/>
-    <w:lsdException w:name="Table List 7" w:semiHidden="1" w:unhideWhenUsed="1"/>
-    <w:lsdException w:name="Table List 8" w:semiHidden="1" w:unhideWhenUsed="1"/>
-    <w:lsdException w:name="Table 3D effects 1" w:semiHidden="1" w:unhideWhenUsed="1"/>
-    <w:lsdException w:name="Table 3D effects 2" w:semiHidden="1" w:unhideWhenUsed="1"/>
-    <w:lsdException w:name="Table 3D effects 3" w:semiHidden="1" w:unhideWhenUsed="1"/>
-    <w:lsdException w:name="Table Contemporary" w:semiHidden="1" w:unhideWhenUsed="1"/>
-    <w:lsdException w:name="Table Elegant" w:semiHidden="1" w:unhideWhenUsed="1"/>
-    <w:lsdException w:name="Table Professional" w:semiHidden="1" w:unhideWhenUsed="1"/>
-    <w:lsdException w:name="Table Subtle 1" w:semiHidden="1" w:unhideWhenUsed="1"/>
-    <w:lsdException w:name="Table Subtle 2" w:semiHidden="1" w:unhideWhenUsed="1"/>
-    <w:lsdException w:name="Table Web 1" w:semiHidden="1" w:unhideWhenUsed="1"/>
-    <w:lsdException w:name="Table Web 2" w:semiHidden="1" w:unhideWhenUsed="1"/>
-    <w:lsdException w:name="Table Web 3" w:semiHidden="1" w:unhideWhenUsed="1"/>
-    <w:lsdException w:name="Balloon Text" w:semiHidden="1" w:unhideWhenUsed="1"/>
-    <w:lsdException w:name="Table Grid" w:uiPriority="59"/>
-    <w:lsdException w:name="Table Theme" w:semiHidden="1" w:unhideWhenUsed="1"/>
-    <w:lsdException w:name="Placeholder Text" w:semiHidden="1"/>
-    <w:lsdException w:name="No Spacing" w:uiPriority="1" w:qFormat="1"/>
-    <w:lsdException w:name="Light Shading" w:uiPriority="60"/>
-    <w:lsdException w:name="Light List" w:uiPriority="61"/>
-    <w:lsdException w:name="Light Grid" w:uiPriority="62"/>
-    <w:lsdException w:name="Medium Shading 1" w:uiPriority="63"/>
-    <w:lsdException w:name="Medium Shading 2" w:uiPriority="64"/>
-    <w:lsdException w:name="Medium List 1" w:uiPriority="65"/>
-    <w:lsdException w:name="Medium List 2" w:uiPriority="66"/>
-    <w:lsdException w:name="Medium Grid 1" w:uiPriority="67"/>
-    <w:lsdException w:name="Medium Grid 2" w:uiPriority="68"/>
-    <w:lsdException w:name="Medium Grid 3" w:uiPriority="69"/>
-    <w:lsdException w:name="Dark List" w:uiPriority="70"/>
-    <w:lsdException w:name="Colorful Shading" w:uiPriority="71"/>
-    <w:lsdException w:name="Colorful List" w:uiPriority="72"/>
-    <w:lsdException w:name="Colorful Grid" w:uiPriority="73"/>
-    <w:lsdException w:name="Light Shading Accent 1" w:uiPriority="60"/>
-    <w:lsdException w:name="Light List Accent 1" w:uiPriority="61"/>
-    <w:lsdException w:name="Light Grid Accent 1" w:uiPriority="62"/>
-    <w:lsdException w:name="Medium Shading 1 Accent 1" w:uiPriority="63"/>
-    <w:lsdException w:name="Medium Shading 2 Accent 1" w:uiPriority="64"/>
-    <w:lsdException w:name="Medium List 1 Accent 1" w:uiPriority="65"/>
-    <w:lsdException w:name="Revision" w:semiHidden="1"/>
-    <w:lsdException w:name="List Paragraph" w:uiPriority="34" w:qFormat="1"/>
-    <w:lsdException w:name="Quote" w:uiPriority="29" w:qFormat="1"/>
-    <w:lsdException w:name="Intense Quote" w:uiPriority="30" w:qFormat="1"/>
-    <w:lsdException w:name="Medium List 2 Accent 1" w:uiPriority="66"/>
-    <w:lsdException w:name="Medium Grid 1 Accent 1" w:uiPriority="67"/>
-    <w:lsdException w:name="Medium Grid 2 Accent 1" w:uiPriority="68"/>
-    <w:lsdException w:name="Medium Grid 3 Accent 1" w:uiPriority="69"/>
-    <w:lsdException w:name="Dark List Accent 1" w:uiPriority="70"/>
-    <w:lsdException w:name="Colorful Shading Accent 1" w:uiPriority="71"/>
-    <w:lsdException w:name="Colorful List Accent 1" w:uiPriority="72"/>
-    <w:lsdException w:name="Colorful Grid Accent 1" w:uiPriority="73"/>
-    <w:lsdException w:name="Light Shading Accent 2" w:uiPriority="60"/>
-    <w:lsdException w:name="Light List Accent 2" w:uiPriority="61"/>
-    <w:lsdException w:name="Light Grid Accent 2" w:uiPriority="62"/>
-    <w:lsdException w:name="Medium Shading 1 Accent 2" w:uiPriority="63"/>
-    <w:lsdException w:name="Medium Shading 2 Accent 2" w:uiPriority="64"/>
-    <w:lsdException w:name="Medium List 1 Accent 2" w:uiPriority="65"/>
-    <w:lsdException w:name="Medium List 2 Accent 2" w:uiPriority="66"/>
-    <w:lsdException w:name="Medium Grid 1 Accent 2" w:uiPriority="67"/>
-    <w:lsdException w:name="Medium Grid 2 Accent 2" w:uiPriority="68"/>
-    <w:lsdException w:name="Medium Grid 3 Accent 2" w:uiPriority="69"/>
-    <w:lsdException w:name="Dark List Accent 2" w:uiPriority="70"/>
-    <w:lsdException w:name="Colorful Shading Accent 2" w:uiPriority="71"/>
-    <w:lsdException w:name="Colorful List Accent 2" w:uiPriority="72"/>
-    <w:lsdException w:name="Colorful Grid Accent 2" w:uiPriority="73"/>
-    <w:lsdException w:name="Light Shading Accent 3" w:uiPriority="60"/>
-    <w:lsdException w:name="Light List Accent 3" w:uiPriority="61"/>
-    <w:lsdException w:name="Light Grid Accent 3" w:uiPriority="62"/>
-    <w:lsdException w:name="Medium Shading 1 Accent 3" w:uiPriority="63"/>
-    <w:lsdException w:name="Medium Shading 2 Accent 3" w:uiPriority="64"/>
-    <w:lsdException w:name="Medium List 1 Accent 3" w:uiPriority="65"/>
-    <w:lsdException w:name="Medium List 2 Accent 3" w:uiPriority="66"/>
-    <w:lsdException w:name="Medium Grid 1 Accent 3" w:uiPriority="67"/>
-    <w:lsdException w:name="Medium Grid 2 Accent 3" w:uiPriority="68"/>
-    <w:lsdException w:name="Medium Grid 3 Accent 3" w:uiPriority="69"/>
-    <w:lsdException w:name="Dark List Accent 3" w:uiPriority="70"/>
-    <w:lsdException w:name="Colorful Shading Accent 3" w:uiPriority="71"/>
-    <w:lsdException w:name="Colorful List Accent 3" w:uiPriority="72"/>
-    <w:lsdException w:name="Colorful Grid Accent 3" w:uiPriority="73"/>
-    <w:lsdException w:name="Light Shading Accent 4" w:uiPriority="60"/>
-    <w:lsdException w:name="Light List Accent 4" w:uiPriority="61"/>
-    <w:lsdException w:name="Light Grid Accent 4" w:uiPriority="62"/>
-    <w:lsdException w:name="Medium Shading 1 Accent 4" w:uiPriority="63"/>
-    <w:lsdException w:name="Medium Shading 2 Accent 4" w:uiPriority="64"/>
-    <w:lsdException w:name="Medium List 1 Accent 4" w:uiPriority="65"/>
-    <w:lsdException w:name="Medium List 2 Accent 4" w:uiPriority="66"/>
-    <w:lsdException w:name="Medium Grid 1 Accent 4" w:uiPriority="67"/>
-    <w:lsdException w:name="Medium Grid 2 Accent 4" w:uiPriority="68"/>
-    <w:lsdException w:name="Medium Grid 3 Accent 4" w:uiPriority="69"/>
-    <w:lsdException w:name="Dark List Accent 4" w:uiPriority="70"/>
-    <w:lsdException w:name="Colorful Shading Accent 4" w:uiPriority="71"/>
-    <w:lsdException w:name="Colorful List Accent 4" w:uiPriority="72"/>
-    <w:lsdException w:name="Colorful Grid Accent 4" w:uiPriority="73"/>
-    <w:lsdException w:name="Light Shading Accent 5" w:uiPriority="60"/>
-    <w:lsdException w:name="Light List Accent 5" w:uiPriority="61"/>
-    <w:lsdException w:name="Light Grid Accent 5" w:uiPriority="62"/>
-    <w:lsdException w:name="Medium Shading 1 Accent 5" w:uiPriority="63"/>
-    <w:lsdException w:name="Medium Shading 2 Accent 5" w:uiPriority="64"/>
-    <w:lsdException w:name="Medium List 1 Accent 5" w:uiPriority="65"/>
-    <w:lsdException w:name="Medium List 2 Accent 5" w:uiPriority="66"/>
-    <w:lsdException w:name="Medium Grid 1 Accent 5" w:uiPriority="67"/>
-    <w:lsdException w:name="Medium Grid 2 Accent 5" w:uiPriority="68"/>
-    <w:lsdException w:name="Medium Grid 3 Accent 5" w:uiPriority="69"/>
-    <w:lsdException w:name="Dark List Accent 5" w:uiPriority="70"/>
-    <w:lsdException w:name="Colorful Shading Accent 5" w:uiPriority="71"/>
-    <w:lsdException w:name="Colorful List Accent 5" w:uiPriority="72"/>
-    <w:lsdException w:name="Colorful Grid Accent 5" w:uiPriority="73"/>
-    <w:lsdException w:name="Light Shading Accent 6" w:uiPriority="60"/>
-    <w:lsdException w:name="Light List Accent 6" w:uiPriority="61"/>
-    <w:lsdException w:name="Light Grid Accent 6" w:uiPriority="62"/>
-    <w:lsdException w:name="Medium Shading 1 Accent 6" w:uiPriority="63"/>
-    <w:lsdException w:name="Medium Shading 2 Accent 6" w:uiPriority="64"/>
-    <w:lsdException w:name="Medium List 1 Accent 6" w:uiPriority="65"/>
-    <w:lsdException w:name="Medium List 2 Accent 6" w:uiPriority="66"/>
-    <w:lsdException w:name="Medium Grid 1 Accent 6" w:uiPriority="67"/>
-    <w:lsdException w:name="Medium Grid 2 Accent 6" w:uiPriority="68"/>
-    <w:lsdException w:name="Medium Grid 3 Accent 6" w:uiPriority="69"/>
-    <w:lsdException w:name="Dark List Accent 6" w:uiPriority="70"/>
-    <w:lsdException w:name="Colorful Shading Accent 6" w:uiPriority="71"/>
-    <w:lsdException w:name="Colorful List Accent 6" w:uiPriority="72"/>
-    <w:lsdException w:name="Colorful Grid Accent 6" w:uiPriority="73"/>
-    <w:lsdException w:name="Subtle Emphasis" w:uiPriority="19" w:qFormat="1"/>
-    <w:lsdException w:name="Intense Emphasis" w:uiPriority="21" w:qFormat="1"/>
-    <w:lsdException w:name="Subtle Reference" w:uiPriority="31" w:qFormat="1"/>
-    <w:lsdException w:name="Intense Reference" w:uiPriority="32" w:qFormat="1"/>
-    <w:lsdException w:name="Book Title" w:uiPriority="33" w:qFormat="1"/>
-    <w:lsdException w:name="Bibliography" w:semiHidden="1" w:uiPriority="37" w:unhideWhenUsed="1"/>
-    <w:lsdException w:name="TOC Heading" w:semiHidden="1" w:uiPriority="39" w:unhideWhenUsed="1" w:qFormat="1"/>
-    <w:lsdException w:name="Plain Table 1" w:uiPriority="41"/>
-    <w:lsdException w:name="Plain Table 2" w:uiPriority="42"/>
-    <w:lsdException w:name="Plain Table 3" w:uiPriority="43"/>
-    <w:lsdException w:name="Plain Table 4" w:uiPriority="44"/>
-    <w:lsdException w:name="Plain Table 5" w:uiPriority="45"/>
-    <w:lsdException w:name="Grid Table Light" w:uiPriority="40"/>
-    <w:lsdException w:name="Grid Table 1 Light" w:uiPriority="46"/>
-    <w:lsdException w:name="Grid Table 2" w:uiPriority="47"/>
-    <w:lsdException w:name="Grid Table 3" w:uiPriority="48"/>
-    <w:lsdException w:name="Grid Table 4" w:uiPriority="49"/>
-    <w:lsdException w:name="Grid Table 5 Dark" w:uiPriority="50"/>
-    <w:lsdException w:name="Grid Table 6 Colorful" w:uiPriority="51"/>
-    <w:lsdException w:name="Grid Table 7 Colorful" w:uiPriority="52"/>
-    <w:lsdException w:name="Grid Table 1 Light Accent 1" w:uiPriority="46"/>
-    <w:lsdException w:name="Grid Table 2 Accent 1" w:uiPriority="47"/>
-    <w:lsdException w:name="Grid Table 3 Accent 1" w:uiPriority="48"/>
-    <w:lsdException w:name="Grid Table 4 Accent 1" w:uiPriority="49"/>
-    <w:lsdException w:name="Grid Table 5 Dark Accent 1" w:uiPriority="50"/>
-    <w:lsdException w:name="Grid Table 6 Colorful Accent 1" w:uiPriority="51"/>
-    <w:lsdException w:name="Grid Table 7 Colorful Accent 1" w:uiPriority="52"/>
-    <w:lsdException w:name="Grid Table 1 Light Accent 2" w:uiPriority="46"/>
-    <w:lsdException w:name="Grid Table 2 Accent 2" w:uiPriority="47"/>
-    <w:lsdException w:name="Grid Table 3 Accent 2" w:uiPriority="48"/>
-    <w:lsdException w:name="Grid Table 4 Accent 2" w:uiPriority="49"/>
-    <w:lsdException w:name="Grid Table 5 Dark Accent 2" w:uiPriority="50"/>
-    <w:lsdException w:name="Grid Table 6 Colorful Accent 2" w:uiPriority="51"/>
-    <w:lsdException w:name="Grid Table 7 Colorful Accent 2" w:uiPriority="52"/>
-    <w:lsdException w:name="Grid Table 1 Light Accent 3" w:uiPriority="46"/>
-    <w:lsdException w:name="Grid Table 2 Accent 3" w:uiPriority="47"/>
-    <w:lsdException w:name="Grid Table 3 Accent 3" w:uiPriority="48"/>
-    <w:lsdException w:name="Grid Table 4 Accent 3" w:uiPriority="49"/>
-    <w:lsdException w:name="Grid Table 5 Dark Accent 3" w:uiPriority="50"/>
-    <w:lsdException w:name="Grid Table 6 Colorful Accent 3" w:uiPriority="51"/>
-    <w:lsdException w:name="Grid Table 7 Colorful Accent 3" w:uiPriority="52"/>
-    <w:lsdException w:name="Grid Table 1 Light Accent 4" w:uiPriority="46"/>
-    <w:lsdException w:name="Grid Table 2 Accent 4" w:uiPriority="47"/>
-    <w:lsdException w:name="Grid Table 3 Accent 4" w:uiPriority="48"/>
-    <w:lsdException w:name="Grid Table 4 Accent 4" w:uiPriority="49"/>
-    <w:lsdException w:name="Grid Table 5 Dark Accent 4" w:uiPriority="50"/>
-    <w:lsdException w:name="Grid Table 6 Colorful Accent 4" w:uiPriority="51"/>
-    <w:lsdException w:name="Grid Table 7 Colorful Accent 4" w:uiPriority="52"/>
-    <w:lsdException w:name="Grid Table 1 Light Accent 5" w:uiPriority="46"/>
-    <w:lsdException w:name="Grid Table 2 Accent 5" w:uiPriority="47"/>
-    <w:lsdException w:name="Grid Table 3 Accent 5" w:uiPriority="48"/>
-    <w:lsdException w:name="Grid Table 4 Accent 5" w:uiPriority="49"/>
-    <w:lsdException w:name="Grid Table 5 Dark Accent 5" w:uiPriority="50"/>
-    <w:lsdException w:name="Grid Table 6 Colorful Accent 5" w:uiPriority="51"/>
-    <w:lsdException w:name="Grid Table 7 Colorful Accent 5" w:uiPriority="52"/>
-    <w:lsdException w:name="Grid Table 1 Light Accent 6" w:uiPriority="46"/>
-    <w:lsdException w:name="Grid Table 2 Accent 6" w:uiPriority="47"/>
-    <w:lsdException w:name="Grid Table 3 Accent 6" w:uiPriority="48"/>
-    <w:lsdException w:name="Grid Table 4 Accent 6" w:uiPriority="49"/>
-    <w:lsdException w:name="Grid Table 5 Dark Accent 6" w:uiPriority="50"/>
-    <w:lsdException w:name="Grid Table 6 Colorful Accent 6" w:uiPriority="51"/>
-    <w:lsdException w:name="Grid Table 7 Colorful Accent 6" w:uiPriority="52"/>
-    <w:lsdException w:name="List Table 1 Light" w:uiPriority="46"/>
-    <w:lsdException w:name="List Table 2" w:uiPriority="47"/>
-    <w:lsdException w:name="List Table 3" w:uiPriority="48"/>
-    <w:lsdException w:name="List Table 4" w:uiPriority="49"/>
-    <w:lsdException w:name="List Table 5 Dark" w:uiPriority="50"/>
-    <w:lsdException w:name="List Table 6 Colorful" w:uiPriority="51"/>
-    <w:lsdException w:name="List Table 7 Colorful" w:uiPriority="52"/>
-    <w:lsdException w:name="List Table 1 Light Accent 1" w:uiPriority="46"/>
-    <w:lsdException w:name="List Table 2 Accent 1" w:uiPriority="47"/>
-    <w:lsdException w:name="List Table 3 Accent 1" w:uiPriority="48"/>
-    <w:lsdException w:name="List Table 4 Accent 1" w:uiPriority="49"/>
-    <w:lsdException w:name="List Table 5 Dark Accent 1" w:uiPriority="50"/>
-    <w:lsdException w:name="List Table 6 Colorful Accent 1" w:uiPriority="51"/>
-    <w:lsdException w:name="List Table 7 Colorful Accent 1" w:uiPriority="52"/>
-    <w:lsdException w:name="List Table 1 Light Accent 2" w:uiPriority="46"/>
-    <w:lsdException w:name="List Table 2 Accent 2" w:uiPriority="47"/>
-    <w:lsdException w:name="List Table 3 Accent 2" w:uiPriority="48"/>
-    <w:lsdException w:name="List Table 4 Accent 2" w:uiPriority="49"/>
-    <w:lsdException w:name="List Table 5 Dark Accent 2" w:uiPriority="50"/>
-    <w:lsdException w:name="List Table 6 Colorful Accent 2" w:uiPriority="51"/>
-    <w:lsdException w:name="List Table 7 Colorful Accent 2" w:uiPriority="52"/>
-    <w:lsdException w:name="List Table 1 Light Accent 3" w:uiPriority="46"/>
-    <w:lsdException w:name="List Table 2 Accent 3" w:uiPriority="47"/>
-    <w:lsdException w:name="List Table 3 Accent 3" w:uiPriority="48"/>
-    <w:lsdException w:name="List Table 4 Accent 3" w:uiPriority="49"/>
-    <w:lsdException w:name="List Table 5 Dark Accent 3" w:uiPriority="50"/>
-    <w:lsdException w:name="List Table 6 Colorful Accent 3" w:uiPriority="51"/>
-    <w:lsdException w:name="List Table 7 Colorful Accent 3" w:uiPriority="52"/>
-    <w:lsdException w:name="List Table 1 Light Accent 4" w:uiPriority="46"/>
-    <w:lsdException w:name="List Table 2 Accent 4" w:uiPriority="47"/>
-    <w:lsdException w:name="List Table 3 Accent 4" w:uiPriority="48"/>
-    <w:lsdException w:name="List Table 4 Accent 4" w:uiPriority="49"/>
-    <w:lsdException w:name="List Table 5 Dark Accent 4" w:uiPriority="50"/>
-    <w:lsdException w:name="List Table 6 Colorful Accent 4" w:uiPriority="51"/>
-    <w:lsdException w:name="List Table 7 Colorful Accent 4" w:uiPriority="52"/>
-    <w:lsdException w:name="List Table 1 Light Accent 5" w:uiPriority="46"/>
-    <w:lsdException w:name="List Table 2 Accent 5" w:uiPriority="47"/>
-    <w:lsdException w:name="List Table 3 Accent 5" w:uiPriority="48"/>
-    <w:lsdException w:name="List Table 4 Accent 5" w:uiPriority="49"/>
-    <w:lsdException w:name="List Table 5 Dark Accent 5" w:uiPriority="50"/>
-    <w:lsdException w:name="List Table 6 Colorful Accent 5" w:uiPriority="51"/>
-    <w:lsdException w:name="List Table 7 Colorful Accent 5" w:uiPriority="52"/>
-    <w:lsdException w:name="List Table 1 Light Accent 6" w:uiPriority="46"/>
-    <w:lsdException w:name="List Table 2 Accent 6" w:uiPriority="47"/>
-    <w:lsdException w:name="List Table 3 Accent 6" w:uiPriority="48"/>
-    <w:lsdException w:name="List Table 4 Accent 6" w:uiPriority="49"/>
-    <w:lsdException w:name="List Table 5 Dark Accent 6" w:uiPriority="50"/>
-    <w:lsdException w:name="List Table 6 Colorful Accent 6" w:uiPriority="51"/>
-    <w:lsdException w:name="List Table 7 Colorful Accent 6" w:uiPriority="52"/>
-    <w:lsdException w:name="Mention" w:semiHidden="1" w:unhideWhenUsed="1"/>
-    <w:lsdException w:name="Smart Hyperlink" w:semiHidden="1" w:unhideWhenUsed="1"/>
-    <w:lsdException w:name="Hashtag" w:semiHidden="1" w:unhideWhenUsed="1"/>
-    <w:lsdException w:name="Unresolved Mention" w:semiHidden="1" w:unhideWhenUsed="1"/>
-    <w:lsdException w:name="Smart Link" w:semiHidden="1" w:unhideWhenUsed="1"/>
+  <w:latentStyles w:defLockedState="0" w:defUIPriority="99" w:defSemiHidden="1" w:defUnhideWhenUsed="1" w:defQFormat="0" w:count="267">
+    <w:lsdException w:name="Normal" w:semiHidden="0" w:uiPriority="0" w:unhideWhenUsed="0" w:qFormat="1"/>
+    <w:lsdException w:name="heading 1" w:semiHidden="0" w:uiPriority="0" w:unhideWhenUsed="0" w:qFormat="1"/>
+    <w:lsdException w:name="heading 2" w:uiPriority="0" w:qFormat="1"/>
+    <w:lsdException w:name="heading 3" w:uiPriority="0" w:qFormat="1"/>
+    <w:lsdException w:name="heading 4" w:uiPriority="9" w:qFormat="1"/>
+    <w:lsdException w:name="heading 5" w:uiPriority="9" w:qFormat="1"/>
+    <w:lsdException w:name="heading 6" w:uiPriority="9" w:qFormat="1"/>
+    <w:lsdException w:name="heading 7" w:uiPriority="9" w:qFormat="1"/>
+    <w:lsdException w:name="heading 8" w:uiPriority="9" w:qFormat="1"/>
+    <w:lsdException w:name="heading 9" w:uiPriority="9" w:qFormat="1"/>
+    <w:lsdException w:name="toc 1" w:uiPriority="39" w:qFormat="1"/>
+    <w:lsdException w:name="toc 2" w:uiPriority="39" w:qFormat="1"/>
+    <w:lsdException w:name="toc 3" w:uiPriority="39" w:qFormat="1"/>
+    <w:lsdException w:name="toc 4" w:uiPriority="39"/>
+    <w:lsdException w:name="toc 5" w:uiPriority="39"/>
+    <w:lsdException w:name="toc 6" w:uiPriority="39"/>
+    <w:lsdException w:name="toc 7" w:uiPriority="39"/>
+    <w:lsdException w:name="toc 8" w:uiPriority="39"/>
+    <w:lsdException w:name="toc 9" w:uiPriority="39"/>
+    <w:lsdException w:name="footer" w:uiPriority="0"/>
+    <w:lsdException w:name="caption" w:uiPriority="0" w:qFormat="1"/>
+    <w:lsdException w:name="Title" w:semiHidden="0" w:uiPriority="10" w:unhideWhenUsed="0" w:qFormat="1"/>
+    <w:lsdException w:name="Default Paragraph Font" w:uiPriority="1"/>
+    <w:lsdException w:name="Subtitle" w:semiHidden="0" w:uiPriority="11" w:unhideWhenUsed="0" w:qFormat="1"/>
+    <w:lsdException w:name="Strong" w:semiHidden="0" w:uiPriority="22" w:unhideWhenUsed="0" w:qFormat="1"/>
+    <w:lsdException w:name="Emphasis" w:semiHidden="0" w:uiPriority="20" w:unhideWhenUsed="0" w:qFormat="1"/>
+    <w:lsdException w:name="Table Grid" w:semiHidden="0" w:uiPriority="59" w:unhideWhenUsed="0"/>
+    <w:lsdException w:name="Placeholder Text" w:unhideWhenUsed="0"/>
+    <w:lsdException w:name="No Spacing" w:semiHidden="0" w:uiPriority="1" w:unhideWhenUsed="0" w:qFormat="1"/>
+    <w:lsdException w:name="Light Shading" w:semiHidden="0" w:uiPriority="60" w:unhideWhenUsed="0"/>
+    <w:lsdException w:name="Light List" w:semiHidden="0" w:uiPriority="61" w:unhideWhenUsed="0"/>
+    <w:lsdException w:name="Light Grid" w:semiHidden="0" w:uiPriority="62" w:unhideWhenUsed="0"/>
+    <w:lsdException w:name="Medium Shading 1" w:semiHidden="0" w:uiPriority="63" w:unhideWhenUsed="0"/>
+    <w:lsdException w:name="Medium Shading 2" w:semiHidden="0" w:uiPriority="64" w:unhideWhenUsed="0"/>
+    <w:lsdException w:name="Medium List 1" w:semiHidden="0" w:uiPriority="65" w:unhideWhenUsed="0"/>
+    <w:lsdException w:name="Medium List 2" w:semiHidden="0" w:uiPriority="66" w:unhideWhenUsed="0"/>
+    <w:lsdException w:name="Medium Grid 1" w:semiHidden="0" w:uiPriority="67" w:unhideWhenUsed="0"/>
+    <w:lsdException w:name="Medium Grid 2" w:semiHidden="0" w:uiPriority="68" w:unhideWhenUsed="0"/>
+    <w:lsdException w:name="Medium Grid 3" w:semiHidden="0" w:uiPriority="69" w:unhideWhenUsed="0"/>
+    <w:lsdException w:name="Dark List" w:semiHidden="0" w:uiPriority="70" w:unhideWhenUsed="0"/>
+    <w:lsdException w:name="Colorful Shading" w:semiHidden="0" w:uiPriority="71" w:unhideWhenUsed="0"/>
+    <w:lsdException w:name="Colorful List" w:semiHidden="0" w:uiPriority="72" w:unhideWhenUsed="0"/>
+    <w:lsdException w:name="Colorful Grid" w:semiHidden="0" w:uiPriority="73" w:unhideWhenUsed="0"/>
+    <w:lsdException w:name="Light Shading Accent 1" w:semiHidden="0" w:uiPriority="60" w:unhideWhenUsed="0"/>
+    <w:lsdException w:name="Light List Accent 1" w:semiHidden="0" w:uiPriority="61" w:unhideWhenUsed="0"/>
+    <w:lsdException w:name="Light Grid Accent 1" w:semiHidden="0" w:uiPriority="62" w:unhideWhenUsed="0"/>
+    <w:lsdException w:name="Medium Shading 1 Accent 1" w:semiHidden="0" w:uiPriority="63" w:unhideWhenUsed="0"/>
+    <w:lsdException w:name="Medium Shading 2 Accent 1" w:semiHidden="0" w:uiPriority="64" w:unhideWhenUsed="0"/>
+    <w:lsdException w:name="Medium List 1 Accent 1" w:semiHidden="0" w:uiPriority="65" w:unhideWhenUsed="0"/>
+    <w:lsdException w:name="Revision" w:unhideWhenUsed="0"/>
+    <w:lsdException w:name="List Paragraph" w:semiHidden="0" w:uiPriority="34" w:unhideWhenUsed="0" w:qFormat="1"/>
+    <w:lsdException w:name="Quote" w:semiHidden="0" w:uiPriority="29" w:unhideWhenUsed="0" w:qFormat="1"/>
+    <w:lsdException w:name="Intense Quote" w:semiHidden="0" w:uiPriority="30" w:unhideWhenUsed="0" w:qFormat="1"/>
+    <w:lsdException w:name="Medium List 2 Accent 1" w:semiHidden="0" w:uiPriority="66" w:unhideWhenUsed="0"/>
+    <w:lsdException w:name="Medium Grid 1 Accent 1" w:semiHidden="0" w:uiPriority="67" w:unhideWhenUsed="0"/>
+    <w:lsdException w:name="Medium Grid 2 Accent 1" w:semiHidden="0" w:uiPriority="68" w:unhideWhenUsed="0"/>
+    <w:lsdException w:name="Medium Grid 3 Accent 1" w:semiHidden="0" w:uiPriority="69" w:unhideWhenUsed="0"/>
+    <w:lsdException w:name="Dark List Accent 1" w:semiHidden="0" w:uiPriority="70" w:unhideWhenUsed="0"/>
+    <w:lsdException w:name="Colorful Shading Accent 1" w:semiHidden="0" w:uiPriority="71" w:unhideWhenUsed="0"/>
+    <w:lsdException w:name="Colorful List Accent 1" w:semiHidden="0" w:uiPriority="72" w:unhideWhenUsed="0"/>
+    <w:lsdException w:name="Colorful Grid Accent 1" w:semiHidden="0" w:uiPriority="73" w:unhideWhenUsed="0"/>
+    <w:lsdException w:name="Light Shading Accent 2" w:semiHidden="0" w:uiPriority="60" w:unhideWhenUsed="0"/>
+    <w:lsdException w:name="Light List Accent 2" w:semiHidden="0" w:uiPriority="61" w:unhideWhenUsed="0"/>
+    <w:lsdException w:name="Light Grid Accent 2" w:semiHidden="0" w:uiPriority="62" w:unhideWhenUsed="0"/>
+    <w:lsdException w:name="Medium Shading 1 Accent 2" w:semiHidden="0" w:uiPriority="63" w:unhideWhenUsed="0"/>
+    <w:lsdException w:name="Medium Shading 2 Accent 2" w:semiHidden="0" w:uiPriority="64" w:unhideWhenUsed="0"/>
+    <w:lsdException w:name="Medium List 1 Accent 2" w:semiHidden="0" w:uiPriority="65" w:unhideWhenUsed="0"/>
+    <w:lsdException w:name="Medium List 2 Accent 2" w:semiHidden="0" w:uiPriority="66" w:unhideWhenUsed="0"/>
+    <w:lsdException w:name="Medium Grid 1 Accent 2" w:semiHidden="0" w:uiPriority="67" w:unhideWhenUsed="0"/>
+    <w:lsdException w:name="Medium Grid 2 Accent 2" w:semiHidden="0" w:uiPriority="68" w:unhideWhenUsed="0"/>
+    <w:lsdException w:name="Medium Grid 3 Accent 2" w:semiHidden="0" w:uiPriority="69" w:unhideWhenUsed="0"/>
+    <w:lsdException w:name="Dark List Accent 2" w:semiHidden="0" w:uiPriority="70" w:unhideWhenUsed="0"/>
+    <w:lsdException w:name="Colorful Shading Accent 2" w:semiHidden="0" w:uiPriority="71" w:unhideWhenUsed="0"/>
+    <w:lsdException w:name="Colorful List Accent 2" w:semiHidden="0" w:uiPriority="72" w:unhideWhenUsed="0"/>
+    <w:lsdException w:name="Colorful Grid Accent 2" w:semiHidden="0" w:uiPriority="73" w:unhideWhenUsed="0"/>
+    <w:lsdException w:name="Light Shading Accent 3" w:semiHidden="0" w:uiPriority="60" w:unhideWhenUsed="0"/>
+    <w:lsdException w:name="Light List Accent 3" w:semiHidden="0" w:uiPriority="61" w:unhideWhenUsed="0"/>
+    <w:lsdException w:name="Light Grid Accent 3" w:semiHidden="0" w:uiPriority="62" w:unhideWhenUsed="0"/>
+    <w:lsdException w:name="Medium Shading 1 Accent 3" w:semiHidden="0" w:uiPriority="63" w:unhideWhenUsed="0"/>
+    <w:lsdException w:name="Medium Shading 2 Accent 3" w:semiHidden="0" w:uiPriority="64" w:unhideWhenUsed="0"/>
+    <w:lsdException w:name="Medium List 1 Accent 3" w:semiHidden="0" w:uiPriority="65" w:unhideWhenUsed="0"/>
+    <w:lsdException w:name="Medium List 2 Accent 3" w:semiHidden="0" w:uiPriority="66" w:unhideWhenUsed="0"/>
+    <w:lsdException w:name="Medium Grid 1 Accent 3" w:semiHidden="0" w:uiPriority="67" w:unhideWhenUsed="0"/>
+    <w:lsdException w:name="Medium Grid 2 Accent 3" w:semiHidden="0" w:uiPriority="68" w:unhideWhenUsed="0"/>
+    <w:lsdException w:name="Medium Grid 3 Accent 3" w:semiHidden="0" w:uiPriority="69" w:unhideWhenUsed="0"/>
+    <w:lsdException w:name="Dark List Accent 3" w:semiHidden="0" w:uiPriority="70" w:unhideWhenUsed="0"/>
+    <w:lsdException w:name="Colorful Shading Accent 3" w:semiHidden="0" w:uiPriority="71" w:unhideWhenUsed="0"/>
+    <w:lsdException w:name="Colorful List Accent 3" w:semiHidden="0" w:uiPriority="72" w:unhideWhenUsed="0"/>
+    <w:lsdException w:name="Colorful Grid Accent 3" w:semiHidden="0" w:uiPriority="73" w:unhideWhenUsed="0"/>
+    <w:lsdException w:name="Light Shading Accent 4" w:semiHidden="0" w:uiPriority="60" w:unhideWhenUsed="0"/>
+    <w:lsdException w:name="Light List Accent 4" w:semiHidden="0" w:uiPriority="61" w:unhideWhenUsed="0"/>
+    <w:lsdException w:name="Light Grid Accent 4" w:semiHidden="0" w:uiPriority="62" w:unhideWhenUsed="0"/>
+    <w:lsdException w:name="Medium Shading 1 Accent 4" w:semiHidden="0" w:uiPriority="63" w:unhideWhenUsed="0"/>
+    <w:lsdException w:name="Medium Shading 2 Accent 4" w:semiHidden="0" w:uiPriority="64" w:unhideWhenUsed="0"/>
+    <w:lsdException w:name="Medium List 1 Accent 4" w:semiHidden="0" w:uiPriority="65" w:unhideWhenUsed="0"/>
+    <w:lsdException w:name="Medium List 2 Accent 4" w:semiHidden="0" w:uiPriority="66" w:unhideWhenUsed="0"/>
+    <w:lsdException w:name="Medium Grid 1 Accent 4" w:semiHidden="0" w:uiPriority="67" w:unhideWhenUsed="0"/>
+    <w:lsdException w:name="Medium Grid 2 Accent 4" w:semiHidden="0" w:uiPriority="68" w:unhideWhenUsed="0"/>
+    <w:lsdException w:name="Medium Grid 3 Accent 4" w:semiHidden="0" w:uiPriority="69" w:unhideWhenUsed="0"/>
+    <w:lsdException w:name="Dark List Accent 4" w:semiHidden="0" w:uiPriority="70" w:unhideWhenUsed="0"/>
+    <w:lsdException w:name="Colorful Shading Accent 4" w:semiHidden="0" w:uiPriority="71" w:unhideWhenUsed="0"/>
+    <w:lsdException w:name="Colorful List Accent 4" w:semiHidden="0" w:uiPriority="72" w:unhideWhenUsed="0"/>
+    <w:lsdException w:name="Colorful Grid Accent 4" w:semiHidden="0" w:uiPriority="73" w:unhideWhenUsed="0"/>
+    <w:lsdException w:name="Light Shading Accent 5" w:semiHidden="0" w:uiPriority="60" w:unhideWhenUsed="0"/>
+    <w:lsdException w:name="Light List Accent 5" w:semiHidden="0" w:uiPriority="61" w:unhideWhenUsed="0"/>
+    <w:lsdException w:name="Light Grid Accent 5" w:semiHidden="0" w:uiPriority="62" w:unhideWhenUsed="0"/>
+    <w:lsdException w:name="Medium Shading 1 Accent 5" w:semiHidden="0" w:uiPriority="63" w:unhideWhenUsed="0"/>
+    <w:lsdException w:name="Medium Shading 2 Accent 5" w:semiHidden="0" w:uiPriority="64" w:unhideWhenUsed="0"/>
+    <w:lsdException w:name="Medium List 1 Accent 5" w:semiHidden="0" w:uiPriority="65" w:unhideWhenUsed="0"/>
+    <w:lsdException w:name="Medium List 2 Accent 5" w:semiHidden="0" w:uiPriority="66" w:unhideWhenUsed="0"/>
+    <w:lsdException w:name="Medium Grid 1 Accent 5" w:semiHidden="0" w:uiPriority="67" w:unhideWhenUsed="0"/>
+    <w:lsdException w:name="Medium Grid 2 Accent 5" w:semiHidden="0" w:uiPriority="68" w:unhideWhenUsed="0"/>
+    <w:lsdException w:name="Medium Grid 3 Accent 5" w:semiHidden="0" w:uiPriority="69" w:unhideWhenUsed="0"/>
+    <w:lsdException w:name="Dark List Accent 5" w:semiHidden="0" w:uiPriority="70" w:unhideWhenUsed="0"/>
+    <w:lsdException w:name="Colorful Shading Accent 5" w:semiHidden="0" w:uiPriority="71" w:unhideWhenUsed="0"/>
+    <w:lsdException w:name="Colorful List Accent 5" w:semiHidden="0" w:uiPriority="72" w:unhideWhenUsed="0"/>
+    <w:lsdException w:name="Colorful Grid Accent 5" w:semiHidden="0" w:uiPriority="73" w:unhideWhenUsed="0"/>
+    <w:lsdException w:name="Light Shading Accent 6" w:semiHidden="0" w:uiPriority="60" w:unhideWhenUsed="0"/>
+    <w:lsdException w:name="Light List Accent 6" w:semiHidden="0" w:uiPriority="61" w:unhideWhenUsed="0"/>
+    <w:lsdException w:name="Light Grid Accent 6" w:semiHidden="0" w:uiPriority="62" w:unhideWhenUsed="0"/>
+    <w:lsdException w:name="Medium Shading 1 Accent 6" w:semiHidden="0" w:uiPriority="63" w:unhideWhenUsed="0"/>
+    <w:lsdException w:name="Medium Shading 2 Accent 6" w:semiHidden="0" w:uiPriority="64" w:unhideWhenUsed="0"/>
+    <w:lsdException w:name="Medium List 1 Accent 6" w:semiHidden="0" w:uiPriority="65" w:unhideWhenUsed="0"/>
+    <w:lsdException w:name="Medium List 2 Accent 6" w:semiHidden="0" w:uiPriority="66" w:unhideWhenUsed="0"/>
+    <w:lsdException w:name="Medium Grid 1 Accent 6" w:semiHidden="0" w:uiPriority="67" w:unhideWhenUsed="0"/>
+    <w:lsdException w:name="Medium Grid 2 Accent 6" w:semiHidden="0" w:uiPriority="68" w:unhideWhenUsed="0"/>
+    <w:lsdException w:name="Medium Grid 3 Accent 6" w:semiHidden="0" w:uiPriority="69" w:unhideWhenUsed="0"/>
+    <w:lsdException w:name="Dark List Accent 6" w:semiHidden="0" w:uiPriority="70" w:unhideWhenUsed="0"/>
+    <w:lsdException w:name="Colorful Shading Accent 6" w:semiHidden="0" w:uiPriority="71" w:unhideWhenUsed="0"/>
+    <w:lsdException w:name="Colorful List Accent 6" w:semiHidden="0" w:uiPriority="72" w:unhideWhenUsed="0"/>
+    <w:lsdException w:name="Colorful Grid Accent 6" w:semiHidden="0" w:uiPriority="73" w:unhideWhenUsed="0"/>
+    <w:lsdException w:name="Subtle Emphasis" w:semiHidden="0" w:uiPriority="19" w:unhideWhenUsed="0" w:qFormat="1"/>
+    <w:lsdException w:name="Intense Emphasis" w:semiHidden="0" w:uiPriority="21" w:unhideWhenUsed="0" w:qFormat="1"/>
+    <w:lsdException w:name="Subtle Reference" w:semiHidden="0" w:uiPriority="31" w:unhideWhenUsed="0" w:qFormat="1"/>
+    <w:lsdException w:name="Intense Reference" w:semiHidden="0" w:uiPriority="32" w:unhideWhenUsed="0" w:qFormat="1"/>
+    <w:lsdException w:name="Book Title" w:semiHidden="0" w:uiPriority="33" w:unhideWhenUsed="0" w:qFormat="1"/>
+    <w:lsdException w:name="Bibliography" w:uiPriority="37"/>
+    <w:lsdException w:name="TOC Heading" w:uiPriority="39" w:qFormat="1"/>
   </w:latentStyles>
   <w:style w:type="paragraph" w:default="1" w:styleId="Normal">
     <w:name w:val="Normal"/>
@@ -4464,6 +4061,7 @@
     <w:uiPriority w:val="99"/>
     <w:semiHidden/>
     <w:unhideWhenUsed/>
+    <w:qFormat/>
     <w:tblPr>
       <w:tblInd w:w="0" w:type="dxa"/>
       <w:tblCellMar>
@@ -4678,6 +4276,7 @@
     <w:uiPriority w:val="59"/>
     <w:rsid w:val="00085B87"/>
     <w:tblPr>
+      <w:tblInd w:w="0" w:type="dxa"/>
       <w:tblBorders>
         <w:top w:val="single" w:sz="4" w:space="0" w:color="000000" w:themeColor="text1"/>
         <w:left w:val="single" w:sz="4" w:space="0" w:color="000000" w:themeColor="text1"/>
@@ -4686,6 +4285,12 @@
         <w:insideH w:val="single" w:sz="4" w:space="0" w:color="000000" w:themeColor="text1"/>
         <w:insideV w:val="single" w:sz="4" w:space="0" w:color="000000" w:themeColor="text1"/>
       </w:tblBorders>
+      <w:tblCellMar>
+        <w:top w:w="0" w:type="dxa"/>
+        <w:left w:w="108" w:type="dxa"/>
+        <w:bottom w:w="0" w:type="dxa"/>
+        <w:right w:w="108" w:type="dxa"/>
+      </w:tblCellMar>
     </w:tblPr>
   </w:style>
   <w:style w:type="character" w:styleId="FollowedHyperlink">
@@ -5580,7 +5185,7 @@
 </file>
 
 <file path=customXml/itemProps1.xml><?xml version="1.0" encoding="utf-8"?>
-<ds:datastoreItem xmlns:ds="http://schemas.openxmlformats.org/officeDocument/2006/customXml" ds:itemID="{717760C2-ED32-4329-8BDA-0959422AB60C}">
+<ds:datastoreItem xmlns:ds="http://schemas.openxmlformats.org/officeDocument/2006/customXml" ds:itemID="{5DA73F05-7B39-421B-9E89-CF249D59E2EB}">
   <ds:schemaRefs>
     <ds:schemaRef ds:uri="http://schemas.openxmlformats.org/officeDocument/2006/bibliography"/>
   </ds:schemaRefs>

</xml_diff>

<commit_message>
More input tax for cleanup.
</commit_message>
<xml_diff>
--- a/Documentation/AboutTAXTools.docx
+++ b/Documentation/AboutTAXTools.docx
@@ -1,6 +1,6 @@
 
 <file path=word/document.xml><?xml version="1.0" encoding="utf-8"?>
-<w:document xmlns:ve="http://schemas.openxmlformats.org/markup-compatibility/2006" xmlns:o="urn:schemas-microsoft-com:office:office" xmlns:r="http://schemas.openxmlformats.org/officeDocument/2006/relationships" xmlns:m="http://schemas.openxmlformats.org/officeDocument/2006/math" xmlns:v="urn:schemas-microsoft-com:vml" xmlns:wp="http://schemas.openxmlformats.org/drawingml/2006/wordprocessingDrawing" xmlns:w10="urn:schemas-microsoft-com:office:word" xmlns:w="http://schemas.openxmlformats.org/wordprocessingml/2006/main" xmlns:wne="http://schemas.microsoft.com/office/word/2006/wordml">
+<w:document xmlns:wpc="http://schemas.microsoft.com/office/word/2010/wordprocessingCanvas" xmlns:cx="http://schemas.microsoft.com/office/drawing/2014/chartex" xmlns:cx1="http://schemas.microsoft.com/office/drawing/2015/9/8/chartex" xmlns:cx2="http://schemas.microsoft.com/office/drawing/2015/10/21/chartex" xmlns:cx3="http://schemas.microsoft.com/office/drawing/2016/5/9/chartex" xmlns:cx4="http://schemas.microsoft.com/office/drawing/2016/5/10/chartex" xmlns:cx5="http://schemas.microsoft.com/office/drawing/2016/5/11/chartex" xmlns:cx6="http://schemas.microsoft.com/office/drawing/2016/5/12/chartex" xmlns:cx7="http://schemas.microsoft.com/office/drawing/2016/5/13/chartex" xmlns:cx8="http://schemas.microsoft.com/office/drawing/2016/5/14/chartex" xmlns:mc="http://schemas.openxmlformats.org/markup-compatibility/2006" xmlns:aink="http://schemas.microsoft.com/office/drawing/2016/ink" xmlns:am3d="http://schemas.microsoft.com/office/drawing/2017/model3d" xmlns:o="urn:schemas-microsoft-com:office:office" xmlns:oel="http://schemas.microsoft.com/office/2019/extlst" xmlns:r="http://schemas.openxmlformats.org/officeDocument/2006/relationships" xmlns:m="http://schemas.openxmlformats.org/officeDocument/2006/math" xmlns:v="urn:schemas-microsoft-com:vml" xmlns:wp14="http://schemas.microsoft.com/office/word/2010/wordprocessingDrawing" xmlns:wp="http://schemas.openxmlformats.org/drawingml/2006/wordprocessingDrawing" xmlns:w10="urn:schemas-microsoft-com:office:word" xmlns:w="http://schemas.openxmlformats.org/wordprocessingml/2006/main" xmlns:w14="http://schemas.microsoft.com/office/word/2010/wordml" xmlns:w15="http://schemas.microsoft.com/office/word/2012/wordml" xmlns:w16cex="http://schemas.microsoft.com/office/word/2018/wordml/cex" xmlns:w16cid="http://schemas.microsoft.com/office/word/2016/wordml/cid" xmlns:w16="http://schemas.microsoft.com/office/word/2018/wordml" xmlns:w16du="http://schemas.microsoft.com/office/word/2023/wordml/word16du" xmlns:w16sdtdh="http://schemas.microsoft.com/office/word/2020/wordml/sdtdatahash" xmlns:w16sdtfl="http://schemas.microsoft.com/office/word/2024/wordml/sdtformatlock" xmlns:w16se="http://schemas.microsoft.com/office/word/2015/wordml/symex" xmlns:wpg="http://schemas.microsoft.com/office/word/2010/wordprocessingGroup" xmlns:wpi="http://schemas.microsoft.com/office/word/2010/wordprocessingInk" xmlns:wne="http://schemas.microsoft.com/office/word/2006/wordml" xmlns:wps="http://schemas.microsoft.com/office/word/2010/wordprocessingShape" mc:Ignorable="w14 w15 w16se w16cid w16 w16cex w16sdtdh w16sdtfl w16du wp14">
   <w:body>
     <w:p>
       <w:pPr>
@@ -1898,24 +1898,19 @@
       <w:pPr>
         <w:pStyle w:val="Heading2"/>
       </w:pPr>
-      <w:bookmarkStart w:id="8" w:name="_Toc231285048"/>
-      <w:bookmarkStart w:id="9" w:name="_Toc241737372"/>
+      <w:bookmarkStart w:id="8" w:name="_Toc241737372"/>
+      <w:bookmarkStart w:id="9" w:name="_Toc231285048"/>
       <w:r>
         <w:t>Default Values</w:t>
       </w:r>
-      <w:bookmarkEnd w:id="9"/>
+      <w:bookmarkEnd w:id="8"/>
     </w:p>
     <w:p>
       <w:pPr>
         <w:pStyle w:val="Body-Text"/>
       </w:pPr>
-      <w:proofErr w:type="gramStart"/>
-      <w:r>
-        <w:t>When a field expecting a numeric value is left blank, its value defaults to zero (0).</w:t>
-      </w:r>
-      <w:proofErr w:type="gramEnd"/>
-      <w:r>
-        <w:t xml:space="preserve"> When you enter a value in a field, that value will be used in any calculation even if the tool calculates a different value for that field. Most of the time, this behavior is what you expect to happen</w:t>
+      <w:r>
+        <w:t>When a field expecting a numeric value is left blank, its value defaults to zero (0). When you enter a value in a field, that value will be used in any calculation even if the tool calculates a different value for that field. Most of the time, this behavior is what you expect to happen</w:t>
       </w:r>
       <w:r>
         <w:t>; after all, if you enter a value, you expect it to be used.</w:t>
@@ -1950,7 +1945,7 @@
       <w:r>
         <w:t>Information</w:t>
       </w:r>
-      <w:bookmarkEnd w:id="8"/>
+      <w:bookmarkEnd w:id="9"/>
       <w:bookmarkEnd w:id="10"/>
     </w:p>
     <w:p>
@@ -2185,14 +2180,14 @@
       </w:pPr>
       <w:bookmarkStart w:id="11" w:name="_Toc228630163"/>
       <w:bookmarkStart w:id="12" w:name="_Toc231285049"/>
-      <w:bookmarkStart w:id="13" w:name="_Toc228630161"/>
-      <w:bookmarkStart w:id="14" w:name="_Toc241737374"/>
+      <w:bookmarkStart w:id="13" w:name="_Toc241737374"/>
+      <w:bookmarkStart w:id="14" w:name="_Toc228630161"/>
       <w:r>
         <w:t>Version Numbers</w:t>
       </w:r>
       <w:bookmarkEnd w:id="11"/>
       <w:bookmarkEnd w:id="12"/>
-      <w:bookmarkEnd w:id="14"/>
+      <w:bookmarkEnd w:id="13"/>
     </w:p>
     <w:p>
       <w:pPr>
@@ -2361,18 +2356,10 @@
         <w:t xml:space="preserve">he version number </w:t>
       </w:r>
       <w:r>
-        <w:t xml:space="preserve">of the development version is always appended with </w:t>
-      </w:r>
-      <w:proofErr w:type="gramStart"/>
-      <w:r>
-        <w:t xml:space="preserve">an </w:t>
-      </w:r>
-      <w:r>
-        <w:t>at</w:t>
-      </w:r>
-      <w:proofErr w:type="gramEnd"/>
-      <w:r>
-        <w:t xml:space="preserve"> sign (@) </w:t>
+        <w:t xml:space="preserve">of the development version is always appended with an </w:t>
+      </w:r>
+      <w:r>
+        <w:t xml:space="preserve">at sign (@) </w:t>
       </w:r>
       <w:r>
         <w:t xml:space="preserve">to call attention to the </w:t>
@@ -2411,13 +2398,13 @@
       <w:pPr>
         <w:pStyle w:val="Heading1"/>
       </w:pPr>
-      <w:bookmarkStart w:id="15" w:name="_Toc231285050"/>
-      <w:bookmarkStart w:id="16" w:name="_Toc241737375"/>
+      <w:bookmarkStart w:id="15" w:name="_Toc241737375"/>
+      <w:bookmarkStart w:id="16" w:name="_Toc231285050"/>
       <w:r>
         <w:lastRenderedPageBreak/>
         <w:t>Issues, Limitations, and Known Problems</w:t>
       </w:r>
-      <w:bookmarkEnd w:id="16"/>
+      <w:bookmarkEnd w:id="15"/>
     </w:p>
     <w:p>
       <w:pPr>
@@ -2464,15 +2451,7 @@
         <w:pStyle w:val="List-Bullet025"/>
       </w:pPr>
       <w:r>
-        <w:t xml:space="preserve">Convert </w:t>
-      </w:r>
-      <w:proofErr w:type="spellStart"/>
-      <w:r>
-        <w:t>CamelCase</w:t>
-      </w:r>
-      <w:proofErr w:type="spellEnd"/>
-      <w:r>
-        <w:t xml:space="preserve"> IDs in HTML to kebab-case.</w:t>
+        <w:t>Convert CamelCase IDs in HTML to kebab-case.</w:t>
       </w:r>
     </w:p>
     <w:p>
@@ -2830,14 +2809,9 @@
         <w:pStyle w:val="List-Bullet-tight025"/>
       </w:pPr>
       <w:r>
-        <w:t xml:space="preserve">Write setter/getter methods for </w:t>
-      </w:r>
-      <w:proofErr w:type="gramStart"/>
-      <w:r>
-        <w:t>lines[</w:t>
+        <w:t>Write setter/getter methods for lines[</w:t>
       </w:r>
       <w:proofErr w:type="spellStart"/>
-      <w:proofErr w:type="gramEnd"/>
       <w:r>
         <w:t>lineno</w:t>
       </w:r>
@@ -2852,14 +2826,9 @@
         <w:ind w:left="1800"/>
       </w:pPr>
       <w:r>
-        <w:t xml:space="preserve">Make sure </w:t>
-      </w:r>
-      <w:proofErr w:type="gramStart"/>
-      <w:r>
-        <w:t>lines[</w:t>
+        <w:t>Make sure lines[</w:t>
       </w:r>
       <w:proofErr w:type="spellStart"/>
-      <w:proofErr w:type="gramEnd"/>
       <w:r>
         <w:t>lineno</w:t>
       </w:r>
@@ -2890,12 +2859,9 @@
         <w:t>super.setter</w:t>
       </w:r>
       <w:proofErr w:type="spellEnd"/>
-      <w:r>
-        <w:t>(</w:t>
-      </w:r>
       <w:proofErr w:type="gramEnd"/>
       <w:r>
-        <w:t>).</w:t>
+        <w:t>().</w:t>
       </w:r>
     </w:p>
     <w:p>
@@ -3052,71 +3018,99 @@
     </w:p>
     <w:p>
       <w:pPr>
-        <w:pStyle w:val="Heading2"/>
-      </w:pPr>
-      <w:bookmarkStart w:id="26" w:name="_Toc241737385"/>
-      <w:r>
-        <w:t>Other Tools</w:t>
-      </w:r>
-      <w:r>
-        <w:t xml:space="preserve"> I'm Thinking </w:t>
-      </w:r>
-      <w:r>
-        <w:t>About</w:t>
-      </w:r>
-      <w:bookmarkEnd w:id="13"/>
-      <w:bookmarkEnd w:id="15"/>
-      <w:bookmarkEnd w:id="26"/>
-    </w:p>
-    <w:p>
-      <w:pPr>
-        <w:pStyle w:val="List-Bullet-tight025"/>
-      </w:pPr>
-      <w:r>
-        <w:t xml:space="preserve">CTC, EIC, and </w:t>
-      </w:r>
-      <w:proofErr w:type="spellStart"/>
-      <w:r>
-        <w:t>CalEITC</w:t>
-      </w:r>
-      <w:proofErr w:type="spellEnd"/>
-      <w:r>
-        <w:t xml:space="preserve"> Calculators</w:t>
-      </w:r>
-    </w:p>
-    <w:p>
-      <w:pPr>
-        <w:pStyle w:val="List-Bullet-tight025"/>
-      </w:pPr>
-      <w:r>
-        <w:t>Foreign Tax Credit Calculator</w:t>
-      </w:r>
-    </w:p>
-    <w:p>
-      <w:pPr>
-        <w:pStyle w:val="List-Bullet-tight025"/>
-      </w:pPr>
-      <w:r>
-        <w:t>Calculate penalty for underpayment of tax</w:t>
-      </w:r>
-    </w:p>
-    <w:p>
-      <w:pPr>
-        <w:pStyle w:val="List-Bullet-tight025"/>
-      </w:pPr>
-      <w:r>
-        <w:t>Currency Exchange Rate Calculator</w:t>
-      </w:r>
-    </w:p>
-    <w:p>
-      <w:pPr>
         <w:pStyle w:val="List-Bullet-tight025"/>
         <w:numPr>
           <w:ilvl w:val="0"/>
           <w:numId w:val="0"/>
         </w:numPr>
-        <w:ind w:left="1440" w:hanging="360"/>
-      </w:pPr>
+        <w:ind w:left="1080"/>
+      </w:pPr>
+    </w:p>
+    <w:p>
+      <w:pPr>
+        <w:pStyle w:val="Body-Text"/>
+      </w:pPr>
+      <w:bookmarkStart w:id="26" w:name="_Toc241737385"/>
+      <w:r>
+        <w:t xml:space="preserve">Not So </w:t>
+      </w:r>
+      <w:r>
+        <w:rPr>
+          <w:lang w:eastAsia="ar-SA"/>
+        </w:rPr>
+        <w:t>Likely</w:t>
+      </w:r>
+      <w:r>
+        <w:t xml:space="preserve"> Features</w:t>
+      </w:r>
+      <w:r>
+        <w:t xml:space="preserve"> </w:t>
+      </w:r>
+    </w:p>
+    <w:p>
+      <w:pPr>
+        <w:pStyle w:val="List-Bullet-tight025"/>
+      </w:pPr>
+      <w:r>
+        <w:t>Medicaid Waiver Payments</w:t>
+      </w:r>
+    </w:p>
+    <w:p>
+      <w:pPr>
+        <w:pStyle w:val="Heading2"/>
+      </w:pPr>
+      <w:r>
+        <w:t>Other Tools</w:t>
+      </w:r>
+      <w:r>
+        <w:t xml:space="preserve"> I'm Thinking </w:t>
+      </w:r>
+      <w:r>
+        <w:t>About</w:t>
+      </w:r>
+      <w:bookmarkEnd w:id="14"/>
+      <w:bookmarkEnd w:id="16"/>
+      <w:bookmarkEnd w:id="26"/>
+    </w:p>
+    <w:p>
+      <w:pPr>
+        <w:pStyle w:val="List-Bullet-tight025"/>
+      </w:pPr>
+      <w:r>
+        <w:t xml:space="preserve">CTC, EIC, and </w:t>
+      </w:r>
+      <w:proofErr w:type="spellStart"/>
+      <w:r>
+        <w:t>CalEITC</w:t>
+      </w:r>
+      <w:proofErr w:type="spellEnd"/>
+      <w:r>
+        <w:t xml:space="preserve"> Calculators</w:t>
+      </w:r>
+    </w:p>
+    <w:p>
+      <w:pPr>
+        <w:pStyle w:val="List-Bullet-tight025"/>
+      </w:pPr>
+      <w:r>
+        <w:t>Foreign Tax Credit Calculator</w:t>
+      </w:r>
+    </w:p>
+    <w:p>
+      <w:pPr>
+        <w:pStyle w:val="List-Bullet-tight025"/>
+      </w:pPr>
+      <w:r>
+        <w:t>Calculate penalty for underpayment of tax</w:t>
+      </w:r>
+    </w:p>
+    <w:p>
+      <w:pPr>
+        <w:pStyle w:val="List-Bullet-tight025"/>
+      </w:pPr>
+      <w:r>
+        <w:t>Currency Exchange Rate Calculator</w:t>
+      </w:r>
     </w:p>
     <w:p>
       <w:pPr>
@@ -3164,7 +3158,7 @@
 </file>
 
 <file path=word/endnotes.xml><?xml version="1.0" encoding="utf-8"?>
-<w:endnotes xmlns:ve="http://schemas.openxmlformats.org/markup-compatibility/2006" xmlns:o="urn:schemas-microsoft-com:office:office" xmlns:r="http://schemas.openxmlformats.org/officeDocument/2006/relationships" xmlns:m="http://schemas.openxmlformats.org/officeDocument/2006/math" xmlns:v="urn:schemas-microsoft-com:vml" xmlns:wp="http://schemas.openxmlformats.org/drawingml/2006/wordprocessingDrawing" xmlns:w10="urn:schemas-microsoft-com:office:word" xmlns:w="http://schemas.openxmlformats.org/wordprocessingml/2006/main" xmlns:wne="http://schemas.microsoft.com/office/word/2006/wordml">
+<w:endnotes xmlns:wpc="http://schemas.microsoft.com/office/word/2010/wordprocessingCanvas" xmlns:cx="http://schemas.microsoft.com/office/drawing/2014/chartex" xmlns:cx1="http://schemas.microsoft.com/office/drawing/2015/9/8/chartex" xmlns:cx2="http://schemas.microsoft.com/office/drawing/2015/10/21/chartex" xmlns:cx3="http://schemas.microsoft.com/office/drawing/2016/5/9/chartex" xmlns:cx4="http://schemas.microsoft.com/office/drawing/2016/5/10/chartex" xmlns:cx5="http://schemas.microsoft.com/office/drawing/2016/5/11/chartex" xmlns:cx6="http://schemas.microsoft.com/office/drawing/2016/5/12/chartex" xmlns:cx7="http://schemas.microsoft.com/office/drawing/2016/5/13/chartex" xmlns:cx8="http://schemas.microsoft.com/office/drawing/2016/5/14/chartex" xmlns:mc="http://schemas.openxmlformats.org/markup-compatibility/2006" xmlns:aink="http://schemas.microsoft.com/office/drawing/2016/ink" xmlns:am3d="http://schemas.microsoft.com/office/drawing/2017/model3d" xmlns:o="urn:schemas-microsoft-com:office:office" xmlns:oel="http://schemas.microsoft.com/office/2019/extlst" xmlns:r="http://schemas.openxmlformats.org/officeDocument/2006/relationships" xmlns:m="http://schemas.openxmlformats.org/officeDocument/2006/math" xmlns:v="urn:schemas-microsoft-com:vml" xmlns:wp14="http://schemas.microsoft.com/office/word/2010/wordprocessingDrawing" xmlns:wp="http://schemas.openxmlformats.org/drawingml/2006/wordprocessingDrawing" xmlns:w10="urn:schemas-microsoft-com:office:word" xmlns:w="http://schemas.openxmlformats.org/wordprocessingml/2006/main" xmlns:w14="http://schemas.microsoft.com/office/word/2010/wordml" xmlns:w15="http://schemas.microsoft.com/office/word/2012/wordml" xmlns:w16cex="http://schemas.microsoft.com/office/word/2018/wordml/cex" xmlns:w16cid="http://schemas.microsoft.com/office/word/2016/wordml/cid" xmlns:w16="http://schemas.microsoft.com/office/word/2018/wordml" xmlns:w16du="http://schemas.microsoft.com/office/word/2023/wordml/word16du" xmlns:w16sdtdh="http://schemas.microsoft.com/office/word/2020/wordml/sdtdatahash" xmlns:w16sdtfl="http://schemas.microsoft.com/office/word/2024/wordml/sdtformatlock" xmlns:w16se="http://schemas.microsoft.com/office/word/2015/wordml/symex" xmlns:wpg="http://schemas.microsoft.com/office/word/2010/wordprocessingGroup" xmlns:wpi="http://schemas.microsoft.com/office/word/2010/wordprocessingInk" xmlns:wne="http://schemas.microsoft.com/office/word/2006/wordml" xmlns:wps="http://schemas.microsoft.com/office/word/2010/wordprocessingShape" mc:Ignorable="w14 w15 w16se w16cid w16 w16cex w16sdtdh w16sdtfl w16du wp14">
   <w:endnote w:type="separator" w:id="-1">
     <w:p>
       <w:r>
@@ -3183,7 +3177,7 @@
 </file>
 
 <file path=word/footer1.xml><?xml version="1.0" encoding="utf-8"?>
-<w:ftr xmlns:ve="http://schemas.openxmlformats.org/markup-compatibility/2006" xmlns:o="urn:schemas-microsoft-com:office:office" xmlns:r="http://schemas.openxmlformats.org/officeDocument/2006/relationships" xmlns:m="http://schemas.openxmlformats.org/officeDocument/2006/math" xmlns:v="urn:schemas-microsoft-com:vml" xmlns:wp="http://schemas.openxmlformats.org/drawingml/2006/wordprocessingDrawing" xmlns:w10="urn:schemas-microsoft-com:office:word" xmlns:w="http://schemas.openxmlformats.org/wordprocessingml/2006/main" xmlns:wne="http://schemas.microsoft.com/office/word/2006/wordml">
+<w:ftr xmlns:wpc="http://schemas.microsoft.com/office/word/2010/wordprocessingCanvas" xmlns:cx="http://schemas.microsoft.com/office/drawing/2014/chartex" xmlns:cx1="http://schemas.microsoft.com/office/drawing/2015/9/8/chartex" xmlns:cx2="http://schemas.microsoft.com/office/drawing/2015/10/21/chartex" xmlns:cx3="http://schemas.microsoft.com/office/drawing/2016/5/9/chartex" xmlns:cx4="http://schemas.microsoft.com/office/drawing/2016/5/10/chartex" xmlns:cx5="http://schemas.microsoft.com/office/drawing/2016/5/11/chartex" xmlns:cx6="http://schemas.microsoft.com/office/drawing/2016/5/12/chartex" xmlns:cx7="http://schemas.microsoft.com/office/drawing/2016/5/13/chartex" xmlns:cx8="http://schemas.microsoft.com/office/drawing/2016/5/14/chartex" xmlns:mc="http://schemas.openxmlformats.org/markup-compatibility/2006" xmlns:aink="http://schemas.microsoft.com/office/drawing/2016/ink" xmlns:am3d="http://schemas.microsoft.com/office/drawing/2017/model3d" xmlns:o="urn:schemas-microsoft-com:office:office" xmlns:oel="http://schemas.microsoft.com/office/2019/extlst" xmlns:r="http://schemas.openxmlformats.org/officeDocument/2006/relationships" xmlns:m="http://schemas.openxmlformats.org/officeDocument/2006/math" xmlns:v="urn:schemas-microsoft-com:vml" xmlns:wp14="http://schemas.microsoft.com/office/word/2010/wordprocessingDrawing" xmlns:wp="http://schemas.openxmlformats.org/drawingml/2006/wordprocessingDrawing" xmlns:w10="urn:schemas-microsoft-com:office:word" xmlns:w="http://schemas.openxmlformats.org/wordprocessingml/2006/main" xmlns:w14="http://schemas.microsoft.com/office/word/2010/wordml" xmlns:w15="http://schemas.microsoft.com/office/word/2012/wordml" xmlns:w16cex="http://schemas.microsoft.com/office/word/2018/wordml/cex" xmlns:w16cid="http://schemas.microsoft.com/office/word/2016/wordml/cid" xmlns:w16="http://schemas.microsoft.com/office/word/2018/wordml" xmlns:w16du="http://schemas.microsoft.com/office/word/2023/wordml/word16du" xmlns:w16sdtdh="http://schemas.microsoft.com/office/word/2020/wordml/sdtdatahash" xmlns:w16sdtfl="http://schemas.microsoft.com/office/word/2024/wordml/sdtformatlock" xmlns:w16se="http://schemas.microsoft.com/office/word/2015/wordml/symex" xmlns:wpg="http://schemas.microsoft.com/office/word/2010/wordprocessingGroup" xmlns:wpi="http://schemas.microsoft.com/office/word/2010/wordprocessingInk" xmlns:wne="http://schemas.microsoft.com/office/word/2006/wordml" xmlns:wps="http://schemas.microsoft.com/office/word/2010/wordprocessingShape" mc:Ignorable="w14 w15 w16se w16cid w16 w16cex w16sdtdh w16sdtfl w16du wp14">
   <w:p>
     <w:pPr>
       <w:pStyle w:val="Footer"/>
@@ -3295,7 +3289,7 @@
 </file>
 
 <file path=word/footnotes.xml><?xml version="1.0" encoding="utf-8"?>
-<w:footnotes xmlns:ve="http://schemas.openxmlformats.org/markup-compatibility/2006" xmlns:o="urn:schemas-microsoft-com:office:office" xmlns:r="http://schemas.openxmlformats.org/officeDocument/2006/relationships" xmlns:m="http://schemas.openxmlformats.org/officeDocument/2006/math" xmlns:v="urn:schemas-microsoft-com:vml" xmlns:wp="http://schemas.openxmlformats.org/drawingml/2006/wordprocessingDrawing" xmlns:w10="urn:schemas-microsoft-com:office:word" xmlns:w="http://schemas.openxmlformats.org/wordprocessingml/2006/main" xmlns:wne="http://schemas.microsoft.com/office/word/2006/wordml">
+<w:footnotes xmlns:wpc="http://schemas.microsoft.com/office/word/2010/wordprocessingCanvas" xmlns:cx="http://schemas.microsoft.com/office/drawing/2014/chartex" xmlns:cx1="http://schemas.microsoft.com/office/drawing/2015/9/8/chartex" xmlns:cx2="http://schemas.microsoft.com/office/drawing/2015/10/21/chartex" xmlns:cx3="http://schemas.microsoft.com/office/drawing/2016/5/9/chartex" xmlns:cx4="http://schemas.microsoft.com/office/drawing/2016/5/10/chartex" xmlns:cx5="http://schemas.microsoft.com/office/drawing/2016/5/11/chartex" xmlns:cx6="http://schemas.microsoft.com/office/drawing/2016/5/12/chartex" xmlns:cx7="http://schemas.microsoft.com/office/drawing/2016/5/13/chartex" xmlns:cx8="http://schemas.microsoft.com/office/drawing/2016/5/14/chartex" xmlns:mc="http://schemas.openxmlformats.org/markup-compatibility/2006" xmlns:aink="http://schemas.microsoft.com/office/drawing/2016/ink" xmlns:am3d="http://schemas.microsoft.com/office/drawing/2017/model3d" xmlns:o="urn:schemas-microsoft-com:office:office" xmlns:oel="http://schemas.microsoft.com/office/2019/extlst" xmlns:r="http://schemas.openxmlformats.org/officeDocument/2006/relationships" xmlns:m="http://schemas.openxmlformats.org/officeDocument/2006/math" xmlns:v="urn:schemas-microsoft-com:vml" xmlns:wp14="http://schemas.microsoft.com/office/word/2010/wordprocessingDrawing" xmlns:wp="http://schemas.openxmlformats.org/drawingml/2006/wordprocessingDrawing" xmlns:w10="urn:schemas-microsoft-com:office:word" xmlns:w="http://schemas.openxmlformats.org/wordprocessingml/2006/main" xmlns:w14="http://schemas.microsoft.com/office/word/2010/wordml" xmlns:w15="http://schemas.microsoft.com/office/word/2012/wordml" xmlns:w16cex="http://schemas.microsoft.com/office/word/2018/wordml/cex" xmlns:w16cid="http://schemas.microsoft.com/office/word/2016/wordml/cid" xmlns:w16="http://schemas.microsoft.com/office/word/2018/wordml" xmlns:w16du="http://schemas.microsoft.com/office/word/2023/wordml/word16du" xmlns:w16sdtdh="http://schemas.microsoft.com/office/word/2020/wordml/sdtdatahash" xmlns:w16sdtfl="http://schemas.microsoft.com/office/word/2024/wordml/sdtformatlock" xmlns:w16se="http://schemas.microsoft.com/office/word/2015/wordml/symex" xmlns:wpg="http://schemas.microsoft.com/office/word/2010/wordprocessingGroup" xmlns:wpi="http://schemas.microsoft.com/office/word/2010/wordprocessingInk" xmlns:wne="http://schemas.microsoft.com/office/word/2006/wordml" xmlns:wps="http://schemas.microsoft.com/office/word/2010/wordprocessingShape" mc:Ignorable="w14 w15 w16se w16cid w16 w16cex w16sdtdh w16sdtfl w16du wp14">
   <w:footnote w:type="separator" w:id="-1">
     <w:p>
       <w:r>
@@ -3314,8 +3308,8 @@
 </file>
 
 <file path=word/numbering.xml><?xml version="1.0" encoding="utf-8"?>
-<w:numbering xmlns:ve="http://schemas.openxmlformats.org/markup-compatibility/2006" xmlns:o="urn:schemas-microsoft-com:office:office" xmlns:r="http://schemas.openxmlformats.org/officeDocument/2006/relationships" xmlns:m="http://schemas.openxmlformats.org/officeDocument/2006/math" xmlns:v="urn:schemas-microsoft-com:vml" xmlns:wp="http://schemas.openxmlformats.org/drawingml/2006/wordprocessingDrawing" xmlns:w10="urn:schemas-microsoft-com:office:word" xmlns:w="http://schemas.openxmlformats.org/wordprocessingml/2006/main" xmlns:wne="http://schemas.microsoft.com/office/word/2006/wordml">
-  <w:abstractNum w:abstractNumId="0">
+<w:numbering xmlns:wpc="http://schemas.microsoft.com/office/word/2010/wordprocessingCanvas" xmlns:cx="http://schemas.microsoft.com/office/drawing/2014/chartex" xmlns:cx1="http://schemas.microsoft.com/office/drawing/2015/9/8/chartex" xmlns:cx2="http://schemas.microsoft.com/office/drawing/2015/10/21/chartex" xmlns:cx3="http://schemas.microsoft.com/office/drawing/2016/5/9/chartex" xmlns:cx4="http://schemas.microsoft.com/office/drawing/2016/5/10/chartex" xmlns:cx5="http://schemas.microsoft.com/office/drawing/2016/5/11/chartex" xmlns:cx6="http://schemas.microsoft.com/office/drawing/2016/5/12/chartex" xmlns:cx7="http://schemas.microsoft.com/office/drawing/2016/5/13/chartex" xmlns:cx8="http://schemas.microsoft.com/office/drawing/2016/5/14/chartex" xmlns:mc="http://schemas.openxmlformats.org/markup-compatibility/2006" xmlns:aink="http://schemas.microsoft.com/office/drawing/2016/ink" xmlns:am3d="http://schemas.microsoft.com/office/drawing/2017/model3d" xmlns:o="urn:schemas-microsoft-com:office:office" xmlns:oel="http://schemas.microsoft.com/office/2019/extlst" xmlns:r="http://schemas.openxmlformats.org/officeDocument/2006/relationships" xmlns:m="http://schemas.openxmlformats.org/officeDocument/2006/math" xmlns:v="urn:schemas-microsoft-com:vml" xmlns:wp14="http://schemas.microsoft.com/office/word/2010/wordprocessingDrawing" xmlns:wp="http://schemas.openxmlformats.org/drawingml/2006/wordprocessingDrawing" xmlns:w10="urn:schemas-microsoft-com:office:word" xmlns:w="http://schemas.openxmlformats.org/wordprocessingml/2006/main" xmlns:w14="http://schemas.microsoft.com/office/word/2010/wordml" xmlns:w15="http://schemas.microsoft.com/office/word/2012/wordml" xmlns:w16cex="http://schemas.microsoft.com/office/word/2018/wordml/cex" xmlns:w16cid="http://schemas.microsoft.com/office/word/2016/wordml/cid" xmlns:w16="http://schemas.microsoft.com/office/word/2018/wordml" xmlns:w16du="http://schemas.microsoft.com/office/word/2023/wordml/word16du" xmlns:w16sdtdh="http://schemas.microsoft.com/office/word/2020/wordml/sdtdatahash" xmlns:w16sdtfl="http://schemas.microsoft.com/office/word/2024/wordml/sdtformatlock" xmlns:w16se="http://schemas.microsoft.com/office/word/2015/wordml/symex" xmlns:wpg="http://schemas.microsoft.com/office/word/2010/wordprocessingGroup" xmlns:wpi="http://schemas.microsoft.com/office/word/2010/wordprocessingInk" xmlns:wne="http://schemas.microsoft.com/office/word/2006/wordml" xmlns:wps="http://schemas.microsoft.com/office/word/2010/wordprocessingShape" mc:Ignorable="w14 w15 w16se w16cid w16 w16cex w16sdtdh w16sdtfl w16du wp14">
+  <w:abstractNum w:abstractNumId="0" w15:restartNumberingAfterBreak="0">
     <w:nsid w:val="163115D9"/>
     <w:multiLevelType w:val="hybridMultilevel"/>
     <w:tmpl w:val="97DAFCAE"/>
@@ -3429,7 +3423,7 @@
       </w:rPr>
     </w:lvl>
   </w:abstractNum>
-  <w:abstractNum w:abstractNumId="1">
+  <w:abstractNum w:abstractNumId="1" w15:restartNumberingAfterBreak="0">
     <w:nsid w:val="3D3B424D"/>
     <w:multiLevelType w:val="hybridMultilevel"/>
     <w:tmpl w:val="11DA1700"/>
@@ -3543,7 +3537,7 @@
       </w:rPr>
     </w:lvl>
   </w:abstractNum>
-  <w:abstractNum w:abstractNumId="2">
+  <w:abstractNum w:abstractNumId="2" w15:restartNumberingAfterBreak="0">
     <w:nsid w:val="41936094"/>
     <w:multiLevelType w:val="hybridMultilevel"/>
     <w:tmpl w:val="D0107CD2"/>
@@ -3657,7 +3651,7 @@
       </w:rPr>
     </w:lvl>
   </w:abstractNum>
-  <w:abstractNum w:abstractNumId="3">
+  <w:abstractNum w:abstractNumId="3" w15:restartNumberingAfterBreak="0">
     <w:nsid w:val="45145E4D"/>
     <w:multiLevelType w:val="hybridMultilevel"/>
     <w:tmpl w:val="7696BC50"/>
@@ -3771,16 +3765,22 @@
       </w:rPr>
     </w:lvl>
   </w:abstractNum>
-  <w:num w:numId="1">
+  <w:num w:numId="1" w16cid:durableId="2033260604">
     <w:abstractNumId w:val="1"/>
   </w:num>
-  <w:num w:numId="2">
+  <w:num w:numId="2" w16cid:durableId="148330540">
     <w:abstractNumId w:val="2"/>
   </w:num>
-  <w:num w:numId="3">
+  <w:num w:numId="3" w16cid:durableId="890732137">
     <w:abstractNumId w:val="0"/>
   </w:num>
-  <w:num w:numId="4">
+  <w:num w:numId="4" w16cid:durableId="2036298626">
+    <w:abstractNumId w:val="3"/>
+  </w:num>
+  <w:num w:numId="5" w16cid:durableId="1292516077">
+    <w:abstractNumId w:val="3"/>
+  </w:num>
+  <w:num w:numId="6" w16cid:durableId="339620909">
     <w:abstractNumId w:val="3"/>
   </w:num>
   <w:numIdMacAtCleanup w:val="4"/>
@@ -3788,7 +3788,7 @@
 </file>
 
 <file path=word/styles.xml><?xml version="1.0" encoding="utf-8"?>
-<w:styles xmlns:r="http://schemas.openxmlformats.org/officeDocument/2006/relationships" xmlns:w="http://schemas.openxmlformats.org/wordprocessingml/2006/main">
+<w:styles xmlns:mc="http://schemas.openxmlformats.org/markup-compatibility/2006" xmlns:r="http://schemas.openxmlformats.org/officeDocument/2006/relationships" xmlns:w="http://schemas.openxmlformats.org/wordprocessingml/2006/main" xmlns:w14="http://schemas.microsoft.com/office/word/2010/wordml" xmlns:w15="http://schemas.microsoft.com/office/word/2012/wordml" xmlns:w16cex="http://schemas.microsoft.com/office/word/2018/wordml/cex" xmlns:w16cid="http://schemas.microsoft.com/office/word/2016/wordml/cid" xmlns:w16="http://schemas.microsoft.com/office/word/2018/wordml" xmlns:w16du="http://schemas.microsoft.com/office/word/2023/wordml/word16du" xmlns:w16sdtdh="http://schemas.microsoft.com/office/word/2020/wordml/sdtdatahash" xmlns:w16sdtfl="http://schemas.microsoft.com/office/word/2024/wordml/sdtformatlock" xmlns:w16se="http://schemas.microsoft.com/office/word/2015/wordml/symex" mc:Ignorable="w14 w15 w16se w16cid w16 w16cex w16sdtdh w16sdtfl w16du">
   <w:docDefaults>
     <w:rPrDefault>
       <w:rPr>
@@ -3802,145 +3802,383 @@
       </w:pPr>
     </w:pPrDefault>
   </w:docDefaults>
-  <w:latentStyles w:defLockedState="0" w:defUIPriority="99" w:defSemiHidden="1" w:defUnhideWhenUsed="1" w:defQFormat="0" w:count="267">
-    <w:lsdException w:name="Normal" w:semiHidden="0" w:uiPriority="0" w:unhideWhenUsed="0" w:qFormat="1"/>
-    <w:lsdException w:name="heading 1" w:semiHidden="0" w:uiPriority="0" w:unhideWhenUsed="0" w:qFormat="1"/>
-    <w:lsdException w:name="heading 2" w:uiPriority="0" w:qFormat="1"/>
-    <w:lsdException w:name="heading 3" w:uiPriority="0" w:qFormat="1"/>
-    <w:lsdException w:name="heading 4" w:uiPriority="9" w:qFormat="1"/>
-    <w:lsdException w:name="heading 5" w:uiPriority="9" w:qFormat="1"/>
-    <w:lsdException w:name="heading 6" w:uiPriority="9" w:qFormat="1"/>
-    <w:lsdException w:name="heading 7" w:uiPriority="9" w:qFormat="1"/>
-    <w:lsdException w:name="heading 8" w:uiPriority="9" w:qFormat="1"/>
-    <w:lsdException w:name="heading 9" w:uiPriority="9" w:qFormat="1"/>
-    <w:lsdException w:name="toc 1" w:uiPriority="39" w:qFormat="1"/>
-    <w:lsdException w:name="toc 2" w:uiPriority="39" w:qFormat="1"/>
-    <w:lsdException w:name="toc 3" w:uiPriority="39" w:qFormat="1"/>
-    <w:lsdException w:name="toc 4" w:uiPriority="39"/>
-    <w:lsdException w:name="toc 5" w:uiPriority="39"/>
-    <w:lsdException w:name="toc 6" w:uiPriority="39"/>
-    <w:lsdException w:name="toc 7" w:uiPriority="39"/>
-    <w:lsdException w:name="toc 8" w:uiPriority="39"/>
-    <w:lsdException w:name="toc 9" w:uiPriority="39"/>
-    <w:lsdException w:name="footer" w:uiPriority="0"/>
-    <w:lsdException w:name="caption" w:uiPriority="0" w:qFormat="1"/>
-    <w:lsdException w:name="Title" w:semiHidden="0" w:uiPriority="10" w:unhideWhenUsed="0" w:qFormat="1"/>
-    <w:lsdException w:name="Default Paragraph Font" w:uiPriority="1"/>
-    <w:lsdException w:name="Subtitle" w:semiHidden="0" w:uiPriority="11" w:unhideWhenUsed="0" w:qFormat="1"/>
-    <w:lsdException w:name="Strong" w:semiHidden="0" w:uiPriority="22" w:unhideWhenUsed="0" w:qFormat="1"/>
-    <w:lsdException w:name="Emphasis" w:semiHidden="0" w:uiPriority="20" w:unhideWhenUsed="0" w:qFormat="1"/>
-    <w:lsdException w:name="Table Grid" w:semiHidden="0" w:uiPriority="59" w:unhideWhenUsed="0"/>
-    <w:lsdException w:name="Placeholder Text" w:unhideWhenUsed="0"/>
-    <w:lsdException w:name="No Spacing" w:semiHidden="0" w:uiPriority="1" w:unhideWhenUsed="0" w:qFormat="1"/>
-    <w:lsdException w:name="Light Shading" w:semiHidden="0" w:uiPriority="60" w:unhideWhenUsed="0"/>
-    <w:lsdException w:name="Light List" w:semiHidden="0" w:uiPriority="61" w:unhideWhenUsed="0"/>
-    <w:lsdException w:name="Light Grid" w:semiHidden="0" w:uiPriority="62" w:unhideWhenUsed="0"/>
-    <w:lsdException w:name="Medium Shading 1" w:semiHidden="0" w:uiPriority="63" w:unhideWhenUsed="0"/>
-    <w:lsdException w:name="Medium Shading 2" w:semiHidden="0" w:uiPriority="64" w:unhideWhenUsed="0"/>
-    <w:lsdException w:name="Medium List 1" w:semiHidden="0" w:uiPriority="65" w:unhideWhenUsed="0"/>
-    <w:lsdException w:name="Medium List 2" w:semiHidden="0" w:uiPriority="66" w:unhideWhenUsed="0"/>
-    <w:lsdException w:name="Medium Grid 1" w:semiHidden="0" w:uiPriority="67" w:unhideWhenUsed="0"/>
-    <w:lsdException w:name="Medium Grid 2" w:semiHidden="0" w:uiPriority="68" w:unhideWhenUsed="0"/>
-    <w:lsdException w:name="Medium Grid 3" w:semiHidden="0" w:uiPriority="69" w:unhideWhenUsed="0"/>
-    <w:lsdException w:name="Dark List" w:semiHidden="0" w:uiPriority="70" w:unhideWhenUsed="0"/>
-    <w:lsdException w:name="Colorful Shading" w:semiHidden="0" w:uiPriority="71" w:unhideWhenUsed="0"/>
-    <w:lsdException w:name="Colorful List" w:semiHidden="0" w:uiPriority="72" w:unhideWhenUsed="0"/>
-    <w:lsdException w:name="Colorful Grid" w:semiHidden="0" w:uiPriority="73" w:unhideWhenUsed="0"/>
-    <w:lsdException w:name="Light Shading Accent 1" w:semiHidden="0" w:uiPriority="60" w:unhideWhenUsed="0"/>
-    <w:lsdException w:name="Light List Accent 1" w:semiHidden="0" w:uiPriority="61" w:unhideWhenUsed="0"/>
-    <w:lsdException w:name="Light Grid Accent 1" w:semiHidden="0" w:uiPriority="62" w:unhideWhenUsed="0"/>
-    <w:lsdException w:name="Medium Shading 1 Accent 1" w:semiHidden="0" w:uiPriority="63" w:unhideWhenUsed="0"/>
-    <w:lsdException w:name="Medium Shading 2 Accent 1" w:semiHidden="0" w:uiPriority="64" w:unhideWhenUsed="0"/>
-    <w:lsdException w:name="Medium List 1 Accent 1" w:semiHidden="0" w:uiPriority="65" w:unhideWhenUsed="0"/>
-    <w:lsdException w:name="Revision" w:unhideWhenUsed="0"/>
-    <w:lsdException w:name="List Paragraph" w:semiHidden="0" w:uiPriority="34" w:unhideWhenUsed="0" w:qFormat="1"/>
-    <w:lsdException w:name="Quote" w:semiHidden="0" w:uiPriority="29" w:unhideWhenUsed="0" w:qFormat="1"/>
-    <w:lsdException w:name="Intense Quote" w:semiHidden="0" w:uiPriority="30" w:unhideWhenUsed="0" w:qFormat="1"/>
-    <w:lsdException w:name="Medium List 2 Accent 1" w:semiHidden="0" w:uiPriority="66" w:unhideWhenUsed="0"/>
-    <w:lsdException w:name="Medium Grid 1 Accent 1" w:semiHidden="0" w:uiPriority="67" w:unhideWhenUsed="0"/>
-    <w:lsdException w:name="Medium Grid 2 Accent 1" w:semiHidden="0" w:uiPriority="68" w:unhideWhenUsed="0"/>
-    <w:lsdException w:name="Medium Grid 3 Accent 1" w:semiHidden="0" w:uiPriority="69" w:unhideWhenUsed="0"/>
-    <w:lsdException w:name="Dark List Accent 1" w:semiHidden="0" w:uiPriority="70" w:unhideWhenUsed="0"/>
-    <w:lsdException w:name="Colorful Shading Accent 1" w:semiHidden="0" w:uiPriority="71" w:unhideWhenUsed="0"/>
-    <w:lsdException w:name="Colorful List Accent 1" w:semiHidden="0" w:uiPriority="72" w:unhideWhenUsed="0"/>
-    <w:lsdException w:name="Colorful Grid Accent 1" w:semiHidden="0" w:uiPriority="73" w:unhideWhenUsed="0"/>
-    <w:lsdException w:name="Light Shading Accent 2" w:semiHidden="0" w:uiPriority="60" w:unhideWhenUsed="0"/>
-    <w:lsdException w:name="Light List Accent 2" w:semiHidden="0" w:uiPriority="61" w:unhideWhenUsed="0"/>
-    <w:lsdException w:name="Light Grid Accent 2" w:semiHidden="0" w:uiPriority="62" w:unhideWhenUsed="0"/>
-    <w:lsdException w:name="Medium Shading 1 Accent 2" w:semiHidden="0" w:uiPriority="63" w:unhideWhenUsed="0"/>
-    <w:lsdException w:name="Medium Shading 2 Accent 2" w:semiHidden="0" w:uiPriority="64" w:unhideWhenUsed="0"/>
-    <w:lsdException w:name="Medium List 1 Accent 2" w:semiHidden="0" w:uiPriority="65" w:unhideWhenUsed="0"/>
-    <w:lsdException w:name="Medium List 2 Accent 2" w:semiHidden="0" w:uiPriority="66" w:unhideWhenUsed="0"/>
-    <w:lsdException w:name="Medium Grid 1 Accent 2" w:semiHidden="0" w:uiPriority="67" w:unhideWhenUsed="0"/>
-    <w:lsdException w:name="Medium Grid 2 Accent 2" w:semiHidden="0" w:uiPriority="68" w:unhideWhenUsed="0"/>
-    <w:lsdException w:name="Medium Grid 3 Accent 2" w:semiHidden="0" w:uiPriority="69" w:unhideWhenUsed="0"/>
-    <w:lsdException w:name="Dark List Accent 2" w:semiHidden="0" w:uiPriority="70" w:unhideWhenUsed="0"/>
-    <w:lsdException w:name="Colorful Shading Accent 2" w:semiHidden="0" w:uiPriority="71" w:unhideWhenUsed="0"/>
-    <w:lsdException w:name="Colorful List Accent 2" w:semiHidden="0" w:uiPriority="72" w:unhideWhenUsed="0"/>
-    <w:lsdException w:name="Colorful Grid Accent 2" w:semiHidden="0" w:uiPriority="73" w:unhideWhenUsed="0"/>
-    <w:lsdException w:name="Light Shading Accent 3" w:semiHidden="0" w:uiPriority="60" w:unhideWhenUsed="0"/>
-    <w:lsdException w:name="Light List Accent 3" w:semiHidden="0" w:uiPriority="61" w:unhideWhenUsed="0"/>
-    <w:lsdException w:name="Light Grid Accent 3" w:semiHidden="0" w:uiPriority="62" w:unhideWhenUsed="0"/>
-    <w:lsdException w:name="Medium Shading 1 Accent 3" w:semiHidden="0" w:uiPriority="63" w:unhideWhenUsed="0"/>
-    <w:lsdException w:name="Medium Shading 2 Accent 3" w:semiHidden="0" w:uiPriority="64" w:unhideWhenUsed="0"/>
-    <w:lsdException w:name="Medium List 1 Accent 3" w:semiHidden="0" w:uiPriority="65" w:unhideWhenUsed="0"/>
-    <w:lsdException w:name="Medium List 2 Accent 3" w:semiHidden="0" w:uiPriority="66" w:unhideWhenUsed="0"/>
-    <w:lsdException w:name="Medium Grid 1 Accent 3" w:semiHidden="0" w:uiPriority="67" w:unhideWhenUsed="0"/>
-    <w:lsdException w:name="Medium Grid 2 Accent 3" w:semiHidden="0" w:uiPriority="68" w:unhideWhenUsed="0"/>
-    <w:lsdException w:name="Medium Grid 3 Accent 3" w:semiHidden="0" w:uiPriority="69" w:unhideWhenUsed="0"/>
-    <w:lsdException w:name="Dark List Accent 3" w:semiHidden="0" w:uiPriority="70" w:unhideWhenUsed="0"/>
-    <w:lsdException w:name="Colorful Shading Accent 3" w:semiHidden="0" w:uiPriority="71" w:unhideWhenUsed="0"/>
-    <w:lsdException w:name="Colorful List Accent 3" w:semiHidden="0" w:uiPriority="72" w:unhideWhenUsed="0"/>
-    <w:lsdException w:name="Colorful Grid Accent 3" w:semiHidden="0" w:uiPriority="73" w:unhideWhenUsed="0"/>
-    <w:lsdException w:name="Light Shading Accent 4" w:semiHidden="0" w:uiPriority="60" w:unhideWhenUsed="0"/>
-    <w:lsdException w:name="Light List Accent 4" w:semiHidden="0" w:uiPriority="61" w:unhideWhenUsed="0"/>
-    <w:lsdException w:name="Light Grid Accent 4" w:semiHidden="0" w:uiPriority="62" w:unhideWhenUsed="0"/>
-    <w:lsdException w:name="Medium Shading 1 Accent 4" w:semiHidden="0" w:uiPriority="63" w:unhideWhenUsed="0"/>
-    <w:lsdException w:name="Medium Shading 2 Accent 4" w:semiHidden="0" w:uiPriority="64" w:unhideWhenUsed="0"/>
-    <w:lsdException w:name="Medium List 1 Accent 4" w:semiHidden="0" w:uiPriority="65" w:unhideWhenUsed="0"/>
-    <w:lsdException w:name="Medium List 2 Accent 4" w:semiHidden="0" w:uiPriority="66" w:unhideWhenUsed="0"/>
-    <w:lsdException w:name="Medium Grid 1 Accent 4" w:semiHidden="0" w:uiPriority="67" w:unhideWhenUsed="0"/>
-    <w:lsdException w:name="Medium Grid 2 Accent 4" w:semiHidden="0" w:uiPriority="68" w:unhideWhenUsed="0"/>
-    <w:lsdException w:name="Medium Grid 3 Accent 4" w:semiHidden="0" w:uiPriority="69" w:unhideWhenUsed="0"/>
-    <w:lsdException w:name="Dark List Accent 4" w:semiHidden="0" w:uiPriority="70" w:unhideWhenUsed="0"/>
-    <w:lsdException w:name="Colorful Shading Accent 4" w:semiHidden="0" w:uiPriority="71" w:unhideWhenUsed="0"/>
-    <w:lsdException w:name="Colorful List Accent 4" w:semiHidden="0" w:uiPriority="72" w:unhideWhenUsed="0"/>
-    <w:lsdException w:name="Colorful Grid Accent 4" w:semiHidden="0" w:uiPriority="73" w:unhideWhenUsed="0"/>
-    <w:lsdException w:name="Light Shading Accent 5" w:semiHidden="0" w:uiPriority="60" w:unhideWhenUsed="0"/>
-    <w:lsdException w:name="Light List Accent 5" w:semiHidden="0" w:uiPriority="61" w:unhideWhenUsed="0"/>
-    <w:lsdException w:name="Light Grid Accent 5" w:semiHidden="0" w:uiPriority="62" w:unhideWhenUsed="0"/>
-    <w:lsdException w:name="Medium Shading 1 Accent 5" w:semiHidden="0" w:uiPriority="63" w:unhideWhenUsed="0"/>
-    <w:lsdException w:name="Medium Shading 2 Accent 5" w:semiHidden="0" w:uiPriority="64" w:unhideWhenUsed="0"/>
-    <w:lsdException w:name="Medium List 1 Accent 5" w:semiHidden="0" w:uiPriority="65" w:unhideWhenUsed="0"/>
-    <w:lsdException w:name="Medium List 2 Accent 5" w:semiHidden="0" w:uiPriority="66" w:unhideWhenUsed="0"/>
-    <w:lsdException w:name="Medium Grid 1 Accent 5" w:semiHidden="0" w:uiPriority="67" w:unhideWhenUsed="0"/>
-    <w:lsdException w:name="Medium Grid 2 Accent 5" w:semiHidden="0" w:uiPriority="68" w:unhideWhenUsed="0"/>
-    <w:lsdException w:name="Medium Grid 3 Accent 5" w:semiHidden="0" w:uiPriority="69" w:unhideWhenUsed="0"/>
-    <w:lsdException w:name="Dark List Accent 5" w:semiHidden="0" w:uiPriority="70" w:unhideWhenUsed="0"/>
-    <w:lsdException w:name="Colorful Shading Accent 5" w:semiHidden="0" w:uiPriority="71" w:unhideWhenUsed="0"/>
-    <w:lsdException w:name="Colorful List Accent 5" w:semiHidden="0" w:uiPriority="72" w:unhideWhenUsed="0"/>
-    <w:lsdException w:name="Colorful Grid Accent 5" w:semiHidden="0" w:uiPriority="73" w:unhideWhenUsed="0"/>
-    <w:lsdException w:name="Light Shading Accent 6" w:semiHidden="0" w:uiPriority="60" w:unhideWhenUsed="0"/>
-    <w:lsdException w:name="Light List Accent 6" w:semiHidden="0" w:uiPriority="61" w:unhideWhenUsed="0"/>
-    <w:lsdException w:name="Light Grid Accent 6" w:semiHidden="0" w:uiPriority="62" w:unhideWhenUsed="0"/>
-    <w:lsdException w:name="Medium Shading 1 Accent 6" w:semiHidden="0" w:uiPriority="63" w:unhideWhenUsed="0"/>
-    <w:lsdException w:name="Medium Shading 2 Accent 6" w:semiHidden="0" w:uiPriority="64" w:unhideWhenUsed="0"/>
-    <w:lsdException w:name="Medium List 1 Accent 6" w:semiHidden="0" w:uiPriority="65" w:unhideWhenUsed="0"/>
-    <w:lsdException w:name="Medium List 2 Accent 6" w:semiHidden="0" w:uiPriority="66" w:unhideWhenUsed="0"/>
-    <w:lsdException w:name="Medium Grid 1 Accent 6" w:semiHidden="0" w:uiPriority="67" w:unhideWhenUsed="0"/>
-    <w:lsdException w:name="Medium Grid 2 Accent 6" w:semiHidden="0" w:uiPriority="68" w:unhideWhenUsed="0"/>
-    <w:lsdException w:name="Medium Grid 3 Accent 6" w:semiHidden="0" w:uiPriority="69" w:unhideWhenUsed="0"/>
-    <w:lsdException w:name="Dark List Accent 6" w:semiHidden="0" w:uiPriority="70" w:unhideWhenUsed="0"/>
-    <w:lsdException w:name="Colorful Shading Accent 6" w:semiHidden="0" w:uiPriority="71" w:unhideWhenUsed="0"/>
-    <w:lsdException w:name="Colorful List Accent 6" w:semiHidden="0" w:uiPriority="72" w:unhideWhenUsed="0"/>
-    <w:lsdException w:name="Colorful Grid Accent 6" w:semiHidden="0" w:uiPriority="73" w:unhideWhenUsed="0"/>
-    <w:lsdException w:name="Subtle Emphasis" w:semiHidden="0" w:uiPriority="19" w:unhideWhenUsed="0" w:qFormat="1"/>
-    <w:lsdException w:name="Intense Emphasis" w:semiHidden="0" w:uiPriority="21" w:unhideWhenUsed="0" w:qFormat="1"/>
-    <w:lsdException w:name="Subtle Reference" w:semiHidden="0" w:uiPriority="31" w:unhideWhenUsed="0" w:qFormat="1"/>
-    <w:lsdException w:name="Intense Reference" w:semiHidden="0" w:uiPriority="32" w:unhideWhenUsed="0" w:qFormat="1"/>
-    <w:lsdException w:name="Book Title" w:semiHidden="0" w:uiPriority="33" w:unhideWhenUsed="0" w:qFormat="1"/>
-    <w:lsdException w:name="Bibliography" w:uiPriority="37"/>
-    <w:lsdException w:name="TOC Heading" w:uiPriority="39" w:qFormat="1"/>
+  <w:latentStyles w:defLockedState="0" w:defUIPriority="99" w:defSemiHidden="0" w:defUnhideWhenUsed="0" w:defQFormat="0" w:count="376">
+    <w:lsdException w:name="Normal" w:uiPriority="0" w:qFormat="1"/>
+    <w:lsdException w:name="heading 1" w:uiPriority="0" w:qFormat="1"/>
+    <w:lsdException w:name="heading 2" w:semiHidden="1" w:uiPriority="0" w:unhideWhenUsed="1" w:qFormat="1"/>
+    <w:lsdException w:name="heading 3" w:semiHidden="1" w:uiPriority="0" w:unhideWhenUsed="1" w:qFormat="1"/>
+    <w:lsdException w:name="heading 4" w:semiHidden="1" w:uiPriority="9" w:unhideWhenUsed="1" w:qFormat="1"/>
+    <w:lsdException w:name="heading 5" w:semiHidden="1" w:uiPriority="9" w:unhideWhenUsed="1" w:qFormat="1"/>
+    <w:lsdException w:name="heading 6" w:semiHidden="1" w:uiPriority="9" w:unhideWhenUsed="1" w:qFormat="1"/>
+    <w:lsdException w:name="heading 7" w:semiHidden="1" w:uiPriority="9" w:unhideWhenUsed="1" w:qFormat="1"/>
+    <w:lsdException w:name="heading 8" w:semiHidden="1" w:uiPriority="9" w:unhideWhenUsed="1" w:qFormat="1"/>
+    <w:lsdException w:name="heading 9" w:semiHidden="1" w:uiPriority="9" w:unhideWhenUsed="1" w:qFormat="1"/>
+    <w:lsdException w:name="index 1" w:semiHidden="1" w:unhideWhenUsed="1"/>
+    <w:lsdException w:name="index 2" w:semiHidden="1" w:unhideWhenUsed="1"/>
+    <w:lsdException w:name="index 3" w:semiHidden="1" w:unhideWhenUsed="1"/>
+    <w:lsdException w:name="index 4" w:semiHidden="1" w:unhideWhenUsed="1"/>
+    <w:lsdException w:name="index 5" w:semiHidden="1" w:unhideWhenUsed="1"/>
+    <w:lsdException w:name="index 6" w:semiHidden="1" w:unhideWhenUsed="1"/>
+    <w:lsdException w:name="index 7" w:semiHidden="1" w:unhideWhenUsed="1"/>
+    <w:lsdException w:name="index 8" w:semiHidden="1" w:unhideWhenUsed="1"/>
+    <w:lsdException w:name="index 9" w:semiHidden="1" w:unhideWhenUsed="1"/>
+    <w:lsdException w:name="toc 1" w:semiHidden="1" w:uiPriority="39" w:unhideWhenUsed="1" w:qFormat="1"/>
+    <w:lsdException w:name="toc 2" w:semiHidden="1" w:uiPriority="39" w:unhideWhenUsed="1" w:qFormat="1"/>
+    <w:lsdException w:name="toc 3" w:semiHidden="1" w:uiPriority="39" w:unhideWhenUsed="1" w:qFormat="1"/>
+    <w:lsdException w:name="toc 4" w:semiHidden="1" w:uiPriority="39" w:unhideWhenUsed="1"/>
+    <w:lsdException w:name="toc 5" w:semiHidden="1" w:uiPriority="39" w:unhideWhenUsed="1"/>
+    <w:lsdException w:name="toc 6" w:semiHidden="1" w:uiPriority="39" w:unhideWhenUsed="1"/>
+    <w:lsdException w:name="toc 7" w:semiHidden="1" w:uiPriority="39" w:unhideWhenUsed="1"/>
+    <w:lsdException w:name="toc 8" w:semiHidden="1" w:uiPriority="39" w:unhideWhenUsed="1"/>
+    <w:lsdException w:name="toc 9" w:semiHidden="1" w:uiPriority="39" w:unhideWhenUsed="1"/>
+    <w:lsdException w:name="Normal Indent" w:semiHidden="1" w:unhideWhenUsed="1"/>
+    <w:lsdException w:name="footnote text" w:semiHidden="1" w:unhideWhenUsed="1"/>
+    <w:lsdException w:name="annotation text" w:semiHidden="1" w:unhideWhenUsed="1"/>
+    <w:lsdException w:name="header" w:semiHidden="1" w:unhideWhenUsed="1"/>
+    <w:lsdException w:name="footer" w:semiHidden="1" w:uiPriority="0" w:unhideWhenUsed="1"/>
+    <w:lsdException w:name="index heading" w:semiHidden="1" w:unhideWhenUsed="1"/>
+    <w:lsdException w:name="caption" w:semiHidden="1" w:uiPriority="0" w:unhideWhenUsed="1" w:qFormat="1"/>
+    <w:lsdException w:name="table of figures" w:semiHidden="1" w:unhideWhenUsed="1"/>
+    <w:lsdException w:name="envelope address" w:semiHidden="1" w:unhideWhenUsed="1"/>
+    <w:lsdException w:name="envelope return" w:semiHidden="1" w:unhideWhenUsed="1"/>
+    <w:lsdException w:name="footnote reference" w:semiHidden="1" w:unhideWhenUsed="1"/>
+    <w:lsdException w:name="annotation reference" w:semiHidden="1" w:unhideWhenUsed="1"/>
+    <w:lsdException w:name="line number" w:semiHidden="1" w:unhideWhenUsed="1"/>
+    <w:lsdException w:name="page number" w:semiHidden="1" w:unhideWhenUsed="1"/>
+    <w:lsdException w:name="endnote reference" w:semiHidden="1" w:unhideWhenUsed="1"/>
+    <w:lsdException w:name="endnote text" w:semiHidden="1" w:unhideWhenUsed="1"/>
+    <w:lsdException w:name="table of authorities" w:semiHidden="1" w:unhideWhenUsed="1"/>
+    <w:lsdException w:name="macro" w:semiHidden="1" w:unhideWhenUsed="1"/>
+    <w:lsdException w:name="toa heading" w:semiHidden="1" w:unhideWhenUsed="1"/>
+    <w:lsdException w:name="List" w:semiHidden="1" w:unhideWhenUsed="1"/>
+    <w:lsdException w:name="List Bullet" w:semiHidden="1" w:unhideWhenUsed="1"/>
+    <w:lsdException w:name="List Number" w:semiHidden="1" w:unhideWhenUsed="1"/>
+    <w:lsdException w:name="List 2" w:semiHidden="1" w:unhideWhenUsed="1"/>
+    <w:lsdException w:name="List 3" w:semiHidden="1" w:unhideWhenUsed="1"/>
+    <w:lsdException w:name="List 4" w:semiHidden="1" w:unhideWhenUsed="1"/>
+    <w:lsdException w:name="List 5" w:semiHidden="1" w:unhideWhenUsed="1"/>
+    <w:lsdException w:name="List Bullet 2" w:semiHidden="1" w:unhideWhenUsed="1"/>
+    <w:lsdException w:name="List Bullet 3" w:semiHidden="1" w:unhideWhenUsed="1"/>
+    <w:lsdException w:name="List Bullet 4" w:semiHidden="1" w:unhideWhenUsed="1"/>
+    <w:lsdException w:name="List Bullet 5" w:semiHidden="1" w:unhideWhenUsed="1"/>
+    <w:lsdException w:name="List Number 2" w:semiHidden="1" w:unhideWhenUsed="1"/>
+    <w:lsdException w:name="List Number 3" w:semiHidden="1" w:unhideWhenUsed="1"/>
+    <w:lsdException w:name="List Number 4" w:semiHidden="1" w:unhideWhenUsed="1"/>
+    <w:lsdException w:name="List Number 5" w:semiHidden="1" w:unhideWhenUsed="1"/>
+    <w:lsdException w:name="Title" w:uiPriority="10" w:qFormat="1"/>
+    <w:lsdException w:name="Closing" w:semiHidden="1" w:unhideWhenUsed="1"/>
+    <w:lsdException w:name="Signature" w:semiHidden="1" w:unhideWhenUsed="1"/>
+    <w:lsdException w:name="Default Paragraph Font" w:semiHidden="1" w:uiPriority="1" w:unhideWhenUsed="1"/>
+    <w:lsdException w:name="Body Text" w:semiHidden="1" w:unhideWhenUsed="1"/>
+    <w:lsdException w:name="Body Text Indent" w:semiHidden="1" w:unhideWhenUsed="1"/>
+    <w:lsdException w:name="List Continue" w:semiHidden="1" w:unhideWhenUsed="1"/>
+    <w:lsdException w:name="List Continue 2" w:semiHidden="1" w:unhideWhenUsed="1"/>
+    <w:lsdException w:name="List Continue 3" w:semiHidden="1" w:unhideWhenUsed="1"/>
+    <w:lsdException w:name="List Continue 4" w:semiHidden="1" w:unhideWhenUsed="1"/>
+    <w:lsdException w:name="List Continue 5" w:semiHidden="1" w:unhideWhenUsed="1"/>
+    <w:lsdException w:name="Message Header" w:semiHidden="1" w:unhideWhenUsed="1"/>
+    <w:lsdException w:name="Subtitle" w:uiPriority="11" w:qFormat="1"/>
+    <w:lsdException w:name="Salutation" w:semiHidden="1" w:unhideWhenUsed="1"/>
+    <w:lsdException w:name="Date" w:semiHidden="1" w:unhideWhenUsed="1"/>
+    <w:lsdException w:name="Body Text First Indent" w:semiHidden="1" w:unhideWhenUsed="1"/>
+    <w:lsdException w:name="Body Text First Indent 2" w:semiHidden="1" w:unhideWhenUsed="1"/>
+    <w:lsdException w:name="Note Heading" w:semiHidden="1" w:unhideWhenUsed="1"/>
+    <w:lsdException w:name="Body Text 2" w:semiHidden="1" w:unhideWhenUsed="1"/>
+    <w:lsdException w:name="Body Text 3" w:semiHidden="1" w:unhideWhenUsed="1"/>
+    <w:lsdException w:name="Body Text Indent 2" w:semiHidden="1" w:unhideWhenUsed="1"/>
+    <w:lsdException w:name="Body Text Indent 3" w:semiHidden="1" w:unhideWhenUsed="1"/>
+    <w:lsdException w:name="Block Text" w:semiHidden="1" w:unhideWhenUsed="1"/>
+    <w:lsdException w:name="Hyperlink" w:semiHidden="1" w:unhideWhenUsed="1"/>
+    <w:lsdException w:name="FollowedHyperlink" w:semiHidden="1" w:unhideWhenUsed="1"/>
+    <w:lsdException w:name="Strong" w:uiPriority="22" w:qFormat="1"/>
+    <w:lsdException w:name="Emphasis" w:uiPriority="20" w:qFormat="1"/>
+    <w:lsdException w:name="Document Map" w:semiHidden="1" w:unhideWhenUsed="1"/>
+    <w:lsdException w:name="Plain Text" w:semiHidden="1" w:unhideWhenUsed="1"/>
+    <w:lsdException w:name="E-mail Signature" w:semiHidden="1" w:unhideWhenUsed="1"/>
+    <w:lsdException w:name="HTML Top of Form" w:semiHidden="1" w:unhideWhenUsed="1"/>
+    <w:lsdException w:name="HTML Bottom of Form" w:semiHidden="1" w:unhideWhenUsed="1"/>
+    <w:lsdException w:name="Normal (Web)" w:semiHidden="1" w:unhideWhenUsed="1"/>
+    <w:lsdException w:name="HTML Acronym" w:semiHidden="1" w:unhideWhenUsed="1"/>
+    <w:lsdException w:name="HTML Address" w:semiHidden="1" w:unhideWhenUsed="1"/>
+    <w:lsdException w:name="HTML Cite" w:semiHidden="1" w:unhideWhenUsed="1"/>
+    <w:lsdException w:name="HTML Code" w:semiHidden="1" w:unhideWhenUsed="1"/>
+    <w:lsdException w:name="HTML Definition" w:semiHidden="1" w:unhideWhenUsed="1"/>
+    <w:lsdException w:name="HTML Keyboard" w:semiHidden="1" w:unhideWhenUsed="1"/>
+    <w:lsdException w:name="HTML Preformatted" w:semiHidden="1" w:unhideWhenUsed="1"/>
+    <w:lsdException w:name="HTML Sample" w:semiHidden="1" w:unhideWhenUsed="1"/>
+    <w:lsdException w:name="HTML Typewriter" w:semiHidden="1" w:unhideWhenUsed="1"/>
+    <w:lsdException w:name="HTML Variable" w:semiHidden="1" w:unhideWhenUsed="1"/>
+    <w:lsdException w:name="Normal Table" w:semiHidden="1" w:unhideWhenUsed="1"/>
+    <w:lsdException w:name="annotation subject" w:semiHidden="1" w:unhideWhenUsed="1"/>
+    <w:lsdException w:name="No List" w:semiHidden="1" w:unhideWhenUsed="1"/>
+    <w:lsdException w:name="Outline List 1" w:semiHidden="1" w:unhideWhenUsed="1"/>
+    <w:lsdException w:name="Outline List 2" w:semiHidden="1" w:unhideWhenUsed="1"/>
+    <w:lsdException w:name="Outline List 3" w:semiHidden="1" w:unhideWhenUsed="1"/>
+    <w:lsdException w:name="Table Simple 1" w:semiHidden="1" w:unhideWhenUsed="1"/>
+    <w:lsdException w:name="Table Simple 2" w:semiHidden="1" w:unhideWhenUsed="1"/>
+    <w:lsdException w:name="Table Simple 3" w:semiHidden="1" w:unhideWhenUsed="1"/>
+    <w:lsdException w:name="Table Classic 1" w:semiHidden="1" w:unhideWhenUsed="1"/>
+    <w:lsdException w:name="Table Classic 2" w:semiHidden="1" w:unhideWhenUsed="1"/>
+    <w:lsdException w:name="Table Classic 3" w:semiHidden="1" w:unhideWhenUsed="1"/>
+    <w:lsdException w:name="Table Classic 4" w:semiHidden="1" w:unhideWhenUsed="1"/>
+    <w:lsdException w:name="Table Colorful 1" w:semiHidden="1" w:unhideWhenUsed="1"/>
+    <w:lsdException w:name="Table Colorful 2" w:semiHidden="1" w:unhideWhenUsed="1"/>
+    <w:lsdException w:name="Table Colorful 3" w:semiHidden="1" w:unhideWhenUsed="1"/>
+    <w:lsdException w:name="Table Columns 1" w:semiHidden="1" w:unhideWhenUsed="1"/>
+    <w:lsdException w:name="Table Columns 2" w:semiHidden="1" w:unhideWhenUsed="1"/>
+    <w:lsdException w:name="Table Columns 3" w:semiHidden="1" w:unhideWhenUsed="1"/>
+    <w:lsdException w:name="Table Columns 4" w:semiHidden="1" w:unhideWhenUsed="1"/>
+    <w:lsdException w:name="Table Columns 5" w:semiHidden="1" w:unhideWhenUsed="1"/>
+    <w:lsdException w:name="Table Grid 1" w:semiHidden="1" w:unhideWhenUsed="1"/>
+    <w:lsdException w:name="Table Grid 2" w:semiHidden="1" w:unhideWhenUsed="1"/>
+    <w:lsdException w:name="Table Grid 3" w:semiHidden="1" w:unhideWhenUsed="1"/>
+    <w:lsdException w:name="Table Grid 4" w:semiHidden="1" w:unhideWhenUsed="1"/>
+    <w:lsdException w:name="Table Grid 5" w:semiHidden="1" w:unhideWhenUsed="1"/>
+    <w:lsdException w:name="Table Grid 6" w:semiHidden="1" w:unhideWhenUsed="1"/>
+    <w:lsdException w:name="Table Grid 7" w:semiHidden="1" w:unhideWhenUsed="1"/>
+    <w:lsdException w:name="Table Grid 8" w:semiHidden="1" w:unhideWhenUsed="1"/>
+    <w:lsdException w:name="Table List 1" w:semiHidden="1" w:unhideWhenUsed="1"/>
+    <w:lsdException w:name="Table List 2" w:semiHidden="1" w:unhideWhenUsed="1"/>
+    <w:lsdException w:name="Table List 3" w:semiHidden="1" w:unhideWhenUsed="1"/>
+    <w:lsdException w:name="Table List 4" w:semiHidden="1" w:unhideWhenUsed="1"/>
+    <w:lsdException w:name="Table List 5" w:semiHidden="1" w:unhideWhenUsed="1"/>
+    <w:lsdException w:name="Table List 6" w:semiHidden="1" w:unhideWhenUsed="1"/>
+    <w:lsdException w:name="Table List 7" w:semiHidden="1" w:unhideWhenUsed="1"/>
+    <w:lsdException w:name="Table List 8" w:semiHidden="1" w:unhideWhenUsed="1"/>
+    <w:lsdException w:name="Table 3D effects 1" w:semiHidden="1" w:unhideWhenUsed="1"/>
+    <w:lsdException w:name="Table 3D effects 2" w:semiHidden="1" w:unhideWhenUsed="1"/>
+    <w:lsdException w:name="Table 3D effects 3" w:semiHidden="1" w:unhideWhenUsed="1"/>
+    <w:lsdException w:name="Table Contemporary" w:semiHidden="1" w:unhideWhenUsed="1"/>
+    <w:lsdException w:name="Table Elegant" w:semiHidden="1" w:unhideWhenUsed="1"/>
+    <w:lsdException w:name="Table Professional" w:semiHidden="1" w:unhideWhenUsed="1"/>
+    <w:lsdException w:name="Table Subtle 1" w:semiHidden="1" w:unhideWhenUsed="1"/>
+    <w:lsdException w:name="Table Subtle 2" w:semiHidden="1" w:unhideWhenUsed="1"/>
+    <w:lsdException w:name="Table Web 1" w:semiHidden="1" w:unhideWhenUsed="1"/>
+    <w:lsdException w:name="Table Web 2" w:semiHidden="1" w:unhideWhenUsed="1"/>
+    <w:lsdException w:name="Table Web 3" w:semiHidden="1" w:unhideWhenUsed="1"/>
+    <w:lsdException w:name="Balloon Text" w:semiHidden="1" w:unhideWhenUsed="1"/>
+    <w:lsdException w:name="Table Grid" w:uiPriority="59"/>
+    <w:lsdException w:name="Table Theme" w:semiHidden="1" w:unhideWhenUsed="1"/>
+    <w:lsdException w:name="Placeholder Text" w:semiHidden="1"/>
+    <w:lsdException w:name="No Spacing" w:uiPriority="1" w:qFormat="1"/>
+    <w:lsdException w:name="Light Shading" w:uiPriority="60"/>
+    <w:lsdException w:name="Light List" w:uiPriority="61"/>
+    <w:lsdException w:name="Light Grid" w:uiPriority="62"/>
+    <w:lsdException w:name="Medium Shading 1" w:uiPriority="63"/>
+    <w:lsdException w:name="Medium Shading 2" w:uiPriority="64"/>
+    <w:lsdException w:name="Medium List 1" w:uiPriority="65"/>
+    <w:lsdException w:name="Medium List 2" w:uiPriority="66"/>
+    <w:lsdException w:name="Medium Grid 1" w:uiPriority="67"/>
+    <w:lsdException w:name="Medium Grid 2" w:uiPriority="68"/>
+    <w:lsdException w:name="Medium Grid 3" w:uiPriority="69"/>
+    <w:lsdException w:name="Dark List" w:uiPriority="70"/>
+    <w:lsdException w:name="Colorful Shading" w:uiPriority="71"/>
+    <w:lsdException w:name="Colorful List" w:uiPriority="72"/>
+    <w:lsdException w:name="Colorful Grid" w:uiPriority="73"/>
+    <w:lsdException w:name="Light Shading Accent 1" w:uiPriority="60"/>
+    <w:lsdException w:name="Light List Accent 1" w:uiPriority="61"/>
+    <w:lsdException w:name="Light Grid Accent 1" w:uiPriority="62"/>
+    <w:lsdException w:name="Medium Shading 1 Accent 1" w:uiPriority="63"/>
+    <w:lsdException w:name="Medium Shading 2 Accent 1" w:uiPriority="64"/>
+    <w:lsdException w:name="Medium List 1 Accent 1" w:uiPriority="65"/>
+    <w:lsdException w:name="Revision" w:semiHidden="1"/>
+    <w:lsdException w:name="List Paragraph" w:uiPriority="34" w:qFormat="1"/>
+    <w:lsdException w:name="Quote" w:uiPriority="29" w:qFormat="1"/>
+    <w:lsdException w:name="Intense Quote" w:uiPriority="30" w:qFormat="1"/>
+    <w:lsdException w:name="Medium List 2 Accent 1" w:uiPriority="66"/>
+    <w:lsdException w:name="Medium Grid 1 Accent 1" w:uiPriority="67"/>
+    <w:lsdException w:name="Medium Grid 2 Accent 1" w:uiPriority="68"/>
+    <w:lsdException w:name="Medium Grid 3 Accent 1" w:uiPriority="69"/>
+    <w:lsdException w:name="Dark List Accent 1" w:uiPriority="70"/>
+    <w:lsdException w:name="Colorful Shading Accent 1" w:uiPriority="71"/>
+    <w:lsdException w:name="Colorful List Accent 1" w:uiPriority="72"/>
+    <w:lsdException w:name="Colorful Grid Accent 1" w:uiPriority="73"/>
+    <w:lsdException w:name="Light Shading Accent 2" w:uiPriority="60"/>
+    <w:lsdException w:name="Light List Accent 2" w:uiPriority="61"/>
+    <w:lsdException w:name="Light Grid Accent 2" w:uiPriority="62"/>
+    <w:lsdException w:name="Medium Shading 1 Accent 2" w:uiPriority="63"/>
+    <w:lsdException w:name="Medium Shading 2 Accent 2" w:uiPriority="64"/>
+    <w:lsdException w:name="Medium List 1 Accent 2" w:uiPriority="65"/>
+    <w:lsdException w:name="Medium List 2 Accent 2" w:uiPriority="66"/>
+    <w:lsdException w:name="Medium Grid 1 Accent 2" w:uiPriority="67"/>
+    <w:lsdException w:name="Medium Grid 2 Accent 2" w:uiPriority="68"/>
+    <w:lsdException w:name="Medium Grid 3 Accent 2" w:uiPriority="69"/>
+    <w:lsdException w:name="Dark List Accent 2" w:uiPriority="70"/>
+    <w:lsdException w:name="Colorful Shading Accent 2" w:uiPriority="71"/>
+    <w:lsdException w:name="Colorful List Accent 2" w:uiPriority="72"/>
+    <w:lsdException w:name="Colorful Grid Accent 2" w:uiPriority="73"/>
+    <w:lsdException w:name="Light Shading Accent 3" w:uiPriority="60"/>
+    <w:lsdException w:name="Light List Accent 3" w:uiPriority="61"/>
+    <w:lsdException w:name="Light Grid Accent 3" w:uiPriority="62"/>
+    <w:lsdException w:name="Medium Shading 1 Accent 3" w:uiPriority="63"/>
+    <w:lsdException w:name="Medium Shading 2 Accent 3" w:uiPriority="64"/>
+    <w:lsdException w:name="Medium List 1 Accent 3" w:uiPriority="65"/>
+    <w:lsdException w:name="Medium List 2 Accent 3" w:uiPriority="66"/>
+    <w:lsdException w:name="Medium Grid 1 Accent 3" w:uiPriority="67"/>
+    <w:lsdException w:name="Medium Grid 2 Accent 3" w:uiPriority="68"/>
+    <w:lsdException w:name="Medium Grid 3 Accent 3" w:uiPriority="69"/>
+    <w:lsdException w:name="Dark List Accent 3" w:uiPriority="70"/>
+    <w:lsdException w:name="Colorful Shading Accent 3" w:uiPriority="71"/>
+    <w:lsdException w:name="Colorful List Accent 3" w:uiPriority="72"/>
+    <w:lsdException w:name="Colorful Grid Accent 3" w:uiPriority="73"/>
+    <w:lsdException w:name="Light Shading Accent 4" w:uiPriority="60"/>
+    <w:lsdException w:name="Light List Accent 4" w:uiPriority="61"/>
+    <w:lsdException w:name="Light Grid Accent 4" w:uiPriority="62"/>
+    <w:lsdException w:name="Medium Shading 1 Accent 4" w:uiPriority="63"/>
+    <w:lsdException w:name="Medium Shading 2 Accent 4" w:uiPriority="64"/>
+    <w:lsdException w:name="Medium List 1 Accent 4" w:uiPriority="65"/>
+    <w:lsdException w:name="Medium List 2 Accent 4" w:uiPriority="66"/>
+    <w:lsdException w:name="Medium Grid 1 Accent 4" w:uiPriority="67"/>
+    <w:lsdException w:name="Medium Grid 2 Accent 4" w:uiPriority="68"/>
+    <w:lsdException w:name="Medium Grid 3 Accent 4" w:uiPriority="69"/>
+    <w:lsdException w:name="Dark List Accent 4" w:uiPriority="70"/>
+    <w:lsdException w:name="Colorful Shading Accent 4" w:uiPriority="71"/>
+    <w:lsdException w:name="Colorful List Accent 4" w:uiPriority="72"/>
+    <w:lsdException w:name="Colorful Grid Accent 4" w:uiPriority="73"/>
+    <w:lsdException w:name="Light Shading Accent 5" w:uiPriority="60"/>
+    <w:lsdException w:name="Light List Accent 5" w:uiPriority="61"/>
+    <w:lsdException w:name="Light Grid Accent 5" w:uiPriority="62"/>
+    <w:lsdException w:name="Medium Shading 1 Accent 5" w:uiPriority="63"/>
+    <w:lsdException w:name="Medium Shading 2 Accent 5" w:uiPriority="64"/>
+    <w:lsdException w:name="Medium List 1 Accent 5" w:uiPriority="65"/>
+    <w:lsdException w:name="Medium List 2 Accent 5" w:uiPriority="66"/>
+    <w:lsdException w:name="Medium Grid 1 Accent 5" w:uiPriority="67"/>
+    <w:lsdException w:name="Medium Grid 2 Accent 5" w:uiPriority="68"/>
+    <w:lsdException w:name="Medium Grid 3 Accent 5" w:uiPriority="69"/>
+    <w:lsdException w:name="Dark List Accent 5" w:uiPriority="70"/>
+    <w:lsdException w:name="Colorful Shading Accent 5" w:uiPriority="71"/>
+    <w:lsdException w:name="Colorful List Accent 5" w:uiPriority="72"/>
+    <w:lsdException w:name="Colorful Grid Accent 5" w:uiPriority="73"/>
+    <w:lsdException w:name="Light Shading Accent 6" w:uiPriority="60"/>
+    <w:lsdException w:name="Light List Accent 6" w:uiPriority="61"/>
+    <w:lsdException w:name="Light Grid Accent 6" w:uiPriority="62"/>
+    <w:lsdException w:name="Medium Shading 1 Accent 6" w:uiPriority="63"/>
+    <w:lsdException w:name="Medium Shading 2 Accent 6" w:uiPriority="64"/>
+    <w:lsdException w:name="Medium List 1 Accent 6" w:uiPriority="65"/>
+    <w:lsdException w:name="Medium List 2 Accent 6" w:uiPriority="66"/>
+    <w:lsdException w:name="Medium Grid 1 Accent 6" w:uiPriority="67"/>
+    <w:lsdException w:name="Medium Grid 2 Accent 6" w:uiPriority="68"/>
+    <w:lsdException w:name="Medium Grid 3 Accent 6" w:uiPriority="69"/>
+    <w:lsdException w:name="Dark List Accent 6" w:uiPriority="70"/>
+    <w:lsdException w:name="Colorful Shading Accent 6" w:uiPriority="71"/>
+    <w:lsdException w:name="Colorful List Accent 6" w:uiPriority="72"/>
+    <w:lsdException w:name="Colorful Grid Accent 6" w:uiPriority="73"/>
+    <w:lsdException w:name="Subtle Emphasis" w:uiPriority="19" w:qFormat="1"/>
+    <w:lsdException w:name="Intense Emphasis" w:uiPriority="21" w:qFormat="1"/>
+    <w:lsdException w:name="Subtle Reference" w:uiPriority="31" w:qFormat="1"/>
+    <w:lsdException w:name="Intense Reference" w:uiPriority="32" w:qFormat="1"/>
+    <w:lsdException w:name="Book Title" w:uiPriority="33" w:qFormat="1"/>
+    <w:lsdException w:name="Bibliography" w:semiHidden="1" w:uiPriority="37" w:unhideWhenUsed="1"/>
+    <w:lsdException w:name="TOC Heading" w:semiHidden="1" w:uiPriority="39" w:unhideWhenUsed="1" w:qFormat="1"/>
+    <w:lsdException w:name="Plain Table 1" w:uiPriority="41"/>
+    <w:lsdException w:name="Plain Table 2" w:uiPriority="42"/>
+    <w:lsdException w:name="Plain Table 3" w:uiPriority="43"/>
+    <w:lsdException w:name="Plain Table 4" w:uiPriority="44"/>
+    <w:lsdException w:name="Plain Table 5" w:uiPriority="45"/>
+    <w:lsdException w:name="Grid Table Light" w:uiPriority="40"/>
+    <w:lsdException w:name="Grid Table 1 Light" w:uiPriority="46"/>
+    <w:lsdException w:name="Grid Table 2" w:uiPriority="47"/>
+    <w:lsdException w:name="Grid Table 3" w:uiPriority="48"/>
+    <w:lsdException w:name="Grid Table 4" w:uiPriority="49"/>
+    <w:lsdException w:name="Grid Table 5 Dark" w:uiPriority="50"/>
+    <w:lsdException w:name="Grid Table 6 Colorful" w:uiPriority="51"/>
+    <w:lsdException w:name="Grid Table 7 Colorful" w:uiPriority="52"/>
+    <w:lsdException w:name="Grid Table 1 Light Accent 1" w:uiPriority="46"/>
+    <w:lsdException w:name="Grid Table 2 Accent 1" w:uiPriority="47"/>
+    <w:lsdException w:name="Grid Table 3 Accent 1" w:uiPriority="48"/>
+    <w:lsdException w:name="Grid Table 4 Accent 1" w:uiPriority="49"/>
+    <w:lsdException w:name="Grid Table 5 Dark Accent 1" w:uiPriority="50"/>
+    <w:lsdException w:name="Grid Table 6 Colorful Accent 1" w:uiPriority="51"/>
+    <w:lsdException w:name="Grid Table 7 Colorful Accent 1" w:uiPriority="52"/>
+    <w:lsdException w:name="Grid Table 1 Light Accent 2" w:uiPriority="46"/>
+    <w:lsdException w:name="Grid Table 2 Accent 2" w:uiPriority="47"/>
+    <w:lsdException w:name="Grid Table 3 Accent 2" w:uiPriority="48"/>
+    <w:lsdException w:name="Grid Table 4 Accent 2" w:uiPriority="49"/>
+    <w:lsdException w:name="Grid Table 5 Dark Accent 2" w:uiPriority="50"/>
+    <w:lsdException w:name="Grid Table 6 Colorful Accent 2" w:uiPriority="51"/>
+    <w:lsdException w:name="Grid Table 7 Colorful Accent 2" w:uiPriority="52"/>
+    <w:lsdException w:name="Grid Table 1 Light Accent 3" w:uiPriority="46"/>
+    <w:lsdException w:name="Grid Table 2 Accent 3" w:uiPriority="47"/>
+    <w:lsdException w:name="Grid Table 3 Accent 3" w:uiPriority="48"/>
+    <w:lsdException w:name="Grid Table 4 Accent 3" w:uiPriority="49"/>
+    <w:lsdException w:name="Grid Table 5 Dark Accent 3" w:uiPriority="50"/>
+    <w:lsdException w:name="Grid Table 6 Colorful Accent 3" w:uiPriority="51"/>
+    <w:lsdException w:name="Grid Table 7 Colorful Accent 3" w:uiPriority="52"/>
+    <w:lsdException w:name="Grid Table 1 Light Accent 4" w:uiPriority="46"/>
+    <w:lsdException w:name="Grid Table 2 Accent 4" w:uiPriority="47"/>
+    <w:lsdException w:name="Grid Table 3 Accent 4" w:uiPriority="48"/>
+    <w:lsdException w:name="Grid Table 4 Accent 4" w:uiPriority="49"/>
+    <w:lsdException w:name="Grid Table 5 Dark Accent 4" w:uiPriority="50"/>
+    <w:lsdException w:name="Grid Table 6 Colorful Accent 4" w:uiPriority="51"/>
+    <w:lsdException w:name="Grid Table 7 Colorful Accent 4" w:uiPriority="52"/>
+    <w:lsdException w:name="Grid Table 1 Light Accent 5" w:uiPriority="46"/>
+    <w:lsdException w:name="Grid Table 2 Accent 5" w:uiPriority="47"/>
+    <w:lsdException w:name="Grid Table 3 Accent 5" w:uiPriority="48"/>
+    <w:lsdException w:name="Grid Table 4 Accent 5" w:uiPriority="49"/>
+    <w:lsdException w:name="Grid Table 5 Dark Accent 5" w:uiPriority="50"/>
+    <w:lsdException w:name="Grid Table 6 Colorful Accent 5" w:uiPriority="51"/>
+    <w:lsdException w:name="Grid Table 7 Colorful Accent 5" w:uiPriority="52"/>
+    <w:lsdException w:name="Grid Table 1 Light Accent 6" w:uiPriority="46"/>
+    <w:lsdException w:name="Grid Table 2 Accent 6" w:uiPriority="47"/>
+    <w:lsdException w:name="Grid Table 3 Accent 6" w:uiPriority="48"/>
+    <w:lsdException w:name="Grid Table 4 Accent 6" w:uiPriority="49"/>
+    <w:lsdException w:name="Grid Table 5 Dark Accent 6" w:uiPriority="50"/>
+    <w:lsdException w:name="Grid Table 6 Colorful Accent 6" w:uiPriority="51"/>
+    <w:lsdException w:name="Grid Table 7 Colorful Accent 6" w:uiPriority="52"/>
+    <w:lsdException w:name="List Table 1 Light" w:uiPriority="46"/>
+    <w:lsdException w:name="List Table 2" w:uiPriority="47"/>
+    <w:lsdException w:name="List Table 3" w:uiPriority="48"/>
+    <w:lsdException w:name="List Table 4" w:uiPriority="49"/>
+    <w:lsdException w:name="List Table 5 Dark" w:uiPriority="50"/>
+    <w:lsdException w:name="List Table 6 Colorful" w:uiPriority="51"/>
+    <w:lsdException w:name="List Table 7 Colorful" w:uiPriority="52"/>
+    <w:lsdException w:name="List Table 1 Light Accent 1" w:uiPriority="46"/>
+    <w:lsdException w:name="List Table 2 Accent 1" w:uiPriority="47"/>
+    <w:lsdException w:name="List Table 3 Accent 1" w:uiPriority="48"/>
+    <w:lsdException w:name="List Table 4 Accent 1" w:uiPriority="49"/>
+    <w:lsdException w:name="List Table 5 Dark Accent 1" w:uiPriority="50"/>
+    <w:lsdException w:name="List Table 6 Colorful Accent 1" w:uiPriority="51"/>
+    <w:lsdException w:name="List Table 7 Colorful Accent 1" w:uiPriority="52"/>
+    <w:lsdException w:name="List Table 1 Light Accent 2" w:uiPriority="46"/>
+    <w:lsdException w:name="List Table 2 Accent 2" w:uiPriority="47"/>
+    <w:lsdException w:name="List Table 3 Accent 2" w:uiPriority="48"/>
+    <w:lsdException w:name="List Table 4 Accent 2" w:uiPriority="49"/>
+    <w:lsdException w:name="List Table 5 Dark Accent 2" w:uiPriority="50"/>
+    <w:lsdException w:name="List Table 6 Colorful Accent 2" w:uiPriority="51"/>
+    <w:lsdException w:name="List Table 7 Colorful Accent 2" w:uiPriority="52"/>
+    <w:lsdException w:name="List Table 1 Light Accent 3" w:uiPriority="46"/>
+    <w:lsdException w:name="List Table 2 Accent 3" w:uiPriority="47"/>
+    <w:lsdException w:name="List Table 3 Accent 3" w:uiPriority="48"/>
+    <w:lsdException w:name="List Table 4 Accent 3" w:uiPriority="49"/>
+    <w:lsdException w:name="List Table 5 Dark Accent 3" w:uiPriority="50"/>
+    <w:lsdException w:name="List Table 6 Colorful Accent 3" w:uiPriority="51"/>
+    <w:lsdException w:name="List Table 7 Colorful Accent 3" w:uiPriority="52"/>
+    <w:lsdException w:name="List Table 1 Light Accent 4" w:uiPriority="46"/>
+    <w:lsdException w:name="List Table 2 Accent 4" w:uiPriority="47"/>
+    <w:lsdException w:name="List Table 3 Accent 4" w:uiPriority="48"/>
+    <w:lsdException w:name="List Table 4 Accent 4" w:uiPriority="49"/>
+    <w:lsdException w:name="List Table 5 Dark Accent 4" w:uiPriority="50"/>
+    <w:lsdException w:name="List Table 6 Colorful Accent 4" w:uiPriority="51"/>
+    <w:lsdException w:name="List Table 7 Colorful Accent 4" w:uiPriority="52"/>
+    <w:lsdException w:name="List Table 1 Light Accent 5" w:uiPriority="46"/>
+    <w:lsdException w:name="List Table 2 Accent 5" w:uiPriority="47"/>
+    <w:lsdException w:name="List Table 3 Accent 5" w:uiPriority="48"/>
+    <w:lsdException w:name="List Table 4 Accent 5" w:uiPriority="49"/>
+    <w:lsdException w:name="List Table 5 Dark Accent 5" w:uiPriority="50"/>
+    <w:lsdException w:name="List Table 6 Colorful Accent 5" w:uiPriority="51"/>
+    <w:lsdException w:name="List Table 7 Colorful Accent 5" w:uiPriority="52"/>
+    <w:lsdException w:name="List Table 1 Light Accent 6" w:uiPriority="46"/>
+    <w:lsdException w:name="List Table 2 Accent 6" w:uiPriority="47"/>
+    <w:lsdException w:name="List Table 3 Accent 6" w:uiPriority="48"/>
+    <w:lsdException w:name="List Table 4 Accent 6" w:uiPriority="49"/>
+    <w:lsdException w:name="List Table 5 Dark Accent 6" w:uiPriority="50"/>
+    <w:lsdException w:name="List Table 6 Colorful Accent 6" w:uiPriority="51"/>
+    <w:lsdException w:name="List Table 7 Colorful Accent 6" w:uiPriority="52"/>
+    <w:lsdException w:name="Mention" w:semiHidden="1" w:unhideWhenUsed="1"/>
+    <w:lsdException w:name="Smart Hyperlink" w:semiHidden="1" w:unhideWhenUsed="1"/>
+    <w:lsdException w:name="Hashtag" w:semiHidden="1" w:unhideWhenUsed="1"/>
+    <w:lsdException w:name="Unresolved Mention" w:semiHidden="1" w:unhideWhenUsed="1"/>
+    <w:lsdException w:name="Smart Link" w:semiHidden="1" w:unhideWhenUsed="1"/>
   </w:latentStyles>
   <w:style w:type="paragraph" w:default="1" w:styleId="Normal">
     <w:name w:val="Normal"/>
@@ -4061,7 +4299,6 @@
     <w:uiPriority w:val="99"/>
     <w:semiHidden/>
     <w:unhideWhenUsed/>
-    <w:qFormat/>
     <w:tblPr>
       <w:tblInd w:w="0" w:type="dxa"/>
       <w:tblCellMar>
@@ -4276,7 +4513,6 @@
     <w:uiPriority w:val="59"/>
     <w:rsid w:val="00085B87"/>
     <w:tblPr>
-      <w:tblInd w:w="0" w:type="dxa"/>
       <w:tblBorders>
         <w:top w:val="single" w:sz="4" w:space="0" w:color="000000" w:themeColor="text1"/>
         <w:left w:val="single" w:sz="4" w:space="0" w:color="000000" w:themeColor="text1"/>
@@ -4285,12 +4521,6 @@
         <w:insideH w:val="single" w:sz="4" w:space="0" w:color="000000" w:themeColor="text1"/>
         <w:insideV w:val="single" w:sz="4" w:space="0" w:color="000000" w:themeColor="text1"/>
       </w:tblBorders>
-      <w:tblCellMar>
-        <w:top w:w="0" w:type="dxa"/>
-        <w:left w:w="108" w:type="dxa"/>
-        <w:bottom w:w="0" w:type="dxa"/>
-        <w:right w:w="108" w:type="dxa"/>
-      </w:tblCellMar>
     </w:tblPr>
   </w:style>
   <w:style w:type="character" w:styleId="FollowedHyperlink">

</xml_diff>

<commit_message>
Make restoring from a file more friendly when there are errors.
</commit_message>
<xml_diff>
--- a/Documentation/AboutTAXTools.docx
+++ b/Documentation/AboutTAXTools.docx
@@ -47,7 +47,7 @@
         <w:rPr>
           <w:noProof/>
         </w:rPr>
-        <w:t>October 2, 2026</w:t>
+        <w:t>October 8, 2026</w:t>
       </w:r>
       <w:r>
         <w:rPr>
@@ -105,15 +105,7 @@
         <w:t xml:space="preserve">The </w:t>
       </w:r>
       <w:r>
-        <w:t xml:space="preserve">Tax Analysis and Experimentation Tools, or </w:t>
-      </w:r>
-      <w:proofErr w:type="spellStart"/>
-      <w:r>
-        <w:t>TAXTools</w:t>
-      </w:r>
-      <w:proofErr w:type="spellEnd"/>
-      <w:r>
-        <w:t xml:space="preserve"> for short,</w:t>
+        <w:t>Tax Analysis and Experimentation Tools, or TAXTools for short,</w:t>
       </w:r>
       <w:r>
         <w:t xml:space="preserve"> are</w:t>
@@ -293,21 +285,7 @@
             <w:rStyle w:val="Hyperlink"/>
             <w:sz w:val="18"/>
           </w:rPr>
-          <w:t>bruceblinn.com/6-OtherStuff/Ta</w:t>
-        </w:r>
-        <w:r>
-          <w:rPr>
-            <w:rStyle w:val="Hyperlink"/>
-            <w:sz w:val="18"/>
-          </w:rPr>
-          <w:t>x</w:t>
-        </w:r>
-        <w:r>
-          <w:rPr>
-            <w:rStyle w:val="Hyperlink"/>
-            <w:sz w:val="18"/>
-          </w:rPr>
-          <w:t>es/TAXToolsHomePage.html</w:t>
+          <w:t>bruceblinn.com/6-OtherStuff/Taxes/TAXToolsHomePage.html</w:t>
         </w:r>
       </w:hyperlink>
     </w:p>
@@ -799,59 +777,21 @@
       <w:pPr>
         <w:pStyle w:val="Body-Text025"/>
       </w:pPr>
-      <w:proofErr w:type="spellStart"/>
-      <w:r>
-        <w:t>IncTax</w:t>
-      </w:r>
-      <w:proofErr w:type="spellEnd"/>
-      <w:r>
-        <w:t xml:space="preserve"> </w:t>
-      </w:r>
-      <w:proofErr w:type="spellStart"/>
-      <w:r>
-        <w:t>IRADeduction</w:t>
-      </w:r>
-      <w:proofErr w:type="spellEnd"/>
-      <w:r>
-        <w:t xml:space="preserve"> Refund </w:t>
-      </w:r>
-      <w:proofErr w:type="spellStart"/>
-      <w:r>
-        <w:t>SalesTax</w:t>
-      </w:r>
-      <w:proofErr w:type="spellEnd"/>
-      <w:r>
-        <w:t xml:space="preserve"> Simple </w:t>
-      </w:r>
-      <w:proofErr w:type="spellStart"/>
-      <w:r>
-        <w:t>SSTax</w:t>
-      </w:r>
-      <w:proofErr w:type="spellEnd"/>
-      <w:r>
-        <w:t xml:space="preserve"> </w:t>
-      </w:r>
-      <w:proofErr w:type="spellStart"/>
-      <w:r>
-        <w:t>StudentLoan</w:t>
-      </w:r>
-      <w:proofErr w:type="spellEnd"/>
-      <w:r>
-        <w:t xml:space="preserve"> </w:t>
-      </w:r>
-      <w:proofErr w:type="spellStart"/>
-      <w:r>
-        <w:t>CA_HiIncDeductions</w:t>
-      </w:r>
-      <w:proofErr w:type="spellEnd"/>
-      <w:r>
-        <w:t xml:space="preserve"> </w:t>
-      </w:r>
-      <w:proofErr w:type="spellStart"/>
-      <w:r>
-        <w:t>CA_HiIncExemptions</w:t>
-      </w:r>
-      <w:proofErr w:type="spellEnd"/>
+      <w:r>
+        <w:t xml:space="preserve">IncTax </w:t>
+      </w:r>
+      <w:r>
+        <w:t xml:space="preserve">IRADeduction Refund </w:t>
+      </w:r>
+      <w:r>
+        <w:t xml:space="preserve">SalesTax Simple SSTax </w:t>
+      </w:r>
+      <w:r>
+        <w:t xml:space="preserve">StudentLoan </w:t>
+      </w:r>
+      <w:r>
+        <w:t>CA_HiIncDeductions CA_HiIncExemptions</w:t>
+      </w:r>
     </w:p>
     <w:p>
       <w:pPr>
@@ -900,11 +840,9 @@
       <w:r>
         <w:t xml:space="preserve">There is a single version number for all of the </w:t>
       </w:r>
-      <w:proofErr w:type="spellStart"/>
       <w:r>
         <w:t>TAXTools</w:t>
       </w:r>
-      <w:proofErr w:type="spellEnd"/>
       <w:r>
         <w:t xml:space="preserve"> because there so much shared code between the tools. </w:t>
       </w:r>
@@ -1374,23 +1312,18 @@
         <w:rPr>
           <w:lang w:eastAsia="ar-SA"/>
         </w:rPr>
-        <w:t>This is a list of issues with the Tax Return Calculator that are closer to defects than missing features.</w:t>
-      </w:r>
-    </w:p>
-    <w:p>
-      <w:pPr>
-        <w:pStyle w:val="List-Bullet-tight025"/>
-      </w:pPr>
-      <w:r>
-        <w:t>Get rid of minimum and maximum values for each line</w:t>
-      </w:r>
-      <w:r>
-        <w:t>, or e</w:t>
-      </w:r>
-      <w:r>
-        <w:t>nter min/max values for all the lines in forms</w:t>
-      </w:r>
-      <w:r>
+        <w:t xml:space="preserve">This is a list of issues with the Tax Return Calculator that </w:t>
+      </w:r>
+      <w:r>
+        <w:rPr>
+          <w:lang w:eastAsia="ar-SA"/>
+        </w:rPr>
+        <w:t>I am planning to fix</w:t>
+      </w:r>
+      <w:r>
+        <w:rPr>
+          <w:lang w:eastAsia="ar-SA"/>
+        </w:rPr>
         <w:t>.</w:t>
       </w:r>
     </w:p>
@@ -1399,31 +1332,32 @@
         <w:pStyle w:val="List-Bullet-tight025"/>
       </w:pPr>
       <w:r>
-        <w:t>When a field is incorrect in a saved file, restore should handle it gracefully.</w:t>
-      </w:r>
-    </w:p>
-    <w:p>
-      <w:pPr>
-        <w:pStyle w:val="List-Bullet-tight025"/>
-      </w:pPr>
-      <w:r>
-        <w:t xml:space="preserve">Should the </w:t>
-      </w:r>
-      <w:proofErr w:type="spellStart"/>
-      <w:r>
-        <w:t>TaxTable</w:t>
-      </w:r>
-      <w:proofErr w:type="spellEnd"/>
-      <w:r>
-        <w:t xml:space="preserve"> functions get the taxpayer object so they do not need the </w:t>
-      </w:r>
-      <w:proofErr w:type="spellStart"/>
-      <w:r>
-        <w:t>filing_status</w:t>
-      </w:r>
-      <w:proofErr w:type="spellEnd"/>
-      <w:r>
-        <w:t xml:space="preserve"> parameter?</w:t>
+        <w:t>QBI</w:t>
+      </w:r>
+    </w:p>
+    <w:p>
+      <w:pPr>
+        <w:pStyle w:val="List-Bullet-tight025"/>
+      </w:pPr>
+      <w:r>
+        <w:t>Test that w</w:t>
+      </w:r>
+      <w:r>
+        <w:t>hen a field is incorrect in a saved file, restore handle</w:t>
+      </w:r>
+      <w:r>
+        <w:t>s</w:t>
+      </w:r>
+      <w:r>
+        <w:t xml:space="preserve"> it gracefully.</w:t>
+      </w:r>
+    </w:p>
+    <w:p>
+      <w:pPr>
+        <w:pStyle w:val="List-Bullet-tight025"/>
+      </w:pPr>
+      <w:r>
+        <w:t>Should the TaxTable functions get the taxpayer object so they do not need the filing_status parameter?</w:t>
       </w:r>
     </w:p>
     <w:p>
@@ -1439,66 +1373,64 @@
         <w:pStyle w:val="List-Bullet-tight025"/>
       </w:pPr>
       <w:r>
-        <w:t>Find forms with fields that need to be negative and fix</w:t>
-      </w:r>
-      <w:r>
-        <w:t>.</w:t>
-      </w:r>
-    </w:p>
-    <w:p>
-      <w:pPr>
-        <w:pStyle w:val="List-Bullet-tight025"/>
-      </w:pPr>
-      <w:r>
-        <w:t>Add all forms in Python tool.</w:t>
-      </w:r>
-    </w:p>
-    <w:p>
-      <w:pPr>
-        <w:pStyle w:val="List-Bullet-tight025"/>
-      </w:pPr>
-      <w:r>
-        <w:t xml:space="preserve">Get rid of </w:t>
-      </w:r>
-      <w:proofErr w:type="spellStart"/>
-      <w:r>
-        <w:t>formname</w:t>
-      </w:r>
-      <w:proofErr w:type="spellEnd"/>
-      <w:r>
-        <w:t xml:space="preserve"> inside the form.</w:t>
-      </w:r>
-    </w:p>
-    <w:p>
-      <w:pPr>
-        <w:pStyle w:val="List-Bullet-tight025"/>
-      </w:pPr>
-      <w:r>
-        <w:t xml:space="preserve">Merge </w:t>
-      </w:r>
-      <w:proofErr w:type="spellStart"/>
-      <w:r>
-        <w:t>TaxTableTmpl</w:t>
-      </w:r>
-      <w:proofErr w:type="spellEnd"/>
-      <w:r>
-        <w:t xml:space="preserve"> with TaxTable.js</w:t>
-      </w:r>
-    </w:p>
-    <w:p>
-      <w:pPr>
-        <w:pStyle w:val="List-Bullet-tight025"/>
-      </w:pPr>
-      <w:r>
-        <w:t>Write setter/getter methods for lines[</w:t>
-      </w:r>
-      <w:proofErr w:type="spellStart"/>
-      <w:r>
-        <w:t>lineno</w:t>
-      </w:r>
-      <w:proofErr w:type="spellEnd"/>
-      <w:r>
-        <w:t>].value.</w:t>
+        <w:t>Add throw statement for unimplemented conditions in tax forms.</w:t>
+      </w:r>
+    </w:p>
+    <w:p>
+      <w:pPr>
+        <w:pStyle w:val="List-Bullet-tight025"/>
+      </w:pPr>
+      <w:r>
+        <w:t xml:space="preserve">Find forms with fields that need to be negative and </w:t>
+      </w:r>
+      <w:r>
+        <w:t>make sure they are handled correctly.</w:t>
+      </w:r>
+    </w:p>
+    <w:p>
+      <w:pPr>
+        <w:pStyle w:val="List-Bullet-tight025"/>
+      </w:pPr>
+      <w:r>
+        <w:t xml:space="preserve">Add all forms </w:t>
+      </w:r>
+      <w:r>
+        <w:t>referenced in</w:t>
+      </w:r>
+      <w:r>
+        <w:t xml:space="preserve"> Python tool.</w:t>
+      </w:r>
+    </w:p>
+    <w:p>
+      <w:pPr>
+        <w:pStyle w:val="List-Bullet-tight025"/>
+        <w:numPr>
+          <w:ilvl w:val="0"/>
+          <w:numId w:val="0"/>
+        </w:numPr>
+        <w:ind w:left="1440"/>
+      </w:pPr>
+    </w:p>
+    <w:p>
+      <w:pPr>
+        <w:pStyle w:val="Body-Text"/>
+        <w:rPr>
+          <w:lang w:eastAsia="ar-SA"/>
+        </w:rPr>
+      </w:pPr>
+      <w:r>
+        <w:rPr>
+          <w:lang w:eastAsia="ar-SA"/>
+        </w:rPr>
+        <w:t>There are many tax rules and forms that will never be implemented in the Tax Return Calculator, but this is a list of the features that should be implemented when time allows.</w:t>
+      </w:r>
+    </w:p>
+    <w:p>
+      <w:pPr>
+        <w:pStyle w:val="List-Bullet-tight025"/>
+      </w:pPr>
+      <w:r>
+        <w:t>Credits</w:t>
       </w:r>
     </w:p>
     <w:p>
@@ -1507,15 +1439,7 @@
         <w:ind w:left="1800"/>
       </w:pPr>
       <w:r>
-        <w:t>Make sure lines[</w:t>
-      </w:r>
-      <w:proofErr w:type="spellStart"/>
-      <w:r>
-        <w:t>lineno</w:t>
-      </w:r>
-      <w:proofErr w:type="spellEnd"/>
-      <w:r>
-        <w:t>].value cannot be accessed directly.</w:t>
+        <w:t>EIC, CTC, Child and Dependent Care.</w:t>
       </w:r>
     </w:p>
     <w:p>
@@ -1524,25 +1448,172 @@
         <w:ind w:left="1800"/>
       </w:pPr>
       <w:r>
-        <w:t xml:space="preserve">In form 1040, override the setter method to map </w:t>
-      </w:r>
-      <w:proofErr w:type="spellStart"/>
-      <w:r>
-        <w:t>lineno</w:t>
-      </w:r>
-      <w:proofErr w:type="spellEnd"/>
-      <w:r>
-        <w:t xml:space="preserve"> 7 to 7a, then call </w:t>
-      </w:r>
-      <w:proofErr w:type="spellStart"/>
-      <w:proofErr w:type="gramStart"/>
-      <w:r>
-        <w:t>super.setter</w:t>
-      </w:r>
-      <w:proofErr w:type="spellEnd"/>
-      <w:proofErr w:type="gramEnd"/>
-      <w:r>
-        <w:t>().</w:t>
+        <w:t>California EITC</w:t>
+      </w:r>
+    </w:p>
+    <w:p>
+      <w:pPr>
+        <w:pStyle w:val="List-Bullet-tight050"/>
+        <w:ind w:left="1800"/>
+      </w:pPr>
+      <w:r>
+        <w:t>Education credits</w:t>
+      </w:r>
+    </w:p>
+    <w:p>
+      <w:pPr>
+        <w:pStyle w:val="List-Bullet-tight050"/>
+        <w:ind w:left="1800"/>
+      </w:pPr>
+      <w:r>
+        <w:t>Premium Tax Credit</w:t>
+      </w:r>
+    </w:p>
+    <w:p>
+      <w:pPr>
+        <w:pStyle w:val="List-Bullet-tight025"/>
+      </w:pPr>
+      <w:r>
+        <w:t>Tax Forms</w:t>
+      </w:r>
+    </w:p>
+    <w:p>
+      <w:pPr>
+        <w:pStyle w:val="List-Bullet-tight050"/>
+        <w:ind w:left="1800"/>
+      </w:pPr>
+      <w:r>
+        <w:t>W-2G</w:t>
+      </w:r>
+    </w:p>
+    <w:p>
+      <w:pPr>
+        <w:pStyle w:val="List-Bullet-tight050"/>
+        <w:ind w:left="1800"/>
+      </w:pPr>
+      <w:r>
+        <w:t>1098 (mortgage)</w:t>
+      </w:r>
+    </w:p>
+    <w:p>
+      <w:pPr>
+        <w:pStyle w:val="List-Bullet-tight025"/>
+      </w:pPr>
+      <w:r>
+        <w:t>Calculating the taxable portion of pensions</w:t>
+      </w:r>
+      <w:r>
+        <w:t>, Simplified Method</w:t>
+      </w:r>
+    </w:p>
+    <w:p>
+      <w:pPr>
+        <w:pStyle w:val="List-Bullet-tight025"/>
+      </w:pPr>
+      <w:r>
+        <w:t>HSA (1099-SA)</w:t>
+      </w:r>
+    </w:p>
+    <w:p>
+      <w:pPr>
+        <w:pStyle w:val="List-Bullet-tight025"/>
+      </w:pPr>
+      <w:r>
+        <w:t>Sale of home, 1099-S</w:t>
+      </w:r>
+    </w:p>
+    <w:p>
+      <w:pPr>
+        <w:pStyle w:val="List-Bullet-tight025"/>
+      </w:pPr>
+      <w:r>
+        <w:t>Public Safety Officer medical insurance deduction</w:t>
+      </w:r>
+    </w:p>
+    <w:p>
+      <w:pPr>
+        <w:pStyle w:val="List-Bullet-tight025"/>
+      </w:pPr>
+      <w:r>
+        <w:t>QCD deduction from retirement account</w:t>
+      </w:r>
+    </w:p>
+    <w:p>
+      <w:pPr>
+        <w:pStyle w:val="List-Bullet-tight025"/>
+        <w:numPr>
+          <w:ilvl w:val="0"/>
+          <w:numId w:val="0"/>
+        </w:numPr>
+        <w:ind w:left="1080"/>
+      </w:pPr>
+    </w:p>
+    <w:p>
+      <w:pPr>
+        <w:pStyle w:val="Body-Text"/>
+      </w:pPr>
+      <w:r>
+        <w:t>Code improvements</w:t>
+      </w:r>
+    </w:p>
+    <w:p>
+      <w:pPr>
+        <w:pStyle w:val="List-Bullet-tight025"/>
+      </w:pPr>
+      <w:r>
+        <w:lastRenderedPageBreak/>
+        <w:t>Merge TaxTableTmpl with TaxTable.js</w:t>
+      </w:r>
+    </w:p>
+    <w:p>
+      <w:pPr>
+        <w:pStyle w:val="List-Bullet-tight025"/>
+      </w:pPr>
+      <w:r>
+        <w:t>Get rid of formname inside the form.</w:t>
+      </w:r>
+    </w:p>
+    <w:p>
+      <w:pPr>
+        <w:pStyle w:val="List-Bullet-tight025"/>
+      </w:pPr>
+      <w:r>
+        <w:t>Get rid of minimum and maximum values for each line</w:t>
+      </w:r>
+      <w:r>
+        <w:t>, or e</w:t>
+      </w:r>
+      <w:r>
+        <w:t>nter min/max values for all the lines in forms</w:t>
+      </w:r>
+      <w:r>
+        <w:t>.</w:t>
+      </w:r>
+    </w:p>
+    <w:p>
+      <w:pPr>
+        <w:pStyle w:val="List-Bullet-tight025"/>
+      </w:pPr>
+      <w:r>
+        <w:t>Write setter/getter methods for lines[lineno].value.</w:t>
+      </w:r>
+    </w:p>
+    <w:p>
+      <w:pPr>
+        <w:pStyle w:val="List-Bullet-tight050"/>
+        <w:ind w:left="1800"/>
+      </w:pPr>
+      <w:r>
+        <w:t>Make sure lines[lineno].value cannot be accessed directly.</w:t>
+      </w:r>
+    </w:p>
+    <w:p>
+      <w:pPr>
+        <w:pStyle w:val="List-Bullet-tight050"/>
+        <w:ind w:left="1800"/>
+      </w:pPr>
+      <w:r>
+        <w:t>In form 1040, override the setter method to map lineno 7 to 7a, then call super.setter().</w:t>
       </w:r>
     </w:p>
     <w:p>
@@ -1557,160 +1628,6 @@
     <w:p>
       <w:pPr>
         <w:pStyle w:val="Body-Text"/>
-        <w:rPr>
-          <w:lang w:eastAsia="ar-SA"/>
-        </w:rPr>
-      </w:pPr>
-      <w:r>
-        <w:rPr>
-          <w:lang w:eastAsia="ar-SA"/>
-        </w:rPr>
-        <w:t>There are many tax rules and forms that will never be implemented in the Tax Return Calculator, but this is a list of the features that should be implemented when time allows.</w:t>
-      </w:r>
-    </w:p>
-    <w:p>
-      <w:pPr>
-        <w:pStyle w:val="List-Bullet-tight025"/>
-      </w:pPr>
-      <w:r>
-        <w:t>Credits</w:t>
-      </w:r>
-    </w:p>
-    <w:p>
-      <w:pPr>
-        <w:pStyle w:val="List-Bullet-tight050"/>
-        <w:ind w:left="1800"/>
-      </w:pPr>
-      <w:r>
-        <w:t>EIC, CTC, Child and Dependent Care.</w:t>
-      </w:r>
-    </w:p>
-    <w:p>
-      <w:pPr>
-        <w:pStyle w:val="List-Bullet-tight050"/>
-        <w:ind w:left="1800"/>
-      </w:pPr>
-      <w:r>
-        <w:t>California EITC</w:t>
-      </w:r>
-    </w:p>
-    <w:p>
-      <w:pPr>
-        <w:pStyle w:val="List-Bullet-tight050"/>
-        <w:ind w:left="1800"/>
-      </w:pPr>
-      <w:r>
-        <w:t>Education credits</w:t>
-      </w:r>
-    </w:p>
-    <w:p>
-      <w:pPr>
-        <w:pStyle w:val="List-Bullet-tight050"/>
-        <w:ind w:left="1800"/>
-      </w:pPr>
-      <w:r>
-        <w:t>Premium Tax Credit</w:t>
-      </w:r>
-    </w:p>
-    <w:p>
-      <w:pPr>
-        <w:pStyle w:val="List-Bullet-tight025"/>
-      </w:pPr>
-      <w:r>
-        <w:t>Tax Forms</w:t>
-      </w:r>
-    </w:p>
-    <w:p>
-      <w:pPr>
-        <w:pStyle w:val="List-Bullet-tight050"/>
-        <w:ind w:left="1800"/>
-      </w:pPr>
-      <w:r>
-        <w:t>W-2G</w:t>
-      </w:r>
-    </w:p>
-    <w:p>
-      <w:pPr>
-        <w:pStyle w:val="List-Bullet-tight050"/>
-        <w:ind w:left="1800"/>
-      </w:pPr>
-      <w:r>
-        <w:t>1098 (mortgage)</w:t>
-      </w:r>
-    </w:p>
-    <w:p>
-      <w:pPr>
-        <w:pStyle w:val="List-Bullet-tight025"/>
-      </w:pPr>
-      <w:r>
-        <w:t>Calculating the taxable portion of IRAs (Form 8606)</w:t>
-      </w:r>
-    </w:p>
-    <w:p>
-      <w:pPr>
-        <w:pStyle w:val="List-Bullet-tight025"/>
-      </w:pPr>
-      <w:r>
-        <w:t>Calculating the taxable portion of pensions</w:t>
-      </w:r>
-      <w:r>
-        <w:t>, Simplified Method</w:t>
-      </w:r>
-    </w:p>
-    <w:p>
-      <w:pPr>
-        <w:pStyle w:val="List-Bullet-tight025"/>
-      </w:pPr>
-      <w:r>
-        <w:t>HSA (1099-SA)</w:t>
-      </w:r>
-    </w:p>
-    <w:p>
-      <w:pPr>
-        <w:pStyle w:val="List-Bullet-tight025"/>
-      </w:pPr>
-      <w:r>
-        <w:lastRenderedPageBreak/>
-        <w:t>Sale of home, 1099-S</w:t>
-      </w:r>
-    </w:p>
-    <w:p>
-      <w:pPr>
-        <w:pStyle w:val="List-Bullet-tight025"/>
-      </w:pPr>
-      <w:r>
-        <w:t>Public Safety Officer medical insurance deduction</w:t>
-      </w:r>
-    </w:p>
-    <w:p>
-      <w:pPr>
-        <w:pStyle w:val="List-Bullet-tight025"/>
-      </w:pPr>
-      <w:r>
-        <w:t>QBI</w:t>
-      </w:r>
-    </w:p>
-    <w:p>
-      <w:pPr>
-        <w:pStyle w:val="List-Bullet-tight025"/>
-      </w:pPr>
-      <w:r>
-        <w:t>QCD deduction from retirement account</w:t>
-      </w:r>
-    </w:p>
-    <w:p>
-      <w:pPr>
-        <w:pStyle w:val="List-Bullet-tight025"/>
-        <w:numPr>
-          <w:ilvl w:val="0"/>
-          <w:numId w:val="0"/>
-        </w:numPr>
-        <w:ind w:left="1080"/>
-      </w:pPr>
-    </w:p>
-    <w:p>
-      <w:pPr>
-        <w:pStyle w:val="Body-Text"/>
       </w:pPr>
       <w:r>
         <w:t xml:space="preserve">Not So </w:t>
@@ -1735,6 +1652,14 @@
     </w:p>
     <w:p>
       <w:pPr>
+        <w:pStyle w:val="List-Bullet-tight025"/>
+      </w:pPr>
+      <w:r>
+        <w:t>Calculating the taxable portion of IRAs (Form 8606)</w:t>
+      </w:r>
+    </w:p>
+    <w:p>
+      <w:pPr>
         <w:pStyle w:val="Heading2"/>
       </w:pPr>
       <w:r>
@@ -1754,15 +1679,7 @@
         <w:pStyle w:val="List-Bullet-tight025"/>
       </w:pPr>
       <w:r>
-        <w:t xml:space="preserve">CTC, EIC, and </w:t>
-      </w:r>
-      <w:proofErr w:type="spellStart"/>
-      <w:r>
-        <w:t>CalEITC</w:t>
-      </w:r>
-      <w:proofErr w:type="spellEnd"/>
-      <w:r>
-        <w:t xml:space="preserve"> Calculators</w:t>
+        <w:t>CTC, EIC, and CalEITC Calculators</w:t>
       </w:r>
     </w:p>
     <w:p>

</xml_diff>

<commit_message>
Update version. Prepare for merge to main.
</commit_message>
<xml_diff>
--- a/Documentation/AboutTAXTools.docx
+++ b/Documentation/AboutTAXTools.docx
@@ -1,6 +1,6 @@
 
 <file path=word/document.xml><?xml version="1.0" encoding="utf-8"?>
-<w:document xmlns:wpc="http://schemas.microsoft.com/office/word/2010/wordprocessingCanvas" xmlns:cx="http://schemas.microsoft.com/office/drawing/2014/chartex" xmlns:cx1="http://schemas.microsoft.com/office/drawing/2015/9/8/chartex" xmlns:cx2="http://schemas.microsoft.com/office/drawing/2015/10/21/chartex" xmlns:cx3="http://schemas.microsoft.com/office/drawing/2016/5/9/chartex" xmlns:cx4="http://schemas.microsoft.com/office/drawing/2016/5/10/chartex" xmlns:cx5="http://schemas.microsoft.com/office/drawing/2016/5/11/chartex" xmlns:cx6="http://schemas.microsoft.com/office/drawing/2016/5/12/chartex" xmlns:cx7="http://schemas.microsoft.com/office/drawing/2016/5/13/chartex" xmlns:cx8="http://schemas.microsoft.com/office/drawing/2016/5/14/chartex" xmlns:mc="http://schemas.openxmlformats.org/markup-compatibility/2006" xmlns:aink="http://schemas.microsoft.com/office/drawing/2016/ink" xmlns:am3d="http://schemas.microsoft.com/office/drawing/2017/model3d" xmlns:o="urn:schemas-microsoft-com:office:office" xmlns:oel="http://schemas.microsoft.com/office/2019/extlst" xmlns:r="http://schemas.openxmlformats.org/officeDocument/2006/relationships" xmlns:m="http://schemas.openxmlformats.org/officeDocument/2006/math" xmlns:v="urn:schemas-microsoft-com:vml" xmlns:wp14="http://schemas.microsoft.com/office/word/2010/wordprocessingDrawing" xmlns:wp="http://schemas.openxmlformats.org/drawingml/2006/wordprocessingDrawing" xmlns:w10="urn:schemas-microsoft-com:office:word" xmlns:w="http://schemas.openxmlformats.org/wordprocessingml/2006/main" xmlns:w14="http://schemas.microsoft.com/office/word/2010/wordml" xmlns:w15="http://schemas.microsoft.com/office/word/2012/wordml" xmlns:w16cex="http://schemas.microsoft.com/office/word/2018/wordml/cex" xmlns:w16cid="http://schemas.microsoft.com/office/word/2016/wordml/cid" xmlns:w16="http://schemas.microsoft.com/office/word/2018/wordml" xmlns:w16du="http://schemas.microsoft.com/office/word/2023/wordml/word16du" xmlns:w16sdtdh="http://schemas.microsoft.com/office/word/2020/wordml/sdtdatahash" xmlns:w16sdtfl="http://schemas.microsoft.com/office/word/2024/wordml/sdtformatlock" xmlns:w16se="http://schemas.microsoft.com/office/word/2015/wordml/symex" xmlns:wpg="http://schemas.microsoft.com/office/word/2010/wordprocessingGroup" xmlns:wpi="http://schemas.microsoft.com/office/word/2010/wordprocessingInk" xmlns:wne="http://schemas.microsoft.com/office/word/2006/wordml" xmlns:wps="http://schemas.microsoft.com/office/word/2010/wordprocessingShape" mc:Ignorable="w14 w15 w16se w16cid w16 w16cex w16sdtdh w16sdtfl w16du wp14">
+<w:document xmlns:ve="http://schemas.openxmlformats.org/markup-compatibility/2006" xmlns:o="urn:schemas-microsoft-com:office:office" xmlns:r="http://schemas.openxmlformats.org/officeDocument/2006/relationships" xmlns:m="http://schemas.openxmlformats.org/officeDocument/2006/math" xmlns:v="urn:schemas-microsoft-com:vml" xmlns:wp="http://schemas.openxmlformats.org/drawingml/2006/wordprocessingDrawing" xmlns:w10="urn:schemas-microsoft-com:office:word" xmlns:w="http://schemas.openxmlformats.org/wordprocessingml/2006/main" xmlns:wne="http://schemas.microsoft.com/office/word/2006/wordml">
   <w:body>
     <w:p>
       <w:pPr>
@@ -47,7 +47,7 @@
         <w:rPr>
           <w:noProof/>
         </w:rPr>
-        <w:t>October 24, 2026</w:t>
+        <w:t>October 27, 2026</w:t>
       </w:r>
       <w:r>
         <w:rPr>
@@ -83,8 +83,16 @@
         <w:t xml:space="preserve"> </w:t>
       </w:r>
       <w:r>
-        <w:t>Analysis and Experimentation</w:t>
-      </w:r>
+        <w:t xml:space="preserve">Analysis and </w:t>
+      </w:r>
+      <w:proofErr w:type="spellStart"/>
+      <w:r>
+        <w:t>eX</w:t>
+      </w:r>
+      <w:r>
+        <w:t>perimentation</w:t>
+      </w:r>
+      <w:proofErr w:type="spellEnd"/>
       <w:r>
         <w:t xml:space="preserve"> </w:t>
       </w:r>
@@ -101,14 +109,26 @@
       <w:pPr>
         <w:pStyle w:val="Body-Text"/>
       </w:pPr>
+      <w:proofErr w:type="gramStart"/>
       <w:r>
         <w:t xml:space="preserve">The </w:t>
       </w:r>
       <w:r>
-        <w:t xml:space="preserve">Tax Analysis and Experimentation Tools, or </w:t>
+        <w:t xml:space="preserve">Tax Analysis and </w:t>
       </w:r>
       <w:proofErr w:type="spellStart"/>
       <w:r>
+        <w:t>eX</w:t>
+      </w:r>
+      <w:r>
+        <w:t>perimentation</w:t>
+      </w:r>
+      <w:proofErr w:type="spellEnd"/>
+      <w:r>
+        <w:t xml:space="preserve"> Tools, or </w:t>
+      </w:r>
+      <w:proofErr w:type="spellStart"/>
+      <w:r>
         <w:t>TAXTools</w:t>
       </w:r>
       <w:proofErr w:type="spellEnd"/>
@@ -119,7 +139,11 @@
         <w:t xml:space="preserve"> are</w:t>
       </w:r>
       <w:r>
-        <w:t xml:space="preserve"> a collection of web-based tools for calculating income tax information. The current set of tools is:</w:t>
+        <w:t xml:space="preserve"> a collection of web-based tools for calculating income tax information.</w:t>
+      </w:r>
+      <w:proofErr w:type="gramEnd"/>
+      <w:r>
+        <w:t xml:space="preserve"> The current set of tools is:</w:t>
       </w:r>
     </w:p>
     <w:p>
@@ -632,15 +656,7 @@
         <w:t>Some of the tools can display additional information that shows internal calculations</w:t>
       </w:r>
       <w:r>
-        <w:t xml:space="preserve">. To see the additional </w:t>
-      </w:r>
-      <w:proofErr w:type="gramStart"/>
-      <w:r>
-        <w:t>information</w:t>
-      </w:r>
-      <w:proofErr w:type="gramEnd"/>
-      <w:r>
-        <w:t xml:space="preserve"> you can enter one of several keywords </w:t>
+        <w:t xml:space="preserve">. To see the additional information you can enter one of several keywords </w:t>
       </w:r>
       <w:r>
         <w:t>in any input field. The keywords are not case-sensitive and can be entered in any order. Separate the input value and one or more keywords using commas or whitespace.</w:t>
@@ -964,13 +980,8 @@
         <w:t xml:space="preserve">the </w:t>
       </w:r>
       <w:r>
-        <w:t xml:space="preserve">tools </w:t>
-      </w:r>
-      <w:proofErr w:type="gramStart"/>
-      <w:r>
-        <w:t>are</w:t>
-      </w:r>
-      <w:proofErr w:type="gramEnd"/>
+        <w:t>tools are</w:t>
+      </w:r>
       <w:r>
         <w:t xml:space="preserve"> released. There are always two versions of </w:t>
       </w:r>
@@ -1135,7 +1146,10 @@
         <w:pStyle w:val="List-Bullet025"/>
       </w:pPr>
       <w:r>
-        <w:t xml:space="preserve">Add </w:t>
+        <w:t>Need</w:t>
+      </w:r>
+      <w:r>
+        <w:t xml:space="preserve"> </w:t>
       </w:r>
       <w:r>
         <w:t xml:space="preserve">more </w:t>
@@ -1351,15 +1365,7 @@
         <w:pStyle w:val="List-Bullet-tight025"/>
       </w:pPr>
       <w:r>
-        <w:t xml:space="preserve">If you are filing Married Filing Separately and you lived with your spouse at </w:t>
-      </w:r>
-      <w:proofErr w:type="spellStart"/>
-      <w:r>
-        <w:t>anytime</w:t>
-      </w:r>
-      <w:proofErr w:type="spellEnd"/>
-      <w:r>
-        <w:t xml:space="preserve"> during the tax year, do not use this tool; the taxable percentage of your Social Security is 85%.</w:t>
+        <w:t>If you are filing Married Filing Separately and you lived with your spouse at anytime during the tax year, do not use this tool; the taxable percentage of your Social Security is 85%.</w:t>
       </w:r>
     </w:p>
     <w:p>
@@ -1418,55 +1424,6 @@
       </w:pPr>
       <w:r>
         <w:t>QBI</w:t>
-      </w:r>
-    </w:p>
-    <w:p>
-      <w:pPr>
-        <w:pStyle w:val="List-Bullet-tight025"/>
-      </w:pPr>
-      <w:r>
-        <w:t>Test that w</w:t>
-      </w:r>
-      <w:r>
-        <w:t>hen a field is incorrect in a saved file, restore handle</w:t>
-      </w:r>
-      <w:r>
-        <w:t>s</w:t>
-      </w:r>
-      <w:r>
-        <w:t xml:space="preserve"> it gracefully.</w:t>
-      </w:r>
-    </w:p>
-    <w:p>
-      <w:pPr>
-        <w:pStyle w:val="List-Bullet-tight025"/>
-      </w:pPr>
-      <w:r>
-        <w:t xml:space="preserve">Should the </w:t>
-      </w:r>
-      <w:proofErr w:type="spellStart"/>
-      <w:r>
-        <w:t>TaxTable</w:t>
-      </w:r>
-      <w:proofErr w:type="spellEnd"/>
-      <w:r>
-        <w:t xml:space="preserve"> functions get the taxpayer object so they do not need the </w:t>
-      </w:r>
-      <w:proofErr w:type="spellStart"/>
-      <w:r>
-        <w:t>filing_status</w:t>
-      </w:r>
-      <w:proofErr w:type="spellEnd"/>
-      <w:r>
-        <w:t xml:space="preserve"> parameter?</w:t>
-      </w:r>
-    </w:p>
-    <w:p>
-      <w:pPr>
-        <w:pStyle w:val="List-Bullet-tight025"/>
-      </w:pPr>
-      <w:r>
-        <w:t>Find all the throw statements and improve the messages.</w:t>
       </w:r>
     </w:p>
     <w:p>
@@ -1678,6 +1635,7 @@
         <w:pStyle w:val="List-Bullet-tight025"/>
       </w:pPr>
       <w:r>
+        <w:lastRenderedPageBreak/>
         <w:t xml:space="preserve">Get rid of </w:t>
       </w:r>
       <w:proofErr w:type="spellStart"/>
@@ -1761,9 +1719,12 @@
         <w:t>super.setter</w:t>
       </w:r>
       <w:proofErr w:type="spellEnd"/>
+      <w:r>
+        <w:t>(</w:t>
+      </w:r>
       <w:proofErr w:type="gramEnd"/>
       <w:r>
-        <w:t>().</w:t>
+        <w:t>).</w:t>
       </w:r>
     </w:p>
     <w:p>
@@ -1908,7 +1869,7 @@
 </file>
 
 <file path=word/endnotes.xml><?xml version="1.0" encoding="utf-8"?>
-<w:endnotes xmlns:wpc="http://schemas.microsoft.com/office/word/2010/wordprocessingCanvas" xmlns:cx="http://schemas.microsoft.com/office/drawing/2014/chartex" xmlns:cx1="http://schemas.microsoft.com/office/drawing/2015/9/8/chartex" xmlns:cx2="http://schemas.microsoft.com/office/drawing/2015/10/21/chartex" xmlns:cx3="http://schemas.microsoft.com/office/drawing/2016/5/9/chartex" xmlns:cx4="http://schemas.microsoft.com/office/drawing/2016/5/10/chartex" xmlns:cx5="http://schemas.microsoft.com/office/drawing/2016/5/11/chartex" xmlns:cx6="http://schemas.microsoft.com/office/drawing/2016/5/12/chartex" xmlns:cx7="http://schemas.microsoft.com/office/drawing/2016/5/13/chartex" xmlns:cx8="http://schemas.microsoft.com/office/drawing/2016/5/14/chartex" xmlns:mc="http://schemas.openxmlformats.org/markup-compatibility/2006" xmlns:aink="http://schemas.microsoft.com/office/drawing/2016/ink" xmlns:am3d="http://schemas.microsoft.com/office/drawing/2017/model3d" xmlns:o="urn:schemas-microsoft-com:office:office" xmlns:oel="http://schemas.microsoft.com/office/2019/extlst" xmlns:r="http://schemas.openxmlformats.org/officeDocument/2006/relationships" xmlns:m="http://schemas.openxmlformats.org/officeDocument/2006/math" xmlns:v="urn:schemas-microsoft-com:vml" xmlns:wp14="http://schemas.microsoft.com/office/word/2010/wordprocessingDrawing" xmlns:wp="http://schemas.openxmlformats.org/drawingml/2006/wordprocessingDrawing" xmlns:w10="urn:schemas-microsoft-com:office:word" xmlns:w="http://schemas.openxmlformats.org/wordprocessingml/2006/main" xmlns:w14="http://schemas.microsoft.com/office/word/2010/wordml" xmlns:w15="http://schemas.microsoft.com/office/word/2012/wordml" xmlns:w16cex="http://schemas.microsoft.com/office/word/2018/wordml/cex" xmlns:w16cid="http://schemas.microsoft.com/office/word/2016/wordml/cid" xmlns:w16="http://schemas.microsoft.com/office/word/2018/wordml" xmlns:w16du="http://schemas.microsoft.com/office/word/2023/wordml/word16du" xmlns:w16sdtdh="http://schemas.microsoft.com/office/word/2020/wordml/sdtdatahash" xmlns:w16sdtfl="http://schemas.microsoft.com/office/word/2024/wordml/sdtformatlock" xmlns:w16se="http://schemas.microsoft.com/office/word/2015/wordml/symex" xmlns:wpg="http://schemas.microsoft.com/office/word/2010/wordprocessingGroup" xmlns:wpi="http://schemas.microsoft.com/office/word/2010/wordprocessingInk" xmlns:wne="http://schemas.microsoft.com/office/word/2006/wordml" xmlns:wps="http://schemas.microsoft.com/office/word/2010/wordprocessingShape" mc:Ignorable="w14 w15 w16se w16cid w16 w16cex w16sdtdh w16sdtfl w16du wp14">
+<w:endnotes xmlns:ve="http://schemas.openxmlformats.org/markup-compatibility/2006" xmlns:o="urn:schemas-microsoft-com:office:office" xmlns:r="http://schemas.openxmlformats.org/officeDocument/2006/relationships" xmlns:m="http://schemas.openxmlformats.org/officeDocument/2006/math" xmlns:v="urn:schemas-microsoft-com:vml" xmlns:wp="http://schemas.openxmlformats.org/drawingml/2006/wordprocessingDrawing" xmlns:w10="urn:schemas-microsoft-com:office:word" xmlns:w="http://schemas.openxmlformats.org/wordprocessingml/2006/main" xmlns:wne="http://schemas.microsoft.com/office/word/2006/wordml">
   <w:endnote w:type="separator" w:id="-1">
     <w:p>
       <w:r>
@@ -1927,7 +1888,7 @@
 </file>
 
 <file path=word/footer1.xml><?xml version="1.0" encoding="utf-8"?>
-<w:ftr xmlns:wpc="http://schemas.microsoft.com/office/word/2010/wordprocessingCanvas" xmlns:cx="http://schemas.microsoft.com/office/drawing/2014/chartex" xmlns:cx1="http://schemas.microsoft.com/office/drawing/2015/9/8/chartex" xmlns:cx2="http://schemas.microsoft.com/office/drawing/2015/10/21/chartex" xmlns:cx3="http://schemas.microsoft.com/office/drawing/2016/5/9/chartex" xmlns:cx4="http://schemas.microsoft.com/office/drawing/2016/5/10/chartex" xmlns:cx5="http://schemas.microsoft.com/office/drawing/2016/5/11/chartex" xmlns:cx6="http://schemas.microsoft.com/office/drawing/2016/5/12/chartex" xmlns:cx7="http://schemas.microsoft.com/office/drawing/2016/5/13/chartex" xmlns:cx8="http://schemas.microsoft.com/office/drawing/2016/5/14/chartex" xmlns:mc="http://schemas.openxmlformats.org/markup-compatibility/2006" xmlns:aink="http://schemas.microsoft.com/office/drawing/2016/ink" xmlns:am3d="http://schemas.microsoft.com/office/drawing/2017/model3d" xmlns:o="urn:schemas-microsoft-com:office:office" xmlns:oel="http://schemas.microsoft.com/office/2019/extlst" xmlns:r="http://schemas.openxmlformats.org/officeDocument/2006/relationships" xmlns:m="http://schemas.openxmlformats.org/officeDocument/2006/math" xmlns:v="urn:schemas-microsoft-com:vml" xmlns:wp14="http://schemas.microsoft.com/office/word/2010/wordprocessingDrawing" xmlns:wp="http://schemas.openxmlformats.org/drawingml/2006/wordprocessingDrawing" xmlns:w10="urn:schemas-microsoft-com:office:word" xmlns:w="http://schemas.openxmlformats.org/wordprocessingml/2006/main" xmlns:w14="http://schemas.microsoft.com/office/word/2010/wordml" xmlns:w15="http://schemas.microsoft.com/office/word/2012/wordml" xmlns:w16cex="http://schemas.microsoft.com/office/word/2018/wordml/cex" xmlns:w16cid="http://schemas.microsoft.com/office/word/2016/wordml/cid" xmlns:w16="http://schemas.microsoft.com/office/word/2018/wordml" xmlns:w16du="http://schemas.microsoft.com/office/word/2023/wordml/word16du" xmlns:w16sdtdh="http://schemas.microsoft.com/office/word/2020/wordml/sdtdatahash" xmlns:w16sdtfl="http://schemas.microsoft.com/office/word/2024/wordml/sdtformatlock" xmlns:w16se="http://schemas.microsoft.com/office/word/2015/wordml/symex" xmlns:wpg="http://schemas.microsoft.com/office/word/2010/wordprocessingGroup" xmlns:wpi="http://schemas.microsoft.com/office/word/2010/wordprocessingInk" xmlns:wne="http://schemas.microsoft.com/office/word/2006/wordml" xmlns:wps="http://schemas.microsoft.com/office/word/2010/wordprocessingShape" mc:Ignorable="w14 w15 w16se w16cid w16 w16cex w16sdtdh w16sdtfl w16du wp14">
+<w:ftr xmlns:ve="http://schemas.openxmlformats.org/markup-compatibility/2006" xmlns:o="urn:schemas-microsoft-com:office:office" xmlns:r="http://schemas.openxmlformats.org/officeDocument/2006/relationships" xmlns:m="http://schemas.openxmlformats.org/officeDocument/2006/math" xmlns:v="urn:schemas-microsoft-com:vml" xmlns:wp="http://schemas.openxmlformats.org/drawingml/2006/wordprocessingDrawing" xmlns:w10="urn:schemas-microsoft-com:office:word" xmlns:w="http://schemas.openxmlformats.org/wordprocessingml/2006/main" xmlns:wne="http://schemas.microsoft.com/office/word/2006/wordml">
   <w:p>
     <w:pPr>
       <w:pStyle w:val="Footer"/>
@@ -2018,7 +1979,7 @@
         <w:szCs w:val="24"/>
         <w:lang w:eastAsia="en-US"/>
       </w:rPr>
-      <w:t>1</w:t>
+      <w:t>5</w:t>
     </w:r>
     <w:r>
       <w:rPr>
@@ -2039,7 +2000,7 @@
 </file>
 
 <file path=word/footnotes.xml><?xml version="1.0" encoding="utf-8"?>
-<w:footnotes xmlns:wpc="http://schemas.microsoft.com/office/word/2010/wordprocessingCanvas" xmlns:cx="http://schemas.microsoft.com/office/drawing/2014/chartex" xmlns:cx1="http://schemas.microsoft.com/office/drawing/2015/9/8/chartex" xmlns:cx2="http://schemas.microsoft.com/office/drawing/2015/10/21/chartex" xmlns:cx3="http://schemas.microsoft.com/office/drawing/2016/5/9/chartex" xmlns:cx4="http://schemas.microsoft.com/office/drawing/2016/5/10/chartex" xmlns:cx5="http://schemas.microsoft.com/office/drawing/2016/5/11/chartex" xmlns:cx6="http://schemas.microsoft.com/office/drawing/2016/5/12/chartex" xmlns:cx7="http://schemas.microsoft.com/office/drawing/2016/5/13/chartex" xmlns:cx8="http://schemas.microsoft.com/office/drawing/2016/5/14/chartex" xmlns:mc="http://schemas.openxmlformats.org/markup-compatibility/2006" xmlns:aink="http://schemas.microsoft.com/office/drawing/2016/ink" xmlns:am3d="http://schemas.microsoft.com/office/drawing/2017/model3d" xmlns:o="urn:schemas-microsoft-com:office:office" xmlns:oel="http://schemas.microsoft.com/office/2019/extlst" xmlns:r="http://schemas.openxmlformats.org/officeDocument/2006/relationships" xmlns:m="http://schemas.openxmlformats.org/officeDocument/2006/math" xmlns:v="urn:schemas-microsoft-com:vml" xmlns:wp14="http://schemas.microsoft.com/office/word/2010/wordprocessingDrawing" xmlns:wp="http://schemas.openxmlformats.org/drawingml/2006/wordprocessingDrawing" xmlns:w10="urn:schemas-microsoft-com:office:word" xmlns:w="http://schemas.openxmlformats.org/wordprocessingml/2006/main" xmlns:w14="http://schemas.microsoft.com/office/word/2010/wordml" xmlns:w15="http://schemas.microsoft.com/office/word/2012/wordml" xmlns:w16cex="http://schemas.microsoft.com/office/word/2018/wordml/cex" xmlns:w16cid="http://schemas.microsoft.com/office/word/2016/wordml/cid" xmlns:w16="http://schemas.microsoft.com/office/word/2018/wordml" xmlns:w16du="http://schemas.microsoft.com/office/word/2023/wordml/word16du" xmlns:w16sdtdh="http://schemas.microsoft.com/office/word/2020/wordml/sdtdatahash" xmlns:w16sdtfl="http://schemas.microsoft.com/office/word/2024/wordml/sdtformatlock" xmlns:w16se="http://schemas.microsoft.com/office/word/2015/wordml/symex" xmlns:wpg="http://schemas.microsoft.com/office/word/2010/wordprocessingGroup" xmlns:wpi="http://schemas.microsoft.com/office/word/2010/wordprocessingInk" xmlns:wne="http://schemas.microsoft.com/office/word/2006/wordml" xmlns:wps="http://schemas.microsoft.com/office/word/2010/wordprocessingShape" mc:Ignorable="w14 w15 w16se w16cid w16 w16cex w16sdtdh w16sdtfl w16du wp14">
+<w:footnotes xmlns:ve="http://schemas.openxmlformats.org/markup-compatibility/2006" xmlns:o="urn:schemas-microsoft-com:office:office" xmlns:r="http://schemas.openxmlformats.org/officeDocument/2006/relationships" xmlns:m="http://schemas.openxmlformats.org/officeDocument/2006/math" xmlns:v="urn:schemas-microsoft-com:vml" xmlns:wp="http://schemas.openxmlformats.org/drawingml/2006/wordprocessingDrawing" xmlns:w10="urn:schemas-microsoft-com:office:word" xmlns:w="http://schemas.openxmlformats.org/wordprocessingml/2006/main" xmlns:wne="http://schemas.microsoft.com/office/word/2006/wordml">
   <w:footnote w:type="separator" w:id="-1">
     <w:p>
       <w:r>
@@ -2058,8 +2019,8 @@
 </file>
 
 <file path=word/numbering.xml><?xml version="1.0" encoding="utf-8"?>
-<w:numbering xmlns:wpc="http://schemas.microsoft.com/office/word/2010/wordprocessingCanvas" xmlns:cx="http://schemas.microsoft.com/office/drawing/2014/chartex" xmlns:cx1="http://schemas.microsoft.com/office/drawing/2015/9/8/chartex" xmlns:cx2="http://schemas.microsoft.com/office/drawing/2015/10/21/chartex" xmlns:cx3="http://schemas.microsoft.com/office/drawing/2016/5/9/chartex" xmlns:cx4="http://schemas.microsoft.com/office/drawing/2016/5/10/chartex" xmlns:cx5="http://schemas.microsoft.com/office/drawing/2016/5/11/chartex" xmlns:cx6="http://schemas.microsoft.com/office/drawing/2016/5/12/chartex" xmlns:cx7="http://schemas.microsoft.com/office/drawing/2016/5/13/chartex" xmlns:cx8="http://schemas.microsoft.com/office/drawing/2016/5/14/chartex" xmlns:mc="http://schemas.openxmlformats.org/markup-compatibility/2006" xmlns:aink="http://schemas.microsoft.com/office/drawing/2016/ink" xmlns:am3d="http://schemas.microsoft.com/office/drawing/2017/model3d" xmlns:o="urn:schemas-microsoft-com:office:office" xmlns:oel="http://schemas.microsoft.com/office/2019/extlst" xmlns:r="http://schemas.openxmlformats.org/officeDocument/2006/relationships" xmlns:m="http://schemas.openxmlformats.org/officeDocument/2006/math" xmlns:v="urn:schemas-microsoft-com:vml" xmlns:wp14="http://schemas.microsoft.com/office/word/2010/wordprocessingDrawing" xmlns:wp="http://schemas.openxmlformats.org/drawingml/2006/wordprocessingDrawing" xmlns:w10="urn:schemas-microsoft-com:office:word" xmlns:w="http://schemas.openxmlformats.org/wordprocessingml/2006/main" xmlns:w14="http://schemas.microsoft.com/office/word/2010/wordml" xmlns:w15="http://schemas.microsoft.com/office/word/2012/wordml" xmlns:w16cex="http://schemas.microsoft.com/office/word/2018/wordml/cex" xmlns:w16cid="http://schemas.microsoft.com/office/word/2016/wordml/cid" xmlns:w16="http://schemas.microsoft.com/office/word/2018/wordml" xmlns:w16du="http://schemas.microsoft.com/office/word/2023/wordml/word16du" xmlns:w16sdtdh="http://schemas.microsoft.com/office/word/2020/wordml/sdtdatahash" xmlns:w16sdtfl="http://schemas.microsoft.com/office/word/2024/wordml/sdtformatlock" xmlns:w16se="http://schemas.microsoft.com/office/word/2015/wordml/symex" xmlns:wpg="http://schemas.microsoft.com/office/word/2010/wordprocessingGroup" xmlns:wpi="http://schemas.microsoft.com/office/word/2010/wordprocessingInk" xmlns:wne="http://schemas.microsoft.com/office/word/2006/wordml" xmlns:wps="http://schemas.microsoft.com/office/word/2010/wordprocessingShape" mc:Ignorable="w14 w15 w16se w16cid w16 w16cex w16sdtdh w16sdtfl w16du wp14">
-  <w:abstractNum w:abstractNumId="0" w15:restartNumberingAfterBreak="0">
+<w:numbering xmlns:ve="http://schemas.openxmlformats.org/markup-compatibility/2006" xmlns:o="urn:schemas-microsoft-com:office:office" xmlns:r="http://schemas.openxmlformats.org/officeDocument/2006/relationships" xmlns:m="http://schemas.openxmlformats.org/officeDocument/2006/math" xmlns:v="urn:schemas-microsoft-com:vml" xmlns:wp="http://schemas.openxmlformats.org/drawingml/2006/wordprocessingDrawing" xmlns:w10="urn:schemas-microsoft-com:office:word" xmlns:w="http://schemas.openxmlformats.org/wordprocessingml/2006/main" xmlns:wne="http://schemas.microsoft.com/office/word/2006/wordml">
+  <w:abstractNum w:abstractNumId="0">
     <w:nsid w:val="163115D9"/>
     <w:multiLevelType w:val="hybridMultilevel"/>
     <w:tmpl w:val="97DAFCAE"/>
@@ -2173,7 +2134,7 @@
       </w:rPr>
     </w:lvl>
   </w:abstractNum>
-  <w:abstractNum w:abstractNumId="1" w15:restartNumberingAfterBreak="0">
+  <w:abstractNum w:abstractNumId="1">
     <w:nsid w:val="3D3B424D"/>
     <w:multiLevelType w:val="hybridMultilevel"/>
     <w:tmpl w:val="11DA1700"/>
@@ -2287,7 +2248,7 @@
       </w:rPr>
     </w:lvl>
   </w:abstractNum>
-  <w:abstractNum w:abstractNumId="2" w15:restartNumberingAfterBreak="0">
+  <w:abstractNum w:abstractNumId="2">
     <w:nsid w:val="41936094"/>
     <w:multiLevelType w:val="hybridMultilevel"/>
     <w:tmpl w:val="D0107CD2"/>
@@ -2401,7 +2362,7 @@
       </w:rPr>
     </w:lvl>
   </w:abstractNum>
-  <w:abstractNum w:abstractNumId="3" w15:restartNumberingAfterBreak="0">
+  <w:abstractNum w:abstractNumId="3">
     <w:nsid w:val="45145E4D"/>
     <w:multiLevelType w:val="hybridMultilevel"/>
     <w:tmpl w:val="7696BC50"/>
@@ -2515,22 +2476,22 @@
       </w:rPr>
     </w:lvl>
   </w:abstractNum>
-  <w:num w:numId="1" w16cid:durableId="2033260604">
+  <w:num w:numId="1">
     <w:abstractNumId w:val="1"/>
   </w:num>
-  <w:num w:numId="2" w16cid:durableId="148330540">
+  <w:num w:numId="2">
     <w:abstractNumId w:val="2"/>
   </w:num>
-  <w:num w:numId="3" w16cid:durableId="890732137">
+  <w:num w:numId="3">
     <w:abstractNumId w:val="0"/>
   </w:num>
-  <w:num w:numId="4" w16cid:durableId="2036298626">
+  <w:num w:numId="4">
     <w:abstractNumId w:val="3"/>
   </w:num>
-  <w:num w:numId="5" w16cid:durableId="1292516077">
+  <w:num w:numId="5">
     <w:abstractNumId w:val="3"/>
   </w:num>
-  <w:num w:numId="6" w16cid:durableId="339620909">
+  <w:num w:numId="6">
     <w:abstractNumId w:val="3"/>
   </w:num>
   <w:numIdMacAtCleanup w:val="4"/>
@@ -2538,7 +2499,7 @@
 </file>
 
 <file path=word/styles.xml><?xml version="1.0" encoding="utf-8"?>
-<w:styles xmlns:mc="http://schemas.openxmlformats.org/markup-compatibility/2006" xmlns:r="http://schemas.openxmlformats.org/officeDocument/2006/relationships" xmlns:w="http://schemas.openxmlformats.org/wordprocessingml/2006/main" xmlns:w14="http://schemas.microsoft.com/office/word/2010/wordml" xmlns:w15="http://schemas.microsoft.com/office/word/2012/wordml" xmlns:w16cex="http://schemas.microsoft.com/office/word/2018/wordml/cex" xmlns:w16cid="http://schemas.microsoft.com/office/word/2016/wordml/cid" xmlns:w16="http://schemas.microsoft.com/office/word/2018/wordml" xmlns:w16du="http://schemas.microsoft.com/office/word/2023/wordml/word16du" xmlns:w16sdtdh="http://schemas.microsoft.com/office/word/2020/wordml/sdtdatahash" xmlns:w16sdtfl="http://schemas.microsoft.com/office/word/2024/wordml/sdtformatlock" xmlns:w16se="http://schemas.microsoft.com/office/word/2015/wordml/symex" mc:Ignorable="w14 w15 w16se w16cid w16 w16cex w16sdtdh w16sdtfl w16du">
+<w:styles xmlns:r="http://schemas.openxmlformats.org/officeDocument/2006/relationships" xmlns:w="http://schemas.openxmlformats.org/wordprocessingml/2006/main">
   <w:docDefaults>
     <w:rPrDefault>
       <w:rPr>
@@ -2552,383 +2513,145 @@
       </w:pPr>
     </w:pPrDefault>
   </w:docDefaults>
-  <w:latentStyles w:defLockedState="0" w:defUIPriority="99" w:defSemiHidden="0" w:defUnhideWhenUsed="0" w:defQFormat="0" w:count="376">
-    <w:lsdException w:name="Normal" w:uiPriority="0" w:qFormat="1"/>
-    <w:lsdException w:name="heading 1" w:uiPriority="0" w:qFormat="1"/>
-    <w:lsdException w:name="heading 2" w:semiHidden="1" w:uiPriority="0" w:unhideWhenUsed="1" w:qFormat="1"/>
-    <w:lsdException w:name="heading 3" w:semiHidden="1" w:uiPriority="0" w:unhideWhenUsed="1" w:qFormat="1"/>
-    <w:lsdException w:name="heading 4" w:semiHidden="1" w:uiPriority="9" w:unhideWhenUsed="1" w:qFormat="1"/>
-    <w:lsdException w:name="heading 5" w:semiHidden="1" w:uiPriority="9" w:unhideWhenUsed="1" w:qFormat="1"/>
-    <w:lsdException w:name="heading 6" w:semiHidden="1" w:uiPriority="9" w:unhideWhenUsed="1" w:qFormat="1"/>
-    <w:lsdException w:name="heading 7" w:semiHidden="1" w:uiPriority="9" w:unhideWhenUsed="1" w:qFormat="1"/>
-    <w:lsdException w:name="heading 8" w:semiHidden="1" w:uiPriority="9" w:unhideWhenUsed="1" w:qFormat="1"/>
-    <w:lsdException w:name="heading 9" w:semiHidden="1" w:uiPriority="9" w:unhideWhenUsed="1" w:qFormat="1"/>
-    <w:lsdException w:name="index 1" w:semiHidden="1" w:unhideWhenUsed="1"/>
-    <w:lsdException w:name="index 2" w:semiHidden="1" w:unhideWhenUsed="1"/>
-    <w:lsdException w:name="index 3" w:semiHidden="1" w:unhideWhenUsed="1"/>
-    <w:lsdException w:name="index 4" w:semiHidden="1" w:unhideWhenUsed="1"/>
-    <w:lsdException w:name="index 5" w:semiHidden="1" w:unhideWhenUsed="1"/>
-    <w:lsdException w:name="index 6" w:semiHidden="1" w:unhideWhenUsed="1"/>
-    <w:lsdException w:name="index 7" w:semiHidden="1" w:unhideWhenUsed="1"/>
-    <w:lsdException w:name="index 8" w:semiHidden="1" w:unhideWhenUsed="1"/>
-    <w:lsdException w:name="index 9" w:semiHidden="1" w:unhideWhenUsed="1"/>
-    <w:lsdException w:name="toc 1" w:semiHidden="1" w:uiPriority="39" w:unhideWhenUsed="1" w:qFormat="1"/>
-    <w:lsdException w:name="toc 2" w:semiHidden="1" w:uiPriority="39" w:unhideWhenUsed="1" w:qFormat="1"/>
-    <w:lsdException w:name="toc 3" w:semiHidden="1" w:uiPriority="39" w:unhideWhenUsed="1" w:qFormat="1"/>
-    <w:lsdException w:name="toc 4" w:semiHidden="1" w:uiPriority="39" w:unhideWhenUsed="1"/>
-    <w:lsdException w:name="toc 5" w:semiHidden="1" w:uiPriority="39" w:unhideWhenUsed="1"/>
-    <w:lsdException w:name="toc 6" w:semiHidden="1" w:uiPriority="39" w:unhideWhenUsed="1"/>
-    <w:lsdException w:name="toc 7" w:semiHidden="1" w:uiPriority="39" w:unhideWhenUsed="1"/>
-    <w:lsdException w:name="toc 8" w:semiHidden="1" w:uiPriority="39" w:unhideWhenUsed="1"/>
-    <w:lsdException w:name="toc 9" w:semiHidden="1" w:uiPriority="39" w:unhideWhenUsed="1"/>
-    <w:lsdException w:name="Normal Indent" w:semiHidden="1" w:unhideWhenUsed="1"/>
-    <w:lsdException w:name="footnote text" w:semiHidden="1" w:unhideWhenUsed="1"/>
-    <w:lsdException w:name="annotation text" w:semiHidden="1" w:unhideWhenUsed="1"/>
-    <w:lsdException w:name="header" w:semiHidden="1" w:unhideWhenUsed="1"/>
-    <w:lsdException w:name="footer" w:semiHidden="1" w:uiPriority="0" w:unhideWhenUsed="1"/>
-    <w:lsdException w:name="index heading" w:semiHidden="1" w:unhideWhenUsed="1"/>
-    <w:lsdException w:name="caption" w:semiHidden="1" w:uiPriority="0" w:unhideWhenUsed="1" w:qFormat="1"/>
-    <w:lsdException w:name="table of figures" w:semiHidden="1" w:unhideWhenUsed="1"/>
-    <w:lsdException w:name="envelope address" w:semiHidden="1" w:unhideWhenUsed="1"/>
-    <w:lsdException w:name="envelope return" w:semiHidden="1" w:unhideWhenUsed="1"/>
-    <w:lsdException w:name="footnote reference" w:semiHidden="1" w:unhideWhenUsed="1"/>
-    <w:lsdException w:name="annotation reference" w:semiHidden="1" w:unhideWhenUsed="1"/>
-    <w:lsdException w:name="line number" w:semiHidden="1" w:unhideWhenUsed="1"/>
-    <w:lsdException w:name="page number" w:semiHidden="1" w:unhideWhenUsed="1"/>
-    <w:lsdException w:name="endnote reference" w:semiHidden="1" w:unhideWhenUsed="1"/>
-    <w:lsdException w:name="endnote text" w:semiHidden="1" w:unhideWhenUsed="1"/>
-    <w:lsdException w:name="table of authorities" w:semiHidden="1" w:unhideWhenUsed="1"/>
-    <w:lsdException w:name="macro" w:semiHidden="1" w:unhideWhenUsed="1"/>
-    <w:lsdException w:name="toa heading" w:semiHidden="1" w:unhideWhenUsed="1"/>
-    <w:lsdException w:name="List" w:semiHidden="1" w:unhideWhenUsed="1"/>
-    <w:lsdException w:name="List Bullet" w:semiHidden="1" w:unhideWhenUsed="1"/>
-    <w:lsdException w:name="List Number" w:semiHidden="1" w:unhideWhenUsed="1"/>
-    <w:lsdException w:name="List 2" w:semiHidden="1" w:unhideWhenUsed="1"/>
-    <w:lsdException w:name="List 3" w:semiHidden="1" w:unhideWhenUsed="1"/>
-    <w:lsdException w:name="List 4" w:semiHidden="1" w:unhideWhenUsed="1"/>
-    <w:lsdException w:name="List 5" w:semiHidden="1" w:unhideWhenUsed="1"/>
-    <w:lsdException w:name="List Bullet 2" w:semiHidden="1" w:unhideWhenUsed="1"/>
-    <w:lsdException w:name="List Bullet 3" w:semiHidden="1" w:unhideWhenUsed="1"/>
-    <w:lsdException w:name="List Bullet 4" w:semiHidden="1" w:unhideWhenUsed="1"/>
-    <w:lsdException w:name="List Bullet 5" w:semiHidden="1" w:unhideWhenUsed="1"/>
-    <w:lsdException w:name="List Number 2" w:semiHidden="1" w:unhideWhenUsed="1"/>
-    <w:lsdException w:name="List Number 3" w:semiHidden="1" w:unhideWhenUsed="1"/>
-    <w:lsdException w:name="List Number 4" w:semiHidden="1" w:unhideWhenUsed="1"/>
-    <w:lsdException w:name="List Number 5" w:semiHidden="1" w:unhideWhenUsed="1"/>
-    <w:lsdException w:name="Title" w:uiPriority="10" w:qFormat="1"/>
-    <w:lsdException w:name="Closing" w:semiHidden="1" w:unhideWhenUsed="1"/>
-    <w:lsdException w:name="Signature" w:semiHidden="1" w:unhideWhenUsed="1"/>
-    <w:lsdException w:name="Default Paragraph Font" w:semiHidden="1" w:uiPriority="1" w:unhideWhenUsed="1"/>
-    <w:lsdException w:name="Body Text" w:semiHidden="1" w:unhideWhenUsed="1"/>
-    <w:lsdException w:name="Body Text Indent" w:semiHidden="1" w:unhideWhenUsed="1"/>
-    <w:lsdException w:name="List Continue" w:semiHidden="1" w:unhideWhenUsed="1"/>
-    <w:lsdException w:name="List Continue 2" w:semiHidden="1" w:unhideWhenUsed="1"/>
-    <w:lsdException w:name="List Continue 3" w:semiHidden="1" w:unhideWhenUsed="1"/>
-    <w:lsdException w:name="List Continue 4" w:semiHidden="1" w:unhideWhenUsed="1"/>
-    <w:lsdException w:name="List Continue 5" w:semiHidden="1" w:unhideWhenUsed="1"/>
-    <w:lsdException w:name="Message Header" w:semiHidden="1" w:unhideWhenUsed="1"/>
-    <w:lsdException w:name="Subtitle" w:uiPriority="11" w:qFormat="1"/>
-    <w:lsdException w:name="Salutation" w:semiHidden="1" w:unhideWhenUsed="1"/>
-    <w:lsdException w:name="Date" w:semiHidden="1" w:unhideWhenUsed="1"/>
-    <w:lsdException w:name="Body Text First Indent" w:semiHidden="1" w:unhideWhenUsed="1"/>
-    <w:lsdException w:name="Body Text First Indent 2" w:semiHidden="1" w:unhideWhenUsed="1"/>
-    <w:lsdException w:name="Note Heading" w:semiHidden="1" w:unhideWhenUsed="1"/>
-    <w:lsdException w:name="Body Text 2" w:semiHidden="1" w:unhideWhenUsed="1"/>
-    <w:lsdException w:name="Body Text 3" w:semiHidden="1" w:unhideWhenUsed="1"/>
-    <w:lsdException w:name="Body Text Indent 2" w:semiHidden="1" w:unhideWhenUsed="1"/>
-    <w:lsdException w:name="Body Text Indent 3" w:semiHidden="1" w:unhideWhenUsed="1"/>
-    <w:lsdException w:name="Block Text" w:semiHidden="1" w:unhideWhenUsed="1"/>
-    <w:lsdException w:name="Hyperlink" w:semiHidden="1" w:unhideWhenUsed="1"/>
-    <w:lsdException w:name="FollowedHyperlink" w:semiHidden="1" w:unhideWhenUsed="1"/>
-    <w:lsdException w:name="Strong" w:uiPriority="22" w:qFormat="1"/>
-    <w:lsdException w:name="Emphasis" w:uiPriority="20" w:qFormat="1"/>
-    <w:lsdException w:name="Document Map" w:semiHidden="1" w:unhideWhenUsed="1"/>
-    <w:lsdException w:name="Plain Text" w:semiHidden="1" w:unhideWhenUsed="1"/>
-    <w:lsdException w:name="E-mail Signature" w:semiHidden="1" w:unhideWhenUsed="1"/>
-    <w:lsdException w:name="HTML Top of Form" w:semiHidden="1" w:unhideWhenUsed="1"/>
-    <w:lsdException w:name="HTML Bottom of Form" w:semiHidden="1" w:unhideWhenUsed="1"/>
-    <w:lsdException w:name="Normal (Web)" w:semiHidden="1" w:unhideWhenUsed="1"/>
-    <w:lsdException w:name="HTML Acronym" w:semiHidden="1" w:unhideWhenUsed="1"/>
-    <w:lsdException w:name="HTML Address" w:semiHidden="1" w:unhideWhenUsed="1"/>
-    <w:lsdException w:name="HTML Cite" w:semiHidden="1" w:unhideWhenUsed="1"/>
-    <w:lsdException w:name="HTML Code" w:semiHidden="1" w:unhideWhenUsed="1"/>
-    <w:lsdException w:name="HTML Definition" w:semiHidden="1" w:unhideWhenUsed="1"/>
-    <w:lsdException w:name="HTML Keyboard" w:semiHidden="1" w:unhideWhenUsed="1"/>
-    <w:lsdException w:name="HTML Preformatted" w:semiHidden="1" w:unhideWhenUsed="1"/>
-    <w:lsdException w:name="HTML Sample" w:semiHidden="1" w:unhideWhenUsed="1"/>
-    <w:lsdException w:name="HTML Typewriter" w:semiHidden="1" w:unhideWhenUsed="1"/>
-    <w:lsdException w:name="HTML Variable" w:semiHidden="1" w:unhideWhenUsed="1"/>
-    <w:lsdException w:name="Normal Table" w:semiHidden="1" w:unhideWhenUsed="1"/>
-    <w:lsdException w:name="annotation subject" w:semiHidden="1" w:unhideWhenUsed="1"/>
-    <w:lsdException w:name="No List" w:semiHidden="1" w:unhideWhenUsed="1"/>
-    <w:lsdException w:name="Outline List 1" w:semiHidden="1" w:unhideWhenUsed="1"/>
-    <w:lsdException w:name="Outline List 2" w:semiHidden="1" w:unhideWhenUsed="1"/>
-    <w:lsdException w:name="Outline List 3" w:semiHidden="1" w:unhideWhenUsed="1"/>
-    <w:lsdException w:name="Table Simple 1" w:semiHidden="1" w:unhideWhenUsed="1"/>
-    <w:lsdException w:name="Table Simple 2" w:semiHidden="1" w:unhideWhenUsed="1"/>
-    <w:lsdException w:name="Table Simple 3" w:semiHidden="1" w:unhideWhenUsed="1"/>
-    <w:lsdException w:name="Table Classic 1" w:semiHidden="1" w:unhideWhenUsed="1"/>
-    <w:lsdException w:name="Table Classic 2" w:semiHidden="1" w:unhideWhenUsed="1"/>
-    <w:lsdException w:name="Table Classic 3" w:semiHidden="1" w:unhideWhenUsed="1"/>
-    <w:lsdException w:name="Table Classic 4" w:semiHidden="1" w:unhideWhenUsed="1"/>
-    <w:lsdException w:name="Table Colorful 1" w:semiHidden="1" w:unhideWhenUsed="1"/>
-    <w:lsdException w:name="Table Colorful 2" w:semiHidden="1" w:unhideWhenUsed="1"/>
-    <w:lsdException w:name="Table Colorful 3" w:semiHidden="1" w:unhideWhenUsed="1"/>
-    <w:lsdException w:name="Table Columns 1" w:semiHidden="1" w:unhideWhenUsed="1"/>
-    <w:lsdException w:name="Table Columns 2" w:semiHidden="1" w:unhideWhenUsed="1"/>
-    <w:lsdException w:name="Table Columns 3" w:semiHidden="1" w:unhideWhenUsed="1"/>
-    <w:lsdException w:name="Table Columns 4" w:semiHidden="1" w:unhideWhenUsed="1"/>
-    <w:lsdException w:name="Table Columns 5" w:semiHidden="1" w:unhideWhenUsed="1"/>
-    <w:lsdException w:name="Table Grid 1" w:semiHidden="1" w:unhideWhenUsed="1"/>
-    <w:lsdException w:name="Table Grid 2" w:semiHidden="1" w:unhideWhenUsed="1"/>
-    <w:lsdException w:name="Table Grid 3" w:semiHidden="1" w:unhideWhenUsed="1"/>
-    <w:lsdException w:name="Table Grid 4" w:semiHidden="1" w:unhideWhenUsed="1"/>
-    <w:lsdException w:name="Table Grid 5" w:semiHidden="1" w:unhideWhenUsed="1"/>
-    <w:lsdException w:name="Table Grid 6" w:semiHidden="1" w:unhideWhenUsed="1"/>
-    <w:lsdException w:name="Table Grid 7" w:semiHidden="1" w:unhideWhenUsed="1"/>
-    <w:lsdException w:name="Table Grid 8" w:semiHidden="1" w:unhideWhenUsed="1"/>
-    <w:lsdException w:name="Table List 1" w:semiHidden="1" w:unhideWhenUsed="1"/>
-    <w:lsdException w:name="Table List 2" w:semiHidden="1" w:unhideWhenUsed="1"/>
-    <w:lsdException w:name="Table List 3" w:semiHidden="1" w:unhideWhenUsed="1"/>
-    <w:lsdException w:name="Table List 4" w:semiHidden="1" w:unhideWhenUsed="1"/>
-    <w:lsdException w:name="Table List 5" w:semiHidden="1" w:unhideWhenUsed="1"/>
-    <w:lsdException w:name="Table List 6" w:semiHidden="1" w:unhideWhenUsed="1"/>
-    <w:lsdException w:name="Table List 7" w:semiHidden="1" w:unhideWhenUsed="1"/>
-    <w:lsdException w:name="Table List 8" w:semiHidden="1" w:unhideWhenUsed="1"/>
-    <w:lsdException w:name="Table 3D effects 1" w:semiHidden="1" w:unhideWhenUsed="1"/>
-    <w:lsdException w:name="Table 3D effects 2" w:semiHidden="1" w:unhideWhenUsed="1"/>
-    <w:lsdException w:name="Table 3D effects 3" w:semiHidden="1" w:unhideWhenUsed="1"/>
-    <w:lsdException w:name="Table Contemporary" w:semiHidden="1" w:unhideWhenUsed="1"/>
-    <w:lsdException w:name="Table Elegant" w:semiHidden="1" w:unhideWhenUsed="1"/>
-    <w:lsdException w:name="Table Professional" w:semiHidden="1" w:unhideWhenUsed="1"/>
-    <w:lsdException w:name="Table Subtle 1" w:semiHidden="1" w:unhideWhenUsed="1"/>
-    <w:lsdException w:name="Table Subtle 2" w:semiHidden="1" w:unhideWhenUsed="1"/>
-    <w:lsdException w:name="Table Web 1" w:semiHidden="1" w:unhideWhenUsed="1"/>
-    <w:lsdException w:name="Table Web 2" w:semiHidden="1" w:unhideWhenUsed="1"/>
-    <w:lsdException w:name="Table Web 3" w:semiHidden="1" w:unhideWhenUsed="1"/>
-    <w:lsdException w:name="Balloon Text" w:semiHidden="1" w:unhideWhenUsed="1"/>
-    <w:lsdException w:name="Table Grid" w:uiPriority="59"/>
-    <w:lsdException w:name="Table Theme" w:semiHidden="1" w:unhideWhenUsed="1"/>
-    <w:lsdException w:name="Placeholder Text" w:semiHidden="1"/>
-    <w:lsdException w:name="No Spacing" w:uiPriority="1" w:qFormat="1"/>
-    <w:lsdException w:name="Light Shading" w:uiPriority="60"/>
-    <w:lsdException w:name="Light List" w:uiPriority="61"/>
-    <w:lsdException w:name="Light Grid" w:uiPriority="62"/>
-    <w:lsdException w:name="Medium Shading 1" w:uiPriority="63"/>
-    <w:lsdException w:name="Medium Shading 2" w:uiPriority="64"/>
-    <w:lsdException w:name="Medium List 1" w:uiPriority="65"/>
-    <w:lsdException w:name="Medium List 2" w:uiPriority="66"/>
-    <w:lsdException w:name="Medium Grid 1" w:uiPriority="67"/>
-    <w:lsdException w:name="Medium Grid 2" w:uiPriority="68"/>
-    <w:lsdException w:name="Medium Grid 3" w:uiPriority="69"/>
-    <w:lsdException w:name="Dark List" w:uiPriority="70"/>
-    <w:lsdException w:name="Colorful Shading" w:uiPriority="71"/>
-    <w:lsdException w:name="Colorful List" w:uiPriority="72"/>
-    <w:lsdException w:name="Colorful Grid" w:uiPriority="73"/>
-    <w:lsdException w:name="Light Shading Accent 1" w:uiPriority="60"/>
-    <w:lsdException w:name="Light List Accent 1" w:uiPriority="61"/>
-    <w:lsdException w:name="Light Grid Accent 1" w:uiPriority="62"/>
-    <w:lsdException w:name="Medium Shading 1 Accent 1" w:uiPriority="63"/>
-    <w:lsdException w:name="Medium Shading 2 Accent 1" w:uiPriority="64"/>
-    <w:lsdException w:name="Medium List 1 Accent 1" w:uiPriority="65"/>
-    <w:lsdException w:name="Revision" w:semiHidden="1"/>
-    <w:lsdException w:name="List Paragraph" w:uiPriority="34" w:qFormat="1"/>
-    <w:lsdException w:name="Quote" w:uiPriority="29" w:qFormat="1"/>
-    <w:lsdException w:name="Intense Quote" w:uiPriority="30" w:qFormat="1"/>
-    <w:lsdException w:name="Medium List 2 Accent 1" w:uiPriority="66"/>
-    <w:lsdException w:name="Medium Grid 1 Accent 1" w:uiPriority="67"/>
-    <w:lsdException w:name="Medium Grid 2 Accent 1" w:uiPriority="68"/>
-    <w:lsdException w:name="Medium Grid 3 Accent 1" w:uiPriority="69"/>
-    <w:lsdException w:name="Dark List Accent 1" w:uiPriority="70"/>
-    <w:lsdException w:name="Colorful Shading Accent 1" w:uiPriority="71"/>
-    <w:lsdException w:name="Colorful List Accent 1" w:uiPriority="72"/>
-    <w:lsdException w:name="Colorful Grid Accent 1" w:uiPriority="73"/>
-    <w:lsdException w:name="Light Shading Accent 2" w:uiPriority="60"/>
-    <w:lsdException w:name="Light List Accent 2" w:uiPriority="61"/>
-    <w:lsdException w:name="Light Grid Accent 2" w:uiPriority="62"/>
-    <w:lsdException w:name="Medium Shading 1 Accent 2" w:uiPriority="63"/>
-    <w:lsdException w:name="Medium Shading 2 Accent 2" w:uiPriority="64"/>
-    <w:lsdException w:name="Medium List 1 Accent 2" w:uiPriority="65"/>
-    <w:lsdException w:name="Medium List 2 Accent 2" w:uiPriority="66"/>
-    <w:lsdException w:name="Medium Grid 1 Accent 2" w:uiPriority="67"/>
-    <w:lsdException w:name="Medium Grid 2 Accent 2" w:uiPriority="68"/>
-    <w:lsdException w:name="Medium Grid 3 Accent 2" w:uiPriority="69"/>
-    <w:lsdException w:name="Dark List Accent 2" w:uiPriority="70"/>
-    <w:lsdException w:name="Colorful Shading Accent 2" w:uiPriority="71"/>
-    <w:lsdException w:name="Colorful List Accent 2" w:uiPriority="72"/>
-    <w:lsdException w:name="Colorful Grid Accent 2" w:uiPriority="73"/>
-    <w:lsdException w:name="Light Shading Accent 3" w:uiPriority="60"/>
-    <w:lsdException w:name="Light List Accent 3" w:uiPriority="61"/>
-    <w:lsdException w:name="Light Grid Accent 3" w:uiPriority="62"/>
-    <w:lsdException w:name="Medium Shading 1 Accent 3" w:uiPriority="63"/>
-    <w:lsdException w:name="Medium Shading 2 Accent 3" w:uiPriority="64"/>
-    <w:lsdException w:name="Medium List 1 Accent 3" w:uiPriority="65"/>
-    <w:lsdException w:name="Medium List 2 Accent 3" w:uiPriority="66"/>
-    <w:lsdException w:name="Medium Grid 1 Accent 3" w:uiPriority="67"/>
-    <w:lsdException w:name="Medium Grid 2 Accent 3" w:uiPriority="68"/>
-    <w:lsdException w:name="Medium Grid 3 Accent 3" w:uiPriority="69"/>
-    <w:lsdException w:name="Dark List Accent 3" w:uiPriority="70"/>
-    <w:lsdException w:name="Colorful Shading Accent 3" w:uiPriority="71"/>
-    <w:lsdException w:name="Colorful List Accent 3" w:uiPriority="72"/>
-    <w:lsdException w:name="Colorful Grid Accent 3" w:uiPriority="73"/>
-    <w:lsdException w:name="Light Shading Accent 4" w:uiPriority="60"/>
-    <w:lsdException w:name="Light List Accent 4" w:uiPriority="61"/>
-    <w:lsdException w:name="Light Grid Accent 4" w:uiPriority="62"/>
-    <w:lsdException w:name="Medium Shading 1 Accent 4" w:uiPriority="63"/>
-    <w:lsdException w:name="Medium Shading 2 Accent 4" w:uiPriority="64"/>
-    <w:lsdException w:name="Medium List 1 Accent 4" w:uiPriority="65"/>
-    <w:lsdException w:name="Medium List 2 Accent 4" w:uiPriority="66"/>
-    <w:lsdException w:name="Medium Grid 1 Accent 4" w:uiPriority="67"/>
-    <w:lsdException w:name="Medium Grid 2 Accent 4" w:uiPriority="68"/>
-    <w:lsdException w:name="Medium Grid 3 Accent 4" w:uiPriority="69"/>
-    <w:lsdException w:name="Dark List Accent 4" w:uiPriority="70"/>
-    <w:lsdException w:name="Colorful Shading Accent 4" w:uiPriority="71"/>
-    <w:lsdException w:name="Colorful List Accent 4" w:uiPriority="72"/>
-    <w:lsdException w:name="Colorful Grid Accent 4" w:uiPriority="73"/>
-    <w:lsdException w:name="Light Shading Accent 5" w:uiPriority="60"/>
-    <w:lsdException w:name="Light List Accent 5" w:uiPriority="61"/>
-    <w:lsdException w:name="Light Grid Accent 5" w:uiPriority="62"/>
-    <w:lsdException w:name="Medium Shading 1 Accent 5" w:uiPriority="63"/>
-    <w:lsdException w:name="Medium Shading 2 Accent 5" w:uiPriority="64"/>
-    <w:lsdException w:name="Medium List 1 Accent 5" w:uiPriority="65"/>
-    <w:lsdException w:name="Medium List 2 Accent 5" w:uiPriority="66"/>
-    <w:lsdException w:name="Medium Grid 1 Accent 5" w:uiPriority="67"/>
-    <w:lsdException w:name="Medium Grid 2 Accent 5" w:uiPriority="68"/>
-    <w:lsdException w:name="Medium Grid 3 Accent 5" w:uiPriority="69"/>
-    <w:lsdException w:name="Dark List Accent 5" w:uiPriority="70"/>
-    <w:lsdException w:name="Colorful Shading Accent 5" w:uiPriority="71"/>
-    <w:lsdException w:name="Colorful List Accent 5" w:uiPriority="72"/>
-    <w:lsdException w:name="Colorful Grid Accent 5" w:uiPriority="73"/>
-    <w:lsdException w:name="Light Shading Accent 6" w:uiPriority="60"/>
-    <w:lsdException w:name="Light List Accent 6" w:uiPriority="61"/>
-    <w:lsdException w:name="Light Grid Accent 6" w:uiPriority="62"/>
-    <w:lsdException w:name="Medium Shading 1 Accent 6" w:uiPriority="63"/>
-    <w:lsdException w:name="Medium Shading 2 Accent 6" w:uiPriority="64"/>
-    <w:lsdException w:name="Medium List 1 Accent 6" w:uiPriority="65"/>
-    <w:lsdException w:name="Medium List 2 Accent 6" w:uiPriority="66"/>
-    <w:lsdException w:name="Medium Grid 1 Accent 6" w:uiPriority="67"/>
-    <w:lsdException w:name="Medium Grid 2 Accent 6" w:uiPriority="68"/>
-    <w:lsdException w:name="Medium Grid 3 Accent 6" w:uiPriority="69"/>
-    <w:lsdException w:name="Dark List Accent 6" w:uiPriority="70"/>
-    <w:lsdException w:name="Colorful Shading Accent 6" w:uiPriority="71"/>
-    <w:lsdException w:name="Colorful List Accent 6" w:uiPriority="72"/>
-    <w:lsdException w:name="Colorful Grid Accent 6" w:uiPriority="73"/>
-    <w:lsdException w:name="Subtle Emphasis" w:uiPriority="19" w:qFormat="1"/>
-    <w:lsdException w:name="Intense Emphasis" w:uiPriority="21" w:qFormat="1"/>
-    <w:lsdException w:name="Subtle Reference" w:uiPriority="31" w:qFormat="1"/>
-    <w:lsdException w:name="Intense Reference" w:uiPriority="32" w:qFormat="1"/>
-    <w:lsdException w:name="Book Title" w:uiPriority="33" w:qFormat="1"/>
-    <w:lsdException w:name="Bibliography" w:semiHidden="1" w:uiPriority="37" w:unhideWhenUsed="1"/>
-    <w:lsdException w:name="TOC Heading" w:semiHidden="1" w:uiPriority="39" w:unhideWhenUsed="1" w:qFormat="1"/>
-    <w:lsdException w:name="Plain Table 1" w:uiPriority="41"/>
-    <w:lsdException w:name="Plain Table 2" w:uiPriority="42"/>
-    <w:lsdException w:name="Plain Table 3" w:uiPriority="43"/>
-    <w:lsdException w:name="Plain Table 4" w:uiPriority="44"/>
-    <w:lsdException w:name="Plain Table 5" w:uiPriority="45"/>
-    <w:lsdException w:name="Grid Table Light" w:uiPriority="40"/>
-    <w:lsdException w:name="Grid Table 1 Light" w:uiPriority="46"/>
-    <w:lsdException w:name="Grid Table 2" w:uiPriority="47"/>
-    <w:lsdException w:name="Grid Table 3" w:uiPriority="48"/>
-    <w:lsdException w:name="Grid Table 4" w:uiPriority="49"/>
-    <w:lsdException w:name="Grid Table 5 Dark" w:uiPriority="50"/>
-    <w:lsdException w:name="Grid Table 6 Colorful" w:uiPriority="51"/>
-    <w:lsdException w:name="Grid Table 7 Colorful" w:uiPriority="52"/>
-    <w:lsdException w:name="Grid Table 1 Light Accent 1" w:uiPriority="46"/>
-    <w:lsdException w:name="Grid Table 2 Accent 1" w:uiPriority="47"/>
-    <w:lsdException w:name="Grid Table 3 Accent 1" w:uiPriority="48"/>
-    <w:lsdException w:name="Grid Table 4 Accent 1" w:uiPriority="49"/>
-    <w:lsdException w:name="Grid Table 5 Dark Accent 1" w:uiPriority="50"/>
-    <w:lsdException w:name="Grid Table 6 Colorful Accent 1" w:uiPriority="51"/>
-    <w:lsdException w:name="Grid Table 7 Colorful Accent 1" w:uiPriority="52"/>
-    <w:lsdException w:name="Grid Table 1 Light Accent 2" w:uiPriority="46"/>
-    <w:lsdException w:name="Grid Table 2 Accent 2" w:uiPriority="47"/>
-    <w:lsdException w:name="Grid Table 3 Accent 2" w:uiPriority="48"/>
-    <w:lsdException w:name="Grid Table 4 Accent 2" w:uiPriority="49"/>
-    <w:lsdException w:name="Grid Table 5 Dark Accent 2" w:uiPriority="50"/>
-    <w:lsdException w:name="Grid Table 6 Colorful Accent 2" w:uiPriority="51"/>
-    <w:lsdException w:name="Grid Table 7 Colorful Accent 2" w:uiPriority="52"/>
-    <w:lsdException w:name="Grid Table 1 Light Accent 3" w:uiPriority="46"/>
-    <w:lsdException w:name="Grid Table 2 Accent 3" w:uiPriority="47"/>
-    <w:lsdException w:name="Grid Table 3 Accent 3" w:uiPriority="48"/>
-    <w:lsdException w:name="Grid Table 4 Accent 3" w:uiPriority="49"/>
-    <w:lsdException w:name="Grid Table 5 Dark Accent 3" w:uiPriority="50"/>
-    <w:lsdException w:name="Grid Table 6 Colorful Accent 3" w:uiPriority="51"/>
-    <w:lsdException w:name="Grid Table 7 Colorful Accent 3" w:uiPriority="52"/>
-    <w:lsdException w:name="Grid Table 1 Light Accent 4" w:uiPriority="46"/>
-    <w:lsdException w:name="Grid Table 2 Accent 4" w:uiPriority="47"/>
-    <w:lsdException w:name="Grid Table 3 Accent 4" w:uiPriority="48"/>
-    <w:lsdException w:name="Grid Table 4 Accent 4" w:uiPriority="49"/>
-    <w:lsdException w:name="Grid Table 5 Dark Accent 4" w:uiPriority="50"/>
-    <w:lsdException w:name="Grid Table 6 Colorful Accent 4" w:uiPriority="51"/>
-    <w:lsdException w:name="Grid Table 7 Colorful Accent 4" w:uiPriority="52"/>
-    <w:lsdException w:name="Grid Table 1 Light Accent 5" w:uiPriority="46"/>
-    <w:lsdException w:name="Grid Table 2 Accent 5" w:uiPriority="47"/>
-    <w:lsdException w:name="Grid Table 3 Accent 5" w:uiPriority="48"/>
-    <w:lsdException w:name="Grid Table 4 Accent 5" w:uiPriority="49"/>
-    <w:lsdException w:name="Grid Table 5 Dark Accent 5" w:uiPriority="50"/>
-    <w:lsdException w:name="Grid Table 6 Colorful Accent 5" w:uiPriority="51"/>
-    <w:lsdException w:name="Grid Table 7 Colorful Accent 5" w:uiPriority="52"/>
-    <w:lsdException w:name="Grid Table 1 Light Accent 6" w:uiPriority="46"/>
-    <w:lsdException w:name="Grid Table 2 Accent 6" w:uiPriority="47"/>
-    <w:lsdException w:name="Grid Table 3 Accent 6" w:uiPriority="48"/>
-    <w:lsdException w:name="Grid Table 4 Accent 6" w:uiPriority="49"/>
-    <w:lsdException w:name="Grid Table 5 Dark Accent 6" w:uiPriority="50"/>
-    <w:lsdException w:name="Grid Table 6 Colorful Accent 6" w:uiPriority="51"/>
-    <w:lsdException w:name="Grid Table 7 Colorful Accent 6" w:uiPriority="52"/>
-    <w:lsdException w:name="List Table 1 Light" w:uiPriority="46"/>
-    <w:lsdException w:name="List Table 2" w:uiPriority="47"/>
-    <w:lsdException w:name="List Table 3" w:uiPriority="48"/>
-    <w:lsdException w:name="List Table 4" w:uiPriority="49"/>
-    <w:lsdException w:name="List Table 5 Dark" w:uiPriority="50"/>
-    <w:lsdException w:name="List Table 6 Colorful" w:uiPriority="51"/>
-    <w:lsdException w:name="List Table 7 Colorful" w:uiPriority="52"/>
-    <w:lsdException w:name="List Table 1 Light Accent 1" w:uiPriority="46"/>
-    <w:lsdException w:name="List Table 2 Accent 1" w:uiPriority="47"/>
-    <w:lsdException w:name="List Table 3 Accent 1" w:uiPriority="48"/>
-    <w:lsdException w:name="List Table 4 Accent 1" w:uiPriority="49"/>
-    <w:lsdException w:name="List Table 5 Dark Accent 1" w:uiPriority="50"/>
-    <w:lsdException w:name="List Table 6 Colorful Accent 1" w:uiPriority="51"/>
-    <w:lsdException w:name="List Table 7 Colorful Accent 1" w:uiPriority="52"/>
-    <w:lsdException w:name="List Table 1 Light Accent 2" w:uiPriority="46"/>
-    <w:lsdException w:name="List Table 2 Accent 2" w:uiPriority="47"/>
-    <w:lsdException w:name="List Table 3 Accent 2" w:uiPriority="48"/>
-    <w:lsdException w:name="List Table 4 Accent 2" w:uiPriority="49"/>
-    <w:lsdException w:name="List Table 5 Dark Accent 2" w:uiPriority="50"/>
-    <w:lsdException w:name="List Table 6 Colorful Accent 2" w:uiPriority="51"/>
-    <w:lsdException w:name="List Table 7 Colorful Accent 2" w:uiPriority="52"/>
-    <w:lsdException w:name="List Table 1 Light Accent 3" w:uiPriority="46"/>
-    <w:lsdException w:name="List Table 2 Accent 3" w:uiPriority="47"/>
-    <w:lsdException w:name="List Table 3 Accent 3" w:uiPriority="48"/>
-    <w:lsdException w:name="List Table 4 Accent 3" w:uiPriority="49"/>
-    <w:lsdException w:name="List Table 5 Dark Accent 3" w:uiPriority="50"/>
-    <w:lsdException w:name="List Table 6 Colorful Accent 3" w:uiPriority="51"/>
-    <w:lsdException w:name="List Table 7 Colorful Accent 3" w:uiPriority="52"/>
-    <w:lsdException w:name="List Table 1 Light Accent 4" w:uiPriority="46"/>
-    <w:lsdException w:name="List Table 2 Accent 4" w:uiPriority="47"/>
-    <w:lsdException w:name="List Table 3 Accent 4" w:uiPriority="48"/>
-    <w:lsdException w:name="List Table 4 Accent 4" w:uiPriority="49"/>
-    <w:lsdException w:name="List Table 5 Dark Accent 4" w:uiPriority="50"/>
-    <w:lsdException w:name="List Table 6 Colorful Accent 4" w:uiPriority="51"/>
-    <w:lsdException w:name="List Table 7 Colorful Accent 4" w:uiPriority="52"/>
-    <w:lsdException w:name="List Table 1 Light Accent 5" w:uiPriority="46"/>
-    <w:lsdException w:name="List Table 2 Accent 5" w:uiPriority="47"/>
-    <w:lsdException w:name="List Table 3 Accent 5" w:uiPriority="48"/>
-    <w:lsdException w:name="List Table 4 Accent 5" w:uiPriority="49"/>
-    <w:lsdException w:name="List Table 5 Dark Accent 5" w:uiPriority="50"/>
-    <w:lsdException w:name="List Table 6 Colorful Accent 5" w:uiPriority="51"/>
-    <w:lsdException w:name="List Table 7 Colorful Accent 5" w:uiPriority="52"/>
-    <w:lsdException w:name="List Table 1 Light Accent 6" w:uiPriority="46"/>
-    <w:lsdException w:name="List Table 2 Accent 6" w:uiPriority="47"/>
-    <w:lsdException w:name="List Table 3 Accent 6" w:uiPriority="48"/>
-    <w:lsdException w:name="List Table 4 Accent 6" w:uiPriority="49"/>
-    <w:lsdException w:name="List Table 5 Dark Accent 6" w:uiPriority="50"/>
-    <w:lsdException w:name="List Table 6 Colorful Accent 6" w:uiPriority="51"/>
-    <w:lsdException w:name="List Table 7 Colorful Accent 6" w:uiPriority="52"/>
-    <w:lsdException w:name="Mention" w:semiHidden="1" w:unhideWhenUsed="1"/>
-    <w:lsdException w:name="Smart Hyperlink" w:semiHidden="1" w:unhideWhenUsed="1"/>
-    <w:lsdException w:name="Hashtag" w:semiHidden="1" w:unhideWhenUsed="1"/>
-    <w:lsdException w:name="Unresolved Mention" w:semiHidden="1" w:unhideWhenUsed="1"/>
-    <w:lsdException w:name="Smart Link" w:semiHidden="1" w:unhideWhenUsed="1"/>
+  <w:latentStyles w:defLockedState="0" w:defUIPriority="99" w:defSemiHidden="1" w:defUnhideWhenUsed="1" w:defQFormat="0" w:count="267">
+    <w:lsdException w:name="Normal" w:semiHidden="0" w:uiPriority="0" w:unhideWhenUsed="0" w:qFormat="1"/>
+    <w:lsdException w:name="heading 1" w:semiHidden="0" w:uiPriority="0" w:unhideWhenUsed="0" w:qFormat="1"/>
+    <w:lsdException w:name="heading 2" w:uiPriority="0" w:qFormat="1"/>
+    <w:lsdException w:name="heading 3" w:uiPriority="0" w:qFormat="1"/>
+    <w:lsdException w:name="heading 4" w:uiPriority="9" w:qFormat="1"/>
+    <w:lsdException w:name="heading 5" w:uiPriority="9" w:qFormat="1"/>
+    <w:lsdException w:name="heading 6" w:uiPriority="9" w:qFormat="1"/>
+    <w:lsdException w:name="heading 7" w:uiPriority="9" w:qFormat="1"/>
+    <w:lsdException w:name="heading 8" w:uiPriority="9" w:qFormat="1"/>
+    <w:lsdException w:name="heading 9" w:uiPriority="9" w:qFormat="1"/>
+    <w:lsdException w:name="toc 1" w:uiPriority="39" w:qFormat="1"/>
+    <w:lsdException w:name="toc 2" w:uiPriority="39" w:qFormat="1"/>
+    <w:lsdException w:name="toc 3" w:uiPriority="39" w:qFormat="1"/>
+    <w:lsdException w:name="toc 4" w:uiPriority="39"/>
+    <w:lsdException w:name="toc 5" w:uiPriority="39"/>
+    <w:lsdException w:name="toc 6" w:uiPriority="39"/>
+    <w:lsdException w:name="toc 7" w:uiPriority="39"/>
+    <w:lsdException w:name="toc 8" w:uiPriority="39"/>
+    <w:lsdException w:name="toc 9" w:uiPriority="39"/>
+    <w:lsdException w:name="footer" w:uiPriority="0"/>
+    <w:lsdException w:name="caption" w:uiPriority="0" w:qFormat="1"/>
+    <w:lsdException w:name="Title" w:semiHidden="0" w:uiPriority="10" w:unhideWhenUsed="0" w:qFormat="1"/>
+    <w:lsdException w:name="Default Paragraph Font" w:uiPriority="1"/>
+    <w:lsdException w:name="Subtitle" w:semiHidden="0" w:uiPriority="11" w:unhideWhenUsed="0" w:qFormat="1"/>
+    <w:lsdException w:name="Strong" w:semiHidden="0" w:uiPriority="22" w:unhideWhenUsed="0" w:qFormat="1"/>
+    <w:lsdException w:name="Emphasis" w:semiHidden="0" w:uiPriority="20" w:unhideWhenUsed="0" w:qFormat="1"/>
+    <w:lsdException w:name="Table Grid" w:semiHidden="0" w:uiPriority="59" w:unhideWhenUsed="0"/>
+    <w:lsdException w:name="Placeholder Text" w:unhideWhenUsed="0"/>
+    <w:lsdException w:name="No Spacing" w:semiHidden="0" w:uiPriority="1" w:unhideWhenUsed="0" w:qFormat="1"/>
+    <w:lsdException w:name="Light Shading" w:semiHidden="0" w:uiPriority="60" w:unhideWhenUsed="0"/>
+    <w:lsdException w:name="Light List" w:semiHidden="0" w:uiPriority="61" w:unhideWhenUsed="0"/>
+    <w:lsdException w:name="Light Grid" w:semiHidden="0" w:uiPriority="62" w:unhideWhenUsed="0"/>
+    <w:lsdException w:name="Medium Shading 1" w:semiHidden="0" w:uiPriority="63" w:unhideWhenUsed="0"/>
+    <w:lsdException w:name="Medium Shading 2" w:semiHidden="0" w:uiPriority="64" w:unhideWhenUsed="0"/>
+    <w:lsdException w:name="Medium List 1" w:semiHidden="0" w:uiPriority="65" w:unhideWhenUsed="0"/>
+    <w:lsdException w:name="Medium List 2" w:semiHidden="0" w:uiPriority="66" w:unhideWhenUsed="0"/>
+    <w:lsdException w:name="Medium Grid 1" w:semiHidden="0" w:uiPriority="67" w:unhideWhenUsed="0"/>
+    <w:lsdException w:name="Medium Grid 2" w:semiHidden="0" w:uiPriority="68" w:unhideWhenUsed="0"/>
+    <w:lsdException w:name="Medium Grid 3" w:semiHidden="0" w:uiPriority="69" w:unhideWhenUsed="0"/>
+    <w:lsdException w:name="Dark List" w:semiHidden="0" w:uiPriority="70" w:unhideWhenUsed="0"/>
+    <w:lsdException w:name="Colorful Shading" w:semiHidden="0" w:uiPriority="71" w:unhideWhenUsed="0"/>
+    <w:lsdException w:name="Colorful List" w:semiHidden="0" w:uiPriority="72" w:unhideWhenUsed="0"/>
+    <w:lsdException w:name="Colorful Grid" w:semiHidden="0" w:uiPriority="73" w:unhideWhenUsed="0"/>
+    <w:lsdException w:name="Light Shading Accent 1" w:semiHidden="0" w:uiPriority="60" w:unhideWhenUsed="0"/>
+    <w:lsdException w:name="Light List Accent 1" w:semiHidden="0" w:uiPriority="61" w:unhideWhenUsed="0"/>
+    <w:lsdException w:name="Light Grid Accent 1" w:semiHidden="0" w:uiPriority="62" w:unhideWhenUsed="0"/>
+    <w:lsdException w:name="Medium Shading 1 Accent 1" w:semiHidden="0" w:uiPriority="63" w:unhideWhenUsed="0"/>
+    <w:lsdException w:name="Medium Shading 2 Accent 1" w:semiHidden="0" w:uiPriority="64" w:unhideWhenUsed="0"/>
+    <w:lsdException w:name="Medium List 1 Accent 1" w:semiHidden="0" w:uiPriority="65" w:unhideWhenUsed="0"/>
+    <w:lsdException w:name="Revision" w:unhideWhenUsed="0"/>
+    <w:lsdException w:name="List Paragraph" w:semiHidden="0" w:uiPriority="34" w:unhideWhenUsed="0" w:qFormat="1"/>
+    <w:lsdException w:name="Quote" w:semiHidden="0" w:uiPriority="29" w:unhideWhenUsed="0" w:qFormat="1"/>
+    <w:lsdException w:name="Intense Quote" w:semiHidden="0" w:uiPriority="30" w:unhideWhenUsed="0" w:qFormat="1"/>
+    <w:lsdException w:name="Medium List 2 Accent 1" w:semiHidden="0" w:uiPriority="66" w:unhideWhenUsed="0"/>
+    <w:lsdException w:name="Medium Grid 1 Accent 1" w:semiHidden="0" w:uiPriority="67" w:unhideWhenUsed="0"/>
+    <w:lsdException w:name="Medium Grid 2 Accent 1" w:semiHidden="0" w:uiPriority="68" w:unhideWhenUsed="0"/>
+    <w:lsdException w:name="Medium Grid 3 Accent 1" w:semiHidden="0" w:uiPriority="69" w:unhideWhenUsed="0"/>
+    <w:lsdException w:name="Dark List Accent 1" w:semiHidden="0" w:uiPriority="70" w:unhideWhenUsed="0"/>
+    <w:lsdException w:name="Colorful Shading Accent 1" w:semiHidden="0" w:uiPriority="71" w:unhideWhenUsed="0"/>
+    <w:lsdException w:name="Colorful List Accent 1" w:semiHidden="0" w:uiPriority="72" w:unhideWhenUsed="0"/>
+    <w:lsdException w:name="Colorful Grid Accent 1" w:semiHidden="0" w:uiPriority="73" w:unhideWhenUsed="0"/>
+    <w:lsdException w:name="Light Shading Accent 2" w:semiHidden="0" w:uiPriority="60" w:unhideWhenUsed="0"/>
+    <w:lsdException w:name="Light List Accent 2" w:semiHidden="0" w:uiPriority="61" w:unhideWhenUsed="0"/>
+    <w:lsdException w:name="Light Grid Accent 2" w:semiHidden="0" w:uiPriority="62" w:unhideWhenUsed="0"/>
+    <w:lsdException w:name="Medium Shading 1 Accent 2" w:semiHidden="0" w:uiPriority="63" w:unhideWhenUsed="0"/>
+    <w:lsdException w:name="Medium Shading 2 Accent 2" w:semiHidden="0" w:uiPriority="64" w:unhideWhenUsed="0"/>
+    <w:lsdException w:name="Medium List 1 Accent 2" w:semiHidden="0" w:uiPriority="65" w:unhideWhenUsed="0"/>
+    <w:lsdException w:name="Medium List 2 Accent 2" w:semiHidden="0" w:uiPriority="66" w:unhideWhenUsed="0"/>
+    <w:lsdException w:name="Medium Grid 1 Accent 2" w:semiHidden="0" w:uiPriority="67" w:unhideWhenUsed="0"/>
+    <w:lsdException w:name="Medium Grid 2 Accent 2" w:semiHidden="0" w:uiPriority="68" w:unhideWhenUsed="0"/>
+    <w:lsdException w:name="Medium Grid 3 Accent 2" w:semiHidden="0" w:uiPriority="69" w:unhideWhenUsed="0"/>
+    <w:lsdException w:name="Dark List Accent 2" w:semiHidden="0" w:uiPriority="70" w:unhideWhenUsed="0"/>
+    <w:lsdException w:name="Colorful Shading Accent 2" w:semiHidden="0" w:uiPriority="71" w:unhideWhenUsed="0"/>
+    <w:lsdException w:name="Colorful List Accent 2" w:semiHidden="0" w:uiPriority="72" w:unhideWhenUsed="0"/>
+    <w:lsdException w:name="Colorful Grid Accent 2" w:semiHidden="0" w:uiPriority="73" w:unhideWhenUsed="0"/>
+    <w:lsdException w:name="Light Shading Accent 3" w:semiHidden="0" w:uiPriority="60" w:unhideWhenUsed="0"/>
+    <w:lsdException w:name="Light List Accent 3" w:semiHidden="0" w:uiPriority="61" w:unhideWhenUsed="0"/>
+    <w:lsdException w:name="Light Grid Accent 3" w:semiHidden="0" w:uiPriority="62" w:unhideWhenUsed="0"/>
+    <w:lsdException w:name="Medium Shading 1 Accent 3" w:semiHidden="0" w:uiPriority="63" w:unhideWhenUsed="0"/>
+    <w:lsdException w:name="Medium Shading 2 Accent 3" w:semiHidden="0" w:uiPriority="64" w:unhideWhenUsed="0"/>
+    <w:lsdException w:name="Medium List 1 Accent 3" w:semiHidden="0" w:uiPriority="65" w:unhideWhenUsed="0"/>
+    <w:lsdException w:name="Medium List 2 Accent 3" w:semiHidden="0" w:uiPriority="66" w:unhideWhenUsed="0"/>
+    <w:lsdException w:name="Medium Grid 1 Accent 3" w:semiHidden="0" w:uiPriority="67" w:unhideWhenUsed="0"/>
+    <w:lsdException w:name="Medium Grid 2 Accent 3" w:semiHidden="0" w:uiPriority="68" w:unhideWhenUsed="0"/>
+    <w:lsdException w:name="Medium Grid 3 Accent 3" w:semiHidden="0" w:uiPriority="69" w:unhideWhenUsed="0"/>
+    <w:lsdException w:name="Dark List Accent 3" w:semiHidden="0" w:uiPriority="70" w:unhideWhenUsed="0"/>
+    <w:lsdException w:name="Colorful Shading Accent 3" w:semiHidden="0" w:uiPriority="71" w:unhideWhenUsed="0"/>
+    <w:lsdException w:name="Colorful List Accent 3" w:semiHidden="0" w:uiPriority="72" w:unhideWhenUsed="0"/>
+    <w:lsdException w:name="Colorful Grid Accent 3" w:semiHidden="0" w:uiPriority="73" w:unhideWhenUsed="0"/>
+    <w:lsdException w:name="Light Shading Accent 4" w:semiHidden="0" w:uiPriority="60" w:unhideWhenUsed="0"/>
+    <w:lsdException w:name="Light List Accent 4" w:semiHidden="0" w:uiPriority="61" w:unhideWhenUsed="0"/>
+    <w:lsdException w:name="Light Grid Accent 4" w:semiHidden="0" w:uiPriority="62" w:unhideWhenUsed="0"/>
+    <w:lsdException w:name="Medium Shading 1 Accent 4" w:semiHidden="0" w:uiPriority="63" w:unhideWhenUsed="0"/>
+    <w:lsdException w:name="Medium Shading 2 Accent 4" w:semiHidden="0" w:uiPriority="64" w:unhideWhenUsed="0"/>
+    <w:lsdException w:name="Medium List 1 Accent 4" w:semiHidden="0" w:uiPriority="65" w:unhideWhenUsed="0"/>
+    <w:lsdException w:name="Medium List 2 Accent 4" w:semiHidden="0" w:uiPriority="66" w:unhideWhenUsed="0"/>
+    <w:lsdException w:name="Medium Grid 1 Accent 4" w:semiHidden="0" w:uiPriority="67" w:unhideWhenUsed="0"/>
+    <w:lsdException w:name="Medium Grid 2 Accent 4" w:semiHidden="0" w:uiPriority="68" w:unhideWhenUsed="0"/>
+    <w:lsdException w:name="Medium Grid 3 Accent 4" w:semiHidden="0" w:uiPriority="69" w:unhideWhenUsed="0"/>
+    <w:lsdException w:name="Dark List Accent 4" w:semiHidden="0" w:uiPriority="70" w:unhideWhenUsed="0"/>
+    <w:lsdException w:name="Colorful Shading Accent 4" w:semiHidden="0" w:uiPriority="71" w:unhideWhenUsed="0"/>
+    <w:lsdException w:name="Colorful List Accent 4" w:semiHidden="0" w:uiPriority="72" w:unhideWhenUsed="0"/>
+    <w:lsdException w:name="Colorful Grid Accent 4" w:semiHidden="0" w:uiPriority="73" w:unhideWhenUsed="0"/>
+    <w:lsdException w:name="Light Shading Accent 5" w:semiHidden="0" w:uiPriority="60" w:unhideWhenUsed="0"/>
+    <w:lsdException w:name="Light List Accent 5" w:semiHidden="0" w:uiPriority="61" w:unhideWhenUsed="0"/>
+    <w:lsdException w:name="Light Grid Accent 5" w:semiHidden="0" w:uiPriority="62" w:unhideWhenUsed="0"/>
+    <w:lsdException w:name="Medium Shading 1 Accent 5" w:semiHidden="0" w:uiPriority="63" w:unhideWhenUsed="0"/>
+    <w:lsdException w:name="Medium Shading 2 Accent 5" w:semiHidden="0" w:uiPriority="64" w:unhideWhenUsed="0"/>
+    <w:lsdException w:name="Medium List 1 Accent 5" w:semiHidden="0" w:uiPriority="65" w:unhideWhenUsed="0"/>
+    <w:lsdException w:name="Medium List 2 Accent 5" w:semiHidden="0" w:uiPriority="66" w:unhideWhenUsed="0"/>
+    <w:lsdException w:name="Medium Grid 1 Accent 5" w:semiHidden="0" w:uiPriority="67" w:unhideWhenUsed="0"/>
+    <w:lsdException w:name="Medium Grid 2 Accent 5" w:semiHidden="0" w:uiPriority="68" w:unhideWhenUsed="0"/>
+    <w:lsdException w:name="Medium Grid 3 Accent 5" w:semiHidden="0" w:uiPriority="69" w:unhideWhenUsed="0"/>
+    <w:lsdException w:name="Dark List Accent 5" w:semiHidden="0" w:uiPriority="70" w:unhideWhenUsed="0"/>
+    <w:lsdException w:name="Colorful Shading Accent 5" w:semiHidden="0" w:uiPriority="71" w:unhideWhenUsed="0"/>
+    <w:lsdException w:name="Colorful List Accent 5" w:semiHidden="0" w:uiPriority="72" w:unhideWhenUsed="0"/>
+    <w:lsdException w:name="Colorful Grid Accent 5" w:semiHidden="0" w:uiPriority="73" w:unhideWhenUsed="0"/>
+    <w:lsdException w:name="Light Shading Accent 6" w:semiHidden="0" w:uiPriority="60" w:unhideWhenUsed="0"/>
+    <w:lsdException w:name="Light List Accent 6" w:semiHidden="0" w:uiPriority="61" w:unhideWhenUsed="0"/>
+    <w:lsdException w:name="Light Grid Accent 6" w:semiHidden="0" w:uiPriority="62" w:unhideWhenUsed="0"/>
+    <w:lsdException w:name="Medium Shading 1 Accent 6" w:semiHidden="0" w:uiPriority="63" w:unhideWhenUsed="0"/>
+    <w:lsdException w:name="Medium Shading 2 Accent 6" w:semiHidden="0" w:uiPriority="64" w:unhideWhenUsed="0"/>
+    <w:lsdException w:name="Medium List 1 Accent 6" w:semiHidden="0" w:uiPriority="65" w:unhideWhenUsed="0"/>
+    <w:lsdException w:name="Medium List 2 Accent 6" w:semiHidden="0" w:uiPriority="66" w:unhideWhenUsed="0"/>
+    <w:lsdException w:name="Medium Grid 1 Accent 6" w:semiHidden="0" w:uiPriority="67" w:unhideWhenUsed="0"/>
+    <w:lsdException w:name="Medium Grid 2 Accent 6" w:semiHidden="0" w:uiPriority="68" w:unhideWhenUsed="0"/>
+    <w:lsdException w:name="Medium Grid 3 Accent 6" w:semiHidden="0" w:uiPriority="69" w:unhideWhenUsed="0"/>
+    <w:lsdException w:name="Dark List Accent 6" w:semiHidden="0" w:uiPriority="70" w:unhideWhenUsed="0"/>
+    <w:lsdException w:name="Colorful Shading Accent 6" w:semiHidden="0" w:uiPriority="71" w:unhideWhenUsed="0"/>
+    <w:lsdException w:name="Colorful List Accent 6" w:semiHidden="0" w:uiPriority="72" w:unhideWhenUsed="0"/>
+    <w:lsdException w:name="Colorful Grid Accent 6" w:semiHidden="0" w:uiPriority="73" w:unhideWhenUsed="0"/>
+    <w:lsdException w:name="Subtle Emphasis" w:semiHidden="0" w:uiPriority="19" w:unhideWhenUsed="0" w:qFormat="1"/>
+    <w:lsdException w:name="Intense Emphasis" w:semiHidden="0" w:uiPriority="21" w:unhideWhenUsed="0" w:qFormat="1"/>
+    <w:lsdException w:name="Subtle Reference" w:semiHidden="0" w:uiPriority="31" w:unhideWhenUsed="0" w:qFormat="1"/>
+    <w:lsdException w:name="Intense Reference" w:semiHidden="0" w:uiPriority="32" w:unhideWhenUsed="0" w:qFormat="1"/>
+    <w:lsdException w:name="Book Title" w:semiHidden="0" w:uiPriority="33" w:unhideWhenUsed="0" w:qFormat="1"/>
+    <w:lsdException w:name="Bibliography" w:uiPriority="37"/>
+    <w:lsdException w:name="TOC Heading" w:uiPriority="39" w:qFormat="1"/>
   </w:latentStyles>
   <w:style w:type="paragraph" w:default="1" w:styleId="Normal">
     <w:name w:val="Normal"/>
@@ -3049,6 +2772,7 @@
     <w:uiPriority w:val="99"/>
     <w:semiHidden/>
     <w:unhideWhenUsed/>
+    <w:qFormat/>
     <w:tblPr>
       <w:tblInd w:w="0" w:type="dxa"/>
       <w:tblCellMar>
@@ -3263,6 +2987,7 @@
     <w:uiPriority w:val="59"/>
     <w:rsid w:val="00085B87"/>
     <w:tblPr>
+      <w:tblInd w:w="0" w:type="dxa"/>
       <w:tblBorders>
         <w:top w:val="single" w:sz="4" w:space="0" w:color="000000" w:themeColor="text1"/>
         <w:left w:val="single" w:sz="4" w:space="0" w:color="000000" w:themeColor="text1"/>
@@ -3271,6 +2996,12 @@
         <w:insideH w:val="single" w:sz="4" w:space="0" w:color="000000" w:themeColor="text1"/>
         <w:insideV w:val="single" w:sz="4" w:space="0" w:color="000000" w:themeColor="text1"/>
       </w:tblBorders>
+      <w:tblCellMar>
+        <w:top w:w="0" w:type="dxa"/>
+        <w:left w:w="108" w:type="dxa"/>
+        <w:bottom w:w="0" w:type="dxa"/>
+        <w:right w:w="108" w:type="dxa"/>
+      </w:tblCellMar>
     </w:tblPr>
   </w:style>
   <w:style w:type="character" w:styleId="FollowedHyperlink">
@@ -4165,7 +3896,7 @@
 </file>
 
 <file path=customXml/itemProps1.xml><?xml version="1.0" encoding="utf-8"?>
-<ds:datastoreItem xmlns:ds="http://schemas.openxmlformats.org/officeDocument/2006/customXml" ds:itemID="{5DA73F05-7B39-421B-9E89-CF249D59E2EB}">
+<ds:datastoreItem xmlns:ds="http://schemas.openxmlformats.org/officeDocument/2006/customXml" ds:itemID="{5233DFEC-9236-4791-BD10-28056766247E}">
   <ds:schemaRefs>
     <ds:schemaRef ds:uri="http://schemas.openxmlformats.org/officeDocument/2006/bibliography"/>
   </ds:schemaRefs>

</xml_diff>